<commit_message>
minor edits, doc and pdf rebuilds
</commit_message>
<xml_diff>
--- a/exports/jpa.docx
+++ b/exports/jpa.docx
@@ -7,7 +7,7 @@
         <w:pStyle w:val="Heading1"/>
       </w:pPr>
       <w:r>
-        <w:t xml:space="preserve">JPA Funding Strategies 🧙</w:t>
+        <w:t xml:space="preserve">JPA Funding Strategies 💵</w:t>
       </w:r>
     </w:p>
     <w:p>
@@ -27,28 +27,92 @@
       </w:r>
     </w:p>
     <w:p>
+      <w:r>
+        <w:t xml:space="preserve">Joint Powers Authorities are proposed as a solution for feedstock aggregation in California to help broker agreements with forest landowners and managers and create long-term supply contracts to increase investor support for wood products businesses. Funding these entities presents its challenges, given the difficulties of securing grants and private investments. Creating a diversified funding portfolio is crucial, especially for new entities, and suggestions for achieving this are provided.</w:t>
+      </w:r>
+    </w:p>
+    <w:p>
       <w:pPr>
         <w:pStyle w:val="Heading3"/>
       </w:pPr>
       <w:r>
+        <w:t xml:space="preserve">Takeaways</w:t>
+      </w:r>
+    </w:p>
+    <w:p>
+      <w:pPr>
+        <w:pStyle w:val="ListParagraph"/>
+        <w:numPr>
+          <w:ilvl w:val="0"/>
+          <w:numId w:val="9"/>
+        </w:numPr>
+      </w:pPr>
+      <w:r>
+        <w:rPr>
+          <w:b/>
+          <w:bCs/>
+        </w:rPr>
+        <w:t xml:space="preserve">Portfolio strategy</w:t>
+      </w:r>
+      <w:r>
+        <w:t xml:space="preserve">. Be strategic about what funds you utilize for different projects and programs. It may be best to look to foundations and business support grants for organizational startup or administrative costs. Still, implementation grants for field projects and private or bank loans for scaling once a feedstock aggregation entity is established.</w:t>
+      </w:r>
+    </w:p>
+    <w:p>
+      <w:pPr>
+        <w:pStyle w:val="ListParagraph"/>
+        <w:numPr>
+          <w:ilvl w:val="0"/>
+          <w:numId w:val="9"/>
+        </w:numPr>
+      </w:pPr>
+      <w:r>
+        <w:rPr>
+          <w:b/>
+          <w:bCs/>
+        </w:rPr>
+        <w:t xml:space="preserve">Temporal ramping</w:t>
+      </w:r>
+      <w:r>
+        <w:t xml:space="preserve">. Revenue sources outside the realm of taxes and grants may be difficult to create and execute with risk-averse agencies and organizations. Try funding with traditional resources, such as grants, first, and then gradually introduce new resources to diversify your funding portfolio and help establish a new organization’s financial stability over time.</w:t>
+      </w:r>
+    </w:p>
+    <w:p>
+      <w:pPr>
+        <w:pStyle w:val="ListParagraph"/>
+        <w:numPr>
+          <w:ilvl w:val="0"/>
+          <w:numId w:val="9"/>
+        </w:numPr>
+      </w:pPr>
+      <w:r>
+        <w:rPr>
+          <w:b/>
+          <w:bCs/>
+        </w:rPr>
+        <w:t xml:space="preserve">Grant dependence &amp; giving</w:t>
+      </w:r>
+      <w:r>
+        <w:t xml:space="preserve">. In a similar vein, just because grants are available doesn’t mean that will be the case indefinitely. As soon as you secure a grant or two, think about how to leverage it with other funding sources and work tirelessly to create more dependable and steady income sources than grants. It may seem daunting, but remember that the single largest source of charitable giving in the United States comes from individuals, not foundations, corporations, or grant-making agencies. The single largest source is also the least restricted type of funding, so it is critical for covering operational expenses (which are often underfunded by grants). Develop a strategy to cultivate local support through individual donations.</w:t>
+      </w:r>
+    </w:p>
+    <w:p>
+      <w:pPr>
+        <w:pStyle w:val="Heading3"/>
+      </w:pPr>
+      <w:r>
         <w:t xml:space="preserve">Background</w:t>
       </w:r>
     </w:p>
     <w:p>
       <w:r>
-        <w:t xml:space="preserve">The large wildfires seasons of the past five years have been catastrophic for forests and communities. However, according to </w:t>
+        <w:t xml:space="preserve">The large wildfire seasons of the past five years have been catastrophic for forests and communities. However, according to </w:t>
       </w:r>
       <w:r>
         <w:t xml:space="preserve">Keeley &amp; Syphard (2021)</w:t>
       </w:r>
       <w:r>
-        <w:t xml:space="preserve">, they are not unprecedented in recent California history and are usually associated with periods of drought, e.g., 1920s and 2010s. researchers  found that during the past century tree densities increased up to seven fold while average tree size decreased 50% in the Sierra Nevada (</w:t>
-      </w:r>
-      <w:r>
-        <w:t xml:space="preserve">North 2022</w:t>
-      </w:r>
-      <w:r>
-        <w:t xml:space="preserve">). A chronic level of stress is created from high competition across trees leading stands to be less resilient to drought, disease, fire, and climate change. </w:t>
+        <w:t xml:space="preserve">, they are not unprecedented in recent California history and are usually associated with periods of drought, e.g., the 1920s and 2010s. </w:t>
       </w:r>
       <w:r>
         <w:t xml:space="preserve">North </w:t>
@@ -61,26 +125,13 @@
         <w:t xml:space="preserve">et al.</w:t>
       </w:r>
       <w:r>
-        <w:t xml:space="preserve"> (2009)</w:t>
-      </w:r>
-      <w:r>
-        <w:t xml:space="preserve"> call for an aggressive approach to treat fire-suppressed stands with an ecological-based approach that reduces the total number of trees/acre, while maintaining stand heterogeneity.</w:t>
-      </w:r>
-    </w:p>
-    <w:p>
-      <w:pPr>
-        <w:pStyle w:val="Heading3"/>
-      </w:pPr>
-      <w:r>
-        <w:t xml:space="preserve">Concerns</w:t>
-      </w:r>
-    </w:p>
-    <w:p>
-      <w:r>
-        <w:t xml:space="preserve">A significant cause for concern regarding the protection of old-growth forests in the United States is their drastic decline from historical levels due to logging and development, which threatens biodiversity and climate stability. </w:t>
-      </w:r>
-      <w:r>
-        <w:t xml:space="preserve">DellaSala </w:t>
+        <w:t xml:space="preserve"> (2022)</w:t>
+      </w:r>
+      <w:r>
+        <w:t xml:space="preserve"> found that during the past century, tree densities increased up to sevenfold while average tree size decreased 50% in the Sierra Nevada. </w:t>
+      </w:r>
+      <w:r>
+        <w:t xml:space="preserve">Hagmann </w:t>
       </w:r>
       <w:r>
         <w:rPr>
@@ -90,18 +141,13 @@
         <w:t xml:space="preserve">et al.</w:t>
       </w:r>
       <w:r>
-        <w:t xml:space="preserve"> (2022)</w:t>
-      </w:r>
-      <w:r>
-        <w:t xml:space="preserve"> highlight the fact that a large proportion of the remaining mature and old-growth forests on federal lands are still vulnerable to logging. The loss of these forests would not only diminish biodiversity but also release substantial amounts of stored carbon into the atmosphere. This underscores the urgent need to protect old growth as a natural climate solution.</w:t>
-      </w:r>
-    </w:p>
-    <w:p>
-      <w:r>
-        <w:t xml:space="preserve">Further compounding these concerns is the lack of a coordinated and effective national policy for old-growth conservation. </w:t>
-      </w:r>
-      <w:r>
-        <w:t xml:space="preserve">Carroll </w:t>
+        <w:t xml:space="preserve"> (2021)</w:t>
+      </w:r>
+      <w:r>
+        <w:t xml:space="preserve"> led a meta analysis showing a fire deficit and widespread alteration of ecological structure and funtion across seasonally dry forests of western North America. A chronic level of stress is created by high competition across tree stands, resulting in reduced resilience to drought, disease, fire, and climate change. </w:t>
+      </w:r>
+      <w:r>
+        <w:t xml:space="preserve">North </w:t>
       </w:r>
       <w:r>
         <w:rPr>
@@ -111,15 +157,10 @@
         <w:t xml:space="preserve">et al.</w:t>
       </w:r>
       <w:r>
-        <w:t xml:space="preserve"> (2025)</w:t>
-      </w:r>
-      <w:r>
-        <w:t xml:space="preserve"> point to a history of policy debates and unfinalized amendments, such as the National Old-Growth Amendment, which have failed to provide lasting protection. The authors argue for a more comprehensive approach that moves beyond simple harvest restrictions to include landscape-level planning, the establishment of reserves, the protection of climate and fire refugia, and the setting of specific goals for the recovery of species that depend on these unique habitats. This highlights the necessity of a long-term, ecosystem-based strategy to ensure the recruitment of new old-growth forests and the recovery of their associated biodiversity.</w:t>
-      </w:r>
-    </w:p>
-    <w:p>
-      <w:r>
-        <w:t xml:space="preserve">But let’s be very clear, thinning dens stands of fire prone forests, is completely different from logging old growth. Furthermore, forest health treatments should not be one size fits all. Treating mixed conifer stands on the western slope of the Sierra Nevada requires different treatments than mesic forests in the Pacific Northwest. Managers should take steps to reduce fire risk, but still be required to consider negative impacts to biodiversity when planning any fire mitigation project.</w:t>
+        <w:t xml:space="preserve"> (2009)</w:t>
+      </w:r>
+      <w:r>
+        <w:t xml:space="preserve"> advocates for an aggressive approach to treating fire-suppressed stands using an ecologically based approach that reduces the total number of trees/acre while maintaining stand heterogeneity.</w:t>
       </w:r>
     </w:p>
     <w:p>
@@ -127,20 +168,15 @@
         <w:pStyle w:val="Heading3"/>
       </w:pPr>
       <w:r>
-        <w:t xml:space="preserve">Feedstock aggregation</w:t>
-      </w:r>
-    </w:p>
-    <w:p>
-      <w:r>
-        <w:t xml:space="preserve">Regardless of approach, thinned forests will create a lot of biomass and much of that biomass from forest health projects is ending up in burn piles or log decks without further utilization. Not only does this negate fire mitigation efforts, since burn piles and decks will promulgate or worsen fires, but the carbon from wood is at risk of not being sequestered.</w:t>
-      </w:r>
-    </w:p>
-    <w:p>
-      <w:r>
-        <w:t xml:space="preserve">Processing biomass from thinning is challenging. </w:t>
-      </w:r>
-      <w:r>
-        <w:t xml:space="preserve">Becker </w:t>
+        <w:t xml:space="preserve">Concerns</w:t>
+      </w:r>
+    </w:p>
+    <w:p>
+      <w:r>
+        <w:t xml:space="preserve">A significant cause for concern regarding the protection of old-growth forests in the United States is their decline from historical levels due to logging and development. </w:t>
+      </w:r>
+      <w:r>
+        <w:t xml:space="preserve">DellaSala </w:t>
       </w:r>
       <w:r>
         <w:rPr>
@@ -150,50 +186,279 @@
         <w:t xml:space="preserve">et al.</w:t>
       </w:r>
       <w:r>
+        <w:t xml:space="preserve"> (2022)</w:t>
+      </w:r>
+      <w:r>
+        <w:t xml:space="preserve"> highlight the fact that a large proportion of the remaining mature and old-growth forests on federal lands are still vulnerable to logging. The loss of these forests would not only diminish biodiversity but also release substantial amounts of stored carbon into the atmosphere.</w:t>
+      </w:r>
+    </w:p>
+    <w:p>
+      <w:r>
+        <w:t xml:space="preserve">Further compounding these concerns is the lack of a coordinated and effective national policy for old-growth conservation. </w:t>
+      </w:r>
+      <w:r>
+        <w:t xml:space="preserve">Carroll </w:t>
+      </w:r>
+      <w:r>
+        <w:rPr>
+          <w:i/>
+          <w:iCs/>
+        </w:rPr>
+        <w:t xml:space="preserve">et al.</w:t>
+      </w:r>
+      <w:r>
+        <w:t xml:space="preserve"> (2025)</w:t>
+      </w:r>
+      <w:r>
+        <w:t xml:space="preserve"> point to a history of policy debates, such as the National Old-Growth Amendment, which has failed to provide lasting protection. The authors advocate for a more comprehensive approach that extends beyond simple harvest restrictions to encompass landscape-level planning, the establishment of reserves, the protection of climate refugia, and the setting of specific goals for the recovery of species that depend on these unique habitats.</w:t>
+      </w:r>
+    </w:p>
+    <w:p>
+      <w:r>
+        <w:t xml:space="preserve">But let’s be very clear: thinning dense stands of fire-prone forests is completely different from logging old growth, and ecological-based thinning is not an excuse to log when maintaining stand heterogeneity and reducing fire risk are the treatment goals. Yet, misinformation about wildfire and forest treatments, similar to climate misinformation, persists (</w:t>
+      </w:r>
+      <w:r>
+        <w:t xml:space="preserve">Jones </w:t>
+      </w:r>
+      <w:r>
+        <w:rPr>
+          <w:i/>
+          <w:iCs/>
+        </w:rPr>
+        <w:t xml:space="preserve">et al.</w:t>
+      </w:r>
+      <w:r>
+        <w:t xml:space="preserve"> (2022)</w:t>
+      </w:r>
+      <w:r>
+        <w:t xml:space="preserve">).</w:t>
+      </w:r>
+    </w:p>
+    <w:p>
+      <w:r>
+        <w:t xml:space="preserve">Managers implementing forest health treatments should adopt a tailored approach to increase forest resilience, mitigate fire risk, and bring stands within a natural range of variation.</w:t>
+      </w:r>
+      <w:r>
+        <w:rPr>
+          <w:rStyle w:val="FootnoteReference"/>
+        </w:rPr>
+        <w:footnoteReference w:id="1"/>
+      </w:r>
+      <w:r>
+        <w:t xml:space="preserve"> Treating mixed conifer stands on the western slope of the Sierra Nevada requires different treatments than mesic forests in the Pacific Northwest. Managers should take steps to reduce fire risk while still considering the negative impacts on biodiversity when planning any fire mitigation project.</w:t>
+      </w:r>
+    </w:p>
+    <w:p>
+      <w:pPr>
+        <w:pStyle w:val="Heading3"/>
+      </w:pPr>
+      <w:r>
+        <w:t xml:space="preserve">Feedstock Aggregation</w:t>
+      </w:r>
+    </w:p>
+    <w:p>
+      <w:r>
+        <w:t xml:space="preserve">Thinned forests create a lot of biomass, and much of that biomass from forest health projects end up in burn piles or log decks and may stay in these locations indefinitely. Not only does this negate fire mitigation efforts, as burn piles and decks can promote or worsen fires, but the carbon from wood is also at risk of not being sequestered.</w:t>
+      </w:r>
+    </w:p>
+    <w:p>
+      <w:r>
+        <w:t xml:space="preserve">Processing biomass from thinning is challenging; </w:t>
+      </w:r>
+      <w:r>
+        <w:t xml:space="preserve">Swezy </w:t>
+      </w:r>
+      <w:r>
+        <w:rPr>
+          <w:i/>
+          <w:iCs/>
+        </w:rPr>
+        <w:t xml:space="preserve">et al.</w:t>
+      </w:r>
+      <w:r>
+        <w:t xml:space="preserve"> (2021)</w:t>
+      </w:r>
+      <w:r>
+        <w:t xml:space="preserve"> found that the cost of forest restoration far exceeds current market prices for biomass. </w:t>
+      </w:r>
+      <w:r>
+        <w:t xml:space="preserve">Becker </w:t>
+      </w:r>
+      <w:r>
+        <w:rPr>
+          <w:i/>
+          <w:iCs/>
+        </w:rPr>
+        <w:t xml:space="preserve">et al.</w:t>
+      </w:r>
+      <w:r>
         <w:t xml:space="preserve"> (2011)</w:t>
       </w:r>
       <w:r>
-        <w:t xml:space="preserve"> point out that supply guarantees, industry presence, transportation, and the value of the biomass are limiting to biomass utilization, whereas agency staffing, budgets, compliance, and partnership aggravated use rather than impeding progress. SIG recently completed a burn pile inventory across California showing massive tonnages of piles scattered through national forests and other lands. Yet burning those piles is likely more expensive that transporting them to a facility for processing (</w:t>
+        <w:t xml:space="preserve"> point out that supply guarantees, industry presence, transportation, and the value of the biomass are limiting to biomass utilization, whereas agency staffing, budgets, compliance, and partnership aggravated use rather than impeding progress. SIG recently completed a burn pile inventory across California, showing massive tonnages of piles scattered through national forests and other lands. Yet burning those piles is likely more expensive than transporting them to a facility for processing (</w:t>
       </w:r>
       <w:r>
         <w:t xml:space="preserve">Barker et al 2024</w:t>
       </w:r>
       <w:r>
-        <w:t xml:space="preserve">).</w:t>
-      </w:r>
-    </w:p>
-    <w:p>
-      <w:r>
-        <w:t xml:space="preserve">Transportation subsidies to move this feedstock to central locations or nearby facilities could be a key missing component of the wildfire problem across the west.</w:t>
-      </w:r>
-    </w:p>
-    <w:p>
-      <w:pPr>
-        <w:pStyle w:val="Heading3"/>
-      </w:pPr>
-      <w:r>
-        <w:t xml:space="preserve">JPA</w:t>
-      </w:r>
-    </w:p>
-    <w:p>
-      <w:r>
-        <w:t xml:space="preserve">Developing and creating the JPA is part of the Land Use and Climate Innovation (formerly OPR) funded California Forest Residual Aggregation for Market Enhancement (CAL FRAME) pilot in the state’s northeast corner.</w:t>
-      </w:r>
-    </w:p>
-    <w:p>
-      <w:r>
-        <w:t xml:space="preserve">JPA finance strategy is adapted from the effort to secure sustainable funding for the proposed Northeast California biomass supply management joint powers authority (JPA) created to improve forest product supply chain bottlenecks. Developing and creating the JPA is part of the Office of Planning and Research (OPR) funded California Forest Residual Aggregation for Market Enhancement (CALFRAME) pilot. See the Introduction for more information on CAL FRAME and Chapter 2 for a summary of the CLERE Inc. </w:t>
-      </w:r>
-      <w:hyperlink w:history="1" r:id="rIdf27b4lgmewclexnztjknd">
+        <w:t xml:space="preserve">). Transportation subsidies to move this feedstock to central locations or nearby facilities could be a crucial missing component in addressing the wildfire problem across the western United States.</w:t>
+      </w:r>
+    </w:p>
+    <w:p>
+      <w:r>
+        <w:t xml:space="preserve">Transporting the feedstock to a central location, accessible and central to processors, biomass facilities, and wood product businesses, would help move the biomass out of the woods, mitigating fire risk while also facilitating the centralization of long-term feedstock contracts with landowners and managing agencies. For instance, </w:t>
+      </w:r>
+      <w:hyperlink w:history="1" r:id="rIdlbuwtkqmumy2wy5xbulbw">
         <w:r>
           <w:rPr>
             <w:rStyle w:val="Hyperlink"/>
           </w:rPr>
-          <w:t xml:space="preserve">JPA Report</w:t>
+          <w:t xml:space="preserve">Regenerative Forest Solutions</w:t>
         </w:r>
       </w:hyperlink>
       <w:r>
-        <w:t xml:space="preserve"> report to the Fall River Resource Conservation District.</w:t>
+        <w:t xml:space="preserve"> identified approximately half (242,365 acres) of Sonoma County’s forested acres as feasible for treatments (</w:t>
+      </w:r>
+      <w:r>
+        <w:t xml:space="preserve">Figure </w:t>
+      </w:r>
+      <w:r>
+        <w:t xml:space="preserve">1</w:t>
+      </w:r>
+      <w:r>
+        <w:t xml:space="preserve">). Berry Sawmill was identified as an ideal location for a wood products campus and aggregation yard </w:t>
+      </w:r>
+      <w:r>
+        <w:t xml:space="preserve">(</w:t>
+      </w:r>
+      <w:r>
+        <w:t xml:space="preserve">Costa, 2025</w:t>
+      </w:r>
+      <w:r>
+        <w:t xml:space="preserve">)</w:t>
+      </w:r>
+      <w:r>
+        <w:t xml:space="preserve">. Creating similar management entities across the West could make it easier for investors to conduct due diligence. Joint Powers Authorities may be an organizational template that can meet these needs.</w:t>
+      </w:r>
+    </w:p>
+    <w:p>
+      <w:pPr>
+        <w:jc w:val="center"/>
+      </w:pPr>
+      <w:r>
+        <w:drawing>
+          <wp:inline distT="0" distB="0" distL="0" distR="0">
+            <wp:extent cx="4000500" cy="3091295"/>
+            <wp:effectExtent b="0" l="0" r="0" t="0"/>
+            <wp:docPr id="1" name="" descr="" title=""/>
+            <wp:cNvGraphicFramePr>
+              <a:graphicFrameLocks xmlns:a="http://schemas.openxmlformats.org/drawingml/2006/main" noChangeAspect="1"/>
+            </wp:cNvGraphicFramePr>
+            <a:graphic xmlns:a="http://schemas.openxmlformats.org/drawingml/2006/main">
+              <a:graphicData uri="http://schemas.openxmlformats.org/drawingml/2006/picture">
+                <pic:pic xmlns:pic="http://schemas.openxmlformats.org/drawingml/2006/picture">
+                  <pic:nvPicPr>
+                    <pic:cNvPr id="0" name="" descr=""/>
+                    <pic:cNvPicPr>
+                      <a:picLocks noChangeAspect="1" noChangeArrowheads="1"/>
+                    </pic:cNvPicPr>
+                  </pic:nvPicPr>
+                  <pic:blipFill>
+                    <a:blip r:embed="rId7" cstate="none"/>
+                    <a:srcRect/>
+                    <a:stretch>
+                      <a:fillRect/>
+                    </a:stretch>
+                  </pic:blipFill>
+                  <pic:spPr bwMode="auto">
+                    <a:xfrm>
+                      <a:off x="0" y="0"/>
+                      <a:ext cx="4000500" cy="3091295"/>
+                    </a:xfrm>
+                    <a:prstGeom prst="rect">
+                      <a:avLst/>
+                    </a:prstGeom>
+                  </pic:spPr>
+                </pic:pic>
+              </a:graphicData>
+            </a:graphic>
+          </wp:inline>
+        </w:drawing>
+      </w:r>
+    </w:p>
+    <w:p>
+      <w:pPr>
+        <w:pStyle w:val="Caption"/>
+      </w:pPr>
+      <w:r>
+        <w:rPr>
+          <w:b/>
+          <w:bCs/>
+        </w:rPr>
+        <w:t xml:space="preserve">Figure </w:t>
+      </w:r>
+      <w:r>
+        <w:rPr>
+          <w:b/>
+          <w:bCs/>
+        </w:rPr>
+        <w:t xml:space="preserve">1</w:t>
+      </w:r>
+      <w:r>
+        <w:rPr>
+          <w:b/>
+          <w:bCs/>
+        </w:rPr>
+        <w:t xml:space="preserve">:</w:t>
+      </w:r>
+      <w:r>
+        <w:t xml:space="preserve"> </w:t>
+      </w:r>
+      <w:r>
+        <w:t xml:space="preserve">Feasible treatment areas of Sonoma County and the location of Berry Sawmill as a feedstock aggregation site (adapted from </w:t>
+      </w:r>
+      <w:r>
+        <w:t xml:space="preserve">Tukman &amp; Griffith (2022)</w:t>
+      </w:r>
+      <w:r>
+        <w:t xml:space="preserve">).  Feasible treatment areas exclude waterways, slopes above 45%, and material that is not within sufficient proximity to roadways.</w:t>
+      </w:r>
+    </w:p>
+    <w:p>
+      <w:pPr>
+        <w:pStyle w:val="Heading3"/>
+      </w:pPr>
+      <w:r>
+        <w:t xml:space="preserve">Joint Powers Authority</w:t>
+      </w:r>
+    </w:p>
+    <w:p>
+      <w:r>
+        <w:t xml:space="preserve">Creating Joint Powers Authorities (JPA) in some regions may be a solution to aggregate feedstock over large areas and provide it to process plants, mills, and other utilization entities. JPAs could act as brokers to facilitate long-term contracts between suppliers and processors, thereby driving investment in processing facilities. Most lenders and investors view wood product businesses as too risky without a minimum term contract of 10 years, preferably longer </w:t>
+      </w:r>
+      <w:r>
+        <w:t xml:space="preserve">(</w:t>
+      </w:r>
+      <w:r>
+        <w:t xml:space="preserve">Darlington &amp; Stevenson, 2023</w:t>
+      </w:r>
+      <w:r>
+        <w:t xml:space="preserve">)</w:t>
+      </w:r>
+      <w:r>
+        <w:t xml:space="preserve">. As an example, the USDA Forest Service, which manages 60% of California’s forests, only allows a maximum of five years for a feedstock supply contract </w:t>
+      </w:r>
+      <w:r>
+        <w:t xml:space="preserve">(</w:t>
+      </w:r>
+      <w:r>
+        <w:t xml:space="preserve">CSG, 2020</w:t>
+      </w:r>
+      <w:r>
+        <w:t xml:space="preserve">)</w:t>
+      </w:r>
+      <w:r>
+        <w:t xml:space="preserve">.</w:t>
       </w:r>
     </w:p>
     <w:p/>
@@ -222,35 +487,74 @@
         <w:ind w:left="288" w:right="288"/>
       </w:pPr>
       <w:r>
-        <w:t xml:space="preserve">Paraphrased from the Governments Working Together manual: Joint powers are exercised when the public officials of greater than two agencies agree to create another legal entity or establish a joint approach to work on a common problem, fund a project, or act as a representative body for a specific activity. Examples of areas where JPAs are used commonly include groundwater management, road construction, and habitat conservation.</w:t>
-      </w:r>
-    </w:p>
-    <w:p>
-      <w:pPr>
-        <w:pBdr>
-          <w:left w:val="double" w:color="5D85D0"/>
-        </w:pBdr>
-        <w:ind w:left="288" w:right="288"/>
-      </w:pPr>
-      <w:r>
-        <w:t xml:space="preserve">A joint powers authority (JPA) is a separate government organization created by the member agencies, but is legally independent from them. A joint powers authority shares powers common to the member agencies, and those powers are outlined in the joint powers agreement (</w:t>
-      </w:r>
-      <w:hyperlink w:history="1" r:id="rIdm_grlofllhwcx4pyyqfna">
+        <w:t xml:space="preserve">Joint Powers Authorities are legally created entities that allow two or more public agencies to jointly exercise common powers </w:t>
+      </w:r>
+      <w:r>
+        <w:t xml:space="preserve">(</w:t>
+      </w:r>
+      <w:r>
+        <w:t xml:space="preserve">Sousa Mills, 2016</w:t>
+      </w:r>
+      <w:r>
+        <w:t xml:space="preserve">)</w:t>
+      </w:r>
+      <w:r>
+        <w:t xml:space="preserve">. A joint powers authority shares powers common to the member agencies, and those powers are outlined in the joint powers agreement. Joint powers are exercised when the public officials of greater than two agencies agree to create another legal entity or establish a joint approach to work on a common problem, fund a project, or act as a representative body for a specific activity. Examples of areas where JPAs are used commonly include groundwater management, road construction, and habitat conservation </w:t>
+      </w:r>
+      <w:r>
+        <w:t xml:space="preserve">(</w:t>
+      </w:r>
+      <w:r>
+        <w:t xml:space="preserve">Cypher &amp; Grinnell, 2007</w:t>
+      </w:r>
+      <w:r>
+        <w:t xml:space="preserve">)</w:t>
+      </w:r>
+      <w:r>
+        <w:t xml:space="preserve">.</w:t>
+      </w:r>
+    </w:p>
+    <w:p/>
+    <w:p>
+      <w:r>
+        <w:t xml:space="preserve">An example of a JPA being developed for feedstock aggregation is located in the northeastern corner of the state. The development of this specific JPA is a key component of the California Forest Residual Aggregation for Market Enhancement (CALFRAME) pilot, funded by the Office of Land Use and Climate Innovation. The finance strategy for a JPA is adapted from this broader effort, with more detail available from </w:t>
+      </w:r>
+      <w:r>
+        <w:t xml:space="preserve">Darlington &amp; Stevenson (2023)</w:t>
+      </w:r>
+      <w:r>
+        <w:t xml:space="preserve">.</w:t>
+      </w:r>
+    </w:p>
+    <w:p>
+      <w:r>
+        <w:rPr>
+          <w:b/>
+          <w:bCs/>
+        </w:rPr>
+        <w:t xml:space="preserve">Biomass insurance from Ecostrat?</w:t>
+      </w:r>
+      <w:r>
+        <w:t xml:space="preserve"> How does this generate revenue for a JPA? </w:t>
+      </w:r>
+      <w:hyperlink w:history="1" r:id="rId6c1sub9ce9oux6hcsp0qx">
         <w:r>
           <w:rPr>
             <w:rStyle w:val="Hyperlink"/>
           </w:rPr>
-          <w:t xml:space="preserve">Governments Working together, 2021</w:t>
+          <w:t xml:space="preserve">https://​ecostrat​.com​/feedstock​-supply​-insurance</w:t>
         </w:r>
       </w:hyperlink>
-      <w:r>
-        <w:t xml:space="preserve">).</w:t>
-      </w:r>
-    </w:p>
-    <w:p/>
-    <w:p>
-      <w:r>
-        <w:t xml:space="preserve">Partners developing the JPA are clear in the role of the organization acting as a critical wood utilization entity, but that it would not compete for funds with other organizations, especially RCDs or markets with private entities such as sawmills and licensed timber operators (LTOs). The approach outlined in this chapter takes a realistic, feasible revenue assessment appropriate for the region. It provides a hypothetical operating budget for running the JPA during the startup’s first five years. Creating a stably funded JPA will be challenging with widely fluctuating changes in private and public funds.</w:t>
+    </w:p>
+    <w:p>
+      <w:r>
+        <w:t xml:space="preserve">In establishing the JPA, partners have been clear about its role: to act as a critical entity for wood utilization without competing for funds with other organizations, such as Resource Conservation Districts (RCDs), sawmills, or licensed timber operators (LTOs). This approach requires a realistic revenue assessment and a plan for the initial five years of operation, acknowledging that creating a stably funded JPA will be challenging given the wide fluctuations in private and public funding. But how can such an entity be funded in rural counties with low tax bases that cannot support a sales tax to develop sustainable revenue for a new entity?</w:t>
+      </w:r>
+      <w:r>
+        <w:rPr>
+          <w:rStyle w:val="FootnoteReference"/>
+        </w:rPr>
+        <w:footnoteReference w:id="2"/>
       </w:r>
     </w:p>
     <w:p>
@@ -263,7 +567,7 @@
     </w:p>
     <w:p>
       <w:r>
-        <w:t xml:space="preserve">The abundance of state and federal funding of the past five years has meant many agencies and organizations depend on grant funding for implementing restoration and infrastructure projects. Trump administration cuts in 2025 clearly demonstrate the vulnerability of relying too heavily on grant funding. Many nonprofits are familiar with the cyclic nature of many funding sources.</w:t>
+        <w:t xml:space="preserve">The abundance of state and federal funding over the past five years has meant many agencies and organizations depend on grant funding for implementing restoration and infrastructure projects. Trump administration cuts in 2025 demonstrate the vulnerability of relying too heavily on grant funding. Many nonprofits are familiar with the cyclic nature of many funding sources.</w:t>
       </w:r>
     </w:p>
     <w:p>
@@ -276,7 +580,7 @@
     </w:p>
     <w:p>
       <w:r>
-        <w:t xml:space="preserve">The Northeast California CAL FRAME project recognized the need for grant funding to start the JPA, and realized the need for additional funding sources that can sustainably fund the JPA over time. These are described below and summarized in (</w:t>
+        <w:t xml:space="preserve">The Northeast California CAL FRAME project recognized the need for grant funding to initiate a JPA and acknowledged the need for additional funding sources that can sustainably support a JPA over time. These are described below and summarized in (</w:t>
       </w:r>
       <w:r>
         <w:t xml:space="preserve">Table </w:t>
@@ -293,7 +597,7 @@
         <w:pStyle w:val="ListParagraph"/>
         <w:numPr>
           <w:ilvl w:val="0"/>
-          <w:numId w:val="7"/>
+          <w:numId w:val="10"/>
         </w:numPr>
       </w:pPr>
       <w:r>
@@ -304,7 +608,7 @@
         <w:t xml:space="preserve">Endowment</w:t>
       </w:r>
       <w:r>
-        <w:t xml:space="preserve">. Create an endowment from the OPR funding tranche (plus other contributions) and invest it conservatively. Interest/gains from the principal would partially fund the JPA. We have assumed the seed funding for the JPA is $2 mn from OPR with an additional $500,000 from foundation, corporate, and individual contributions.</w:t>
+        <w:t xml:space="preserve">. Create an endowment from the OPR funding tranche (plus other contributions) and invest it conservatively. Interest or gains from the principal would partially fund a JPA.</w:t>
       </w:r>
     </w:p>
     <w:p>
@@ -312,7 +616,7 @@
         <w:pStyle w:val="ListParagraph"/>
         <w:numPr>
           <w:ilvl w:val="0"/>
-          <w:numId w:val="7"/>
+          <w:numId w:val="10"/>
         </w:numPr>
       </w:pPr>
       <w:r>
@@ -323,7 +627,7 @@
         <w:t xml:space="preserve">Contributions</w:t>
       </w:r>
       <w:r>
-        <w:t xml:space="preserve">. Although the McConnell Foundation is an eventual, not immediate donor, casting a wider net at the state or Western Region level for foundations, corporations, and individuals that could give to the JPA is warranted. We suggest that rather than considering the contributions as grants to support the JPA, the Pilot Project Team should consider creating a campaign with a specific fundraising amount to start. This approach will make it easier to approach each donor with a specific amount to ask, make donors part of the overall campaign, and make smaller contributions from individuals meaningful and possible. We also recommend that initial contributions go to endowment creation.</w:t>
+        <w:t xml:space="preserve">. Although the McConnell Foundation is an eventual, not immediate donor, casting a wider net at the state or Western Region level for foundations, corporations, and individuals that could give to a JPA is warranted. We suggest that rather than considering the contributions as grants to support a JPA, the Pilot Project Team should consider creating a campaign with a specific fundraising amount to start. This approach will make it easier to approach each donor with a specific amount to ask, involve donors in the overall campaign, and make smaller contributions from individuals more meaningful and achievable. We also recommend that initial contributions go to endowment creation.</w:t>
       </w:r>
     </w:p>
     <w:p>
@@ -331,7 +635,7 @@
         <w:pStyle w:val="ListParagraph"/>
         <w:numPr>
           <w:ilvl w:val="0"/>
-          <w:numId w:val="7"/>
+          <w:numId w:val="10"/>
         </w:numPr>
       </w:pPr>
       <w:r>
@@ -342,7 +646,7 @@
         <w:t xml:space="preserve">Federal and State Grants</w:t>
       </w:r>
       <w:r>
-        <w:t xml:space="preserve">. It is unlikely that the JPA will get operational funding from state and fed grants, but any proposals that it leads or participates in could charge overhead (~10%) plus directly bill salaries to cover some operating costs. Negotiating a higher indirect, or NICRA, to increase this value by a grant could be another long-term strategy to increase operating cost revenues.</w:t>
+        <w:t xml:space="preserve">. It is unlikely that a JPA will receive operational funding from state and federal grants, but any proposals it leads or participates in could charge overhead (~10%) plus directly bill salaries to cover some operating costs. Negotiating a higher indirect, or NICRA, rate to increase this value through a grant could be another long-term strategy to boost operating cost revenues.</w:t>
       </w:r>
     </w:p>
     <w:p>
@@ -350,7 +654,7 @@
         <w:pStyle w:val="ListParagraph"/>
         <w:numPr>
           <w:ilvl w:val="0"/>
-          <w:numId w:val="7"/>
+          <w:numId w:val="10"/>
         </w:numPr>
       </w:pPr>
       <w:r>
@@ -361,7 +665,7 @@
         <w:t xml:space="preserve">Member Contributions</w:t>
       </w:r>
       <w:r>
-        <w:t xml:space="preserve">. RCD and other feedstock aggregation members pay $5k/yr to participate in the program. This would be unrestricted funding for the JPA.</w:t>
+        <w:t xml:space="preserve">. RCD and other feedstock aggregation members pay $5k/yr to participate in the program. This would be unrestricted funding for a JPA.</w:t>
       </w:r>
     </w:p>
     <w:p>
@@ -369,7 +673,7 @@
         <w:pStyle w:val="ListParagraph"/>
         <w:numPr>
           <w:ilvl w:val="0"/>
-          <w:numId w:val="7"/>
+          <w:numId w:val="10"/>
         </w:numPr>
       </w:pPr>
       <w:r>
@@ -380,7 +684,7 @@
         <w:t xml:space="preserve">Fee for Service</w:t>
       </w:r>
       <w:r>
-        <w:t xml:space="preserve">. Western Shasta RCD, for example, works with nonindustrial forest owners and provides services for forest management plans with small forested LOs (The State funds the development of FMPs, but landowners cannot secure funds to implement the plans). JPA could create a similar service offering. However, it must ensure it does not compete with the region’s RCDs.</w:t>
+        <w:t xml:space="preserve">. Western Shasta RCD, for example, works with nonindustrial forest owners and provides services for forest management plans with small forested LOs (The State funds the development of FMPs, but landowners cannot secure funds to implement the plans). JPA could offer a similar service. However, it must ensure it does not compete with the region’s RCDs.</w:t>
       </w:r>
     </w:p>
     <w:p>
@@ -388,7 +692,7 @@
         <w:pStyle w:val="ListParagraph"/>
         <w:numPr>
           <w:ilvl w:val="0"/>
-          <w:numId w:val="7"/>
+          <w:numId w:val="10"/>
         </w:numPr>
       </w:pPr>
       <w:r>
@@ -399,7 +703,7 @@
         <w:t xml:space="preserve">Sort yards</w:t>
       </w:r>
       <w:r>
-        <w:t xml:space="preserve">. Managing a sort yard for aggregated feedstock would be a strategic revenue source in line with the JPA mission. This would require substantial investment in equipment and a site to start. See the budget for a cost breakdown. A feasibility study would be helpful to understand total costs, potential revenue, and risk reduction associated with the yard.</w:t>
+        <w:t xml:space="preserve">. Managing a sort yard for aggregated feedstock would be a strategic revenue source. This would require a substantial investment in equipment and a suitable site. See the budget for a cost breakdown. A feasibility study would help understand the total costs, potential revenue, and risk reduction associated with the yard.</w:t>
       </w:r>
     </w:p>
     <w:p>
@@ -431,7 +735,7 @@
         <w:t xml:space="preserve"> </w:t>
       </w:r>
       <w:r>
-        <w:t xml:space="preserve">Analysis of funding types appropriate to aggregation JPAs. Timing roughly refers to the amount of time required to generate income. Difficulty is a qualitative scale from 1 = easiest to secure to 5 = most difficult.</w:t>
+        <w:t xml:space="preserve">Analysis of funding types appropriate to aggregation JPAs. Timing roughly refers to the amount of time required to generate income. Difficulty is a qualitative scale ranging from 1 (easiest to secure) to 5 (most difficult).</w:t>
       </w:r>
     </w:p>
     <w:tbl>
@@ -634,7 +938,7 @@
         <w:tc>
           <w:p>
             <w:r>
-              <w:t xml:space="preserve">Dependent on relationships to program officers, board members</w:t>
+              <w:t xml:space="preserve">Dependent on relationships with program officers, board members</w:t>
             </w:r>
           </w:p>
         </w:tc>
@@ -757,11 +1061,11 @@
         <w:pStyle w:val="ListParagraph"/>
         <w:numPr>
           <w:ilvl w:val="0"/>
-          <w:numId w:val="8"/>
+          <w:numId w:val="11"/>
         </w:numPr>
       </w:pPr>
       <w:r>
-        <w:t xml:space="preserve">New finance options, such as environmental impact bonds, could be introduced over a longer time period and trialed at a small scale, then scale up when successful. These could also be other finance mechanisms, such as revolving loan funds (with low-interest loans), public-private partnerships, or bonds.</w:t>
+        <w:t xml:space="preserve">New finance options, such as environmental impact bonds, could be introduced over a longer period and trialed at a small scale, then scale up when successful. These could also include other financial mechanisms, such as revolving loan funds (offering low-interest loans), public-private partnerships, or bonds.</w:t>
       </w:r>
     </w:p>
     <w:p>
@@ -769,7 +1073,7 @@
         <w:pStyle w:val="ListParagraph"/>
         <w:numPr>
           <w:ilvl w:val="0"/>
-          <w:numId w:val="8"/>
+          <w:numId w:val="11"/>
         </w:numPr>
       </w:pPr>
       <w:r>
@@ -778,27 +1082,6 @@
     </w:p>
     <w:p>
       <w:pPr>
-        <w:pStyle w:val="ListParagraph"/>
-        <w:numPr>
-          <w:ilvl w:val="0"/>
-          <w:numId w:val="8"/>
-        </w:numPr>
-      </w:pPr>
-      <w:r>
-        <w:t xml:space="preserve">The GANTT chart timeline includes testing, adopting, and implementing temporal finance mechanisms (</w:t>
-      </w:r>
-      <w:r>
-        <w:t xml:space="preserve">Table </w:t>
-      </w:r>
-      <w:r>
-        <w:t xml:space="preserve">3</w:t>
-      </w:r>
-      <w:r>
-        <w:t xml:space="preserve">).</w:t>
-      </w:r>
-    </w:p>
-    <w:p>
-      <w:pPr>
         <w:pStyle w:val="Heading3"/>
       </w:pPr>
       <w:r>
@@ -806,7 +1089,7 @@
       </w:r>
     </w:p>
     <w:p>
-      <w:hyperlink w:history="1" r:id="rIdvl0u-zrgsminxh_m7mcxu">
+      <w:hyperlink w:history="1" r:id="rIdrfy7gyd_rs5fa8_9mwvpm">
         <w:r>
           <w:rPr>
             <w:rStyle w:val="Hyperlink"/>
@@ -815,24 +1098,22 @@
         </w:r>
       </w:hyperlink>
       <w:r>
-        <w:t xml:space="preserve"> is a conservation finance strategy that involves cooperative interaction between individual project developers, stakeholders, and finance providers. This process may or may not include traditional financial institutions (</w:t>
-      </w:r>
-      <w:hyperlink w:history="1" r:id="rId-0ijwywhovn5tmidnzsni">
-        <w:r>
-          <w:rPr>
-            <w:rStyle w:val="Hyperlink"/>
-          </w:rPr>
-          <w:t xml:space="preserve">collaborativefinance​.org</w:t>
-        </w:r>
-      </w:hyperlink>
-      <w:r>
-        <w:t xml:space="preserve">). The term can be broadened to include finance developed by fair and equitable participation of stakeholders in a region, landscape, or watershed to address natural resource and infrastructure management needs, utilizing multiple forms of funding from public grants to private investment. Finance approaches may include outcomes-based finance models such as environmental impact bonds.</w:t>
+        <w:t xml:space="preserve"> is a conservation finance strategy that involves cooperative interaction between individual project developers, stakeholders, and finance providers. This process may or may not include traditional financial institutions.</w:t>
       </w:r>
       <w:r>
         <w:rPr>
           <w:rStyle w:val="FootnoteReference"/>
         </w:rPr>
-        <w:footnoteReference w:id="1"/>
+        <w:footnoteReference w:id="3"/>
+      </w:r>
+      <w:r>
+        <w:t xml:space="preserve"> The term can be broadened to include finance developed through the fair and equitable participation of stakeholders in a region, landscape, or watershed, addressing natural resource and infrastructure management needs, and utilizing multiple forms of funding, from public grants to private investment. Finance approaches may include outcomes-based finance models such as environmental impact bonds.</w:t>
+      </w:r>
+      <w:r>
+        <w:rPr>
+          <w:rStyle w:val="FootnoteReference"/>
+        </w:rPr>
+        <w:footnoteReference w:id="4"/>
       </w:r>
     </w:p>
     <w:p/>
@@ -869,7 +1150,7 @@
       </w:r>
       <w:r>
         <w:t xml:space="preserve">
-Conservation finance options include environmental impact bonds like Blue Forest’s Forest Resilience Bond, which leverages private investment from impact investors to support forest health projects, with repayment to investors over time supported by beneficiaries based on the savings and benefits from reduced wildfire risks and improved ecosystem services. A JPA could utilize environmental impact bonds on a trial basis at a small scale, then expand over an extended period. Identifying potential payor entities interested in paying for the avoided costs of wildfire with pro-active measures, such as thinning and prescribed fire, is worth pursuing immediately or as soon as the JPA hires an executive director.</w:t>
+Conservation finance options include environmental impact bonds, such as Blue Forest’s Forest Resilience Bond, which leverages private investment from impact investors to support forest health projects. Repayment to investors is supported over time by beneficiaries based on the savings and benefits from reduced wildfire risks and improved ecosystem services. A JPA could utilize environmental impact bonds on a trial basis at a small scale and then expand over an extended period. Identifying potential payor entities interested in covering the avoided costs of wildfire through proactive measures, such as thinning and prescribed fire, is worth pursuing immediately or as soon as an executive director is hired.</w:t>
       </w:r>
     </w:p>
     <w:p>
@@ -880,7 +1161,7 @@
         <w:ind w:left="288" w:right="288"/>
       </w:pPr>
       <w:r>
-        <w:t xml:space="preserve">We do not recommend solely relying on impact bonds since they take a lengthy time to develop and rely on a payor to provide avoided-cost funding. However, a bond could be a valuable complementary funding resource to other secured revenues. Other ‘newer’ finance options could include the following:</w:t>
+        <w:t xml:space="preserve">We do not recommend relying solely on impact bonds, as they take a lengthy time to develop and rely on a payor to provide avoided cost funding. However, a bond could be a valuable complementary funding resource to other secured revenues. Other ‘newer’ finance options could include the following:</w:t>
       </w:r>
     </w:p>
     <w:p>
@@ -899,7 +1180,7 @@
       </w:r>
       <w:r>
         <w:t xml:space="preserve">
-Carbon markets offer an opportunity for the JPA, its members, and Implementing Entities to secure gap or stack funding for on-the-ground forest management activities, such as thinning, pruning, mastication, mechanical treatment, and even prescribed burning. Revenue realized through the carbon market could help the JPA to treat more forest land than otherwise possible and generate additional biomass that could be put under supply contracts to support existing and emerging infrastructure. Market prices for carbon credits vary depending on a given project’s size and location, treatment type, and the carbon market or registry used. Carbon credits can be realized for projects of any size and located on federal, state, and private lands. See the Avoided Wildfire Emissions Protocol section as another approach that is easier to implement than carbon sequestration credits or markets since the avoided costs are already calculated, and proponents do not have to seek an entity to purchase the credits.</w:t>
+Carbon markets provide an opportunity to secure funding for on-the-ground forest management activities, including thinning, pruning, mastication, mechanical treatment, and prescribed burning. Revenue realized through the carbon market could help a JPA to treat more forest land than otherwise possible and generate additional biomass that could be put under supply contracts to support existing and emerging infrastructure. Market prices for carbon credits vary depending on a given project’s size and location, treatment type, and the carbon market or registry used. Carbon credits can be realized for projects of any size and located on federal, state, and private lands. Refer to the Avoided Wildfire Emissions Protocol section for an alternative approach that is easier to implement than carbon sequestration credits or markets, as the avoided costs are already calculated, and proponents do not need to seek an entity to purchase the credits.</w:t>
       </w:r>
     </w:p>
     <w:p>
@@ -910,7 +1191,7 @@
         <w:ind w:left="288" w:right="288"/>
       </w:pPr>
       <w:r>
-        <w:t xml:space="preserve">The National Forest Foundation implemented several voluntary carbon projects in California and the West following wildfires. Funded by corporate donors, the projects created carbon based on growth trajectories of planted trees. The credits were registered with the American Carbon Registry but immediately retired upon creation since trading carbon on public lands is disallowed.</w:t>
+        <w:t xml:space="preserve">The National Forest Foundation implemented several voluntary carbon projects in California and the West following wildfires. Funded by corporate donors, the projects created carbon based on growth trajectories of planted trees. The credits were registered with the American Carbon Registry but were immediately retired upon creation, as trading carbon on public lands is prohibited.</w:t>
       </w:r>
     </w:p>
     <w:p>
@@ -929,7 +1210,7 @@
       </w:r>
       <w:r>
         <w:t xml:space="preserve">
-Spatial Informatics Group and Element Markets developed a forecast methodology under the Climate Forward program to recognize the climate benefits associated with fuel treatment activities that lower the risk of catastrophic forest fires and their emissions. Known as the Avoided Wildfire Emissions Forecast Methodology, the Climate Action Reserve protocol could provide complementary funding for thinning and prescribed fire projects to grants and private investments. The Protocol differs from carbon offsets in that forecasted mitigation units (FMUs) are issued for forecasted greenhouse gas reductions or removals. FMUs are used to mitigate anticipated future emissions, such as wildfires.</w:t>
+The Spatial Informatics Group and Element Markets developed a forecast methodology under the Climate Forward program to recognize the climate benefits associated with fuel treatment activities that reduce the risk of catastrophic forest fires and their associated emissions. Known as the Avoided Wildfire Emissions Forecast Methodology, the Climate Action Reserve protocol could provide complementary funding for thinning and prescribed fire projects to grants and private investments. The Protocol differs from carbon offsets in that forecasted mitigation units (FMUs) are issued for forecasted greenhouse gas reductions or removals. FMUs are used to mitigate anticipated future emissions, such as wildfires.</w:t>
       </w:r>
     </w:p>
     <w:p>
@@ -948,7 +1229,7 @@
       </w:r>
       <w:r>
         <w:t xml:space="preserve">
-Although it may be several years from implementation, developing and marketing low-carbon building materials is another new opportunity. Buildings are a major source of greenhouse gas emissions, so building decarbonization is a California state priority. Embodied carbon is the lifecycle of greenhouse gas emissions from creating, transporting, and disposing of building materials (Carbon Leadership Forum, 2022). In other words, embodied carbon is any building’s carbon footprint contained in its building materials. It differs from operational carbon, the carbon produced by a building’s energy, heat, and lighting. The California Air Resources Board is developing a comprehensive strategy for embodied carbon and is seeking comments following the signing of ABs 2446 and 43 (CARB, 2024). More details on embodied carbon can be found in this slide deck from a recent California Air Resources Board workshop held on September 19, 2024.</w:t>
+Although it may be several years from implementation, developing and marketing low-carbon building materials is another new opportunity. Buildings are a significant source of greenhouse gas emissions, making building decarbonization a California state priority. Embodied carbon is the lifecycle of greenhouse gas emissions from creating, transporting, and disposing of building materials (Carbon Leadership Forum, 2022). In other words, embodied carbon is any building’s carbon footprint contained in its building materials. It differs from operational carbon, the carbon produced by a building’s energy, heat, and lighting. The California Air Resources Board is developing a comprehensive strategy for embodied carbon and is seeking comments following the signing of ABs 2446 and 43.</w:t>
       </w:r>
     </w:p>
     <w:p>
@@ -967,7 +1248,7 @@
       </w:r>
       <w:r>
         <w:t xml:space="preserve">
-Pooled funding sources such as impact bonds or revolving loan funds can help make a greater amount of funds available to more projects across a landscape. Typically offered at lower than market interest rates, revolving loan funds are self-replenishing pools of money utilizing principal and interest payments on existing loans to issue new loans. They have been used effectively on small to large scale to develop businesses, assist healthcare, and improve environmental outcomes. Revolving loan funds also provide much needed up front capital for project startup. They are flexible and can be used with more conventional funds such as grants and loans.</w:t>
+Pooled funding sources such as impact bonds or revolving loan funds can help make a greater amount of funds available to more projects across a landscape. Typically offered at lower-than-market interest rates, revolving loan funds are self-replenishing pools of money that utilize principal and interest payments on existing loans to issue new loans. They have been used effectively on small to large scale to develop businesses, assist healthcare, and improve environmental outcomes. Revolving loan funds also provide much-needed upfront capital for project startups. They are flexible and can be used in conjunction with more conventional funds, such as grants and loans.</w:t>
       </w:r>
     </w:p>
     <w:p>
@@ -989,7 +1270,7 @@
         <w:ind w:left="288" w:right="288"/>
       </w:pPr>
       <w:r>
-        <w:t xml:space="preserve">Blue Forest is operating a revolving loan fund called the California Wildfire Innovation Fund that could expand into broader support of other forest health entities.</w:t>
+        <w:t xml:space="preserve">Blue Forest is operating a revolving loan fund called the California Wildfire Innovation Fund, which could expand into broader support for other forest health entities.</w:t>
       </w:r>
     </w:p>
     <w:p>
@@ -1008,7 +1289,19 @@
       </w:r>
       <w:r>
         <w:t xml:space="preserve">
-Parametric or index-based insurance covers the probability of a predefined event instead of indemnifying actual loss incurred (Swissre, 2018). These so-called trigger events are typically disaster (e.g., wildfire, flooding, hurricane, earthquake) related and measured through triggers such as wind speed, quake magnitude, acres burned/burn severity, or rainfall amount. Insurable triggers are modeled and must happen by chance. When the triggers are reached, a predetermined pay-out is made regardless of the sustained physical losses. Parametric insurance is meant to complement existing indemnity insurance but is increasingly used for post-disaster restoration funding in the natural world.</w:t>
+Parametric or index-based insurance covers the probability of a predefined event instead of indemnifying actual loss incurred </w:t>
+      </w:r>
+      <w:r>
+        <w:t xml:space="preserve">(</w:t>
+      </w:r>
+      <w:r>
+        <w:t xml:space="preserve">Re, 2023</w:t>
+      </w:r>
+      <w:r>
+        <w:t xml:space="preserve">)</w:t>
+      </w:r>
+      <w:r>
+        <w:t xml:space="preserve">. These so-called trigger events are typically disaster-related (e.g., wildfires, flooding, hurricanes, earthquakes) and are measured through triggers such as wind speed, quake magnitude, acres burned or burn severity, or rainfall amount. Insurable triggers are modeled and must happen by chance. When the triggers are reached, a predetermined pay-out is made regardless of the sustained physical losses. Parametric insurance is meant to complement existing indemnity insurance but is increasingly used for post-disaster restoration funding in the natural world.</w:t>
       </w:r>
     </w:p>
     <w:p>
@@ -1019,7 +1312,18 @@
         <w:ind w:left="288" w:right="288"/>
       </w:pPr>
       <w:r>
-        <w:t xml:space="preserve">One of the earliest examples of parametric insurance use for nature recovery is the Mesoamerican Reef parametric insurance that provided $800,000 for reef restoration following Hurricane Delta. The trigger was windspeed with a parameter greater than 100 knots. The funds came from the Coastal Zone Management Trust (Winters, 2020). Using insurance to protect forests and communities, likely through wildfire risk mitigation, could be a novel way to fund the JPA’s activities throughout the region and provide complementary funds that could be particularly valuable post fire.</w:t>
+        <w:t xml:space="preserve">One of the earliest examples of parametric insurance used for nature recovery is the Mesoamerican Reef parametric insurance that provided $800,000 for reef restoration following Hurricane Delta. The trigger was windspeed with a parameter greater than 100 knots. The funds came from the </w:t>
+      </w:r>
+      <w:hyperlink w:history="1" r:id="rIdpfgtjy8cnvef2sm9eg_qc">
+        <w:r>
+          <w:rPr>
+            <w:rStyle w:val="Hyperlink"/>
+          </w:rPr>
+          <w:t xml:space="preserve">Coastal Zone Management Trust</w:t>
+        </w:r>
+      </w:hyperlink>
+      <w:r>
+        <w:t xml:space="preserve">. Using insurance to protect forests and communities, likely through wildfire risk mitigation, could be a novel way to fund activities throughout the region and provide complementary funds that could be particularly valuable post-fire.</w:t>
       </w:r>
     </w:p>
     <w:p>
@@ -1038,7 +1342,7 @@
       </w:r>
       <w:r>
         <w:t xml:space="preserve">
-Technology could help finance the JPA, connect payors to the JPA, and provide digital platforms that connect funders to implementers. Blockchain and digital solutions have mostly been applied to reforestation and carbon sequestration projects. It could be possible to simply set up a digital marketplace, where funders and implementers connect to implement forest health restoration and infrastructure projects. Developing a platform for aggregated funding could be a portion of a funded project or developed in tandem, rather than on its own.</w:t>
+The technology could help to connect funders to a new JPA. Blockchain and digital solutions have mostly been applied to reforestation and carbon sequestration projects. It may be possible to establish a digital marketplace where funders and implementers can connect and collaborate on implementing forest health restoration and infrastructure projects. Developing a platform for aggregated funding could be part of a funded project or developed in tandem rather than as a standalone initiative.</w:t>
       </w:r>
     </w:p>
     <w:p/>
@@ -1615,27 +1919,17 @@
     </w:p>
     <w:p>
       <w:r>
-        <w:t xml:space="preserve">The revenue estimates are based on a startup endowment of $1 million, regular indirect costs to cover operating from grants, and significant fee-for-service to forest landowners and possibly fees charged for use of wood from a sort yard. Ideally, the goal would be a stable revenue source to cover staff salaries and operational costs. It may be that a multi-year campaign is needed to get to a minimum level ($2 million is suggested since that could generate ~$100,000 annually as an endowment). We’ve made a conservative estimate for the start-up endowment, but the number may be higher but not substantially, e.g., $2 mn.</w:t>
-      </w:r>
-    </w:p>
-    <w:p>
-      <w:r>
-        <w:t xml:space="preserve">Contributions include endowment, passive income, gifts, and member contributions. Contributions and gifts may come from local to regional foundations and corporations interested in the forest health world. Individual contributions always have the potential to add up to more than foundation and corporate gifts but take more time to manage. Creating a time-bound campaign with a specific fundraising goal replete with a thermometer to show progress could be a great way to involve communities in the region through giving and creating outreach or communications opportunities at the same time to explain the need for the JPA and the importance of sustainable funding from the community to protect homes, infrastructure, and forests.</w:t>
-      </w:r>
-    </w:p>
-    <w:p>
-      <w:r>
-        <w:t xml:space="preserve">Revenue may also be derived from the feedstock supply insurance product being developed by members of the CALFRAME team and Ecostrat. Approximately half the startup funding could fund this mechanism or a parametric insurance model. These are in process, so more details will be provided once ready.</w:t>
-      </w:r>
-    </w:p>
-    <w:p>
-      <w:r>
-        <w:t xml:space="preserve">Grants in the budget will not compete with the RCDs. RCDs rely on various sources’ grants to carry out their work, cover staff salaries, and keep the lights on at the office. Grant resources are limited, so a new entity such as the JPA cannot compete for those funds in any way.</w:t>
-      </w:r>
-    </w:p>
-    <w:p>
-      <w:r>
-        <w:t xml:space="preserve">On the other hand, the JPA may help administer a large grant across multiple RCDs to leverage more funds across a region. With the devolution of some state funding sources, this could be a great option to manage those funds and reduce the competition for funding resources since the grants solely go to local organizations. The fee-for-service section includes an item for grant administration. It also includes an option for implementing landowner forest plans since this may be a viable revenue source and may help source wood for the JPA. A sort yard that the JPA manages to source, centralize, and sell woody biomass is another revenue option but will require investment to be successful. Expenses for the sort yard are included in the expenses section.</w:t>
+        <w:t xml:space="preserve">Revenue contributions include contributions, grants, and fee-for-service consulting. Contributions and gifts may come from local to regional foundations and corporations interested in forest health. Individual contributions always have the potential to add up to more than foundation and corporate gifts, but they require more time to manage. Creating a time-bound campaign with a specific fundraising goal replete with a thermometer to show progress could be a great way to involve communities in the region through giving and creating outreach or communications opportunities at the same time to explain the need for a JPA and the importance of sustainable funding from the community to protect homes, infrastructure, and forests.</w:t>
+      </w:r>
+    </w:p>
+    <w:p>
+      <w:r>
+        <w:t xml:space="preserve">In the case of pilot projects supported by the Office of Land Use and Climate Innovation, a tranche of endowment-like funding is being provided for startup funding of aggregation entities. In some cases, this amount is as much as $1 million, which, along with a capital campaign to bolster individual giving and create awareness around a JPA, could create a base endowment and provide stable operational revenue to a new organization from the principal if the endowment funds are wisely invested.</w:t>
+      </w:r>
+    </w:p>
+    <w:p>
+      <w:r>
+        <w:t xml:space="preserve">Although not competing for grants with RCDs, a JPA may help administer a large grant across multiple RCDs to leverage more funds across a region. With the devolution of some state funding sources, this could be a great option for managing those funds and reducing competition for funding resources, as the grants are allocated to local organizations. The fee-for-service section includes an item for grant administration. It also includes an option for implementing landowner forest plans, as this may be a viable revenue source and could help source wood. A sort yard managed by the JPA to source, centralize, and sell woody biomass is another revenue option but will require investment to be successful. Expenses for the sort yard are included in the expenses section.</w:t>
       </w:r>
     </w:p>
     <w:p/>
@@ -1653,7 +1947,7 @@
           <w:bCs/>
           <w:color w:val="FFFFFF"/>
         </w:rPr>
-        <w:t xml:space="preserve">JPA RCD competition</w:t>
+        <w:t xml:space="preserve">JPA - RCD competition</w:t>
       </w:r>
     </w:p>
     <w:p>
@@ -1664,13 +1958,13 @@
         <w:ind w:left="288" w:right="288"/>
       </w:pPr>
       <w:r>
-        <w:t xml:space="preserve">It is critical to incorporate into the JPA’s bylaws and revenue-generating practices that grant fundraising does not compete with RCDs. It is possible a JPA may collaborate on a grant with one or more RCDs but should never submit grants for which an RCD qualifies.</w:t>
+        <w:t xml:space="preserve">Evaluating whether to form a new governmental entity or organization is an important consideration for feedstock aggregation. Working with existing organizations, such as Resource Conservation Districts or Fire Safe Councils, would be a good starting point. It is critical to incorporate into the JPA’s bylaws and revenue-generating practices that grant fundraising does not compete with RCDs. It is possible a JPA may collaborate on a grant with one or more RCDs but should never submit grants for which an RCD qualifies.</w:t>
       </w:r>
     </w:p>
     <w:p/>
     <w:p>
       <w:r>
-        <w:t xml:space="preserve">Contingency funding should be written into the budget expenses. Adding 10-15% contingency line items to any secured grant would supplement that funding, although most grant funding contingencies are to be applied to implementation budget shortfalls. Other contingency funding sources could come from unrestricted funding (contributions/gifts) and a higher indirect rate.</w:t>
+        <w:t xml:space="preserve">Contingency funding should be written into the budget expenses. Adding 10-15% contingency line items to any secured grant would supplement that funding, although most grant funding contingencies are to be applied to implementation budget shortfalls. Other contingency funding sources could include unrestricted funding (such as contributions or gifts) and a higher indirect rate.</w:t>
       </w:r>
     </w:p>
     <w:p>
@@ -1683,7 +1977,7 @@
     </w:p>
     <w:p>
       <w:r>
-        <w:t xml:space="preserve">An annual expense budget of ~$ $400,000 is estimated for the JPA startup. The total expenses/year slowly ramp up each year of the budget with the idea that with additional secured revenue, the JPA would bring on more staff capacity and increase offerings, reach, or fee-for-service activities such as additional sort yards. The bulk of the expenses are for labor/staff, including an executive director, contracted feedstock manager, administrative bookkeeper, and various contracted services. Briefly, the staff responsibilities are the following:</w:t>
+        <w:t xml:space="preserve">An annual expense budget of ~$ $400,000 is estimated for a JPA startup. The total expenses/year slowly ramp up each year of the budget with the idea that with additional secured revenue, a JPA would bring on more staff capacity and increase offerings, reach, or fee-for-service activities such as additional sort yards. The bulk of the expenses is for labor and staff, including an executive director, a contracted feedstock manager, an administrative bookkeeper, and various contracted services. Briefly, the staff responsibilities are the following:</w:t>
       </w:r>
     </w:p>
     <w:p>
@@ -1691,7 +1985,7 @@
         <w:pStyle w:val="ListParagraph"/>
         <w:numPr>
           <w:ilvl w:val="0"/>
-          <w:numId w:val="9"/>
+          <w:numId w:val="12"/>
         </w:numPr>
       </w:pPr>
       <w:r>
@@ -1710,7 +2004,7 @@
         <w:pStyle w:val="ListParagraph"/>
         <w:numPr>
           <w:ilvl w:val="0"/>
-          <w:numId w:val="9"/>
+          <w:numId w:val="12"/>
         </w:numPr>
       </w:pPr>
       <w:r>
@@ -1729,7 +2023,7 @@
         <w:pStyle w:val="ListParagraph"/>
         <w:numPr>
           <w:ilvl w:val="0"/>
-          <w:numId w:val="9"/>
+          <w:numId w:val="12"/>
         </w:numPr>
       </w:pPr>
       <w:r>
@@ -1745,12 +2039,12 @@
     </w:p>
     <w:p>
       <w:r>
-        <w:t xml:space="preserve">Other expenses include operations and maintenance, audit/legal fees, insurance, equipment, software, travel, and bank fees. Expenses include communications, website, outreach and equipment, insurance, and land lease costs for a sort yard.</w:t>
-      </w:r>
-    </w:p>
-    <w:p>
-      <w:pPr>
-        <w:pStyle w:val="Heading2"/>
+        <w:t xml:space="preserve">Other expenses include operations and maintenance, audit and legal fees, insurance, equipment, software, travel, and bank fees. Expenses include communications, website development, outreach, equipment, insurance, and land lease costs for a sort yard.</w:t>
+      </w:r>
+    </w:p>
+    <w:p>
+      <w:pPr>
+        <w:pStyle w:val="Heading3"/>
       </w:pPr>
       <w:r>
         <w:t xml:space="preserve">Timeline</w:t>
@@ -1758,7 +2052,7 @@
     </w:p>
     <w:p>
       <w:r>
-        <w:t xml:space="preserve">An approximate timeline for key activities to fund and operationalize the JPA is shown in </w:t>
+        <w:t xml:space="preserve">An approximate timeline for key activities to fund and operationalize a JPA is shown in </w:t>
       </w:r>
       <w:r>
         <w:t xml:space="preserve">Table </w:t>
@@ -1767,7 +2061,7 @@
         <w:t xml:space="preserve">3</w:t>
       </w:r>
       <w:r>
-        <w:t xml:space="preserve">. Endowment seed funding and a capital campaign will be critical to initiate the endowment. Staffing is described under expenses and shows the approximate start time for each staff member. The development of the JPA bylaws will define governance, and the JPA will created when the LAFCO filing is completed.</w:t>
+        <w:t xml:space="preserve">. Endowment seed funding and a capital campaign will be critical to initiate the endowment. Staffing is described under expenses and shows the approximate start time for each staff member. The development of JPA bylaws will define governance, and  JPA will created when the Local Agency Formation Commission (LAFCO) filing is completed.</w:t>
       </w:r>
     </w:p>
     <w:p>
@@ -1799,7 +2093,7 @@
         <w:t xml:space="preserve"> </w:t>
       </w:r>
       <w:r>
-        <w:t xml:space="preserve">Timeline for the JPA startup period.</w:t>
+        <w:t xml:space="preserve">Timeline for a theoretical JPA startup period.</w:t>
       </w:r>
     </w:p>
     <w:tbl>
@@ -2359,7 +2653,7 @@
     </w:p>
     <w:p>
       <w:r>
-        <w:t xml:space="preserve">Expand explanation of these</w:t>
+        <w:t xml:space="preserve">Funding JPAs is not a simple task, as most public funding sources are focused on project implementation, e.g., funding restoration projects in the field, rather than providing administrative support or organizational startup. Some foundations fund this type of work, but accessing those funds can be challenging. Another challenge is competing with existing entities for scarce local, regional, and federal resources. The following are recommendations to consider when examining the feasibility of building and maintaining a JPA for feedstock aggregation:</w:t>
       </w:r>
     </w:p>
     <w:p>
@@ -2367,11 +2661,18 @@
         <w:pStyle w:val="ListParagraph"/>
         <w:numPr>
           <w:ilvl w:val="0"/>
-          <w:numId w:val="10"/>
+          <w:numId w:val="13"/>
         </w:numPr>
       </w:pPr>
       <w:r>
-        <w:t xml:space="preserve">Distinguish between start-up vs. operational funds.</w:t>
+        <w:rPr>
+          <w:b/>
+          <w:bCs/>
+        </w:rPr>
+        <w:t xml:space="preserve">Utilize public funds for startup and traditional projects</w:t>
+      </w:r>
+      <w:r>
+        <w:t xml:space="preserve">. Public funding is readily available and generally suitable for trials or the initial development of feasible but new ideas.</w:t>
       </w:r>
     </w:p>
     <w:p>
@@ -2379,11 +2680,18 @@
         <w:pStyle w:val="ListParagraph"/>
         <w:numPr>
           <w:ilvl w:val="0"/>
-          <w:numId w:val="10"/>
+          <w:numId w:val="13"/>
         </w:numPr>
       </w:pPr>
       <w:r>
-        <w:t xml:space="preserve">Consider budget ramping</w:t>
+        <w:rPr>
+          <w:b/>
+          <w:bCs/>
+        </w:rPr>
+        <w:t xml:space="preserve">Pilot non-traditional, higher risk, or new revenue sources as pilots</w:t>
+      </w:r>
+      <w:r>
+        <w:t xml:space="preserve">. Then, ramp them up with success, and participating entities and partners see their value and understand how they work.</w:t>
       </w:r>
     </w:p>
     <w:p>
@@ -2391,11 +2699,18 @@
         <w:pStyle w:val="ListParagraph"/>
         <w:numPr>
           <w:ilvl w:val="0"/>
-          <w:numId w:val="10"/>
+          <w:numId w:val="13"/>
         </w:numPr>
       </w:pPr>
       <w:r>
-        <w:t xml:space="preserve">Tie expenses to realistic revenues</w:t>
+        <w:rPr>
+          <w:b/>
+          <w:bCs/>
+        </w:rPr>
+        <w:t xml:space="preserve">Co-house staff and resources</w:t>
+      </w:r>
+      <w:r>
+        <w:t xml:space="preserve">. Utilize existing offices and share staff and other resources as capacity and funding allows. This is particularly important during the startup and early phases of developing a JPA.</w:t>
       </w:r>
     </w:p>
     <w:p>
@@ -2403,11 +2718,18 @@
         <w:pStyle w:val="ListParagraph"/>
         <w:numPr>
           <w:ilvl w:val="0"/>
-          <w:numId w:val="10"/>
+          <w:numId w:val="13"/>
         </w:numPr>
       </w:pPr>
       <w:r>
-        <w:t xml:space="preserve">Consider temporal addition of non-traditional or higher risk revenue sources, but pilot them at a small scale first, then increase with success.</w:t>
+        <w:rPr>
+          <w:b/>
+          <w:bCs/>
+        </w:rPr>
+        <w:t xml:space="preserve">Incorporate feedstock insurance</w:t>
+      </w:r>
+      <w:r>
+        <w:t xml:space="preserve">. To de-risk feedstock pricing and also attract new investors to wood product businesses.</w:t>
       </w:r>
     </w:p>
     <w:p>
@@ -2415,11 +2737,18 @@
         <w:pStyle w:val="ListParagraph"/>
         <w:numPr>
           <w:ilvl w:val="0"/>
-          <w:numId w:val="10"/>
+          <w:numId w:val="13"/>
         </w:numPr>
       </w:pPr>
       <w:r>
-        <w:t xml:space="preserve">Fund a sort yard feasibility study.</w:t>
+        <w:rPr>
+          <w:b/>
+          <w:bCs/>
+        </w:rPr>
+        <w:t xml:space="preserve">Leverage public funds with private investment</w:t>
+      </w:r>
+      <w:r>
+        <w:t xml:space="preserve">. When public funds are secured, immediately work to leverage them with other public and private funding resources. Don’t wait until near the end of grants to look for additional funds.</w:t>
       </w:r>
     </w:p>
     <w:p>
@@ -2427,11 +2756,18 @@
         <w:pStyle w:val="ListParagraph"/>
         <w:numPr>
           <w:ilvl w:val="0"/>
-          <w:numId w:val="10"/>
+          <w:numId w:val="13"/>
         </w:numPr>
       </w:pPr>
       <w:r>
-        <w:t xml:space="preserve">Consider a feasibility study to determine revenue from realistic to moon-shot possibilities.</w:t>
+        <w:rPr>
+          <w:b/>
+          <w:bCs/>
+        </w:rPr>
+        <w:t xml:space="preserve">Sort yards with wood campuses or easements</w:t>
+      </w:r>
+      <w:r>
+        <w:t xml:space="preserve">. Could land trusts or agencies that fund easements include sort yards as part of restoration efforts?</w:t>
       </w:r>
     </w:p>
     <w:p>
@@ -2439,23 +2775,18 @@
         <w:pStyle w:val="ListParagraph"/>
         <w:numPr>
           <w:ilvl w:val="0"/>
-          <w:numId w:val="10"/>
+          <w:numId w:val="13"/>
         </w:numPr>
       </w:pPr>
       <w:r>
-        <w:t xml:space="preserve">Examine insurance requirements and costs.</w:t>
-      </w:r>
-    </w:p>
-    <w:p>
-      <w:pPr>
-        <w:pStyle w:val="ListParagraph"/>
-        <w:numPr>
-          <w:ilvl w:val="0"/>
-          <w:numId w:val="10"/>
-        </w:numPr>
-      </w:pPr>
-      <w:r>
-        <w:t xml:space="preserve">As revenue is secured, refine the budget and create a more detailed operating budget</w:t>
+        <w:rPr>
+          <w:b/>
+          <w:bCs/>
+        </w:rPr>
+        <w:t xml:space="preserve">Use the right revenue source</w:t>
+      </w:r>
+      <w:r>
+        <w:t xml:space="preserve">. Property and sales tax increases are more effective in populated areas with higher incomes; however, they usually are not appropriate for disadvantaged rural where the tax base and population tend to be to low to provide enough funding.</w:t>
       </w:r>
     </w:p>
     <w:p>
@@ -2490,7 +2821,7 @@
       <w:r>
         <w:t xml:space="preserve">. </w:t>
       </w:r>
-      <w:hyperlink w:history="1" r:id="rIdbb5wrkal3fh1rc7j24fjk">
+      <w:hyperlink w:history="1" r:id="rIdqyghhpionnmogazz4m64b">
         <w:r>
           <w:rPr>
             <w:rStyle w:val="Hyperlink"/>
@@ -2499,7 +2830,7 @@
         </w:r>
       </w:hyperlink>
       <w:r>
-        <w:t xml:space="preserve">Becker, D. R., McCaffrey, S. M., Abbas, D., Halvorsen, K. E., Jakes, P., &amp; Moseley, C. (2011). Conventional Wisdoms of Woody Biomass Utilization on Federal Public Lands. </w:t>
+        <w:t xml:space="preserve">Becker, D. R., McCaffrey, S. M., Abbas, D., Halvorsen, K. E., Jakes, P., &amp; Moseley, C. (2011). Conventional wisdoms of woody biomass utilization on federal public lands. </w:t>
       </w:r>
       <w:r>
         <w:rPr>
@@ -2521,7 +2852,7 @@
       <w:r>
         <w:t xml:space="preserve">(4), 208–218. </w:t>
       </w:r>
-      <w:hyperlink w:history="1" r:id="rIdrazlmrlu7hrfivar_3r1i">
+      <w:hyperlink w:history="1" r:id="rIddsp5k8y8_ywsvt1optosc">
         <w:r>
           <w:rPr>
             <w:rStyle w:val="Hyperlink"/>
@@ -2530,14 +2861,14 @@
         </w:r>
       </w:hyperlink>
       <w:r>
-        <w:t xml:space="preserve">Carroll, C., Noon, B. R., Masino, S. A., &amp; Noss, R. F. (2025). Coordinating old-growth conservation across scales of space, time, and biodiversity: lessons from the US policy debate. </w:t>
+        <w:t xml:space="preserve">Bohlman, G. N., Safford, H. D., &amp; Skinner, C. N. (2021). Natural range of variation for yellow pine and mixed-conifer forests in northwestern California and southwestern Oregon. </w:t>
       </w:r>
       <w:r>
         <w:rPr>
           <w:i/>
           <w:iCs/>
         </w:rPr>
-        <w:t xml:space="preserve">Frontiers in Forests and Global Change</w:t>
+        <w:t xml:space="preserve">Gen. Tech. Rep. PSW-GTR-273. Albany, CA: US Department of Agriculture, Forest Service, Pacific Southwest Research Station. 146 p.</w:t>
       </w:r>
       <w:r>
         <w:t xml:space="preserve">, </w:t>
@@ -2547,12 +2878,35 @@
           <w:i/>
           <w:iCs/>
         </w:rPr>
+        <w:t xml:space="preserve">273</w:t>
+      </w:r>
+      <w:r>
+        <w:t xml:space="preserve">.</w:t>
+      </w:r>
+      <w:r>
+        <w:t xml:space="preserve">Carroll, C., Noon, B. R., Masino, S. A., &amp; Noss, R. F. (2025). Coordinating old-growth conservation across scales of space, time, and biodiversity: lessons from the US policy debate. </w:t>
+      </w:r>
+      <w:r>
+        <w:rPr>
+          <w:i/>
+          <w:iCs/>
+        </w:rPr>
+        <w:t xml:space="preserve">Frontiers in Forests and Global Change</w:t>
+      </w:r>
+      <w:r>
+        <w:t xml:space="preserve">, </w:t>
+      </w:r>
+      <w:r>
+        <w:rPr>
+          <w:i/>
+          <w:iCs/>
+        </w:rPr>
         <w:t xml:space="preserve">8</w:t>
       </w:r>
       <w:r>
         <w:t xml:space="preserve">. </w:t>
       </w:r>
-      <w:hyperlink w:history="1" r:id="rIddwgy7qoitugddy6qk9x71">
+      <w:hyperlink w:history="1" r:id="rIdoyifou9pvvllebyjotzyy">
         <w:r>
           <w:rPr>
             <w:rStyle w:val="Hyperlink"/>
@@ -2561,29 +2915,134 @@
         </w:r>
       </w:hyperlink>
       <w:r>
-        <w:t xml:space="preserve">DellaSala, D. A., Mackey, B., Norman, P., Campbell, C., Comer, P. J., Kormos, C. F., Keith, H., &amp; Rogers, B. (2022). Mature and old-growth forests contribute to large-scale conservation targets in the conterminous United States. </w:t>
+        <w:t xml:space="preserve">Costa, T. (2025). </w:t>
       </w:r>
       <w:r>
         <w:rPr>
           <w:i/>
           <w:iCs/>
         </w:rPr>
-        <w:t xml:space="preserve">Frontiers in Forests and Global Change</w:t>
-      </w:r>
-      <w:r>
-        <w:t xml:space="preserve">, </w:t>
+        <w:t xml:space="preserve">Assessing the viability of wood recovery and utilization in Sonoma County</w:t>
+      </w:r>
+      <w:r>
+        <w:t xml:space="preserve">. Regenerative Forest Solutions. </w:t>
+      </w:r>
+      <w:hyperlink w:history="1" r:id="rId7dai7a2dsl1hwn6n4rkjc">
+        <w:r>
+          <w:rPr>
+            <w:rStyle w:val="Hyperlink"/>
+          </w:rPr>
+          <w:t xml:space="preserve">https://www.regenerativeforestsolutions.org/resourcesandreports/full-study-assessing-the-viability-of-wood-recovery-and-utilization-in-sonoma-county</w:t>
+        </w:r>
+      </w:hyperlink>
+      <w:r>
+        <w:t xml:space="preserve">CSG. (2020). </w:t>
       </w:r>
       <w:r>
         <w:rPr>
           <w:i/>
           <w:iCs/>
         </w:rPr>
+        <w:t xml:space="preserve">Forest resilience authorities (FRAs): How regional wood waste management can support forest health and economic development goals in California</w:t>
+      </w:r>
+      <w:r>
+        <w:t xml:space="preserve">. Conservation Strategy Group. </w:t>
+      </w:r>
+      <w:hyperlink w:history="1" r:id="rIdz15ryjutgeehbisgzp13d">
+        <w:r>
+          <w:rPr>
+            <w:rStyle w:val="Hyperlink"/>
+          </w:rPr>
+          <w:t xml:space="preserve">https://drive.google.com/file/d/1wPsETRE7AewydAGzFuuZoFvQkKNaFh6r/view</w:t>
+        </w:r>
+      </w:hyperlink>
+      <w:r>
+        <w:t xml:space="preserve">Cypher, T., &amp; Grinnell, C. (2007). </w:t>
+      </w:r>
+      <w:r>
+        <w:rPr>
+          <w:i/>
+          <w:iCs/>
+        </w:rPr>
+        <w:t xml:space="preserve">Governments working together: A citizen’s guide to joint powers agreements</w:t>
+      </w:r>
+      <w:r>
+        <w:t xml:space="preserve">. Senate Local Government Committee. </w:t>
+      </w:r>
+      <w:hyperlink w:history="1" r:id="rIdiltcwgazr26dhlvmlxvqv">
+        <w:r>
+          <w:rPr>
+            <w:rStyle w:val="Hyperlink"/>
+          </w:rPr>
+          <w:t xml:space="preserve">https://sgf.senate.ca.gov/sites/sgf.senate.ca.gov/files/GWTFinalversion2.pdf</w:t>
+        </w:r>
+      </w:hyperlink>
+      <w:r>
+        <w:t xml:space="preserve">Darlington, C., &amp; Stevenson, C. (2023). </w:t>
+      </w:r>
+      <w:r>
+        <w:rPr>
+          <w:i/>
+          <w:iCs/>
+        </w:rPr>
+        <w:t xml:space="preserve">Joint Powers Authorities: A tool to manage forest biomass residuals in California</w:t>
+      </w:r>
+      <w:r>
+        <w:t xml:space="preserve">. CLERE, Inc. </w:t>
+      </w:r>
+      <w:hyperlink w:history="1" r:id="rIdrgsfluknrab8ugp1-rtva">
+        <w:r>
+          <w:rPr>
+            <w:rStyle w:val="Hyperlink"/>
+          </w:rPr>
+          <w:t xml:space="preserve">https://bof.fire.ca.gov/media/sbvcxfiy/cal-frame-jpa-noreast-opr-pilot_final-may122023.pdf</w:t>
+        </w:r>
+      </w:hyperlink>
+      <w:r>
+        <w:t xml:space="preserve">de Sousa Mills, P. (2016). </w:t>
+      </w:r>
+      <w:r>
+        <w:rPr>
+          <w:i/>
+          <w:iCs/>
+        </w:rPr>
+        <w:t xml:space="preserve">The ins and outs of joint powers authorities in California</w:t>
+      </w:r>
+      <w:r>
+        <w:t xml:space="preserve">. </w:t>
+      </w:r>
+      <w:hyperlink w:history="1" r:id="rIdpkv_ogqdhjk03g4rj90lb">
+        <w:r>
+          <w:rPr>
+            <w:rStyle w:val="Hyperlink"/>
+          </w:rPr>
+          <w:t xml:space="preserve">https://bbklaw.com/resources/the-ins-and-outs-of-joint-powers-authorities-in-california</w:t>
+        </w:r>
+      </w:hyperlink>
+      <w:r>
+        <w:t xml:space="preserve">DellaSala, D. A., Mackey, B., Norman, P., Campbell, C., Comer, P. J., Kormos, C. F., Keith, H., &amp; Rogers, B. (2022). Mature and old-growth forests contribute to large-scale conservation targets in the conterminous United States. </w:t>
+      </w:r>
+      <w:r>
+        <w:rPr>
+          <w:i/>
+          <w:iCs/>
+        </w:rPr>
+        <w:t xml:space="preserve">Frontiers in Forests and Global Change</w:t>
+      </w:r>
+      <w:r>
+        <w:t xml:space="preserve">, </w:t>
+      </w:r>
+      <w:r>
+        <w:rPr>
+          <w:i/>
+          <w:iCs/>
+        </w:rPr>
         <w:t xml:space="preserve">5</w:t>
       </w:r>
       <w:r>
         <w:t xml:space="preserve">. </w:t>
       </w:r>
-      <w:hyperlink w:history="1" r:id="rIdz9arrgdyrqip2fgby44cv">
+      <w:hyperlink w:history="1" r:id="rIdsj1yx2sdowjniwjvdkoo9">
         <w:r>
           <w:rPr>
             <w:rStyle w:val="Hyperlink"/>
@@ -2592,14 +3051,14 @@
         </w:r>
       </w:hyperlink>
       <w:r>
-        <w:t xml:space="preserve">Keeley, J. E., &amp; Syphard, A. D. (2021). Large California wildfires: 2020 fires in historical context. </w:t>
+        <w:t xml:space="preserve">Hagmann, R. K., Hessburg, P. F., Prichard, S. J., Povak, N. A., Brown, P. M., Fulé, P. Z., Keane, R. E., Knapp, E. E., Lydersen, J. M., Metlen, K. L., Reilly, M. J., Sánchez Meador, A. J., Stephens, S. L., Stevens, J. T., Taylor, A. H., Yocom, L. L., Battaglia, M. A., Churchill, D. J., Daniels, L. D., … Waltz, A. E. M. (2021). Evidence for widespread changes in the structure, composition, and fire regimes of western North American forests. </w:t>
       </w:r>
       <w:r>
         <w:rPr>
           <w:i/>
           <w:iCs/>
         </w:rPr>
-        <w:t xml:space="preserve">Fire Ecology</w:t>
+        <w:t xml:space="preserve">Ecological Applications</w:t>
       </w:r>
       <w:r>
         <w:t xml:space="preserve">, </w:t>
@@ -2609,12 +3068,74 @@
           <w:i/>
           <w:iCs/>
         </w:rPr>
+        <w:t xml:space="preserve">31</w:t>
+      </w:r>
+      <w:r>
+        <w:t xml:space="preserve">(8). </w:t>
+      </w:r>
+      <w:hyperlink w:history="1" r:id="rIdbdcsiqd9tac4qi5qb9pkl">
+        <w:r>
+          <w:rPr>
+            <w:rStyle w:val="Hyperlink"/>
+          </w:rPr>
+          <w:t xml:space="preserve">10.1002/eap.2431</w:t>
+        </w:r>
+      </w:hyperlink>
+      <w:r>
+        <w:t xml:space="preserve">Jones, G. M., Vraga, E. K., Hessburg, P. F., Hurteau, M. D., Allen, C. D., Keane, R. E., Spies, T. A., North, M. P., Collins, B. M., Finney, M. A., Lydersen, J. M., &amp; Westerling, A. L. (2022). Counteracting wildfire misinformation. </w:t>
+      </w:r>
+      <w:r>
+        <w:rPr>
+          <w:i/>
+          <w:iCs/>
+        </w:rPr>
+        <w:t xml:space="preserve">Frontiers in Ecology and the Environment</w:t>
+      </w:r>
+      <w:r>
+        <w:t xml:space="preserve">, </w:t>
+      </w:r>
+      <w:r>
+        <w:rPr>
+          <w:i/>
+          <w:iCs/>
+        </w:rPr>
+        <w:t xml:space="preserve">20</w:t>
+      </w:r>
+      <w:r>
+        <w:t xml:space="preserve">(7), 392–393. </w:t>
+      </w:r>
+      <w:hyperlink w:history="1" r:id="rIdvr11-5ooxgd85nlzdigkb">
+        <w:r>
+          <w:rPr>
+            <w:rStyle w:val="Hyperlink"/>
+          </w:rPr>
+          <w:t xml:space="preserve">10.1002/fee.2553</w:t>
+        </w:r>
+      </w:hyperlink>
+      <w:r>
+        <w:t xml:space="preserve">Keeley, J. E., &amp; Syphard, A. D. (2021). Large California wildfires: 2020 fires in historical context. </w:t>
+      </w:r>
+      <w:r>
+        <w:rPr>
+          <w:i/>
+          <w:iCs/>
+        </w:rPr>
+        <w:t xml:space="preserve">Fire Ecology</w:t>
+      </w:r>
+      <w:r>
+        <w:t xml:space="preserve">, </w:t>
+      </w:r>
+      <w:r>
+        <w:rPr>
+          <w:i/>
+          <w:iCs/>
+        </w:rPr>
         <w:t xml:space="preserve">17</w:t>
       </w:r>
       <w:r>
         <w:t xml:space="preserve">(1). </w:t>
       </w:r>
-      <w:hyperlink w:history="1" r:id="rIdebuonuposp4i3ow4rrnhh">
+      <w:hyperlink w:history="1" r:id="rIdm4rredmwv8x8wgbfoybs6">
         <w:r>
           <w:rPr>
             <w:rStyle w:val="Hyperlink"/>
@@ -2645,7 +3166,7 @@
       <w:r>
         <w:t xml:space="preserve">, 120004. </w:t>
       </w:r>
-      <w:hyperlink w:history="1" r:id="rIdo_nwyu3-hfa7rm_8wzg-v">
+      <w:hyperlink w:history="1" r:id="rIdc0k71zhd9jya8xsyx0rqb">
         <w:r>
           <w:rPr>
             <w:rStyle w:val="Hyperlink"/>
@@ -2666,12 +3187,85 @@
       <w:r>
         <w:t xml:space="preserve">. U.S. Department of Agriculture, Forest Service, Pacific Southwest Research Station. </w:t>
       </w:r>
-      <w:hyperlink w:history="1" r:id="rIdba6xhb0amyp3nten4qehg">
+      <w:hyperlink w:history="1" r:id="rId8zwtcxvczknwdv8cjpsql">
         <w:r>
           <w:rPr>
             <w:rStyle w:val="Hyperlink"/>
           </w:rPr>
           <w:t xml:space="preserve">10.2737/psw-gtr-220</w:t>
+        </w:r>
+      </w:hyperlink>
+      <w:r>
+        <w:t xml:space="preserve">Re, S. (2023). </w:t>
+      </w:r>
+      <w:r>
+        <w:rPr>
+          <w:i/>
+          <w:iCs/>
+        </w:rPr>
+        <w:t xml:space="preserve">What is parametric insurance?</w:t>
+      </w:r>
+      <w:r>
+        <w:t xml:space="preserve"> Swiss Re Corporate Solutions. </w:t>
+      </w:r>
+      <w:hyperlink w:history="1" r:id="rIdrflvtqtl3bt3rm47gvdhu">
+        <w:r>
+          <w:rPr>
+            <w:rStyle w:val="Hyperlink"/>
+          </w:rPr>
+          <w:t xml:space="preserve">https://corporatesolutions.swissre.com/insights/knowledge/what_is_parametric_insurance.html</w:t>
+        </w:r>
+      </w:hyperlink>
+      <w:r>
+        <w:t xml:space="preserve">Swezy, C., Bailey, J., &amp; Chung, W. (2021). Linking Federal Forest Restoration with Wood Utilization: Modeling Biomass Prices and Analyzing Forest Restoration Costs in the Northern Sierra Nevada. </w:t>
+      </w:r>
+      <w:r>
+        <w:rPr>
+          <w:i/>
+          <w:iCs/>
+        </w:rPr>
+        <w:t xml:space="preserve">Energies</w:t>
+      </w:r>
+      <w:r>
+        <w:t xml:space="preserve">, </w:t>
+      </w:r>
+      <w:r>
+        <w:rPr>
+          <w:i/>
+          <w:iCs/>
+        </w:rPr>
+        <w:t xml:space="preserve">14</w:t>
+      </w:r>
+      <w:r>
+        <w:t xml:space="preserve">(9), 2696. </w:t>
+      </w:r>
+      <w:hyperlink w:history="1" r:id="rId2fuxe3dzf6hsv9fj7hh42">
+        <w:r>
+          <w:rPr>
+            <w:rStyle w:val="Hyperlink"/>
+          </w:rPr>
+          <w:t xml:space="preserve">10.3390/en14092696</w:t>
+        </w:r>
+      </w:hyperlink>
+      <w:r>
+        <w:t xml:space="preserve">Tukman, M., &amp; Griffith, E. (2022). </w:t>
+      </w:r>
+      <w:r>
+        <w:rPr>
+          <w:i/>
+          <w:iCs/>
+        </w:rPr>
+        <w:t xml:space="preserve">North coast mechanical treatment feasibility: Assessing areas across the North Coast for mechanical treatment feasibility of hazardous fuels</w:t>
+      </w:r>
+      <w:r>
+        <w:t xml:space="preserve">. North Coast Resource Partnership. </w:t>
+      </w:r>
+      <w:hyperlink w:history="1" r:id="rIdj8oqfd-8vadut5gardpyw">
+        <w:r>
+          <w:rPr>
+            <w:rStyle w:val="Hyperlink"/>
+          </w:rPr>
+          <w:t xml:space="preserve">https://storymaps.arcgis.com/stories/d176adc01bcf465ab846a7d93e1d625c</w:t>
         </w:r>
       </w:hyperlink>
     </w:p>
@@ -2705,7 +3299,7 @@
         <wp:inline distT="0" distB="0" distL="0" distR="0">
           <wp:extent cx="608542" cy="105833"/>
           <wp:effectExtent b="0" l="0" r="0" t="0"/>
-          <wp:docPr id="1" name="" descr="" title=""/>
+          <wp:docPr id="2" name="" descr="" title=""/>
           <wp:cNvGraphicFramePr>
             <a:graphicFrameLocks xmlns:a="http://schemas.openxmlformats.org/drawingml/2006/main" noChangeAspect="1"/>
           </wp:cNvGraphicFramePr>
@@ -2787,9 +3381,81 @@
         <w:footnoteRef/>
       </w:r>
       <w:r>
-        <w:t xml:space="preserve">For a deeper discussion of collaborative finance approaches to financing water infrastructure and fire mitigtation, see </w:t>
-      </w:r>
-      <w:hyperlink w:history="1" r:id="rId0kh3k9t_6rcuxrxz6n5-b">
+        <w:t xml:space="preserve">See </w:t>
+      </w:r>
+      <w:r>
+        <w:t xml:space="preserve">(</w:t>
+      </w:r>
+      <w:r>
+        <w:t xml:space="preserve">Bohlman </w:t>
+      </w:r>
+      <w:r>
+        <w:rPr>
+          <w:i/>
+          <w:iCs/>
+        </w:rPr>
+        <w:t xml:space="preserve">et al.</w:t>
+      </w:r>
+      <w:r>
+        <w:t xml:space="preserve">, 2021</w:t>
+      </w:r>
+      <w:r>
+        <w:t xml:space="preserve">)</w:t>
+      </w:r>
+      <w:r>
+        <w:t xml:space="preserve">.</w:t>
+      </w:r>
+    </w:p>
+  </w:footnote>
+  <w:footnote w:id="2">
+    <w:p>
+      <w:r>
+        <w:rPr>
+          <w:rStyle w:val="FootnoteReference"/>
+        </w:rPr>
+        <w:footnoteRef/>
+      </w:r>
+      <w:r>
+        <w:t xml:space="preserve">JPAs similar to the Marin Wildfire Prevention Authority, funded through sales tax increase, aren’t possible in northeastern California where a low tax base and few people cannot generate the same income as a more densely populated county such as Marin.</w:t>
+      </w:r>
+    </w:p>
+  </w:footnote>
+  <w:footnote w:id="3">
+    <w:p>
+      <w:r>
+        <w:rPr>
+          <w:rStyle w:val="FootnoteReference"/>
+        </w:rPr>
+        <w:footnoteRef/>
+      </w:r>
+      <w:r>
+        <w:t xml:space="preserve">See </w:t>
+      </w:r>
+      <w:hyperlink w:history="1" r:id="rIdssnonvxtdgc9omy18ai8q">
+        <w:r>
+          <w:rPr>
+            <w:rStyle w:val="Hyperlink"/>
+          </w:rPr>
+          <w:t xml:space="preserve">collaborative finance</w:t>
+        </w:r>
+      </w:hyperlink>
+      <w:r>
+        <w:t xml:space="preserve"> for more information.</w:t>
+      </w:r>
+    </w:p>
+  </w:footnote>
+  <w:footnote w:id="4">
+    <w:p>
+      <w:r>
+        <w:rPr>
+          <w:rStyle w:val="FootnoteReference"/>
+        </w:rPr>
+        <w:footnoteRef/>
+      </w:r>
+      <w:r>
+        <w:t xml:space="preserve">For a deeper discussion of collaborative finance approaches to financing water infrastructure and fire mitigation, see </w:t>
+      </w:r>
+      <w:hyperlink w:history="1" r:id="rIdgq_ebpv2hjadynnv4q3n_">
         <w:r>
           <w:rPr>
             <w:rStyle w:val="Hyperlink"/>
@@ -2800,7 +3466,7 @@
       <w:r>
         <w:t xml:space="preserve"> and </w:t>
       </w:r>
-      <w:hyperlink w:history="1" r:id="rId8wcmjfeitpj86psv2mhkd">
+      <w:hyperlink w:history="1" r:id="rIdu67lhnlgeryly0k0cyfkd">
         <w:r>
           <w:rPr>
             <w:rStyle w:val="Hyperlink"/>
@@ -2818,7 +3484,7 @@
 
 <file path=word/numbering.xml><?xml version="1.0" encoding="utf-8"?>
 <w:numbering xmlns:wpc="http://schemas.microsoft.com/office/word/2010/wordprocessingCanvas" xmlns:mc="http://schemas.openxmlformats.org/markup-compatibility/2006" xmlns:o="urn:schemas-microsoft-com:office:office" xmlns:r="http://schemas.openxmlformats.org/officeDocument/2006/relationships" xmlns:m="http://schemas.openxmlformats.org/officeDocument/2006/math" xmlns:v="urn:schemas-microsoft-com:vml" xmlns:wp14="http://schemas.microsoft.com/office/word/2010/wordprocessingDrawing" xmlns:wp="http://schemas.openxmlformats.org/drawingml/2006/wordprocessingDrawing" xmlns:w10="urn:schemas-microsoft-com:office:word" xmlns:w="http://schemas.openxmlformats.org/wordprocessingml/2006/main" xmlns:w14="http://schemas.microsoft.com/office/word/2010/wordml" xmlns:w15="http://schemas.microsoft.com/office/word/2012/wordml" xmlns:wpg="http://schemas.microsoft.com/office/word/2010/wordprocessingGroup" xmlns:wpi="http://schemas.microsoft.com/office/word/2010/wordprocessingInk" xmlns:wne="http://schemas.microsoft.com/office/word/2006/wordml" xmlns:wps="http://schemas.microsoft.com/office/word/2010/wordprocessingShape" mc:Ignorable="w14 w15 wp14">
-  <w:abstractNum w:abstractNumId="2" w15:restartNumberingAfterBreak="0">
+  <w:abstractNum w:abstractNumId="3" w15:restartNumberingAfterBreak="0">
     <w:multiLevelType w:val="hybridMultilevel"/>
     <w:lvl w:ilvl="0" w15:tentative="1">
       <w:start w:val="1"/>
@@ -2899,90 +3565,6 @@
       <w:lvlJc w:val="left"/>
       <w:pPr>
         <w:ind w:left="6480" w:hanging="360"/>
-      </w:pPr>
-    </w:lvl>
-  </w:abstractNum>
-  <w:abstractNum w:abstractNumId="3" w15:restartNumberingAfterBreak="0">
-    <w:multiLevelType w:val="hybridMultilevel"/>
-    <w:lvl w:ilvl="0" w15:tentative="1">
-      <w:start w:val="1"/>
-      <w:numFmt w:val="decimal"/>
-      <w:lvlText w:val="%1."/>
-      <w:lvlJc w:val="start"/>
-      <w:pPr>
-        <w:ind w:left="720" w:hanging="259"/>
-      </w:pPr>
-    </w:lvl>
-    <w:lvl w:ilvl="1" w15:tentative="1">
-      <w:start w:val="1"/>
-      <w:numFmt w:val="lowerLetter"/>
-      <w:lvlText w:val="%2."/>
-      <w:lvlJc w:val="start"/>
-      <w:pPr>
-        <w:ind w:left="1440" w:hanging="259"/>
-      </w:pPr>
-    </w:lvl>
-    <w:lvl w:ilvl="2" w15:tentative="1">
-      <w:start w:val="1"/>
-      <w:numFmt w:val="lowerRoman"/>
-      <w:lvlText w:val="%3."/>
-      <w:lvlJc w:val="start"/>
-      <w:pPr>
-        <w:ind w:left="2160" w:hanging="259"/>
-      </w:pPr>
-    </w:lvl>
-    <w:lvl w:ilvl="3" w15:tentative="1">
-      <w:start w:val="1"/>
-      <w:numFmt w:val="decimal"/>
-      <w:lvlText w:val="%4."/>
-      <w:lvlJc w:val="start"/>
-      <w:pPr>
-        <w:ind w:left="2880" w:hanging="259"/>
-      </w:pPr>
-    </w:lvl>
-    <w:lvl w:ilvl="4" w15:tentative="1">
-      <w:start w:val="1"/>
-      <w:numFmt w:val="lowerLetter"/>
-      <w:lvlText w:val="%5."/>
-      <w:lvlJc w:val="start"/>
-      <w:pPr>
-        <w:ind w:left="3600" w:hanging="259"/>
-      </w:pPr>
-    </w:lvl>
-    <w:lvl w:ilvl="5" w15:tentative="1">
-      <w:start w:val="1"/>
-      <w:numFmt w:val="lowerRoman"/>
-      <w:lvlText w:val="%6."/>
-      <w:lvlJc w:val="start"/>
-      <w:pPr>
-        <w:ind w:left="4320" w:hanging="259"/>
-      </w:pPr>
-    </w:lvl>
-    <w:lvl w:ilvl="6" w15:tentative="1">
-      <w:start w:val="1"/>
-      <w:numFmt w:val="decimal"/>
-      <w:lvlText w:val="%7."/>
-      <w:lvlJc w:val="start"/>
-      <w:pPr>
-        <w:ind w:left="5040" w:hanging="259"/>
-      </w:pPr>
-    </w:lvl>
-    <w:lvl w:ilvl="7" w15:tentative="1">
-      <w:start w:val="1"/>
-      <w:numFmt w:val="lowerLetter"/>
-      <w:lvlText w:val="%8."/>
-      <w:lvlJc w:val="start"/>
-      <w:pPr>
-        <w:ind w:left="5760" w:hanging="259"/>
-      </w:pPr>
-    </w:lvl>
-    <w:lvl w:ilvl="8" w15:tentative="1">
-      <w:start w:val="1"/>
-      <w:numFmt w:val="lowerRoman"/>
-      <w:lvlText w:val="%9."/>
-      <w:lvlJc w:val="start"/>
-      <w:pPr>
-        <w:ind w:left="6480" w:hanging="259"/>
       </w:pPr>
     </w:lvl>
   </w:abstractNum>
@@ -3074,8 +3656,8 @@
     <w:multiLevelType w:val="hybridMultilevel"/>
     <w:lvl w:ilvl="0" w15:tentative="1">
       <w:start w:val="1"/>
-      <w:numFmt w:val="bullet"/>
-      <w:lvlText w:val="●"/>
+      <w:numFmt w:val="decimal"/>
+      <w:lvlText w:val="%1."/>
       <w:lvlJc w:val="start"/>
       <w:pPr>
         <w:ind w:left="720" w:hanging="259"/>
@@ -3083,8 +3665,8 @@
     </w:lvl>
     <w:lvl w:ilvl="1" w15:tentative="1">
       <w:start w:val="1"/>
-      <w:numFmt w:val="bullet"/>
-      <w:lvlText w:val="○"/>
+      <w:numFmt w:val="lowerLetter"/>
+      <w:lvlText w:val="%2."/>
       <w:lvlJc w:val="start"/>
       <w:pPr>
         <w:ind w:left="1440" w:hanging="259"/>
@@ -3092,8 +3674,8 @@
     </w:lvl>
     <w:lvl w:ilvl="2" w15:tentative="1">
       <w:start w:val="1"/>
-      <w:numFmt w:val="bullet"/>
-      <w:lvlText w:val="■"/>
+      <w:numFmt w:val="lowerRoman"/>
+      <w:lvlText w:val="%3."/>
       <w:lvlJc w:val="start"/>
       <w:pPr>
         <w:ind w:left="2160" w:hanging="259"/>
@@ -3101,8 +3683,8 @@
     </w:lvl>
     <w:lvl w:ilvl="3" w15:tentative="1">
       <w:start w:val="1"/>
-      <w:numFmt w:val="bullet"/>
-      <w:lvlText w:val="●"/>
+      <w:numFmt w:val="decimal"/>
+      <w:lvlText w:val="%4."/>
       <w:lvlJc w:val="start"/>
       <w:pPr>
         <w:ind w:left="2880" w:hanging="259"/>
@@ -3110,8 +3692,8 @@
     </w:lvl>
     <w:lvl w:ilvl="4" w15:tentative="1">
       <w:start w:val="1"/>
-      <w:numFmt w:val="bullet"/>
-      <w:lvlText w:val="○"/>
+      <w:numFmt w:val="lowerLetter"/>
+      <w:lvlText w:val="%5."/>
       <w:lvlJc w:val="start"/>
       <w:pPr>
         <w:ind w:left="3600" w:hanging="259"/>
@@ -3119,8 +3701,8 @@
     </w:lvl>
     <w:lvl w:ilvl="5" w15:tentative="1">
       <w:start w:val="1"/>
-      <w:numFmt w:val="bullet"/>
-      <w:lvlText w:val="■"/>
+      <w:numFmt w:val="lowerRoman"/>
+      <w:lvlText w:val="%6."/>
       <w:lvlJc w:val="start"/>
       <w:pPr>
         <w:ind w:left="4320" w:hanging="259"/>
@@ -3128,8 +3710,8 @@
     </w:lvl>
     <w:lvl w:ilvl="6" w15:tentative="1">
       <w:start w:val="1"/>
-      <w:numFmt w:val="bullet"/>
-      <w:lvlText w:val="●"/>
+      <w:numFmt w:val="decimal"/>
+      <w:lvlText w:val="%7."/>
       <w:lvlJc w:val="start"/>
       <w:pPr>
         <w:ind w:left="5040" w:hanging="259"/>
@@ -3137,8 +3719,8 @@
     </w:lvl>
     <w:lvl w:ilvl="7" w15:tentative="1">
       <w:start w:val="1"/>
-      <w:numFmt w:val="bullet"/>
-      <w:lvlText w:val="○"/>
+      <w:numFmt w:val="lowerLetter"/>
+      <w:lvlText w:val="%8."/>
       <w:lvlJc w:val="start"/>
       <w:pPr>
         <w:ind w:left="5760" w:hanging="259"/>
@@ -3146,8 +3728,8 @@
     </w:lvl>
     <w:lvl w:ilvl="8" w15:tentative="1">
       <w:start w:val="1"/>
-      <w:numFmt w:val="bullet"/>
-      <w:lvlText w:val="■"/>
+      <w:numFmt w:val="lowerRoman"/>
+      <w:lvlText w:val="%9."/>
       <w:lvlJc w:val="start"/>
       <w:pPr>
         <w:ind w:left="6480" w:hanging="259"/>
@@ -3238,32 +3820,206 @@
       </w:pPr>
     </w:lvl>
   </w:abstractNum>
+  <w:abstractNum w:abstractNumId="7" w15:restartNumberingAfterBreak="0">
+    <w:multiLevelType w:val="hybridMultilevel"/>
+    <w:lvl w:ilvl="0" w15:tentative="1">
+      <w:start w:val="1"/>
+      <w:numFmt w:val="bullet"/>
+      <w:lvlText w:val="●"/>
+      <w:lvlJc w:val="start"/>
+      <w:pPr>
+        <w:ind w:left="720" w:hanging="259"/>
+      </w:pPr>
+    </w:lvl>
+    <w:lvl w:ilvl="1" w15:tentative="1">
+      <w:start w:val="1"/>
+      <w:numFmt w:val="bullet"/>
+      <w:lvlText w:val="○"/>
+      <w:lvlJc w:val="start"/>
+      <w:pPr>
+        <w:ind w:left="1440" w:hanging="259"/>
+      </w:pPr>
+    </w:lvl>
+    <w:lvl w:ilvl="2" w15:tentative="1">
+      <w:start w:val="1"/>
+      <w:numFmt w:val="bullet"/>
+      <w:lvlText w:val="■"/>
+      <w:lvlJc w:val="start"/>
+      <w:pPr>
+        <w:ind w:left="2160" w:hanging="259"/>
+      </w:pPr>
+    </w:lvl>
+    <w:lvl w:ilvl="3" w15:tentative="1">
+      <w:start w:val="1"/>
+      <w:numFmt w:val="bullet"/>
+      <w:lvlText w:val="●"/>
+      <w:lvlJc w:val="start"/>
+      <w:pPr>
+        <w:ind w:left="2880" w:hanging="259"/>
+      </w:pPr>
+    </w:lvl>
+    <w:lvl w:ilvl="4" w15:tentative="1">
+      <w:start w:val="1"/>
+      <w:numFmt w:val="bullet"/>
+      <w:lvlText w:val="○"/>
+      <w:lvlJc w:val="start"/>
+      <w:pPr>
+        <w:ind w:left="3600" w:hanging="259"/>
+      </w:pPr>
+    </w:lvl>
+    <w:lvl w:ilvl="5" w15:tentative="1">
+      <w:start w:val="1"/>
+      <w:numFmt w:val="bullet"/>
+      <w:lvlText w:val="■"/>
+      <w:lvlJc w:val="start"/>
+      <w:pPr>
+        <w:ind w:left="4320" w:hanging="259"/>
+      </w:pPr>
+    </w:lvl>
+    <w:lvl w:ilvl="6" w15:tentative="1">
+      <w:start w:val="1"/>
+      <w:numFmt w:val="bullet"/>
+      <w:lvlText w:val="●"/>
+      <w:lvlJc w:val="start"/>
+      <w:pPr>
+        <w:ind w:left="5040" w:hanging="259"/>
+      </w:pPr>
+    </w:lvl>
+    <w:lvl w:ilvl="7" w15:tentative="1">
+      <w:start w:val="1"/>
+      <w:numFmt w:val="bullet"/>
+      <w:lvlText w:val="○"/>
+      <w:lvlJc w:val="start"/>
+      <w:pPr>
+        <w:ind w:left="5760" w:hanging="259"/>
+      </w:pPr>
+    </w:lvl>
+    <w:lvl w:ilvl="8" w15:tentative="1">
+      <w:start w:val="1"/>
+      <w:numFmt w:val="bullet"/>
+      <w:lvlText w:val="■"/>
+      <w:lvlJc w:val="start"/>
+      <w:pPr>
+        <w:ind w:left="6480" w:hanging="259"/>
+      </w:pPr>
+    </w:lvl>
+  </w:abstractNum>
+  <w:abstractNum w:abstractNumId="8" w15:restartNumberingAfterBreak="0">
+    <w:multiLevelType w:val="hybridMultilevel"/>
+    <w:lvl w:ilvl="0" w15:tentative="1">
+      <w:start w:val="1"/>
+      <w:numFmt w:val="decimal"/>
+      <w:lvlText w:val="%1."/>
+      <w:lvlJc w:val="start"/>
+      <w:pPr>
+        <w:ind w:left="720" w:hanging="259"/>
+      </w:pPr>
+    </w:lvl>
+    <w:lvl w:ilvl="1" w15:tentative="1">
+      <w:start w:val="1"/>
+      <w:numFmt w:val="lowerLetter"/>
+      <w:lvlText w:val="%2."/>
+      <w:lvlJc w:val="start"/>
+      <w:pPr>
+        <w:ind w:left="1440" w:hanging="259"/>
+      </w:pPr>
+    </w:lvl>
+    <w:lvl w:ilvl="2" w15:tentative="1">
+      <w:start w:val="1"/>
+      <w:numFmt w:val="lowerRoman"/>
+      <w:lvlText w:val="%3."/>
+      <w:lvlJc w:val="start"/>
+      <w:pPr>
+        <w:ind w:left="2160" w:hanging="259"/>
+      </w:pPr>
+    </w:lvl>
+    <w:lvl w:ilvl="3" w15:tentative="1">
+      <w:start w:val="1"/>
+      <w:numFmt w:val="decimal"/>
+      <w:lvlText w:val="%4."/>
+      <w:lvlJc w:val="start"/>
+      <w:pPr>
+        <w:ind w:left="2880" w:hanging="259"/>
+      </w:pPr>
+    </w:lvl>
+    <w:lvl w:ilvl="4" w15:tentative="1">
+      <w:start w:val="1"/>
+      <w:numFmt w:val="lowerLetter"/>
+      <w:lvlText w:val="%5."/>
+      <w:lvlJc w:val="start"/>
+      <w:pPr>
+        <w:ind w:left="3600" w:hanging="259"/>
+      </w:pPr>
+    </w:lvl>
+    <w:lvl w:ilvl="5" w15:tentative="1">
+      <w:start w:val="1"/>
+      <w:numFmt w:val="lowerRoman"/>
+      <w:lvlText w:val="%6."/>
+      <w:lvlJc w:val="start"/>
+      <w:pPr>
+        <w:ind w:left="4320" w:hanging="259"/>
+      </w:pPr>
+    </w:lvl>
+    <w:lvl w:ilvl="6" w15:tentative="1">
+      <w:start w:val="1"/>
+      <w:numFmt w:val="decimal"/>
+      <w:lvlText w:val="%7."/>
+      <w:lvlJc w:val="start"/>
+      <w:pPr>
+        <w:ind w:left="5040" w:hanging="259"/>
+      </w:pPr>
+    </w:lvl>
+    <w:lvl w:ilvl="7" w15:tentative="1">
+      <w:start w:val="1"/>
+      <w:numFmt w:val="lowerLetter"/>
+      <w:lvlText w:val="%8."/>
+      <w:lvlJc w:val="start"/>
+      <w:pPr>
+        <w:ind w:left="5760" w:hanging="259"/>
+      </w:pPr>
+    </w:lvl>
+    <w:lvl w:ilvl="8" w15:tentative="1">
+      <w:start w:val="1"/>
+      <w:numFmt w:val="lowerRoman"/>
+      <w:lvlText w:val="%9."/>
+      <w:lvlJc w:val="start"/>
+      <w:pPr>
+        <w:ind w:left="6480" w:hanging="259"/>
+      </w:pPr>
+    </w:lvl>
+  </w:abstractNum>
   <w:num w:numId="1">
-    <w:abstractNumId w:val="2"/>
-    <w:lvlOverride w:ilvl="0">
-      <w:startOverride w:val="1"/>
-    </w:lvlOverride>
-  </w:num>
-  <w:num w:numId="7">
     <w:abstractNumId w:val="3"/>
     <w:lvlOverride w:ilvl="0">
       <w:startOverride w:val="1"/>
     </w:lvlOverride>
   </w:num>
-  <w:num w:numId="8">
+  <w:num w:numId="9">
     <w:abstractNumId w:val="4"/>
     <w:lvlOverride w:ilvl="0">
       <w:startOverride w:val="1"/>
     </w:lvlOverride>
   </w:num>
-  <w:num w:numId="9">
+  <w:num w:numId="10">
     <w:abstractNumId w:val="5"/>
     <w:lvlOverride w:ilvl="0">
       <w:startOverride w:val="1"/>
     </w:lvlOverride>
   </w:num>
-  <w:num w:numId="10">
+  <w:num w:numId="11">
     <w:abstractNumId w:val="6"/>
+    <w:lvlOverride w:ilvl="0">
+      <w:startOverride w:val="1"/>
+    </w:lvlOverride>
+  </w:num>
+  <w:num w:numId="12">
+    <w:abstractNumId w:val="7"/>
+    <w:lvlOverride w:ilvl="0">
+      <w:startOverride w:val="1"/>
+    </w:lvlOverride>
+  </w:num>
+  <w:num w:numId="13">
+    <w:abstractNumId w:val="8"/>
     <w:lvlOverride w:ilvl="0">
       <w:startOverride w:val="1"/>
     </w:lvlOverride>

</xml_diff>

<commit_message>
docx and pdf exports
</commit_message>
<xml_diff>
--- a/exports/jpa.docx
+++ b/exports/jpa.docx
@@ -23,12 +23,15 @@
         <w:pStyle w:val="Heading2"/>
       </w:pPr>
       <w:r>
+        <w:t xml:space="preserve">1.1	</w:t>
+      </w:r>
+      <w:r>
         <w:t xml:space="preserve">JPA Funding Strategies</w:t>
       </w:r>
     </w:p>
     <w:p>
       <w:r>
-        <w:t xml:space="preserve">Joint Powers Authorities are proposed as a solution for feedstock aggregation in California to help broker agreements with forest landowners and managers and create long-term supply contracts to increase investor support for wood products businesses. Funding these entities presents its challenges, given the difficulties of securing grants and private investments. Creating a diversified funding portfolio is crucial, especially for new entities, and suggestions for achieving this are provided.</w:t>
+        <w:t xml:space="preserve">Joint Powers Authorities (JPAs) are proposed as a solution in California to facilitate agreements with forest landowners and managers, thereby creating long-term supply contracts and increasing investor support for wood products businesses. Funding JPAs presents challenges, given the difficulties of securing grants and private investments. Creating a diversified funding portfolio is crucial, especially for new entities, and suggestions for achieving this are provided.</w:t>
       </w:r>
     </w:p>
     <w:p>
@@ -36,7 +39,15 @@
         <w:pStyle w:val="Heading3"/>
       </w:pPr>
       <w:r>
+        <w:t xml:space="preserve">1.1.1	</w:t>
+      </w:r>
+      <w:r>
         <w:t xml:space="preserve">Takeaways</w:t>
+      </w:r>
+    </w:p>
+    <w:p>
+      <w:r>
+        <w:t xml:space="preserve">Developing diverse funding sources is always a sound strategy. Additionally, creating steady and dependable income sources can help complement the dynamic world of grant funding. Additional takeaways are the following:</w:t>
       </w:r>
     </w:p>
     <w:p>
@@ -44,7 +55,7 @@
         <w:pStyle w:val="ListParagraph"/>
         <w:numPr>
           <w:ilvl w:val="0"/>
-          <w:numId w:val="9"/>
+          <w:numId w:val="10"/>
         </w:numPr>
       </w:pPr>
       <w:r>
@@ -55,7 +66,7 @@
         <w:t xml:space="preserve">Portfolio strategy</w:t>
       </w:r>
       <w:r>
-        <w:t xml:space="preserve">. Be strategic about what funds you utilize for different projects and programs. It may be best to look to foundations and business support grants for organizational startup or administrative costs. Still, implementation grants for field projects and private or bank loans for scaling once a feedstock aggregation entity is established.</w:t>
+        <w:t xml:space="preserve">. Be strategic about what funds you utilize for different projects and programs. Look to foundations and business support grants for organizational startup or administrative costs. Still, there are implementation grants for field projects and private or bank loans for scaling once a JPA is established.</w:t>
       </w:r>
     </w:p>
     <w:p>
@@ -63,7 +74,7 @@
         <w:pStyle w:val="ListParagraph"/>
         <w:numPr>
           <w:ilvl w:val="0"/>
-          <w:numId w:val="9"/>
+          <w:numId w:val="10"/>
         </w:numPr>
       </w:pPr>
       <w:r>
@@ -74,7 +85,7 @@
         <w:t xml:space="preserve">Temporal ramping</w:t>
       </w:r>
       <w:r>
-        <w:t xml:space="preserve">. Revenue sources outside the realm of taxes and grants may be difficult to create and execute with risk-averse agencies and organizations. Try funding with traditional resources, such as grants, first, and then gradually introduce new resources to diversify your funding portfolio and help establish a new organization’s financial stability over time.</w:t>
+        <w:t xml:space="preserve">. Revenue sources outside the realm of taxes and grants may be difficult to create and execute with risk-averse agencies and organizations. Try funding with traditional resources, such as grants, first, and then gradually introduce new resources to diversify your funding portfolio and help establish the new organization’s financial stability over time.</w:t>
       </w:r>
     </w:p>
     <w:p>
@@ -82,7 +93,7 @@
         <w:pStyle w:val="ListParagraph"/>
         <w:numPr>
           <w:ilvl w:val="0"/>
-          <w:numId w:val="9"/>
+          <w:numId w:val="10"/>
         </w:numPr>
       </w:pPr>
       <w:r>
@@ -93,7 +104,7 @@
         <w:t xml:space="preserve">Grant dependence &amp; giving</w:t>
       </w:r>
       <w:r>
-        <w:t xml:space="preserve">. In a similar vein, just because grants are available doesn’t mean that will be the case indefinitely. As soon as you secure a grant or two, think about how to leverage it with other funding sources and work tirelessly to create more dependable and steady income sources than grants. It may seem daunting, but remember that the single largest source of charitable giving in the United States comes from individuals, not foundations, corporations, or grant-making agencies. The single largest source is also the least restricted type of funding, so it is critical for covering operational expenses (which are often underfunded by grants). Develop a strategy to cultivate local support through individual donations.</w:t>
+        <w:t xml:space="preserve">. In a similar vein, just because grants are available does not mean that will be the case indefinitely. As soon as you secure a grant, leverage it with other funding sources and work tirelessly to create more dependable and steady income sources. It may seem daunting, but remember that the single largest source of charitable giving in the United States comes from individuals, not foundations, corporations, or grant-making agencies. Individual contributions are also the least restricted type of funding, making them critical for covering operational expenses. Develop a strategy to cultivate local support through individual donations and campaigns.</w:t>
       </w:r>
     </w:p>
     <w:p>
@@ -101,18 +112,21 @@
         <w:pStyle w:val="Heading3"/>
       </w:pPr>
       <w:r>
+        <w:t xml:space="preserve">1.1.2	</w:t>
+      </w:r>
+      <w:r>
         <w:t xml:space="preserve">Background</w:t>
       </w:r>
     </w:p>
     <w:p>
       <w:r>
-        <w:t xml:space="preserve">The large wildfire seasons of the past five years have been catastrophic for forests and communities. However, according to </w:t>
+        <w:t xml:space="preserve">The large wildfire seasons of the past five years were catastrophic for forests and communities. However, according to </w:t>
       </w:r>
       <w:r>
         <w:t xml:space="preserve">Keeley &amp; Syphard (2021)</w:t>
       </w:r>
       <w:r>
-        <w:t xml:space="preserve">, they are not unprecedented in recent California history and are usually associated with periods of drought, e.g., the 1920s and 2010s. </w:t>
+        <w:t xml:space="preserve">, these events are not unprecedented in recent California history and are typically associated with periods of drought, e.g., the 1920s and 2010s. According to </w:t>
       </w:r>
       <w:r>
         <w:t xml:space="preserve">North </w:t>
@@ -128,7 +142,12 @@
         <w:t xml:space="preserve"> (2022)</w:t>
       </w:r>
       <w:r>
-        <w:t xml:space="preserve"> found that during the past century, tree densities increased up to sevenfold while average tree size decreased 50% in the Sierra Nevada. </w:t>
+        <w:t xml:space="preserve">, tree densities in the Sierra Nevada have increased by up to sevenfold over the past century, while average tree size has decreased by 50%.</w:t>
+      </w:r>
+    </w:p>
+    <w:p>
+      <w:r>
+        <w:t xml:space="preserve">Not only does this overcrowding weaken forest health, but excessively dense forests also cause fires to burn more severely. A meta-analysis led by </w:t>
       </w:r>
       <w:r>
         <w:t xml:space="preserve">Hagmann </w:t>
@@ -144,7 +163,7 @@
         <w:t xml:space="preserve"> (2021)</w:t>
       </w:r>
       <w:r>
-        <w:t xml:space="preserve"> led a meta analysis showing a fire deficit and widespread alteration of ecological structure and funtion across seasonally dry forests of western North America. A chronic level of stress is created by high competition across tree stands, resulting in reduced resilience to drought, disease, fire, and climate change. </w:t>
+        <w:t xml:space="preserve"> showed a fire deficit and widespread alteration of ecological structure and function across seasonally dry forests of western North America. A chronic level of stress is created by high competition across tree stands, resulting in reduced resilience to drought, disease, fire, and climate change. </w:t>
       </w:r>
       <w:r>
         <w:t xml:space="preserve">North </w:t>
@@ -168,6 +187,9 @@
         <w:pStyle w:val="Heading3"/>
       </w:pPr>
       <w:r>
+        <w:t xml:space="preserve">1.1.3	</w:t>
+      </w:r>
+      <w:r>
         <w:t xml:space="preserve">Concerns</w:t>
       </w:r>
     </w:p>
@@ -189,7 +211,7 @@
         <w:t xml:space="preserve"> (2022)</w:t>
       </w:r>
       <w:r>
-        <w:t xml:space="preserve"> highlight the fact that a large proportion of the remaining mature and old-growth forests on federal lands are still vulnerable to logging. The loss of these forests would not only diminish biodiversity but also release substantial amounts of stored carbon into the atmosphere.</w:t>
+        <w:t xml:space="preserve"> highlight the fact that a large proportion of the remaining mature and old-growth forests on federal lands are still vulnerable to logging. The loss of these forests will not only diminish biodiversity but also release substantial amounts of carbon into the atmosphere.</w:t>
       </w:r>
     </w:p>
     <w:p>
@@ -210,12 +232,12 @@
         <w:t xml:space="preserve"> (2025)</w:t>
       </w:r>
       <w:r>
-        <w:t xml:space="preserve"> point to a history of policy debates, such as the National Old-Growth Amendment, which has failed to provide lasting protection. The authors advocate for a more comprehensive approach that extends beyond simple harvest restrictions to encompass landscape-level planning, the establishment of reserves, the protection of climate refugia, and the setting of specific goals for the recovery of species that depend on these unique habitats.</w:t>
-      </w:r>
-    </w:p>
-    <w:p>
-      <w:r>
-        <w:t xml:space="preserve">But let’s be very clear: thinning dense stands of fire-prone forests is completely different from logging old growth, and ecological-based thinning is not an excuse to log when maintaining stand heterogeneity and reducing fire risk are the treatment goals. Yet, misinformation about wildfire and forest treatments, similar to climate misinformation, persists (</w:t>
+        <w:t xml:space="preserve"> point to a history of policy debates, such as the National Old-Growth Amendment, which failed to provide lasting protection. The authors advocate for a more comprehensive approach that extends beyond simple harvest restrictions to encompass landscape-level planning, the establishment of reserves, the protection of climate refugia, and the setting of specific goals for the recovery of species that depend on these unique habitats. Impacts on these forests are a concern for communities that rely on them for their water supplies.</w:t>
+      </w:r>
+    </w:p>
+    <w:p>
+      <w:r>
+        <w:t xml:space="preserve">However, let’s be very clear: thinning dense stands of fire-prone forests is entirely different from logging old-growth forests, and ecologically based thinning is not an excuse to log when maintaining stand heterogeneity and reducing fire risk are the primary treatment goals. Yet, misinformation about wildfire and forest treatments, similar to climate misinformation, persists (</w:t>
       </w:r>
       <w:r>
         <w:t xml:space="preserve">Jones </w:t>
@@ -236,7 +258,7 @@
     </w:p>
     <w:p>
       <w:r>
-        <w:t xml:space="preserve">Managers implementing forest health treatments should adopt a tailored approach to increase forest resilience, mitigate fire risk, and bring stands within a natural range of variation.</w:t>
+        <w:t xml:space="preserve">Managers implementing forest health treatments should adopt a tailored approach to increase forest resilience, mitigate fire risk, bring stands within a natural range of variation, and create forests that can thrive over the long term.</w:t>
       </w:r>
       <w:r>
         <w:rPr>
@@ -253,12 +275,15 @@
         <w:pStyle w:val="Heading3"/>
       </w:pPr>
       <w:r>
+        <w:t xml:space="preserve">1.1.4	</w:t>
+      </w:r>
+      <w:r>
         <w:t xml:space="preserve">Feedstock Aggregation</w:t>
       </w:r>
     </w:p>
     <w:p>
       <w:r>
-        <w:t xml:space="preserve">Thinned forests create a lot of biomass, and much of that biomass from forest health projects end up in burn piles or log decks and may stay in these locations indefinitely. Not only does this negate fire mitigation efforts, as burn piles and decks can promote or worsen fires, but the carbon from wood is also at risk of not being sequestered.</w:t>
+        <w:t xml:space="preserve">Thinned forests create a lot of biomass, and much of that biomass from forest health projects ends up in burn piles or log decks and may stay in these locations indefinitely. Not only does this negate fire mitigation efforts, as burn piles and decks can promote or worsen fires, but the carbon from wood is also at risk of not being sequestered.</w:t>
       </w:r>
     </w:p>
     <w:p>
@@ -295,20 +320,56 @@
         <w:t xml:space="preserve"> (2011)</w:t>
       </w:r>
       <w:r>
-        <w:t xml:space="preserve"> point out that supply guarantees, industry presence, transportation, and the value of the biomass are limiting to biomass utilization, whereas agency staffing, budgets, compliance, and partnership aggravated use rather than impeding progress. SIG recently completed a burn pile inventory across California, showing massive tonnages of piles scattered through national forests and other lands. Yet burning those piles is likely more expensive than transporting them to a facility for processing (</w:t>
+        <w:t xml:space="preserve"> point out that supply guarantees, industry presence, transportation, and the value of the biomass are limiting factors to utilization, whereas agency staffing, budgets, compliance, and partnership aggravated utilization problems rather than impeding progress. A burn pile inventory across California showed massive wood tonnages scattered through national forests and other lands </w:t>
+      </w:r>
+      <w:r>
+        <w:t xml:space="preserve">(</w:t>
+      </w:r>
+      <w:r>
+        <w:t xml:space="preserve">Darlington </w:t>
+      </w:r>
+      <w:r>
+        <w:rPr>
+          <w:i/>
+          <w:iCs/>
+        </w:rPr>
+        <w:t xml:space="preserve">et al.</w:t>
+      </w:r>
+      <w:r>
+        <w:t xml:space="preserve">, 2023</w:t>
+      </w:r>
+      <w:r>
+        <w:t xml:space="preserve">)</w:t>
+      </w:r>
+      <w:r>
+        <w:t xml:space="preserve">. Yet burning those piles is likely more expensive than transporting them to a facility for processing (</w:t>
       </w:r>
       <w:r>
         <w:t xml:space="preserve">Barker et al 2024</w:t>
       </w:r>
       <w:r>
-        <w:t xml:space="preserve">). Transportation subsidies to move this feedstock to central locations or nearby facilities could be a crucial missing component in addressing the wildfire problem across the western United States.</w:t>
-      </w:r>
-    </w:p>
-    <w:p>
-      <w:r>
-        <w:t xml:space="preserve">Transporting the feedstock to a central location, accessible and central to processors, biomass facilities, and wood product businesses, would help move the biomass out of the woods, mitigating fire risk while also facilitating the centralization of long-term feedstock contracts with landowners and managing agencies. For instance, </w:t>
-      </w:r>
-      <w:hyperlink w:history="1" r:id="rIdlbuwtkqmumy2wy5xbulbw">
+        <w:t xml:space="preserve">).</w:t>
+      </w:r>
+    </w:p>
+    <w:p>
+      <w:r>
+        <w:t xml:space="preserve">Transportation subsidies to move this feedstock to central locations or nearby facilities could be a crucial missing component in addressing the wildfire problem across the western United States.</w:t>
+      </w:r>
+      <w:r>
+        <w:rPr>
+          <w:rStyle w:val="FootnoteReference"/>
+        </w:rPr>
+        <w:footnoteReference w:id="2"/>
+      </w:r>
+      <w:r>
+        <w:t xml:space="preserve"> Transporting the feedstock to a central location, accessible and central to processors, biomass facilities, and wood product businesses, would help move the biomass out of the woods, mitigating fire risk while also facilitating the centralization of long-term feedstock contracts with landowners and managing agencies.</w:t>
+      </w:r>
+    </w:p>
+    <w:p>
+      <w:r>
+        <w:t xml:space="preserve">For instance, </w:t>
+      </w:r>
+      <w:hyperlink w:history="1" r:id="rId-koxdvkvvfxoz02iludj-">
         <w:r>
           <w:rPr>
             <w:rStyle w:val="Hyperlink"/>
@@ -323,7 +384,7 @@
         <w:t xml:space="preserve">Figure </w:t>
       </w:r>
       <w:r>
-        <w:t xml:space="preserve">1</w:t>
+        <w:t xml:space="preserve">1.1</w:t>
       </w:r>
       <w:r>
         <w:t xml:space="preserve">). Berry Sawmill was identified as an ideal location for a wood products campus and aggregation yard </w:t>
@@ -338,7 +399,13 @@
         <w:t xml:space="preserve">)</w:t>
       </w:r>
       <w:r>
-        <w:t xml:space="preserve">. Creating similar management entities across the West could make it easier for investors to conduct due diligence. Joint Powers Authorities may be an organizational template that can meet these needs.</w:t>
+        <w:t xml:space="preserve">. Creating similar management entities across the West could make it easier for investors to conduct due diligence. Joint Powers Authorities may be an organizational template that can meet these needs. </w:t>
+      </w:r>
+      <w:r>
+        <w:t xml:space="preserve">Swezy &amp; Oldson (2025)</w:t>
+      </w:r>
+      <w:r>
+        <w:t xml:space="preserve"> cautioned against starting new sort yards in northeast California, instead focusing on supporting existing biomass facilities, offering insurance to existing wood yards, and securing funding for a consistent pipeline of environmentally compliant (CEQA/NEPA) projects on which operators can bid.</w:t>
       </w:r>
     </w:p>
     <w:p>
@@ -402,7 +469,7 @@
           <w:b/>
           <w:bCs/>
         </w:rPr>
-        <w:t xml:space="preserve">1</w:t>
+        <w:t xml:space="preserve">1.1</w:t>
       </w:r>
       <w:r>
         <w:rPr>
@@ -415,13 +482,13 @@
         <w:t xml:space="preserve"> </w:t>
       </w:r>
       <w:r>
-        <w:t xml:space="preserve">Feasible treatment areas of Sonoma County and the location of Berry Sawmill as a feedstock aggregation site (adapted from </w:t>
+        <w:t xml:space="preserve">Feasible treatment areas of Sonoma County and the location of Berry Sawmill as a feedstock aggregation site—adapted from </w:t>
       </w:r>
       <w:r>
         <w:t xml:space="preserve">Tukman &amp; Griffith (2022)</w:t>
       </w:r>
       <w:r>
-        <w:t xml:space="preserve">).  Feasible treatment areas exclude waterways, slopes above 45%, and material that is not within sufficient proximity to roadways.</w:t>
+        <w:t xml:space="preserve">. Treatment areas exclude waterways, slopes above 45%, and biomass that is not within sufficient proximity to roadways.</w:t>
       </w:r>
     </w:p>
     <w:p>
@@ -429,36 +496,116 @@
         <w:pStyle w:val="Heading3"/>
       </w:pPr>
       <w:r>
+        <w:t xml:space="preserve">1.1.5	</w:t>
+      </w:r>
+      <w:r>
         <w:t xml:space="preserve">Joint Powers Authority</w:t>
       </w:r>
     </w:p>
     <w:p>
       <w:r>
-        <w:t xml:space="preserve">Creating Joint Powers Authorities (JPA) in some regions may be a solution to aggregate feedstock over large areas and provide it to process plants, mills, and other utilization entities. JPAs could act as brokers to facilitate long-term contracts between suppliers and processors, thereby driving investment in processing facilities. Most lenders and investors view wood product businesses as too risky without a minimum term contract of 10 years, preferably longer </w:t>
+        <w:t xml:space="preserve">Perhaps the most critical challenge to biomass utilization is establishing long-term feedstock supply contracts. For example, the USDA Forest Service, which manages 60% of California’s forests, typically allows a maximum of five years for a feedstock supply contract </w:t>
       </w:r>
       <w:r>
         <w:t xml:space="preserve">(</w:t>
       </w:r>
       <w:r>
+        <w:t xml:space="preserve">CSG, 2020</w:t>
+      </w:r>
+      <w:r>
+        <w:t xml:space="preserve">)</w:t>
+      </w:r>
+      <w:r>
+        <w:t xml:space="preserve">. The lack of long-term contracts makes investment in wood utilization businesses risky. Creating JPAs in some regions may be a solution to address this issue. JPAs could act as brokers to facilitate long-term contracts between suppliers and processors, thereby driving investment in processing facilities. Most lenders and investors view wood product businesses as too risky without a minimum term contract of 10 years, preferably longer </w:t>
+      </w:r>
+      <w:r>
+        <w:t xml:space="preserve">(</w:t>
+      </w:r>
+      <w:r>
         <w:t xml:space="preserve">Darlington &amp; Stevenson, 2023</w:t>
       </w:r>
       <w:r>
         <w:t xml:space="preserve">)</w:t>
       </w:r>
       <w:r>
-        <w:t xml:space="preserve">. As an example, the USDA Forest Service, which manages 60% of California’s forests, only allows a maximum of five years for a feedstock supply contract </w:t>
+        <w:t xml:space="preserve">.</w:t>
+      </w:r>
+    </w:p>
+    <w:p>
+      <w:r>
+        <w:t xml:space="preserve">In addition to potentially resolving this problem, JPAs also have the following benefits that may help drive economic development </w:t>
       </w:r>
       <w:r>
         <w:t xml:space="preserve">(</w:t>
       </w:r>
       <w:r>
-        <w:t xml:space="preserve">CSG, 2020</w:t>
+        <w:t xml:space="preserve">Darlington, 2025</w:t>
       </w:r>
       <w:r>
         <w:t xml:space="preserve">)</w:t>
       </w:r>
       <w:r>
-        <w:t xml:space="preserve">.</w:t>
+        <w:t xml:space="preserve">:</w:t>
+      </w:r>
+    </w:p>
+    <w:p>
+      <w:pPr>
+        <w:pStyle w:val="ListParagraph"/>
+        <w:numPr>
+          <w:ilvl w:val="0"/>
+          <w:numId w:val="11"/>
+        </w:numPr>
+      </w:pPr>
+      <w:r>
+        <w:t xml:space="preserve">Shared risk mitigation</w:t>
+      </w:r>
+    </w:p>
+    <w:p>
+      <w:pPr>
+        <w:pStyle w:val="ListParagraph"/>
+        <w:numPr>
+          <w:ilvl w:val="0"/>
+          <w:numId w:val="11"/>
+        </w:numPr>
+      </w:pPr>
+      <w:r>
+        <w:t xml:space="preserve">Improved service delivery, including contract development/management for third parties</w:t>
+      </w:r>
+    </w:p>
+    <w:p>
+      <w:pPr>
+        <w:pStyle w:val="ListParagraph"/>
+        <w:numPr>
+          <w:ilvl w:val="0"/>
+          <w:numId w:val="11"/>
+        </w:numPr>
+      </w:pPr>
+      <w:r>
+        <w:t xml:space="preserve">Cost-sharing, grant pursuit, and shared staffing</w:t>
+      </w:r>
+    </w:p>
+    <w:p>
+      <w:pPr>
+        <w:pStyle w:val="ListParagraph"/>
+        <w:numPr>
+          <w:ilvl w:val="0"/>
+          <w:numId w:val="11"/>
+        </w:numPr>
+      </w:pPr>
+      <w:r>
+        <w:t xml:space="preserve">Enhanced coordination among participating agencies, cities, and counties</w:t>
+      </w:r>
+    </w:p>
+    <w:p>
+      <w:pPr>
+        <w:pStyle w:val="ListParagraph"/>
+        <w:numPr>
+          <w:ilvl w:val="0"/>
+          <w:numId w:val="11"/>
+        </w:numPr>
+      </w:pPr>
+      <w:r>
+        <w:t xml:space="preserve">Jointly established bonds, debt, and insurance tools, and public infrastructure finance</w:t>
       </w:r>
     </w:p>
     <w:p/>
@@ -499,7 +646,7 @@
         <w:t xml:space="preserve">)</w:t>
       </w:r>
       <w:r>
-        <w:t xml:space="preserve">. A joint powers authority shares powers common to the member agencies, and those powers are outlined in the joint powers agreement. Joint powers are exercised when the public officials of greater than two agencies agree to create another legal entity or establish a joint approach to work on a common problem, fund a project, or act as a representative body for a specific activity. Examples of areas where JPAs are used commonly include groundwater management, road construction, and habitat conservation </w:t>
+        <w:t xml:space="preserve">. A joint powers authority shares powers common to the member agencies, and those powers are outlined in the joint powers agreement. Joint powers are exercised when public officials from more than two agencies agree to create a new legal entity or establish a joint approach to address a common problem, fund a project, or serve as a representative body for a specific activity. Examples of areas where JPAs are used commonly include groundwater management, road construction, and habitat conservation </w:t>
       </w:r>
       <w:r>
         <w:t xml:space="preserve">(</w:t>
@@ -517,7 +664,7 @@
     <w:p/>
     <w:p>
       <w:r>
-        <w:t xml:space="preserve">An example of a JPA being developed for feedstock aggregation is located in the northeastern corner of the state. The development of this specific JPA is a key component of the California Forest Residual Aggregation for Market Enhancement (CALFRAME) pilot, funded by the Office of Land Use and Climate Innovation. The finance strategy for a JPA is adapted from this broader effort, with more detail available from </w:t>
+        <w:t xml:space="preserve">Developing JPAs as a management entity for feedstock aggregation is a key component of the California Forest Residual Aggregation for Market Enhancement (CALFRAME) pilot, funded by the Governor’s Office of Land Use and Climate Innovation. This funding strategy for a JPA is adapted from this broader effort, with more detail available from </w:t>
       </w:r>
       <w:r>
         <w:t xml:space="preserve">Darlington &amp; Stevenson (2023)</w:t>
@@ -527,47 +674,107 @@
       </w:r>
     </w:p>
     <w:p>
+      <w:r>
+        <w:t xml:space="preserve">JPA establishment is at different levels across the state. During the establishment or modification of existing JPAs, participants have been clear about the entity’s role: to act as a critical entity for long-term feedstock supply contracts without competing for funds with other organizations, such as Resource Conservation Districts (RCDs), sawmills, or licensed timber operators (LTOs). This approach requires a realistic revenue assessment and a plan for the initial five years of operation, acknowledging that creating a stably funded JPA will be challenging given the wide fluctuations in private and public funding. But how can such an entity be funded in rural counties with low tax bases that cannot support a sales tax to develop sustainable revenue for a new entity?</w:t>
+      </w:r>
+      <w:r>
+        <w:rPr>
+          <w:rStyle w:val="FootnoteReference"/>
+        </w:rPr>
+        <w:footnoteReference w:id="3"/>
+      </w:r>
+    </w:p>
+    <w:p/>
+    <w:p>
+      <w:pPr>
+        <w:pBdr>
+          <w:left w:val="double" w:color="5D85D0"/>
+        </w:pBdr>
+        <w:shd w:color="5D85D0" w:val="solid"/>
+        <w:ind w:left="288" w:right="288"/>
+      </w:pPr>
       <w:r>
         <w:rPr>
           <w:b/>
           <w:bCs/>
-        </w:rPr>
-        <w:t xml:space="preserve">Biomass insurance from Ecostrat?</w:t>
-      </w:r>
-      <w:r>
-        <w:t xml:space="preserve"> How does this generate revenue for a JPA? </w:t>
-      </w:r>
-      <w:hyperlink w:history="1" r:id="rId6c1sub9ce9oux6hcsp0qx">
+          <w:color w:val="FFFFFF"/>
+        </w:rPr>
+        <w:t xml:space="preserve">LTO and RCD role in forest management</w:t>
+      </w:r>
+    </w:p>
+    <w:p>
+      <w:pPr>
+        <w:pBdr>
+          <w:left w:val="double" w:color="5D85D0"/>
+        </w:pBdr>
+        <w:ind w:left="288" w:right="288"/>
+      </w:pPr>
+      <w:r>
+        <w:rPr>
+          <w:b/>
+          <w:bCs/>
+        </w:rPr>
+        <w:t xml:space="preserve">Resource Conservation Districts</w:t>
+      </w:r>
+      <w:r>
+        <w:t xml:space="preserve"> (RCDs) are quasi-governmental, non-regulatory agencies based in California’s counties, providing critical resources, funding, and training to address forest health. There are approximately 40 RCDs with forestry programs that focus on implementing thinning, prescribed fire, and providing technical assistance to private landowners, as well as collaborating with other organizations (</w:t>
+      </w:r>
+      <w:hyperlink w:history="1" r:id="rIdsovsxaukpbnxuqrndmj1n">
         <w:r>
           <w:rPr>
             <w:rStyle w:val="Hyperlink"/>
           </w:rPr>
-          <w:t xml:space="preserve">https://​ecostrat​.com​/feedstock​-supply​-insurance</w:t>
+          <w:t xml:space="preserve">CARCD</w:t>
         </w:r>
       </w:hyperlink>
-    </w:p>
-    <w:p>
-      <w:r>
-        <w:t xml:space="preserve">In establishing the JPA, partners have been clear about its role: to act as a critical entity for wood utilization without competing for funds with other organizations, such as Resource Conservation Districts (RCDs), sawmills, or licensed timber operators (LTOs). This approach requires a realistic revenue assessment and a plan for the initial five years of operation, acknowledging that creating a stably funded JPA will be challenging given the wide fluctuations in private and public funding. But how can such an entity be funded in rural counties with low tax bases that cannot support a sales tax to develop sustainable revenue for a new entity?</w:t>
-      </w:r>
-      <w:r>
-        <w:rPr>
-          <w:rStyle w:val="FootnoteReference"/>
-        </w:rPr>
-        <w:footnoteReference w:id="2"/>
-      </w:r>
-    </w:p>
+      <w:r>
+        <w:t xml:space="preserve">).</w:t>
+      </w:r>
+    </w:p>
+    <w:p>
+      <w:pPr>
+        <w:pBdr>
+          <w:left w:val="double" w:color="5D85D0"/>
+        </w:pBdr>
+        <w:ind w:left="288" w:right="288"/>
+      </w:pPr>
+      <w:r>
+        <w:rPr>
+          <w:b/>
+          <w:bCs/>
+        </w:rPr>
+        <w:t xml:space="preserve">Licensed Timber Operators</w:t>
+      </w:r>
+      <w:r>
+        <w:t xml:space="preserve"> (LTOs) are the loggers licensed to operate forestry operations in the state of California. They are licensed under the state’s Forest Practice Act Law and authorized to conduct tree cutting and removal (</w:t>
+      </w:r>
+      <w:hyperlink w:history="1" r:id="rIdntsd9k9lwprao2fgv5ecz">
+        <w:r>
+          <w:rPr>
+            <w:rStyle w:val="Hyperlink"/>
+          </w:rPr>
+          <w:t xml:space="preserve">CAL FIRE</w:t>
+        </w:r>
+      </w:hyperlink>
+      <w:r>
+        <w:t xml:space="preserve">). During the past decade, LTOs have been critical to carrying out forest health projects funded by CAL FIRE and others to reduce wildfire risk and improve forest resilience. Their limited numbers have at times curtailed forest health projects.</w:t>
+      </w:r>
+    </w:p>
+    <w:p/>
     <w:p>
       <w:pPr>
         <w:pStyle w:val="Heading2"/>
       </w:pPr>
       <w:r>
+        <w:t xml:space="preserve">1.2	</w:t>
+      </w:r>
+      <w:r>
         <w:t xml:space="preserve">Funding Options</w:t>
       </w:r>
     </w:p>
     <w:p>
       <w:r>
-        <w:t xml:space="preserve">The abundance of state and federal funding over the past five years has meant many agencies and organizations depend on grant funding for implementing restoration and infrastructure projects. Trump administration cuts in 2025 demonstrate the vulnerability of relying too heavily on grant funding. Many nonprofits are familiar with the cyclic nature of many funding sources.</w:t>
+        <w:t xml:space="preserve">The abundance of state and federal funding over the past five years has led many agencies and organizations to rely heavily on grant funding for implementing restoration and infrastructure projects. The Trump administration’s cuts in 2025, or the periodic surplus/deficit of California state funding, demonstrate the vulnerability of grant funding dependence. Many organizations are familiar with the cyclical nature of funding sources and seek to create more dependable, even-keeled funding streams, although grants can often complement stable revenue streams.</w:t>
       </w:r>
     </w:p>
     <w:p>
@@ -575,21 +782,24 @@
         <w:pStyle w:val="Heading3"/>
       </w:pPr>
       <w:r>
+        <w:t xml:space="preserve">1.2.1	</w:t>
+      </w:r>
+      <w:r>
         <w:t xml:space="preserve">Traditional</w:t>
       </w:r>
     </w:p>
     <w:p>
       <w:r>
-        <w:t xml:space="preserve">The Northeast California CAL FRAME project recognized the need for grant funding to initiate a JPA and acknowledged the need for additional funding sources that can sustainably support a JPA over time. These are described below and summarized in (</w:t>
+        <w:t xml:space="preserve">Many of the Office of Land Use and Climate Innovation’s feedstock aggregation pilots recognized the need for long-term funding sources and that grants are not a dependable resource to maintain an organization over time. Traditional funding sources are many, and a blended portfolio should help weather changes in grant cycles and tap into funding sources that can provide steady revenue. These options are described below, with the pluses and minuses of each summarized in (</w:t>
       </w:r>
       <w:r>
         <w:t xml:space="preserve">Table </w:t>
       </w:r>
       <w:r>
-        <w:t xml:space="preserve">1</w:t>
-      </w:r>
-      <w:r>
-        <w:t xml:space="preserve">).</w:t>
+        <w:t xml:space="preserve">1.1</w:t>
+      </w:r>
+      <w:r>
+        <w:t xml:space="preserve">). Other revenue sources, such as climate bond funding, agency funding, and legislative action, are also available, but their outcomes tend to be grant-based and temporary.</w:t>
       </w:r>
     </w:p>
     <w:p>
@@ -597,7 +807,7 @@
         <w:pStyle w:val="ListParagraph"/>
         <w:numPr>
           <w:ilvl w:val="0"/>
-          <w:numId w:val="10"/>
+          <w:numId w:val="12"/>
         </w:numPr>
       </w:pPr>
       <w:r>
@@ -608,7 +818,7 @@
         <w:t xml:space="preserve">Endowment</w:t>
       </w:r>
       <w:r>
-        <w:t xml:space="preserve">. Create an endowment from the OPR funding tranche (plus other contributions) and invest it conservatively. Interest or gains from the principal would partially fund a JPA.</w:t>
+        <w:t xml:space="preserve">. In the case of the feedstock aggregation pilots, the Office of Land Use and Climate Change Innovation provided a funding tranche to kickstart JPA creation. This funding could be used to create an endowment or, at the very least, seed an endowment that could provide a steady source of unrestricted revenue if invested wisely. Other JPAs could do the same with an initial foundation grant or a campaign to raise sufficient funds to start an endowment.</w:t>
       </w:r>
     </w:p>
     <w:p>
@@ -616,7 +826,7 @@
         <w:pStyle w:val="ListParagraph"/>
         <w:numPr>
           <w:ilvl w:val="0"/>
-          <w:numId w:val="10"/>
+          <w:numId w:val="12"/>
         </w:numPr>
       </w:pPr>
       <w:r>
@@ -627,7 +837,29 @@
         <w:t xml:space="preserve">Contributions</w:t>
       </w:r>
       <w:r>
-        <w:t xml:space="preserve">. Although the McConnell Foundation is an eventual, not immediate donor, casting a wider net at the state or Western Region level for foundations, corporations, and individuals that could give to a JPA is warranted. We suggest that rather than considering the contributions as grants to support a JPA, the Pilot Project Team should consider creating a campaign with a specific fundraising amount to start. This approach will make it easier to approach each donor with a specific amount to ask, involve donors in the overall campaign, and make smaller contributions from individuals more meaningful and achievable. We also recommend that initial contributions go to endowment creation.</w:t>
+        <w:t xml:space="preserve">. A capital campaign to raise awareness about a JPA and generate individual, corporate, and foundation grants would complement any secured funds. Match from non-public sources often makes grant applications more competitive. A well-defined JPA strategy that clearly outlines the mission, programs, and projects is crucial for focusing funding requests. Similarly, for any grant application, it prioritizes which funding to pursue </w:t>
+      </w:r>
+      <w:r>
+        <w:t xml:space="preserve">(</w:t>
+      </w:r>
+      <w:r>
+        <w:t xml:space="preserve">Russell </w:t>
+      </w:r>
+      <w:r>
+        <w:rPr>
+          <w:i/>
+          <w:iCs/>
+        </w:rPr>
+        <w:t xml:space="preserve">et al.</w:t>
+      </w:r>
+      <w:r>
+        <w:t xml:space="preserve">, 2024</w:t>
+      </w:r>
+      <w:r>
+        <w:t xml:space="preserve">)</w:t>
+      </w:r>
+      <w:r>
+        <w:t xml:space="preserve">. Capital or general campaigns can be an excellent vehicle to drive individual donations and raise awareness about the importance of the issue at hand.</w:t>
       </w:r>
     </w:p>
     <w:p>
@@ -635,7 +867,7 @@
         <w:pStyle w:val="ListParagraph"/>
         <w:numPr>
           <w:ilvl w:val="0"/>
-          <w:numId w:val="10"/>
+          <w:numId w:val="12"/>
         </w:numPr>
       </w:pPr>
       <w:r>
@@ -646,7 +878,7 @@
         <w:t xml:space="preserve">Federal and State Grants</w:t>
       </w:r>
       <w:r>
-        <w:t xml:space="preserve">. It is unlikely that a JPA will receive operational funding from state and federal grants, but any proposals it leads or participates in could charge overhead (~10%) plus directly bill salaries to cover some operating costs. Negotiating a higher indirect, or NICRA, rate to increase this value through a grant could be another long-term strategy to boost operating cost revenues.</w:t>
+        <w:t xml:space="preserve">. It is unlikely that a JPA will receive significant operational funding from state and federal grants, but any proposals it leads or participates in could charge overhead (~10%) plus directly bill salaries to cover some operating costs related to the grant. A negotiated indirect cost rate agreement, or NICRA, to increase this value through public grants could be another approach to boost operating cost revenues.</w:t>
       </w:r>
     </w:p>
     <w:p>
@@ -654,7 +886,7 @@
         <w:pStyle w:val="ListParagraph"/>
         <w:numPr>
           <w:ilvl w:val="0"/>
-          <w:numId w:val="10"/>
+          <w:numId w:val="12"/>
         </w:numPr>
       </w:pPr>
       <w:r>
@@ -665,7 +897,7 @@
         <w:t xml:space="preserve">Member Contributions</w:t>
       </w:r>
       <w:r>
-        <w:t xml:space="preserve">. RCD and other feedstock aggregation members pay $5k/yr to participate in the program. This would be unrestricted funding for a JPA.</w:t>
+        <w:t xml:space="preserve">. JPA members or beneficiaries, such as RCDs, pay an annual cost to participate in the feedstock aggregation program. Membership would provide consistent revenue and encourage the member organizations to be involved in the development and success of the JPA.</w:t>
       </w:r>
     </w:p>
     <w:p>
@@ -673,7 +905,7 @@
         <w:pStyle w:val="ListParagraph"/>
         <w:numPr>
           <w:ilvl w:val="0"/>
-          <w:numId w:val="10"/>
+          <w:numId w:val="12"/>
         </w:numPr>
       </w:pPr>
       <w:r>
@@ -681,10 +913,10 @@
           <w:b/>
           <w:bCs/>
         </w:rPr>
-        <w:t xml:space="preserve">Fee for Service</w:t>
-      </w:r>
-      <w:r>
-        <w:t xml:space="preserve">. Western Shasta RCD, for example, works with nonindustrial forest owners and provides services for forest management plans with small forested LOs (The State funds the development of FMPs, but landowners cannot secure funds to implement the plans). JPA could offer a similar service. However, it must ensure it does not compete with the region’s RCDs.</w:t>
+        <w:t xml:space="preserve">Fee-for-service</w:t>
+      </w:r>
+      <w:r>
+        <w:t xml:space="preserve">. Charging fees for forest management, timber harvest plans, feedstock contracts, or grant administration, depending on the skills of the JPA staff, could be another way to generate a steady income source. Western Shasta RCD, for example, works with non-industrial forest owners to develop forest management plans. The State can fund the development of forest management plans for private landowners. A JPA could offer similar services as long as it does not compete with RCDs in the region.</w:t>
       </w:r>
     </w:p>
     <w:p>
@@ -692,7 +924,7 @@
         <w:pStyle w:val="ListParagraph"/>
         <w:numPr>
           <w:ilvl w:val="0"/>
-          <w:numId w:val="10"/>
+          <w:numId w:val="12"/>
         </w:numPr>
       </w:pPr>
       <w:r>
@@ -703,7 +935,7 @@
         <w:t xml:space="preserve">Sort yards</w:t>
       </w:r>
       <w:r>
-        <w:t xml:space="preserve">. Managing a sort yard for aggregated feedstock would be a strategic revenue source. This would require a substantial investment in equipment and a suitable site. See the budget for a cost breakdown. A feasibility study would help understand the total costs, potential revenue, and risk reduction associated with the yard.</w:t>
+        <w:t xml:space="preserve">. Managing a sort yard for aggregated feedstock could be a strategic revenue source. Note that feedstock aggregation and sort yards should not be conflated, nor should the creation of JPAs be thought of as sort yard managers. A sort yard may be one strategy for income generation, but it not necessarily connected to the goal of a feedstock aggregation JPA, which is to broker long-term supply contracts.</w:t>
       </w:r>
     </w:p>
     <w:p>
@@ -722,7 +954,7 @@
           <w:b/>
           <w:bCs/>
         </w:rPr>
-        <w:t xml:space="preserve">1</w:t>
+        <w:t xml:space="preserve">1.1</w:t>
       </w:r>
       <w:r>
         <w:rPr>
@@ -735,7 +967,7 @@
         <w:t xml:space="preserve"> </w:t>
       </w:r>
       <w:r>
-        <w:t xml:space="preserve">Analysis of funding types appropriate to aggregation JPAs. Timing roughly refers to the amount of time required to generate income. Difficulty is a qualitative scale ranging from 1 (easiest to secure) to 5 (most difficult).</w:t>
+        <w:t xml:space="preserve">Analysis of funding types suitable for aggregation JPAs. Timing roughly refers to the amount of time required to generate income. Difficulty is a qualitative scale ranging from 1 (easiest to secure) to 5 (most difficult). Note that sort yards are not to be conflated with JPA creation or feedstock aggregation.</w:t>
       </w:r>
     </w:p>
     <w:tbl>
@@ -905,7 +1137,7 @@
         <w:tc>
           <w:p>
             <w:r>
-              <w:t xml:space="preserve">Public grants may take up to 1 year to contracting from proposal submittal</w:t>
+              <w:t xml:space="preserve">Public grants may take a long time from proposal to contract execution</w:t>
             </w:r>
           </w:p>
         </w:tc>
@@ -978,7 +1210,7 @@
         <w:tc>
           <w:p>
             <w:r>
-              <w:t xml:space="preserve">Staffing, uneveness of demand</w:t>
+              <w:t xml:space="preserve">Staffing, unevenness of demand</w:t>
             </w:r>
           </w:p>
         </w:tc>
@@ -1025,7 +1257,7 @@
         <w:tc>
           <w:p>
             <w:r>
-              <w:t xml:space="preserve">Permitting and capacity building may take a long time</w:t>
+              <w:t xml:space="preserve">Permitting and capacity building take time.</w:t>
             </w:r>
           </w:p>
         </w:tc>
@@ -1048,356 +1280,172 @@
         <w:pStyle w:val="Heading3"/>
       </w:pPr>
       <w:r>
-        <w:t xml:space="preserve">Temporal Adoption</w:t>
-      </w:r>
-    </w:p>
-    <w:p>
-      <w:r>
-        <w:t xml:space="preserve">In general, the feasible options identified are traditional and similar to funding approaches for an RCD or nonprofit.</w:t>
-      </w:r>
-    </w:p>
-    <w:p>
-      <w:pPr>
-        <w:pStyle w:val="ListParagraph"/>
-        <w:numPr>
-          <w:ilvl w:val="0"/>
-          <w:numId w:val="11"/>
-        </w:numPr>
-      </w:pPr>
-      <w:r>
-        <w:t xml:space="preserve">New finance options, such as environmental impact bonds, could be introduced over a longer period and trialed at a small scale, then scale up when successful. These could also include other financial mechanisms, such as revolving loan funds (offering low-interest loans), public-private partnerships, or bonds.</w:t>
-      </w:r>
-    </w:p>
-    <w:p>
-      <w:pPr>
-        <w:pStyle w:val="ListParagraph"/>
-        <w:numPr>
-          <w:ilvl w:val="0"/>
-          <w:numId w:val="11"/>
-        </w:numPr>
-      </w:pPr>
-      <w:r>
-        <w:t xml:space="preserve">Other revenue-generating options could be tested in the same manner to ensure their effectiveness and introduce them to skeptical participants, financial managers, or government entities that are not used to working with alternative finance options.</w:t>
-      </w:r>
-    </w:p>
-    <w:p>
-      <w:pPr>
-        <w:pStyle w:val="Heading3"/>
-      </w:pPr>
-      <w:r>
-        <w:t xml:space="preserve">Collaborative Finance</w:t>
-      </w:r>
-    </w:p>
-    <w:p>
-      <w:hyperlink w:history="1" r:id="rIdrfy7gyd_rs5fa8_9mwvpm">
-        <w:r>
-          <w:rPr>
-            <w:rStyle w:val="Hyperlink"/>
-          </w:rPr>
-          <w:t xml:space="preserve">Collaborative finance</w:t>
-        </w:r>
-      </w:hyperlink>
-      <w:r>
-        <w:t xml:space="preserve"> is a conservation finance strategy that involves cooperative interaction between individual project developers, stakeholders, and finance providers. This process may or may not include traditional financial institutions.</w:t>
-      </w:r>
-      <w:r>
-        <w:rPr>
-          <w:rStyle w:val="FootnoteReference"/>
-        </w:rPr>
-        <w:footnoteReference w:id="3"/>
-      </w:r>
-      <w:r>
-        <w:t xml:space="preserve"> The term can be broadened to include finance developed through the fair and equitable participation of stakeholders in a region, landscape, or watershed, addressing natural resource and infrastructure management needs, and utilizing multiple forms of funding, from public grants to private investment. Finance approaches may include outcomes-based finance models such as environmental impact bonds.</w:t>
-      </w:r>
-      <w:r>
-        <w:rPr>
-          <w:rStyle w:val="FootnoteReference"/>
-        </w:rPr>
-        <w:footnoteReference w:id="4"/>
-      </w:r>
-    </w:p>
-    <w:p/>
-    <w:p>
-      <w:pPr>
-        <w:pBdr>
-          <w:left w:val="double" w:color="5D85D0"/>
-        </w:pBdr>
-        <w:shd w:color="5D85D0" w:val="solid"/>
-        <w:ind w:left="288" w:right="288"/>
+        <w:t xml:space="preserve">1.2.2	</w:t>
+      </w:r>
+      <w:r>
+        <w:t xml:space="preserve">Endowment Analysis</w:t>
+      </w:r>
+    </w:p>
+    <w:p>
+      <w:r>
+        <w:t xml:space="preserve">Endowment-based funding represents a promising and underutilized strategy for ensuring the long-term financial sustainability of Joint Powers Authorities (JPAs) engaged in forest health and feedstock aggregation. Unlike grant-dependent models, which are vulnerable to the cyclical nature of public budgets and shifting political priorities, endowments can provide a stable and predictable revenue stream. Endowments may be the most strategic way to fund JPAs, especially since some may struggle to garner grant funding in the future, given their long-term feedstock supply contract focus.</w:t>
+      </w:r>
+    </w:p>
+    <w:p>
+      <w:pPr>
+        <w:pStyle w:val="Heading4"/>
+      </w:pPr>
+      <w:r>
+        <w:t xml:space="preserve">How it Works</w:t>
+      </w:r>
+    </w:p>
+    <w:p>
+      <w:r>
+        <w:t xml:space="preserve">By investing a substantial principal—such as an initial gift of $10 million—and supplementing it with modest annual contributions, a JPA can generate consistent income to support core operations, staffing, and potentially even programmatic expansion (</w:t>
+      </w:r>
+      <w:r>
+        <w:t xml:space="preserve">Figure </w:t>
+      </w:r>
+      <w:r>
+        <w:t xml:space="preserve">1.2</w:t>
+      </w:r>
+      <w:r>
+        <w:t xml:space="preserve">). The administrative burden and ongoing costs associated with managing an endowment are typically lower than those required for continuous grant writing and reporting, making this approach attractive for organizations seeking to minimize overhead.</w:t>
+      </w:r>
+    </w:p>
+    <w:p>
+      <w:pPr>
+        <w:jc w:val="center"/>
+      </w:pPr>
+      <w:r>
+        <w:drawing>
+          <wp:inline distT="0" distB="0" distL="0" distR="0">
+            <wp:extent cx="4000500" cy="3856038"/>
+            <wp:effectExtent b="0" l="0" r="0" t="0"/>
+            <wp:docPr id="2" name="" descr="" title=""/>
+            <wp:cNvGraphicFramePr>
+              <a:graphicFrameLocks xmlns:a="http://schemas.openxmlformats.org/drawingml/2006/main" noChangeAspect="1"/>
+            </wp:cNvGraphicFramePr>
+            <a:graphic xmlns:a="http://schemas.openxmlformats.org/drawingml/2006/main">
+              <a:graphicData uri="http://schemas.openxmlformats.org/drawingml/2006/picture">
+                <pic:pic xmlns:pic="http://schemas.openxmlformats.org/drawingml/2006/picture">
+                  <pic:nvPicPr>
+                    <pic:cNvPr id="0" name="" descr=""/>
+                    <pic:cNvPicPr>
+                      <a:picLocks noChangeAspect="1" noChangeArrowheads="1"/>
+                    </pic:cNvPicPr>
+                  </pic:nvPicPr>
+                  <pic:blipFill>
+                    <a:blip r:embed="rId8" cstate="none"/>
+                    <a:srcRect/>
+                    <a:stretch>
+                      <a:fillRect/>
+                    </a:stretch>
+                  </pic:blipFill>
+                  <pic:spPr bwMode="auto">
+                    <a:xfrm>
+                      <a:off x="0" y="0"/>
+                      <a:ext cx="4000500" cy="3856038"/>
+                    </a:xfrm>
+                    <a:prstGeom prst="rect">
+                      <a:avLst/>
+                    </a:prstGeom>
+                  </pic:spPr>
+                </pic:pic>
+              </a:graphicData>
+            </a:graphic>
+          </wp:inline>
+        </w:drawing>
+      </w:r>
+    </w:p>
+    <w:p>
+      <w:pPr>
+        <w:pStyle w:val="Caption"/>
       </w:pPr>
       <w:r>
         <w:rPr>
           <w:b/>
           <w:bCs/>
-          <w:color w:val="FFFFFF"/>
-        </w:rPr>
-        <w:t xml:space="preserve">New Funding Options</w:t>
-      </w:r>
-    </w:p>
-    <w:p>
-      <w:pPr>
-        <w:pBdr>
-          <w:left w:val="double" w:color="5D85D0"/>
-        </w:pBdr>
-        <w:ind w:left="288" w:right="288"/>
-      </w:pPr>
+        </w:rPr>
+        <w:t xml:space="preserve">Figure </w:t>
+      </w:r>
       <w:r>
         <w:rPr>
           <w:b/>
           <w:bCs/>
         </w:rPr>
-        <w:t xml:space="preserve">New Finance Options</w:t>
-      </w:r>
-      <w:r>
-        <w:t xml:space="preserve">
-Conservation finance options include environmental impact bonds, such as Blue Forest’s Forest Resilience Bond, which leverages private investment from impact investors to support forest health projects. Repayment to investors is supported over time by beneficiaries based on the savings and benefits from reduced wildfire risks and improved ecosystem services. A JPA could utilize environmental impact bonds on a trial basis at a small scale and then expand over an extended period. Identifying potential payor entities interested in covering the avoided costs of wildfire through proactive measures, such as thinning and prescribed fire, is worth pursuing immediately or as soon as an executive director is hired.</w:t>
-      </w:r>
-    </w:p>
-    <w:p>
-      <w:pPr>
-        <w:pBdr>
-          <w:left w:val="double" w:color="5D85D0"/>
-        </w:pBdr>
-        <w:ind w:left="288" w:right="288"/>
-      </w:pPr>
-      <w:r>
-        <w:t xml:space="preserve">We do not recommend relying solely on impact bonds, as they take a lengthy time to develop and rely on a payor to provide avoided cost funding. However, a bond could be a valuable complementary funding resource to other secured revenues. Other ‘newer’ finance options could include the following:</w:t>
-      </w:r>
-    </w:p>
-    <w:p>
-      <w:pPr>
-        <w:pBdr>
-          <w:left w:val="double" w:color="5D85D0"/>
-        </w:pBdr>
-        <w:ind w:left="288" w:right="288"/>
-      </w:pPr>
+        <w:t xml:space="preserve">1.2</w:t>
+      </w:r>
       <w:r>
         <w:rPr>
           <w:b/>
           <w:bCs/>
         </w:rPr>
-        <w:t xml:space="preserve">Carbon Markets</w:t>
-      </w:r>
-      <w:r>
-        <w:t xml:space="preserve">
-Carbon markets provide an opportunity to secure funding for on-the-ground forest management activities, including thinning, pruning, mastication, mechanical treatment, and prescribed burning. Revenue realized through the carbon market could help a JPA to treat more forest land than otherwise possible and generate additional biomass that could be put under supply contracts to support existing and emerging infrastructure. Market prices for carbon credits vary depending on a given project’s size and location, treatment type, and the carbon market or registry used. Carbon credits can be realized for projects of any size and located on federal, state, and private lands. Refer to the Avoided Wildfire Emissions Protocol section for an alternative approach that is easier to implement than carbon sequestration credits or markets, as the avoided costs are already calculated, and proponents do not need to seek an entity to purchase the credits.</w:t>
-      </w:r>
-    </w:p>
-    <w:p>
-      <w:pPr>
-        <w:pBdr>
-          <w:left w:val="double" w:color="5D85D0"/>
-        </w:pBdr>
-        <w:ind w:left="288" w:right="288"/>
-      </w:pPr>
-      <w:r>
-        <w:t xml:space="preserve">The National Forest Foundation implemented several voluntary carbon projects in California and the West following wildfires. Funded by corporate donors, the projects created carbon based on growth trajectories of planted trees. The credits were registered with the American Carbon Registry but were immediately retired upon creation, as trading carbon on public lands is prohibited.</w:t>
-      </w:r>
-    </w:p>
-    <w:p>
-      <w:pPr>
-        <w:pBdr>
-          <w:left w:val="double" w:color="5D85D0"/>
-        </w:pBdr>
-        <w:ind w:left="288" w:right="288"/>
+        <w:t xml:space="preserve">:</w:t>
+      </w:r>
+      <w:r>
+        <w:t xml:space="preserve"> </w:t>
+      </w:r>
+      <w:r>
+        <w:t xml:space="preserve">Endowment operations and potential earnings over 10 years with a 7% return, 4% annual spending rate, and 0.2% administrative fees. The total return over 10 years is estimated to be 32%. Withdrawals would be from interest earned from the principal. Returns may be lower or higher than 6% so the investment may increase or decrease more or less than the linear increase indicated in the chart. Graphic adapted from </w:t>
+      </w:r>
+      <w:r>
+        <w:t xml:space="preserve">Synchronicity Earth (2025)</w:t>
+      </w:r>
+      <w:r>
+        <w:t xml:space="preserve">.</w:t>
+      </w:r>
+    </w:p>
+    <w:p>
+      <w:r>
+        <w:br/>
+        <w:t xml:space="preserve">Financial calculations demonstrate the power of the initial investment over time compared to annual grants or allocations. With a conservative annual return of 7%, a spending rate of 4%, and an administrative fee of 0.2%, an endowment of $10 mn  could yield approximately $400,000 in its first year, with annual income rising to nearly $448,000 by year 5 (</w:t>
+      </w:r>
+      <w:r>
+        <w:t xml:space="preserve">Table </w:t>
+      </w:r>
+      <w:r>
+        <w:t xml:space="preserve">1.2</w:t>
+      </w:r>
+      <w:r>
+        <w:t xml:space="preserve">). This steady growth not only insulates a JPA from the volatility of state surpluses and deficits but also frames endowment funding as a long-term cost-avoidance strategy for public agencies and private donors alike. By establishing a robust endowment, JPAs can ensure operational continuity, attract and retain skilled staff, and maintain the flexibility needed to respond to emerging challenges in forest management and wildfire mitigation.</w:t>
+      </w:r>
+    </w:p>
+    <w:p>
+      <w:r>
+        <w:t xml:space="preserve">To calculate the required endowments, we estimated 5-year returns with a 4% annual spending and a modest 7% annual return. A 0.2% administrative fee and an additional $5,000/yr in individual contributions were factored into the return calculations. We set each endowment to the closest $100,000 that created a 5-year return exceeding the estimated 5-year budget created by each pilot team.</w:t>
+      </w:r>
+    </w:p>
+    <w:p>
+      <w:pPr>
+        <w:pStyle w:val="Caption"/>
       </w:pPr>
       <w:r>
         <w:rPr>
           <w:b/>
           <w:bCs/>
         </w:rPr>
-        <w:t xml:space="preserve">Avoided Wildfire Emissions</w:t>
-      </w:r>
-      <w:r>
-        <w:t xml:space="preserve">
-The Spatial Informatics Group and Element Markets developed a forecast methodology under the Climate Forward program to recognize the climate benefits associated with fuel treatment activities that reduce the risk of catastrophic forest fires and their associated emissions. Known as the Avoided Wildfire Emissions Forecast Methodology, the Climate Action Reserve protocol could provide complementary funding for thinning and prescribed fire projects to grants and private investments. The Protocol differs from carbon offsets in that forecasted mitigation units (FMUs) are issued for forecasted greenhouse gas reductions or removals. FMUs are used to mitigate anticipated future emissions, such as wildfires.</w:t>
-      </w:r>
-    </w:p>
-    <w:p>
-      <w:pPr>
-        <w:pBdr>
-          <w:left w:val="double" w:color="5D85D0"/>
-        </w:pBdr>
-        <w:ind w:left="288" w:right="288"/>
-      </w:pPr>
+        <w:t xml:space="preserve">Table </w:t>
+      </w:r>
       <w:r>
         <w:rPr>
           <w:b/>
           <w:bCs/>
         </w:rPr>
-        <w:t xml:space="preserve">Embodied Carbon</w:t>
-      </w:r>
-      <w:r>
-        <w:t xml:space="preserve">
-Although it may be several years from implementation, developing and marketing low-carbon building materials is another new opportunity. Buildings are a significant source of greenhouse gas emissions, making building decarbonization a California state priority. Embodied carbon is the lifecycle of greenhouse gas emissions from creating, transporting, and disposing of building materials (Carbon Leadership Forum, 2022). In other words, embodied carbon is any building’s carbon footprint contained in its building materials. It differs from operational carbon, the carbon produced by a building’s energy, heat, and lighting. The California Air Resources Board is developing a comprehensive strategy for embodied carbon and is seeking comments following the signing of ABs 2446 and 43.</w:t>
-      </w:r>
-    </w:p>
-    <w:p>
-      <w:pPr>
-        <w:pBdr>
-          <w:left w:val="double" w:color="5D85D0"/>
-        </w:pBdr>
-        <w:ind w:left="288" w:right="288"/>
-      </w:pPr>
+        <w:t xml:space="preserve">1.2</w:t>
+      </w:r>
       <w:r>
         <w:rPr>
           <w:b/>
           <w:bCs/>
         </w:rPr>
-        <w:t xml:space="preserve">Revolving Loan Funds</w:t>
-      </w:r>
-      <w:r>
-        <w:t xml:space="preserve">
-Pooled funding sources such as impact bonds or revolving loan funds can help make a greater amount of funds available to more projects across a landscape. Typically offered at lower-than-market interest rates, revolving loan funds are self-replenishing pools of money that utilize principal and interest payments on existing loans to issue new loans. They have been used effectively on small to large scale to develop businesses, assist healthcare, and improve environmental outcomes. Revolving loan funds also provide much-needed upfront capital for project startups. They are flexible and can be used in conjunction with more conventional funds, such as grants and loans.</w:t>
-      </w:r>
-    </w:p>
-    <w:p>
-      <w:pPr>
-        <w:pBdr>
-          <w:left w:val="double" w:color="5D85D0"/>
-        </w:pBdr>
-        <w:ind w:left="288" w:right="288"/>
-      </w:pPr>
-      <w:r>
-        <w:t xml:space="preserve">For example, through a coalition of public and private partners, the Southwest Wildfire Impact Fund intends to utilize resources from private investors and revenues from biomass generated from forest thinning to offset the financial burden for wildfire mitigation in the San Juan National Forest wildland-urban interface. The project fosters regional collaboration through shared project financing and implementation. It also creates the opportunity for scaling up forest treatments and fire reduction by creating a revolving loan fund that reinvests proceeds into additional projects, ensuring that capital is available for long-term re-treatment and expansion of forest health interventions.</w:t>
-      </w:r>
-    </w:p>
-    <w:p>
-      <w:pPr>
-        <w:pBdr>
-          <w:left w:val="double" w:color="5D85D0"/>
-        </w:pBdr>
-        <w:ind w:left="288" w:right="288"/>
-      </w:pPr>
-      <w:r>
-        <w:t xml:space="preserve">Blue Forest is operating a revolving loan fund called the California Wildfire Innovation Fund, which could expand into broader support for other forest health entities.</w:t>
-      </w:r>
-    </w:p>
-    <w:p>
-      <w:pPr>
-        <w:pBdr>
-          <w:left w:val="double" w:color="5D85D0"/>
-        </w:pBdr>
-        <w:ind w:left="288" w:right="288"/>
-      </w:pPr>
-      <w:r>
-        <w:rPr>
-          <w:b/>
-          <w:bCs/>
-        </w:rPr>
-        <w:t xml:space="preserve">Parametric Insurance</w:t>
-      </w:r>
-      <w:r>
-        <w:t xml:space="preserve">
-Parametric or index-based insurance covers the probability of a predefined event instead of indemnifying actual loss incurred </w:t>
-      </w:r>
-      <w:r>
-        <w:t xml:space="preserve">(</w:t>
-      </w:r>
-      <w:r>
-        <w:t xml:space="preserve">Re, 2023</w:t>
-      </w:r>
-      <w:r>
-        <w:t xml:space="preserve">)</w:t>
-      </w:r>
-      <w:r>
-        <w:t xml:space="preserve">. These so-called trigger events are typically disaster-related (e.g., wildfires, flooding, hurricanes, earthquakes) and are measured through triggers such as wind speed, quake magnitude, acres burned or burn severity, or rainfall amount. Insurable triggers are modeled and must happen by chance. When the triggers are reached, a predetermined pay-out is made regardless of the sustained physical losses. Parametric insurance is meant to complement existing indemnity insurance but is increasingly used for post-disaster restoration funding in the natural world.</w:t>
-      </w:r>
-    </w:p>
-    <w:p>
-      <w:pPr>
-        <w:pBdr>
-          <w:left w:val="double" w:color="5D85D0"/>
-        </w:pBdr>
-        <w:ind w:left="288" w:right="288"/>
-      </w:pPr>
-      <w:r>
-        <w:t xml:space="preserve">One of the earliest examples of parametric insurance used for nature recovery is the Mesoamerican Reef parametric insurance that provided $800,000 for reef restoration following Hurricane Delta. The trigger was windspeed with a parameter greater than 100 knots. The funds came from the </w:t>
-      </w:r>
-      <w:hyperlink w:history="1" r:id="rIdpfgtjy8cnvef2sm9eg_qc">
-        <w:r>
-          <w:rPr>
-            <w:rStyle w:val="Hyperlink"/>
-          </w:rPr>
-          <w:t xml:space="preserve">Coastal Zone Management Trust</w:t>
-        </w:r>
-      </w:hyperlink>
-      <w:r>
-        <w:t xml:space="preserve">. Using insurance to protect forests and communities, likely through wildfire risk mitigation, could be a novel way to fund activities throughout the region and provide complementary funds that could be particularly valuable post-fire.</w:t>
-      </w:r>
-    </w:p>
-    <w:p>
-      <w:pPr>
-        <w:pBdr>
-          <w:left w:val="double" w:color="5D85D0"/>
-        </w:pBdr>
-        <w:ind w:left="288" w:right="288"/>
-      </w:pPr>
-      <w:r>
-        <w:rPr>
-          <w:b/>
-          <w:bCs/>
-        </w:rPr>
-        <w:t xml:space="preserve">Tech-based Solutions</w:t>
-      </w:r>
-      <w:r>
-        <w:t xml:space="preserve">
-The technology could help to connect funders to a new JPA. Blockchain and digital solutions have mostly been applied to reforestation and carbon sequestration projects. It may be possible to establish a digital marketplace where funders and implementers can connect and collaborate on implementing forest health restoration and infrastructure projects. Developing a platform for aggregated funding could be part of a funded project or developed in tandem rather than as a standalone initiative.</w:t>
-      </w:r>
-    </w:p>
-    <w:p/>
-    <w:p>
-      <w:pPr>
-        <w:pStyle w:val="Heading2"/>
-      </w:pPr>
-      <w:r>
-        <w:t xml:space="preserve">Budget</w:t>
-      </w:r>
-    </w:p>
-    <w:p>
-      <w:r>
-        <w:t xml:space="preserve">CAL FRAME partners estimated an approximate annual budget averaging $400,000 during the 1st three years of operation and based on similar operating expenses for RCDs in the region (</w:t>
-      </w:r>
-      <w:r>
-        <w:t xml:space="preserve">Table </w:t>
-      </w:r>
-      <w:r>
-        <w:t xml:space="preserve">2</w:t>
-      </w:r>
-      <w:r>
-        <w:t xml:space="preserve">).</w:t>
-      </w:r>
-    </w:p>
-    <w:p>
-      <w:pPr>
-        <w:pStyle w:val="Caption"/>
-      </w:pPr>
-      <w:r>
-        <w:rPr>
-          <w:b/>
-          <w:bCs/>
-        </w:rPr>
-        <w:t xml:space="preserve">Table </w:t>
-      </w:r>
-      <w:r>
-        <w:rPr>
-          <w:b/>
-          <w:bCs/>
-        </w:rPr>
-        <w:t xml:space="preserve">2</w:t>
-      </w:r>
-      <w:r>
-        <w:rPr>
-          <w:b/>
-          <w:bCs/>
-        </w:rPr>
         <w:t xml:space="preserve">:</w:t>
       </w:r>
       <w:r>
         <w:t xml:space="preserve"> </w:t>
       </w:r>
       <w:r>
-        <w:t xml:space="preserve">Three-year hypothetical JPA budget showing revenue and expenses.</w:t>
+        <w:t xml:space="preserve">Endowments based on four pilot JPA annual budget estimates. 5-year budget is an estimate from the respective JPA proponents. Average returns are based on a 7% return with income generated averaged over the 1st five years. An estimated 0.2% administrative fee and $5,000 contribution to the principal are included in the calculations. RRA = Risk Reduction Authority, RFS = Regenerative Forest Solutions.</w:t>
       </w:r>
     </w:p>
     <w:tbl>
@@ -1426,55 +1474,35 @@
         <w:tc>
           <w:p>
             <w:r>
-              <w:rPr>
-                <w:b/>
-                <w:bCs/>
-              </w:rPr>
-              <w:t xml:space="preserve">ITEM</w:t>
-            </w:r>
-          </w:p>
-        </w:tc>
-        <w:tc>
-          <w:p>
-            <w:r>
-              <w:rPr>
-                <w:b/>
-                <w:bCs/>
-              </w:rPr>
-              <w:t xml:space="preserve">YR1</w:t>
-            </w:r>
-          </w:p>
-        </w:tc>
-        <w:tc>
-          <w:p>
-            <w:r>
-              <w:rPr>
-                <w:b/>
-                <w:bCs/>
-              </w:rPr>
-              <w:t xml:space="preserve">YR2</w:t>
-            </w:r>
-          </w:p>
-        </w:tc>
-        <w:tc>
-          <w:p>
-            <w:r>
-              <w:rPr>
-                <w:b/>
-                <w:bCs/>
-              </w:rPr>
-              <w:t xml:space="preserve">YR3</w:t>
-            </w:r>
-          </w:p>
-        </w:tc>
-        <w:tc>
-          <w:p>
-            <w:r>
-              <w:rPr>
-                <w:b/>
-                <w:bCs/>
-              </w:rPr>
-              <w:t xml:space="preserve">TOTAL</w:t>
+              <w:t xml:space="preserve">JPA</w:t>
+            </w:r>
+          </w:p>
+        </w:tc>
+        <w:tc>
+          <w:p>
+            <w:r>
+              <w:t xml:space="preserve">5-yr Budget</w:t>
+            </w:r>
+          </w:p>
+        </w:tc>
+        <w:tc>
+          <w:p>
+            <w:r>
+              <w:t xml:space="preserve">Endowment</w:t>
+            </w:r>
+          </w:p>
+        </w:tc>
+        <w:tc>
+          <w:p>
+            <w:r>
+              <w:t xml:space="preserve">Avg. Return</w:t>
+            </w:r>
+          </w:p>
+        </w:tc>
+        <w:tc>
+          <w:p>
+            <w:r>
+              <w:t xml:space="preserve">5-yr Return</w:t>
             </w:r>
           </w:p>
         </w:tc>
@@ -1484,19 +1512,39 @@
           <w:tblHeader/>
         </w:trPr>
         <w:tc>
-          <w:p/>
-        </w:tc>
-        <w:tc>
-          <w:p/>
-        </w:tc>
-        <w:tc>
-          <w:p/>
-        </w:tc>
-        <w:tc>
-          <w:p/>
-        </w:tc>
-        <w:tc>
-          <w:p/>
+          <w:p>
+            <w:r>
+              <w:t xml:space="preserve">Tahoe Central Sierra</w:t>
+            </w:r>
+          </w:p>
+        </w:tc>
+        <w:tc>
+          <w:p>
+            <w:r>
+              <w:t xml:space="preserve">1,293,750</w:t>
+            </w:r>
+          </w:p>
+        </w:tc>
+        <w:tc>
+          <w:p>
+            <w:r>
+              <w:t xml:space="preserve">6,500,000</w:t>
+            </w:r>
+          </w:p>
+        </w:tc>
+        <w:tc>
+          <w:p>
+            <w:r>
+              <w:t xml:space="preserve">275,596</w:t>
+            </w:r>
+          </w:p>
+        </w:tc>
+        <w:tc>
+          <w:p>
+            <w:r>
+              <w:t xml:space="preserve">1,377,982</w:t>
+            </w:r>
+          </w:p>
         </w:tc>
       </w:tr>
       <w:tr>
@@ -1506,25 +1554,37 @@
         <w:tc>
           <w:p>
             <w:r>
-              <w:rPr>
-                <w:b/>
-                <w:bCs/>
-              </w:rPr>
-              <w:t xml:space="preserve">REVENUE</w:t>
-            </w:r>
-          </w:p>
-        </w:tc>
-        <w:tc>
-          <w:p/>
-        </w:tc>
-        <w:tc>
-          <w:p/>
-        </w:tc>
-        <w:tc>
-          <w:p/>
-        </w:tc>
-        <w:tc>
-          <w:p/>
+              <w:t xml:space="preserve">Lake County RRA</w:t>
+            </w:r>
+          </w:p>
+        </w:tc>
+        <w:tc>
+          <w:p>
+            <w:r>
+              <w:t xml:space="preserve">1,380,662</w:t>
+            </w:r>
+          </w:p>
+        </w:tc>
+        <w:tc>
+          <w:p>
+            <w:r>
+              <w:t xml:space="preserve">6,600,000</w:t>
+            </w:r>
+          </w:p>
+        </w:tc>
+        <w:tc>
+          <w:p>
+            <w:r>
+              <w:t xml:space="preserve">279,596</w:t>
+            </w:r>
+          </w:p>
+        </w:tc>
+        <w:tc>
+          <w:p>
+            <w:r>
+              <w:t xml:space="preserve">1,399,134</w:t>
+            </w:r>
+          </w:p>
         </w:tc>
       </w:tr>
       <w:tr>
@@ -1534,35 +1594,35 @@
         <w:tc>
           <w:p>
             <w:r>
-              <w:t xml:space="preserve">Contributions</w:t>
-            </w:r>
-          </w:p>
-        </w:tc>
-        <w:tc>
-          <w:p>
-            <w:r>
-              <w:t xml:space="preserve">60,000</w:t>
-            </w:r>
-          </w:p>
-        </w:tc>
-        <w:tc>
-          <w:p>
-            <w:r>
-              <w:t xml:space="preserve">60,000</w:t>
-            </w:r>
-          </w:p>
-        </w:tc>
-        <w:tc>
-          <w:p>
-            <w:r>
-              <w:t xml:space="preserve">60,000</w:t>
-            </w:r>
-          </w:p>
-        </w:tc>
-        <w:tc>
-          <w:p>
-            <w:r>
-              <w:t xml:space="preserve">180,000</w:t>
+              <w:t xml:space="preserve">Northeast CA</w:t>
+            </w:r>
+          </w:p>
+        </w:tc>
+        <w:tc>
+          <w:p>
+            <w:r>
+              <w:t xml:space="preserve">2,067,375</w:t>
+            </w:r>
+          </w:p>
+        </w:tc>
+        <w:tc>
+          <w:p>
+            <w:r>
+              <w:t xml:space="preserve">10,000,000</w:t>
+            </w:r>
+          </w:p>
+        </w:tc>
+        <w:tc>
+          <w:p>
+            <w:r>
+              <w:t xml:space="preserve">423,659</w:t>
+            </w:r>
+          </w:p>
+        </w:tc>
+        <w:tc>
+          <w:p>
+            <w:r>
+              <w:t xml:space="preserve">2,118,296</w:t>
             </w:r>
           </w:p>
         </w:tc>
@@ -1574,35 +1634,35 @@
         <w:tc>
           <w:p>
             <w:r>
-              <w:t xml:space="preserve">Grants</w:t>
-            </w:r>
-          </w:p>
-        </w:tc>
-        <w:tc>
-          <w:p>
-            <w:r>
-              <w:t xml:space="preserve">60,000</w:t>
-            </w:r>
-          </w:p>
-        </w:tc>
-        <w:tc>
-          <w:p>
-            <w:r>
-              <w:t xml:space="preserve">120,000</w:t>
-            </w:r>
-          </w:p>
-        </w:tc>
-        <w:tc>
-          <w:p>
-            <w:r>
-              <w:t xml:space="preserve">150,000</w:t>
-            </w:r>
-          </w:p>
-        </w:tc>
-        <w:tc>
-          <w:p>
-            <w:r>
-              <w:t xml:space="preserve">330,000</w:t>
+              <w:t xml:space="preserve">Sonoma County RFS</w:t>
+            </w:r>
+          </w:p>
+        </w:tc>
+        <w:tc>
+          <w:p>
+            <w:r>
+              <w:t xml:space="preserve">3,674,075</w:t>
+            </w:r>
+          </w:p>
+        </w:tc>
+        <w:tc>
+          <w:p>
+            <w:r>
+              <w:t xml:space="preserve">17,500,000</w:t>
+            </w:r>
+          </w:p>
+        </w:tc>
+        <w:tc>
+          <w:p>
+            <w:r>
+              <w:t xml:space="preserve">740,313</w:t>
+            </w:r>
+          </w:p>
+        </w:tc>
+        <w:tc>
+          <w:p>
+            <w:r>
+              <w:t xml:space="preserve">3,701,566</w:t>
             </w:r>
           </w:p>
         </w:tc>
@@ -1614,291 +1674,35 @@
         <w:tc>
           <w:p>
             <w:r>
-              <w:t xml:space="preserve">Fee-for-Service</w:t>
-            </w:r>
-          </w:p>
-        </w:tc>
-        <w:tc>
-          <w:p>
-            <w:r>
-              <w:t xml:space="preserve">140,000</w:t>
-            </w:r>
-          </w:p>
-        </w:tc>
-        <w:tc>
-          <w:p>
-            <w:r>
-              <w:t xml:space="preserve">220,000</w:t>
-            </w:r>
-          </w:p>
-        </w:tc>
-        <w:tc>
-          <w:p>
-            <w:r>
-              <w:t xml:space="preserve">330,000</w:t>
-            </w:r>
-          </w:p>
-        </w:tc>
-        <w:tc>
-          <w:p>
-            <w:r>
-              <w:t xml:space="preserve">690,000</w:t>
-            </w:r>
-          </w:p>
-        </w:tc>
-      </w:tr>
-      <w:tr>
-        <w:trPr>
-          <w:tblHeader/>
-        </w:trPr>
-        <w:tc>
-          <w:p>
-            <w:r>
-              <w:rPr>
-                <w:b/>
-                <w:bCs/>
-              </w:rPr>
-              <w:t xml:space="preserve">TOTAL REVENUE</w:t>
-            </w:r>
-          </w:p>
-        </w:tc>
-        <w:tc>
-          <w:p>
-            <w:r>
-              <w:t xml:space="preserve">260,000</w:t>
-            </w:r>
-          </w:p>
-        </w:tc>
-        <w:tc>
-          <w:p>
-            <w:r>
-              <w:t xml:space="preserve">400,000</w:t>
-            </w:r>
-          </w:p>
-        </w:tc>
-        <w:tc>
-          <w:p>
-            <w:r>
-              <w:t xml:space="preserve">540,000</w:t>
-            </w:r>
-          </w:p>
-        </w:tc>
-        <w:tc>
-          <w:p>
-            <w:r>
-              <w:t xml:space="preserve">1,200,000</w:t>
-            </w:r>
-          </w:p>
-        </w:tc>
-      </w:tr>
-      <w:tr>
-        <w:trPr>
-          <w:tblHeader/>
-        </w:trPr>
-        <w:tc>
-          <w:p/>
-        </w:tc>
-        <w:tc>
-          <w:p/>
-        </w:tc>
-        <w:tc>
-          <w:p/>
-        </w:tc>
-        <w:tc>
-          <w:p/>
-        </w:tc>
-        <w:tc>
-          <w:p/>
-        </w:tc>
-      </w:tr>
-      <w:tr>
-        <w:trPr>
-          <w:tblHeader/>
-        </w:trPr>
-        <w:tc>
-          <w:p>
-            <w:r>
-              <w:rPr>
-                <w:b/>
-                <w:bCs/>
-              </w:rPr>
-              <w:t xml:space="preserve">EXPENSES</w:t>
-            </w:r>
-          </w:p>
-        </w:tc>
-        <w:tc>
-          <w:p/>
-        </w:tc>
-        <w:tc>
-          <w:p/>
-        </w:tc>
-        <w:tc>
-          <w:p/>
-        </w:tc>
-        <w:tc>
-          <w:p/>
-        </w:tc>
-      </w:tr>
-      <w:tr>
-        <w:trPr>
-          <w:tblHeader/>
-        </w:trPr>
-        <w:tc>
-          <w:p>
-            <w:r>
-              <w:t xml:space="preserve">Labor</w:t>
-            </w:r>
-          </w:p>
-        </w:tc>
-        <w:tc>
-          <w:p>
-            <w:r>
-              <w:t xml:space="preserve">340,000</w:t>
-            </w:r>
-          </w:p>
-        </w:tc>
-        <w:tc>
-          <w:p>
-            <w:r>
-              <w:t xml:space="preserve">370,000</w:t>
-            </w:r>
-          </w:p>
-        </w:tc>
-        <w:tc>
-          <w:p>
-            <w:r>
-              <w:t xml:space="preserve">410,000</w:t>
-            </w:r>
-          </w:p>
-        </w:tc>
-        <w:tc>
-          <w:p>
-            <w:r>
-              <w:t xml:space="preserve">1,120,000</w:t>
-            </w:r>
-          </w:p>
-        </w:tc>
-      </w:tr>
-      <w:tr>
-        <w:trPr>
-          <w:tblHeader/>
-        </w:trPr>
-        <w:tc>
-          <w:p>
-            <w:r>
-              <w:t xml:space="preserve">Operations</w:t>
-            </w:r>
-          </w:p>
-        </w:tc>
-        <w:tc>
-          <w:p>
-            <w:r>
-              <w:t xml:space="preserve">20,000</w:t>
-            </w:r>
-          </w:p>
-        </w:tc>
-        <w:tc>
-          <w:p>
-            <w:r>
-              <w:t xml:space="preserve">30,000</w:t>
-            </w:r>
-          </w:p>
-        </w:tc>
-        <w:tc>
-          <w:p>
-            <w:r>
-              <w:t xml:space="preserve">40,000</w:t>
-            </w:r>
-          </w:p>
-        </w:tc>
-        <w:tc>
-          <w:p>
-            <w:r>
-              <w:t xml:space="preserve">90,000</w:t>
-            </w:r>
-          </w:p>
-        </w:tc>
-      </w:tr>
-      <w:tr>
-        <w:trPr>
-          <w:tblHeader/>
-        </w:trPr>
-        <w:tc>
-          <w:p>
-            <w:r>
-              <w:t xml:space="preserve">Outreach</w:t>
-            </w:r>
-          </w:p>
-        </w:tc>
-        <w:tc>
-          <w:p>
-            <w:r>
-              <w:t xml:space="preserve">2,000</w:t>
-            </w:r>
-          </w:p>
-        </w:tc>
-        <w:tc>
-          <w:p>
-            <w:r>
-              <w:t xml:space="preserve">3,000</w:t>
-            </w:r>
-          </w:p>
-        </w:tc>
-        <w:tc>
-          <w:p>
-            <w:r>
-              <w:t xml:space="preserve">4,000</w:t>
-            </w:r>
-          </w:p>
-        </w:tc>
-        <w:tc>
-          <w:p>
-            <w:r>
-              <w:t xml:space="preserve">9,000</w:t>
-            </w:r>
-          </w:p>
-        </w:tc>
-      </w:tr>
-      <w:tr>
-        <w:trPr>
-          <w:tblHeader/>
-        </w:trPr>
-        <w:tc>
-          <w:p>
-            <w:r>
-              <w:rPr>
-                <w:b/>
-                <w:bCs/>
-              </w:rPr>
-              <w:t xml:space="preserve">TOTAL EXPENSES</w:t>
-            </w:r>
-          </w:p>
-        </w:tc>
-        <w:tc>
-          <w:p>
-            <w:r>
-              <w:t xml:space="preserve">362,000</w:t>
-            </w:r>
-          </w:p>
-        </w:tc>
-        <w:tc>
-          <w:p>
-            <w:r>
-              <w:t xml:space="preserve">403,000</w:t>
-            </w:r>
-          </w:p>
-        </w:tc>
-        <w:tc>
-          <w:p>
-            <w:r>
-              <w:t xml:space="preserve">454,000</w:t>
-            </w:r>
-          </w:p>
-        </w:tc>
-        <w:tc>
-          <w:p>
-            <w:r>
-              <w:t xml:space="preserve">1,219,000</w:t>
+              <w:t xml:space="preserve">TOTAL</w:t>
+            </w:r>
+          </w:p>
+        </w:tc>
+        <w:tc>
+          <w:p>
+            <w:r>
+              <w:t xml:space="preserve">8,415,862</w:t>
+            </w:r>
+          </w:p>
+        </w:tc>
+        <w:tc>
+          <w:p>
+            <w:r>
+              <w:t xml:space="preserve">40,700,000</w:t>
+            </w:r>
+          </w:p>
+        </w:tc>
+        <w:tc>
+          <w:p>
+            <w:r>
+              <w:t xml:space="preserve">n/a</w:t>
+            </w:r>
+          </w:p>
+        </w:tc>
+        <w:tc>
+          <w:p>
+            <w:r>
+              <w:t xml:space="preserve">8,618,130</w:t>
             </w:r>
           </w:p>
         </w:tc>
@@ -1911,189 +1715,56 @@
     </w:p>
     <w:p>
       <w:pPr>
-        <w:pStyle w:val="Heading3"/>
-      </w:pPr>
-      <w:r>
-        <w:t xml:space="preserve">Revenue</w:t>
-      </w:r>
-    </w:p>
-    <w:p>
-      <w:r>
-        <w:t xml:space="preserve">Revenue contributions include contributions, grants, and fee-for-service consulting. Contributions and gifts may come from local to regional foundations and corporations interested in forest health. Individual contributions always have the potential to add up to more than foundation and corporate gifts, but they require more time to manage. Creating a time-bound campaign with a specific fundraising goal replete with a thermometer to show progress could be a great way to involve communities in the region through giving and creating outreach or communications opportunities at the same time to explain the need for a JPA and the importance of sustainable funding from the community to protect homes, infrastructure, and forests.</w:t>
-      </w:r>
-    </w:p>
-    <w:p>
-      <w:r>
-        <w:t xml:space="preserve">In the case of pilot projects supported by the Office of Land Use and Climate Innovation, a tranche of endowment-like funding is being provided for startup funding of aggregation entities. In some cases, this amount is as much as $1 million, which, along with a capital campaign to bolster individual giving and create awareness around a JPA, could create a base endowment and provide stable operational revenue to a new organization from the principal if the endowment funds are wisely invested.</w:t>
-      </w:r>
-    </w:p>
-    <w:p>
-      <w:r>
-        <w:t xml:space="preserve">Although not competing for grants with RCDs, a JPA may help administer a large grant across multiple RCDs to leverage more funds across a region. With the devolution of some state funding sources, this could be a great option for managing those funds and reducing competition for funding resources, as the grants are allocated to local organizations. The fee-for-service section includes an item for grant administration. It also includes an option for implementing landowner forest plans, as this may be a viable revenue source and could help source wood. A sort yard managed by the JPA to source, centralize, and sell woody biomass is another revenue option but will require investment to be successful. Expenses for the sort yard are included in the expenses section.</w:t>
-      </w:r>
-    </w:p>
-    <w:p/>
-    <w:p>
-      <w:pPr>
-        <w:pBdr>
-          <w:left w:val="double" w:color="5D85D0"/>
-        </w:pBdr>
-        <w:shd w:color="5D85D0" w:val="solid"/>
-        <w:ind w:left="288" w:right="288"/>
+        <w:pStyle w:val="Heading4"/>
+      </w:pPr>
+      <w:r>
+        <w:t xml:space="preserve">Avoided Cost Estimate</w:t>
+      </w:r>
+    </w:p>
+    <w:p>
+      <w:r>
+        <w:t xml:space="preserve">Let’s assume that it would cost $115,000/yr for a state agency to manage a grants program. This includes staff, administrative, and operating costs. We’ve assumed an annual rate of inflation of 4% to give a total five-year cost of $622,877. The 5-year returns are very close to the estimated operating costs of each JPA, so we’ll assume that $8.7 mn is the total amount granted, giving a total cost of 9,322,877. Although the granting agency return on investment is really the public benefit from making the grants for project implementation, these operating costs would provide an ROI of -6.7% (</w:t>
+      </w:r>
+      <w:r>
+        <w:t xml:space="preserve">Table </w:t>
+      </w:r>
+      <w:r>
+        <w:t xml:space="preserve">1.3</w:t>
+      </w:r>
+      <w:r>
+        <w:t xml:space="preserve">) for five years. That ROI would continue to decrease over time, e.g., become more costly for the State, whereas the ROI of 27% for the endowment investment would continue to grow.</w:t>
+      </w:r>
+    </w:p>
+    <w:p>
+      <w:pPr>
+        <w:pStyle w:val="Caption"/>
       </w:pPr>
       <w:r>
         <w:rPr>
           <w:b/>
           <w:bCs/>
-          <w:color w:val="FFFFFF"/>
-        </w:rPr>
-        <w:t xml:space="preserve">JPA - RCD competition</w:t>
-      </w:r>
-    </w:p>
-    <w:p>
-      <w:pPr>
-        <w:pBdr>
-          <w:left w:val="double" w:color="5D85D0"/>
-        </w:pBdr>
-        <w:ind w:left="288" w:right="288"/>
-      </w:pPr>
-      <w:r>
-        <w:t xml:space="preserve">Evaluating whether to form a new governmental entity or organization is an important consideration for feedstock aggregation. Working with existing organizations, such as Resource Conservation Districts or Fire Safe Councils, would be a good starting point. It is critical to incorporate into the JPA’s bylaws and revenue-generating practices that grant fundraising does not compete with RCDs. It is possible a JPA may collaborate on a grant with one or more RCDs but should never submit grants for which an RCD qualifies.</w:t>
-      </w:r>
-    </w:p>
-    <w:p/>
-    <w:p>
-      <w:r>
-        <w:t xml:space="preserve">Contingency funding should be written into the budget expenses. Adding 10-15% contingency line items to any secured grant would supplement that funding, although most grant funding contingencies are to be applied to implementation budget shortfalls. Other contingency funding sources could include unrestricted funding (such as contributions or gifts) and a higher indirect rate.</w:t>
-      </w:r>
-    </w:p>
-    <w:p>
-      <w:pPr>
-        <w:pStyle w:val="Heading3"/>
-      </w:pPr>
-      <w:r>
-        <w:t xml:space="preserve">Expenses</w:t>
-      </w:r>
-    </w:p>
-    <w:p>
-      <w:r>
-        <w:t xml:space="preserve">An annual expense budget of ~$ $400,000 is estimated for a JPA startup. The total expenses/year slowly ramp up each year of the budget with the idea that with additional secured revenue, a JPA would bring on more staff capacity and increase offerings, reach, or fee-for-service activities such as additional sort yards. The bulk of the expenses is for labor and staff, including an executive director, a contracted feedstock manager, an administrative bookkeeper, and various contracted services. Briefly, the staff responsibilities are the following:</w:t>
-      </w:r>
-    </w:p>
-    <w:p>
-      <w:pPr>
-        <w:pStyle w:val="ListParagraph"/>
-        <w:numPr>
-          <w:ilvl w:val="0"/>
-          <w:numId w:val="12"/>
-        </w:numPr>
-      </w:pPr>
+        </w:rPr>
+        <w:t xml:space="preserve">Table </w:t>
+      </w:r>
       <w:r>
         <w:rPr>
           <w:b/>
           <w:bCs/>
         </w:rPr>
-        <w:t xml:space="preserve">Executive Director</w:t>
-      </w:r>
-      <w:r>
-        <w:t xml:space="preserve">. Manage board of directors, lead program development/outreach/education/fundraising/communications, develop an annual budget, manage contracts, recruit and manage staff.</w:t>
-      </w:r>
-    </w:p>
-    <w:p>
-      <w:pPr>
-        <w:pStyle w:val="ListParagraph"/>
-        <w:numPr>
-          <w:ilvl w:val="0"/>
-          <w:numId w:val="12"/>
-        </w:numPr>
-      </w:pPr>
+        <w:t xml:space="preserve">1.3</w:t>
+      </w:r>
       <w:r>
         <w:rPr>
           <w:b/>
           <w:bCs/>
         </w:rPr>
-        <w:t xml:space="preserve">Administrative Bookkeeper</w:t>
-      </w:r>
-      <w:r>
-        <w:t xml:space="preserve">. Track/invoice budget, develop cost allocation plan, manage grant reporting, administer payroll, manage AP/AR accounts, prepare 1099s and tax docs, develop grant budgets, and ensure financial compliance.</w:t>
-      </w:r>
-    </w:p>
-    <w:p>
-      <w:pPr>
-        <w:pStyle w:val="ListParagraph"/>
-        <w:numPr>
-          <w:ilvl w:val="0"/>
-          <w:numId w:val="12"/>
-        </w:numPr>
-      </w:pPr>
-      <w:r>
-        <w:rPr>
-          <w:b/>
-          <w:bCs/>
-        </w:rPr>
-        <w:t xml:space="preserve">Feedstock Manager</w:t>
-      </w:r>
-      <w:r>
-        <w:t xml:space="preserve">. Source and sell feedstock from public and private lands, arrange transport to sort yard(s), manage sort yards, develop outreach materials, manage compliance documents for sort yard and aggregation, and maintain records.</w:t>
-      </w:r>
-    </w:p>
-    <w:p>
-      <w:r>
-        <w:t xml:space="preserve">Other expenses include operations and maintenance, audit and legal fees, insurance, equipment, software, travel, and bank fees. Expenses include communications, website development, outreach, equipment, insurance, and land lease costs for a sort yard.</w:t>
-      </w:r>
-    </w:p>
-    <w:p>
-      <w:pPr>
-        <w:pStyle w:val="Heading3"/>
-      </w:pPr>
-      <w:r>
-        <w:t xml:space="preserve">Timeline</w:t>
-      </w:r>
-    </w:p>
-    <w:p>
-      <w:r>
-        <w:t xml:space="preserve">An approximate timeline for key activities to fund and operationalize a JPA is shown in </w:t>
-      </w:r>
-      <w:r>
-        <w:t xml:space="preserve">Table </w:t>
-      </w:r>
-      <w:r>
-        <w:t xml:space="preserve">3</w:t>
-      </w:r>
-      <w:r>
-        <w:t xml:space="preserve">. Endowment seed funding and a capital campaign will be critical to initiate the endowment. Staffing is described under expenses and shows the approximate start time for each staff member. The development of JPA bylaws will define governance, and  JPA will created when the Local Agency Formation Commission (LAFCO) filing is completed.</w:t>
-      </w:r>
-    </w:p>
-    <w:p>
-      <w:pPr>
-        <w:pStyle w:val="Caption"/>
-      </w:pPr>
-      <w:r>
-        <w:rPr>
-          <w:b/>
-          <w:bCs/>
-        </w:rPr>
-        <w:t xml:space="preserve">Table </w:t>
-      </w:r>
-      <w:r>
-        <w:rPr>
-          <w:b/>
-          <w:bCs/>
-        </w:rPr>
-        <w:t xml:space="preserve">3</w:t>
-      </w:r>
-      <w:r>
-        <w:rPr>
-          <w:b/>
-          <w:bCs/>
-        </w:rPr>
         <w:t xml:space="preserve">:</w:t>
       </w:r>
       <w:r>
         <w:t xml:space="preserve"> </w:t>
       </w:r>
       <w:r>
-        <w:t xml:space="preserve">Timeline for a theoretical JPA startup period.</w:t>
+        <w:t xml:space="preserve">Avoided cost estimate estimated from the four pilot budgets vs. estimated agency costs to manage grant funds.</w:t>
       </w:r>
     </w:p>
     <w:tbl>
@@ -2113,10 +1784,6 @@
         <w:gridCol w:w="100"/>
         <w:gridCol w:w="100"/>
         <w:gridCol w:w="100"/>
-        <w:gridCol w:w="100"/>
-        <w:gridCol w:w="100"/>
-        <w:gridCol w:w="100"/>
-        <w:gridCol w:w="100"/>
       </w:tblGrid>
       <w:tr>
         <w:trPr>
@@ -2125,88 +1792,28 @@
         <w:tc>
           <w:p>
             <w:r>
-              <w:rPr>
-                <w:b/>
-                <w:bCs/>
-              </w:rPr>
-              <w:t xml:space="preserve">Task</w:t>
-            </w:r>
-          </w:p>
-        </w:tc>
-        <w:tc>
-          <w:p>
-            <w:r>
-              <w:rPr>
-                <w:b/>
-                <w:bCs/>
-              </w:rPr>
-              <w:t xml:space="preserve">Sub-task</w:t>
-            </w:r>
-          </w:p>
-        </w:tc>
-        <w:tc>
-          <w:p>
-            <w:r>
-              <w:rPr>
-                <w:b/>
-                <w:bCs/>
-              </w:rPr>
-              <w:t xml:space="preserve">2025</w:t>
-            </w:r>
-          </w:p>
-        </w:tc>
-        <w:tc>
-          <w:p>
-            <w:r>
-              <w:rPr>
-                <w:b/>
-                <w:bCs/>
-              </w:rPr>
-              <w:t xml:space="preserve">2026</w:t>
-            </w:r>
-          </w:p>
-        </w:tc>
-        <w:tc>
-          <w:p>
-            <w:r>
-              <w:rPr>
-                <w:b/>
-                <w:bCs/>
-              </w:rPr>
-              <w:t xml:space="preserve">2027</w:t>
-            </w:r>
-          </w:p>
-        </w:tc>
-        <w:tc>
-          <w:p>
-            <w:r>
-              <w:rPr>
-                <w:b/>
-                <w:bCs/>
-              </w:rPr>
-              <w:t xml:space="preserve">2028</w:t>
-            </w:r>
-          </w:p>
-        </w:tc>
-        <w:tc>
-          <w:p>
-            <w:r>
-              <w:rPr>
-                <w:b/>
-                <w:bCs/>
-              </w:rPr>
-              <w:t xml:space="preserve">2029</w:t>
-            </w:r>
-          </w:p>
-        </w:tc>
-        <w:tc>
-          <w:p>
-            <w:r>
-              <w:rPr>
-                <w:b/>
-                <w:bCs/>
-              </w:rPr>
-              <w:t xml:space="preserve">2030</w:t>
+              <w:t xml:space="preserve">Program</w:t>
+            </w:r>
+          </w:p>
+        </w:tc>
+        <w:tc>
+          <w:p>
+            <w:r>
+              <w:t xml:space="preserve">Amount</w:t>
+            </w:r>
+          </w:p>
+        </w:tc>
+        <w:tc>
+          <w:p>
+            <w:r>
+              <w:t xml:space="preserve">5-year return</w:t>
+            </w:r>
+          </w:p>
+        </w:tc>
+        <w:tc>
+          <w:p>
+            <w:r>
+              <w:t xml:space="preserve">ROI (%)</w:t>
             </w:r>
           </w:p>
         </w:tc>
@@ -2218,50 +1825,30 @@
         <w:tc>
           <w:p>
             <w:r>
-              <w:rPr>
-                <w:b/>
-                <w:bCs/>
-              </w:rPr>
-              <w:t xml:space="preserve">1. Revenue Generation</w:t>
-            </w:r>
-          </w:p>
-        </w:tc>
-        <w:tc>
-          <w:p>
-            <w:r>
-              <w:t xml:space="preserve">Endowment creation</w:t>
-            </w:r>
-          </w:p>
-        </w:tc>
-        <w:tc>
-          <w:p/>
-        </w:tc>
-        <w:tc>
-          <w:p/>
-        </w:tc>
-        <w:tc>
-          <w:p>
-            <w:r>
-              <w:t xml:space="preserve">X</w:t>
-            </w:r>
-          </w:p>
-        </w:tc>
-        <w:tc>
-          <w:p>
-            <w:r>
-              <w:t xml:space="preserve">X</w:t>
-            </w:r>
-          </w:p>
-        </w:tc>
-        <w:tc>
-          <w:p>
-            <w:r>
-              <w:t xml:space="preserve">X</w:t>
-            </w:r>
-          </w:p>
-        </w:tc>
-        <w:tc>
-          <w:p/>
+              <w:t xml:space="preserve">Endowments</w:t>
+            </w:r>
+          </w:p>
+        </w:tc>
+        <w:tc>
+          <w:p>
+            <w:r>
+              <w:t xml:space="preserve">40,700,000</w:t>
+            </w:r>
+          </w:p>
+        </w:tc>
+        <w:tc>
+          <w:p>
+            <w:r>
+              <w:t xml:space="preserve">8,618,130</w:t>
+            </w:r>
+          </w:p>
+        </w:tc>
+        <w:tc>
+          <w:p>
+            <w:r>
+              <w:t xml:space="preserve">21</w:t>
+            </w:r>
+          </w:p>
         </w:tc>
       </w:tr>
       <w:tr>
@@ -2269,372 +1856,32 @@
           <w:tblHeader/>
         </w:trPr>
         <w:tc>
-          <w:p/>
-        </w:tc>
-        <w:tc>
-          <w:p>
-            <w:r>
-              <w:t xml:space="preserve">Gift campaign</w:t>
-            </w:r>
-          </w:p>
-        </w:tc>
-        <w:tc>
-          <w:p>
-            <w:r>
-              <w:t xml:space="preserve">X</w:t>
-            </w:r>
-          </w:p>
-        </w:tc>
-        <w:tc>
-          <w:p>
-            <w:r>
-              <w:t xml:space="preserve">X</w:t>
-            </w:r>
-          </w:p>
-        </w:tc>
-        <w:tc>
-          <w:p>
-            <w:r>
-              <w:t xml:space="preserve">X</w:t>
-            </w:r>
-          </w:p>
-        </w:tc>
-        <w:tc>
-          <w:p/>
-        </w:tc>
-        <w:tc>
-          <w:p/>
-        </w:tc>
-        <w:tc>
-          <w:p/>
-        </w:tc>
-      </w:tr>
-      <w:tr>
-        <w:trPr>
-          <w:tblHeader/>
-        </w:trPr>
-        <w:tc>
-          <w:p/>
-        </w:tc>
-        <w:tc>
-          <w:p>
-            <w:r>
-              <w:t xml:space="preserve">Fee-service</w:t>
-            </w:r>
-          </w:p>
-        </w:tc>
-        <w:tc>
-          <w:p/>
-        </w:tc>
-        <w:tc>
-          <w:p/>
-        </w:tc>
-        <w:tc>
-          <w:p>
-            <w:r>
-              <w:t xml:space="preserve">X</w:t>
-            </w:r>
-          </w:p>
-        </w:tc>
-        <w:tc>
-          <w:p>
-            <w:r>
-              <w:t xml:space="preserve">X</w:t>
-            </w:r>
-          </w:p>
-        </w:tc>
-        <w:tc>
-          <w:p>
-            <w:r>
-              <w:t xml:space="preserve">X</w:t>
-            </w:r>
-          </w:p>
-        </w:tc>
-        <w:tc>
-          <w:p>
-            <w:r>
-              <w:t xml:space="preserve">X</w:t>
-            </w:r>
-          </w:p>
-        </w:tc>
-      </w:tr>
-      <w:tr>
-        <w:trPr>
-          <w:tblHeader/>
-        </w:trPr>
-        <w:tc>
-          <w:p/>
-        </w:tc>
-        <w:tc>
-          <w:p>
-            <w:r>
-              <w:t xml:space="preserve">Sort yard 1</w:t>
-            </w:r>
-          </w:p>
-        </w:tc>
-        <w:tc>
-          <w:p/>
-        </w:tc>
-        <w:tc>
-          <w:p/>
-        </w:tc>
-        <w:tc>
-          <w:p/>
-        </w:tc>
-        <w:tc>
-          <w:p/>
-        </w:tc>
-        <w:tc>
-          <w:p>
-            <w:r>
-              <w:t xml:space="preserve">X</w:t>
-            </w:r>
-          </w:p>
-        </w:tc>
-        <w:tc>
-          <w:p/>
-        </w:tc>
-      </w:tr>
-      <w:tr>
-        <w:trPr>
-          <w:tblHeader/>
-        </w:trPr>
-        <w:tc>
-          <w:p/>
-        </w:tc>
-        <w:tc>
-          <w:p>
-            <w:r>
-              <w:t xml:space="preserve">Sort yard 2</w:t>
-            </w:r>
-          </w:p>
-        </w:tc>
-        <w:tc>
-          <w:p/>
-        </w:tc>
-        <w:tc>
-          <w:p/>
-        </w:tc>
-        <w:tc>
-          <w:p/>
-        </w:tc>
-        <w:tc>
-          <w:p/>
-        </w:tc>
-        <w:tc>
-          <w:p/>
-        </w:tc>
-        <w:tc>
-          <w:p>
-            <w:r>
-              <w:t xml:space="preserve">X</w:t>
-            </w:r>
-          </w:p>
-        </w:tc>
-      </w:tr>
-      <w:tr>
-        <w:trPr>
-          <w:tblHeader/>
-        </w:trPr>
-        <w:tc>
-          <w:p>
-            <w:r>
-              <w:rPr>
-                <w:b/>
-                <w:bCs/>
-              </w:rPr>
-              <w:t xml:space="preserve">2. Staffing</w:t>
-            </w:r>
-          </w:p>
-        </w:tc>
-        <w:tc>
-          <w:p>
-            <w:r>
-              <w:t xml:space="preserve">Executive director</w:t>
-            </w:r>
-          </w:p>
-        </w:tc>
-        <w:tc>
-          <w:p>
-            <w:r>
-              <w:t xml:space="preserve">X</w:t>
-            </w:r>
-          </w:p>
-        </w:tc>
-        <w:tc>
-          <w:p/>
-        </w:tc>
-        <w:tc>
-          <w:p/>
-        </w:tc>
-        <w:tc>
-          <w:p/>
-        </w:tc>
-        <w:tc>
-          <w:p/>
-        </w:tc>
-        <w:tc>
-          <w:p/>
-        </w:tc>
-      </w:tr>
-      <w:tr>
-        <w:trPr>
-          <w:tblHeader/>
-        </w:trPr>
-        <w:tc>
-          <w:p/>
-        </w:tc>
-        <w:tc>
-          <w:p>
-            <w:r>
-              <w:t xml:space="preserve">Administrator</w:t>
-            </w:r>
-          </w:p>
-        </w:tc>
-        <w:tc>
-          <w:p>
-            <w:r>
-              <w:t xml:space="preserve">X</w:t>
-            </w:r>
-          </w:p>
-        </w:tc>
-        <w:tc>
-          <w:p/>
-        </w:tc>
-        <w:tc>
-          <w:p/>
-        </w:tc>
-        <w:tc>
-          <w:p/>
-        </w:tc>
-        <w:tc>
-          <w:p/>
-        </w:tc>
-        <w:tc>
-          <w:p/>
-        </w:tc>
-      </w:tr>
-      <w:tr>
-        <w:trPr>
-          <w:tblHeader/>
-        </w:trPr>
-        <w:tc>
-          <w:p/>
-        </w:tc>
-        <w:tc>
-          <w:p>
-            <w:r>
-              <w:t xml:space="preserve">Feedstock manager</w:t>
-            </w:r>
-          </w:p>
-        </w:tc>
-        <w:tc>
-          <w:p/>
-        </w:tc>
-        <w:tc>
-          <w:p>
-            <w:r>
-              <w:t xml:space="preserve">X</w:t>
-            </w:r>
-          </w:p>
-        </w:tc>
-        <w:tc>
-          <w:p/>
-        </w:tc>
-        <w:tc>
-          <w:p/>
-        </w:tc>
-        <w:tc>
-          <w:p/>
-        </w:tc>
-        <w:tc>
-          <w:p/>
-        </w:tc>
-      </w:tr>
-      <w:tr>
-        <w:trPr>
-          <w:tblHeader/>
-        </w:trPr>
-        <w:tc>
-          <w:p>
-            <w:r>
-              <w:rPr>
-                <w:b/>
-                <w:bCs/>
-              </w:rPr>
-              <w:t xml:space="preserve">3. Governance</w:t>
-            </w:r>
-          </w:p>
-        </w:tc>
-        <w:tc>
-          <w:p>
-            <w:r>
-              <w:t xml:space="preserve">JPA bylaws</w:t>
-            </w:r>
-          </w:p>
-        </w:tc>
-        <w:tc>
-          <w:p>
-            <w:r>
-              <w:t xml:space="preserve">X</w:t>
-            </w:r>
-          </w:p>
-        </w:tc>
-        <w:tc>
-          <w:p>
-            <w:r>
-              <w:t xml:space="preserve">X</w:t>
-            </w:r>
-          </w:p>
-        </w:tc>
-        <w:tc>
-          <w:p/>
-        </w:tc>
-        <w:tc>
-          <w:p/>
-        </w:tc>
-        <w:tc>
-          <w:p/>
-        </w:tc>
-        <w:tc>
-          <w:p/>
-        </w:tc>
-      </w:tr>
-      <w:tr>
-        <w:trPr>
-          <w:tblHeader/>
-        </w:trPr>
-        <w:tc>
-          <w:p/>
-        </w:tc>
-        <w:tc>
-          <w:p>
-            <w:r>
-              <w:t xml:space="preserve">LAFCO filing</w:t>
-            </w:r>
-          </w:p>
-        </w:tc>
-        <w:tc>
-          <w:p>
-            <w:r>
-              <w:t xml:space="preserve">X</w:t>
-            </w:r>
-          </w:p>
-        </w:tc>
-        <w:tc>
-          <w:p/>
-        </w:tc>
-        <w:tc>
-          <w:p/>
-        </w:tc>
-        <w:tc>
-          <w:p/>
-        </w:tc>
-        <w:tc>
-          <w:p/>
-        </w:tc>
-        <w:tc>
-          <w:p/>
+          <w:p>
+            <w:r>
+              <w:t xml:space="preserve">Grants</w:t>
+            </w:r>
+          </w:p>
+        </w:tc>
+        <w:tc>
+          <w:p>
+            <w:r>
+              <w:t xml:space="preserve">9,322,877</w:t>
+            </w:r>
+          </w:p>
+        </w:tc>
+        <w:tc>
+          <w:p>
+            <w:r>
+              <w:t xml:space="preserve">-8,700,000</w:t>
+            </w:r>
+          </w:p>
+        </w:tc>
+        <w:tc>
+          <w:p>
+            <w:r>
+              <w:t xml:space="preserve">-6.7</w:t>
+            </w:r>
+          </w:p>
         </w:tc>
       </w:tr>
     </w:tbl>
@@ -2645,15 +1892,45 @@
     </w:p>
     <w:p>
       <w:pPr>
-        <w:pStyle w:val="Heading2"/>
-      </w:pPr>
-      <w:r>
-        <w:t xml:space="preserve">Recommendations</w:t>
-      </w:r>
-    </w:p>
-    <w:p>
-      <w:r>
-        <w:t xml:space="preserve">Funding JPAs is not a simple task, as most public funding sources are focused on project implementation, e.g., funding restoration projects in the field, rather than providing administrative support or organizational startup. Some foundations fund this type of work, but accessing those funds can be challenging. Another challenge is competing with existing entities for scarce local, regional, and federal resources. The following are recommendations to consider when examining the feasibility of building and maintaining a JPA for feedstock aggregation:</w:t>
+        <w:pStyle w:val="Heading4"/>
+      </w:pPr>
+      <w:r>
+        <w:t xml:space="preserve">Benefits</w:t>
+      </w:r>
+    </w:p>
+    <w:p>
+      <w:r>
+        <w:t xml:space="preserve">An innovative approach to multiplying the impact of a JPA’s funding endowment is to allocate a portion of the principal for low-interest loans to forest health operations and wood products businesses.</w:t>
+      </w:r>
+      <w:r>
+        <w:rPr>
+          <w:rStyle w:val="FootnoteReference"/>
+        </w:rPr>
+        <w:footnoteReference w:id="4"/>
+      </w:r>
+      <w:r>
+        <w:t xml:space="preserve"> By acting as a community-based lender, the JPA can support local projects that might otherwise struggle to access affordable capital, accelerating restoration and market development. The interest payments received from these loans can then be reinvested into the endowment, steadily growing the principal over time. This strategy not only amplifies the reach of the original endowment but also creates a self-reinforcing cycle of investment and impact, enhancing both financial sustainability and landscape resilience.</w:t>
+      </w:r>
+    </w:p>
+    <w:p>
+      <w:r>
+        <w:t xml:space="preserve">Although we don’t have evidence to support this theory, we suspect organizations with a solid endowment will be more competitive for public funding, given their ability to provide a match and solid operating revenue. Established endowments offer a source of unrestricted funds that can be strategically used to meet grant match requirements for state and federal funding opportunities. With a robust endowment, organizations can offer greater match amounts, making their grant applications more competitive and attractive to funders. Additionally, a solid core operating budget supported by endowment income ensures organizational stability and the capacity to manage and implement grant-funded projects effectively.</w:t>
+      </w:r>
+    </w:p>
+    <w:p>
+      <w:pPr>
+        <w:pStyle w:val="Heading3"/>
+      </w:pPr>
+      <w:r>
+        <w:t xml:space="preserve">1.2.3	</w:t>
+      </w:r>
+      <w:r>
+        <w:t xml:space="preserve">Temporal Adoption</w:t>
+      </w:r>
+    </w:p>
+    <w:p>
+      <w:r>
+        <w:t xml:space="preserve">Any funding strategies, whether they are traditional or new conservation finance approaches, may be new or untested for certain audiences. Raising funds from traditional resources, then piloting new options over time, may be the best approach to introduce novel income sources. For example:</w:t>
       </w:r>
     </w:p>
     <w:p>
@@ -2665,14 +1942,7 @@
         </w:numPr>
       </w:pPr>
       <w:r>
-        <w:rPr>
-          <w:b/>
-          <w:bCs/>
-        </w:rPr>
-        <w:t xml:space="preserve">Utilize public funds for startup and traditional projects</w:t>
-      </w:r>
-      <w:r>
-        <w:t xml:space="preserve">. Public funding is readily available and generally suitable for trials or the initial development of feasible but new ideas.</w:t>
+        <w:t xml:space="preserve">New finance options, such as environmental impact bonds, could be introduced over a longer period and trialed at a small scale, then scaled up when successful. These could also include other financial mechanisms, such as revolving loan funds (offering low-interest loans), public-private partnerships, or bonds.</w:t>
       </w:r>
     </w:p>
     <w:p>
@@ -2684,14 +1954,410 @@
         </w:numPr>
       </w:pPr>
       <w:r>
+        <w:t xml:space="preserve">Other revenue-generating options could be tested in the same manner to ensure their effectiveness and introduce them to skeptical participants, financial managers, or government entities that are not used to working with alternative finance options.</w:t>
+      </w:r>
+    </w:p>
+    <w:p>
+      <w:pPr>
+        <w:pStyle w:val="Heading3"/>
+      </w:pPr>
+      <w:r>
+        <w:t xml:space="preserve">1.2.4	</w:t>
+      </w:r>
+      <w:r>
+        <w:t xml:space="preserve">Collaborative Finance</w:t>
+      </w:r>
+    </w:p>
+    <w:p>
+      <w:r>
+        <w:t xml:space="preserve">Collaborative finance is a conservation finance strategy that involves cooperative interaction between individual project developers, stakeholders, and finance providers </w:t>
+      </w:r>
+      <w:r>
+        <w:t xml:space="preserve">(</w:t>
+      </w:r>
+      <w:r>
+        <w:t xml:space="preserve">Russell &amp; Odefey, 2024</w:t>
+      </w:r>
+      <w:r>
+        <w:t xml:space="preserve">)</w:t>
+      </w:r>
+      <w:r>
+        <w:t xml:space="preserve">. This process may or may not include traditional financial institutions.</w:t>
+      </w:r>
+      <w:r>
+        <w:rPr>
+          <w:rStyle w:val="FootnoteReference"/>
+        </w:rPr>
+        <w:footnoteReference w:id="5"/>
+      </w:r>
+      <w:r>
+        <w:t xml:space="preserve"> The term can be broadened to include finance developed through the fair and equitable participation of stakeholders in a region, landscape, or watershed, addressing natural resource and infrastructure management needs, and utilizing multiple forms of funding, from public grants to private investment. Finance approaches may include outcomes-based finance models such as environmental impact bonds.</w:t>
+      </w:r>
+    </w:p>
+    <w:p>
+      <w:r>
+        <w:t xml:space="preserve">The challenge of new finance options vs. more traditional approaches is, simply put, they’re new. As a result, more conservative controllers, accountants, and similar financial managers within any organization will be resistant to implementing new, unproven methods for generating income. Consequently, it may be best to start strong with traditional approaches and gradually test new strategies. Feasibility studies may also help introduce collaborative finance and new approaches. However, there are examples of established and successful impact finance bonds on the North Yuba River to draw upon when creating novel funding streams.</w:t>
+      </w:r>
+    </w:p>
+    <w:p/>
+    <w:p>
+      <w:pPr>
+        <w:pBdr>
+          <w:left w:val="double" w:color="5D85D0"/>
+        </w:pBdr>
+        <w:shd w:color="5D85D0" w:val="solid"/>
+        <w:ind w:left="288" w:right="288"/>
+      </w:pPr>
+      <w:r>
         <w:rPr>
           <w:b/>
           <w:bCs/>
-        </w:rPr>
-        <w:t xml:space="preserve">Pilot non-traditional, higher risk, or new revenue sources as pilots</w:t>
-      </w:r>
-      <w:r>
-        <w:t xml:space="preserve">. Then, ramp them up with success, and participating entities and partners see their value and understand how they work.</w:t>
+          <w:color w:val="FFFFFF"/>
+        </w:rPr>
+        <w:t xml:space="preserve">New Funding Options</w:t>
+      </w:r>
+    </w:p>
+    <w:p>
+      <w:pPr>
+        <w:pBdr>
+          <w:left w:val="double" w:color="5D85D0"/>
+        </w:pBdr>
+        <w:ind w:left="288" w:right="288"/>
+      </w:pPr>
+      <w:r>
+        <w:rPr>
+          <w:b/>
+          <w:bCs/>
+        </w:rPr>
+        <w:t xml:space="preserve">New Finance Options</w:t>
+      </w:r>
+      <w:r>
+        <w:t xml:space="preserve">
+Conservation finance options include environmental impact bonds, such as Blue Forest’s Forest Resilience Bonds, which leverage private investment from impact investors to support forest health projects. Repayment to investors is supported over time by beneficiaries based on the savings and benefits from reduced wildfire risks and improved ecosystem services. A JPA could utilize environmental impact bonds on a trial basis at a small scale and then expand over an extended period. Identifying potential payor entities interested in covering the avoided costs of wildfire through proactive measures, such as thinning and prescribed fire, is worth pursuing immediately or as soon as an executive director is hired.</w:t>
+      </w:r>
+    </w:p>
+    <w:p>
+      <w:pPr>
+        <w:pBdr>
+          <w:left w:val="double" w:color="5D85D0"/>
+        </w:pBdr>
+        <w:ind w:left="288" w:right="288"/>
+      </w:pPr>
+      <w:r>
+        <w:t xml:space="preserve">We do not recommend relying solely on impact bonds, as they take a lengthy time to develop and rely on a payor to provide avoided cost funding. However, a bond could be a valuable complementary funding resource to other secured revenues. Other ‘newer’ finance options could include the following:</w:t>
+      </w:r>
+    </w:p>
+    <w:p>
+      <w:pPr>
+        <w:pBdr>
+          <w:left w:val="double" w:color="5D85D0"/>
+        </w:pBdr>
+        <w:ind w:left="288" w:right="288"/>
+      </w:pPr>
+      <w:r>
+        <w:rPr>
+          <w:b/>
+          <w:bCs/>
+        </w:rPr>
+        <w:t xml:space="preserve">Carbon Markets</w:t>
+      </w:r>
+      <w:r>
+        <w:t xml:space="preserve">
+Carbon markets offer an opportunity to secure funding for on-the-ground forest management activities, including thinning, pruning, mastication, mechanical treatment, and prescribed burning. Revenue realized through carbon markets could help a JPA to treat more forest land than otherwise possible and generate additional biomass that could be put under supply contracts. Market prices for carbon credits vary depending on a given project’s size, location, treatment type, and the specific carbon market or registry used. Carbon credits can be generated for projects of any size, regardless of their location on federal, state, or private lands. Refer to the Avoided Wildfire Emissions Protocol section below for an alternative approach that is easier to implement than carbon sequestration credits or markets, as the avoided costs are already calculated, and proponents do not need to seek an entity to purchase the credits.</w:t>
+      </w:r>
+    </w:p>
+    <w:p>
+      <w:pPr>
+        <w:pBdr>
+          <w:left w:val="double" w:color="5D85D0"/>
+        </w:pBdr>
+        <w:ind w:left="288" w:right="288"/>
+      </w:pPr>
+      <w:r>
+        <w:t xml:space="preserve">The National Forest Foundation implemented several voluntary carbon projects in California and the West following wildfires. Funded by corporate donors, the projects created carbon based on the growth trajectories of planted trees. The credits were registered with the American Carbon Registry but were immediately retired upon creation, as trading carbon on public lands is prohibited.</w:t>
+      </w:r>
+    </w:p>
+    <w:p>
+      <w:pPr>
+        <w:pBdr>
+          <w:left w:val="double" w:color="5D85D0"/>
+        </w:pBdr>
+        <w:ind w:left="288" w:right="288"/>
+      </w:pPr>
+      <w:r>
+        <w:rPr>
+          <w:b/>
+          <w:bCs/>
+        </w:rPr>
+        <w:t xml:space="preserve">Avoided Wildfire Emissions</w:t>
+      </w:r>
+      <w:r>
+        <w:t xml:space="preserve">
+The Spatial Informatics Group and Element Markets developed a forecast methodology under the Climate Forward program to recognize the climate benefits associated with fuel treatment activities that reduce the risk of catastrophic forest fires and their associated emissions. Known as the Avoided Wildfire Emissions Forecast Methodology, the protocol could provide complementary funding for thinning and prescribed fire projects, in addition to grants and private investments. The Protocol differs from carbon offsets in that forecasted mitigation units (FMUs) are issued for forecasted reductions or removals of greenhouse gases. FMUs are used to mitigate anticipated future emissions, such as wildfires. This methodology, however, uses outdated allometric equations to calculate changes to forests and does not model fire or climate. Verra’s </w:t>
+      </w:r>
+      <w:hyperlink w:history="1" r:id="rIdhir5t89dyflsp8oeh4du_">
+        <w:r>
+          <w:rPr>
+            <w:rStyle w:val="Hyperlink"/>
+          </w:rPr>
+          <w:t xml:space="preserve">Methodology</w:t>
+        </w:r>
+      </w:hyperlink>
+      <w:r>
+        <w:t xml:space="preserve"> for Avoided Forest Conversion from Decreased Wildfire may be a more accurate approach to tracking treatment impacts on carbon stocks over time.</w:t>
+      </w:r>
+    </w:p>
+    <w:p>
+      <w:pPr>
+        <w:pBdr>
+          <w:left w:val="double" w:color="5D85D0"/>
+        </w:pBdr>
+        <w:ind w:left="288" w:right="288"/>
+      </w:pPr>
+      <w:r>
+        <w:rPr>
+          <w:b/>
+          <w:bCs/>
+        </w:rPr>
+        <w:t xml:space="preserve">Embodied Carbon</w:t>
+      </w:r>
+      <w:r>
+        <w:t xml:space="preserve">
+Although it may be several years from implementation, developing and marketing low-carbon building materials is another new opportunity. Buildings are a significant source of greenhouse gas emissions, making building decarbonization a California state priority. Embodied carbon is the lifecycle of greenhouse gas emissions from creating, transporting, and disposing of building materials (Carbon Leadership Forum, 2022). In other words, embodied carbon is any building’s carbon footprint contained in its building materials. It differs from operational carbon, the carbon produced by a building’s energy, heat, and lighting. The California Air Resources Board is developing a comprehensive strategy for embodied carbon and is seeking comments following the signing of ABs 2446 and 43.</w:t>
+      </w:r>
+    </w:p>
+    <w:p>
+      <w:pPr>
+        <w:pBdr>
+          <w:left w:val="double" w:color="5D85D0"/>
+        </w:pBdr>
+        <w:ind w:left="288" w:right="288"/>
+      </w:pPr>
+      <w:r>
+        <w:rPr>
+          <w:b/>
+          <w:bCs/>
+        </w:rPr>
+        <w:t xml:space="preserve">Revolving Loan Funds</w:t>
+      </w:r>
+      <w:r>
+        <w:t xml:space="preserve">
+Pooled funding sources, such as impact bonds or revolving loan funds, can help make a greater amount of funds available to more projects across a landscape. Typically offered at lower-than-market interest rates, revolving loan funds are self-replenishing pools of money that utilize principal and interest payments on existing loans to issue new loans. They have been used effectively on both small and large scales to develop businesses, support healthcare, and improve environmental outcomes. Revolving loan funds also provide much-needed upfront capital for project startups. They are flexible and can be used in conjunction with more conventional funds, such as grants and loans.</w:t>
+      </w:r>
+    </w:p>
+    <w:p>
+      <w:pPr>
+        <w:pBdr>
+          <w:left w:val="double" w:color="5D85D0"/>
+        </w:pBdr>
+        <w:ind w:left="288" w:right="288"/>
+      </w:pPr>
+      <w:r>
+        <w:t xml:space="preserve">For example, through a coalition of public and private partners, the Southwest Wildfire Impact Fund aims to utilize resources from private investors and revenues generated from biomass produced through forest thinning to offset the financial burden of wildfire mitigation in the San Juan National Forest’s wildland-urban interface. The project fosters regional collaboration through shared project financing and implementation. It also creates the opportunity for scaling up forest treatments and fire reduction by creating a revolving loan fund that reinvests proceeds into additional projects, ensuring that capital is available for long-term re-treatment and expansion of forest health interventions.</w:t>
+      </w:r>
+    </w:p>
+    <w:p>
+      <w:pPr>
+        <w:pBdr>
+          <w:left w:val="double" w:color="5D85D0"/>
+        </w:pBdr>
+        <w:ind w:left="288" w:right="288"/>
+      </w:pPr>
+      <w:r>
+        <w:t xml:space="preserve">Blue Forest is operating a revolving loan fund called the California Wildfire Innovation Fund, which could expand into broader support for other forest health entities.</w:t>
+      </w:r>
+    </w:p>
+    <w:p>
+      <w:pPr>
+        <w:pBdr>
+          <w:left w:val="double" w:color="5D85D0"/>
+        </w:pBdr>
+        <w:ind w:left="288" w:right="288"/>
+      </w:pPr>
+      <w:r>
+        <w:rPr>
+          <w:b/>
+          <w:bCs/>
+        </w:rPr>
+        <w:t xml:space="preserve">Parametric Insurance</w:t>
+      </w:r>
+      <w:r>
+        <w:t xml:space="preserve">
+Parametric or index-based insurance covers the probability of a predefined event, rather than indemnifying the actual loss incurred </w:t>
+      </w:r>
+      <w:r>
+        <w:t xml:space="preserve">(</w:t>
+      </w:r>
+      <w:r>
+        <w:t xml:space="preserve">Re, 2023</w:t>
+      </w:r>
+      <w:r>
+        <w:t xml:space="preserve">)</w:t>
+      </w:r>
+      <w:r>
+        <w:t xml:space="preserve">. These so-called trigger events are typically disaster-related (e.g., wildfires, flooding, hurricanes, earthquakes). They are measured through triggers such as wind speed, earthquake magnitude, acres burned, burn severity, or rainfall amount. Insurable triggers are modeled and must happen by chance. When the triggers are reached, a predetermined payout is made regardless of the sustained physical losses. Parametric insurance is meant to complement existing indemnity insurance but is increasingly used for post-disaster restoration funding in the natural world.</w:t>
+      </w:r>
+    </w:p>
+    <w:p>
+      <w:pPr>
+        <w:pBdr>
+          <w:left w:val="double" w:color="5D85D0"/>
+        </w:pBdr>
+        <w:ind w:left="288" w:right="288"/>
+      </w:pPr>
+      <w:r>
+        <w:t xml:space="preserve">One of the earliest examples of parametric insurance used for nature recovery is the Mesoamerican Reef parametric insurance that provided $800,000 for reef restoration following Hurricane Delta. The trigger was windspeed with a parameter greater than 100 knots. The funds originated from the </w:t>
+      </w:r>
+      <w:hyperlink w:history="1" r:id="rIdebh02ezesfwpcadziejb5">
+        <w:r>
+          <w:rPr>
+            <w:rStyle w:val="Hyperlink"/>
+          </w:rPr>
+          <w:t xml:space="preserve">Coastal Zone Management Trust</w:t>
+        </w:r>
+      </w:hyperlink>
+      <w:r>
+        <w:t xml:space="preserve">. Utilizing insurance to protect forests and communities, likely through wildfire risk mitigation, could be a novel approach to funding activities throughout the region and provide complementary funds that could be particularly valuable post-fire.</w:t>
+      </w:r>
+    </w:p>
+    <w:p>
+      <w:pPr>
+        <w:pBdr>
+          <w:left w:val="double" w:color="5D85D0"/>
+        </w:pBdr>
+        <w:ind w:left="288" w:right="288"/>
+      </w:pPr>
+      <w:r>
+        <w:rPr>
+          <w:b/>
+          <w:bCs/>
+        </w:rPr>
+        <w:t xml:space="preserve">Tech-based Solutions</w:t>
+      </w:r>
+      <w:r>
+        <w:t xml:space="preserve">
+The technology could help connect funders to a new JPA. Blockchain and digital solutions have mostly been applied to reforestation and carbon sequestration projects. It may be possible to establish a digital marketplace where funders and implementers can connect and collaborate on implementing forest health restoration and infrastructure projects. Developing a platform for aggregated funding could be part of a funded project or developed in tandem rather than as a standalone initiative.</w:t>
+      </w:r>
+    </w:p>
+    <w:p/>
+    <w:p>
+      <w:pPr>
+        <w:pStyle w:val="Heading2"/>
+      </w:pPr>
+      <w:r>
+        <w:t xml:space="preserve">1.3	</w:t>
+      </w:r>
+      <w:r>
+        <w:t xml:space="preserve">Budget</w:t>
+      </w:r>
+    </w:p>
+    <w:p>
+      <w:r>
+        <w:t xml:space="preserve">Rough estimates for JPA creation in California for 2025 range from a bare bones budget of approximately $400,000/year to a more “inflation-proof” budget of $2-3 million/year for startup and sustainable implementation over time.</w:t>
+      </w:r>
+      <w:r>
+        <w:rPr>
+          <w:rStyle w:val="FootnoteReference"/>
+        </w:rPr>
+        <w:footnoteReference w:id="3"/>
+      </w:r>
+    </w:p>
+    <w:p>
+      <w:pPr>
+        <w:pStyle w:val="Heading3"/>
+      </w:pPr>
+      <w:r>
+        <w:t xml:space="preserve">1.3.1	</w:t>
+      </w:r>
+      <w:r>
+        <w:t xml:space="preserve">Revenue</w:t>
+      </w:r>
+    </w:p>
+    <w:p>
+      <w:r>
+        <w:t xml:space="preserve">Revenue may come from a variety of sources such as grants, donations, and fee-for-service consulting. Contributions and gifts may come from local to regional foundations and corporations interested in forest health. Individual contributions always have the potential to add up to more than foundation and corporate gifts, as they are the largest charitable giving category in the United States. However, they require more time to manage. Creating a time-bound campaign with a specific fundraising goal replete with a thermometer to track progress could be a great way to involve communities in a region through giving and engaging them in the need for a JPA to ultimately mitigate wildfire threats.</w:t>
+      </w:r>
+    </w:p>
+    <w:p>
+      <w:r>
+        <w:t xml:space="preserve">In the case of pilot projects supported by the Governor’s Office of Land Use and Climate Innovation, a tranche of endowment-like funding is being provided for startup funding of aggregation entities. In some cases, this amount is as much as $1 million, which, along with a capital campaign to bolster individual giving and create awareness around a JPA, could create a base endowment and provide stable operational revenue to a new organization from the principal if the endowment funds are wisely invested.</w:t>
+      </w:r>
+    </w:p>
+    <w:p>
+      <w:r>
+        <w:t xml:space="preserve">Although not competing for grants with RCDs, a JPA may help administer a large grant across multiple RCDs to leverage more funds across a region. With the devolution of some state funding sources, this could be a great option for managing regional funds and reducing competition for funding resources, as the grants are allocated to local organizations.</w:t>
+      </w:r>
+    </w:p>
+    <w:p/>
+    <w:p>
+      <w:pPr>
+        <w:pBdr>
+          <w:left w:val="double" w:color="5D85D0"/>
+        </w:pBdr>
+        <w:shd w:color="5D85D0" w:val="solid"/>
+        <w:ind w:left="288" w:right="288"/>
+      </w:pPr>
+      <w:r>
+        <w:rPr>
+          <w:b/>
+          <w:bCs/>
+          <w:color w:val="FFFFFF"/>
+        </w:rPr>
+        <w:t xml:space="preserve">JPA - RCD competition</w:t>
+      </w:r>
+    </w:p>
+    <w:p>
+      <w:pPr>
+        <w:pBdr>
+          <w:left w:val="double" w:color="5D85D0"/>
+        </w:pBdr>
+        <w:ind w:left="288" w:right="288"/>
+      </w:pPr>
+      <w:r>
+        <w:t xml:space="preserve">Evaluating whether to form a new governmental entity or organization is an important consideration for feedstock aggregation. Working with existing organizations, such as Resource Conservation Districts or Fire Safe Councils, would be a good starting point. It is critical to incorporate into the JPA’s bylaws and revenue-generating practices that grant fundraising does not compete with RCDs. It is possible a JPA may collaborate on a grant with one or more RCDs, but should never submit grants for which an RCD is eligible.</w:t>
+      </w:r>
+    </w:p>
+    <w:p/>
+    <w:p>
+      <w:r>
+        <w:t xml:space="preserve">Contingency funding should be written into the budget expenses. Adding 10-15% contingency line items to any secured grant would supplement that funding; however, most grant funding contingencies are typically applied to budget shortfalls. Other contingency funding sources could include unrestricted funding (such as contributions or gifts) and a higher indirect rate.</w:t>
+      </w:r>
+    </w:p>
+    <w:p>
+      <w:pPr>
+        <w:pStyle w:val="Heading3"/>
+      </w:pPr>
+      <w:r>
+        <w:t xml:space="preserve">1.3.2	</w:t>
+      </w:r>
+      <w:r>
+        <w:t xml:space="preserve">Expenses</w:t>
+      </w:r>
+    </w:p>
+    <w:p>
+      <w:r>
+        <w:t xml:space="preserve">An annual expense budget of ~$ $400,000-2 million is estimated for a JPA startup. The total expenses/year could slowly ramp up each year of the budget, with the idea that additional secured revenue would enable a JPA to bring on more staff capacity, increase offerings, reach, or fee-for-service activities, or undertake additional revenue generation activities. The bulk of the expenses is for labor and staff, although some JPAs operate completely through contracted staff.</w:t>
+      </w:r>
+    </w:p>
+    <w:p>
+      <w:r>
+        <w:t xml:space="preserve">Other expenses may include operations and maintenance, audit and legal fees, LAFCO filing, bylaw creation, insurance, equipment, software, travel, bank fees, communications, website development, outreach, and other related expenses.</w:t>
+      </w:r>
+    </w:p>
+    <w:p>
+      <w:pPr>
+        <w:pStyle w:val="Heading2"/>
+      </w:pPr>
+      <w:r>
+        <w:t xml:space="preserve">1.4	</w:t>
+      </w:r>
+      <w:r>
+        <w:t xml:space="preserve">Recommendations</w:t>
+      </w:r>
+    </w:p>
+    <w:p>
+      <w:r>
+        <w:t xml:space="preserve">Funding JPAs is not a simple task, as most public funding sources are focused on project implementation, e.g., funding restoration projects in the field, rather than providing administrative support or organizational startup. Some foundations fund this type of work, but accessing those funds can be challenging. Another challenge is competing with existing entities for scarce local, regional, and federal resources. The following are recommendations to consider when examining the feasibility of building and maintaining a JPA for long-term feedstock agreements:</w:t>
       </w:r>
     </w:p>
     <w:p>
@@ -2699,7 +2365,7 @@
         <w:pStyle w:val="ListParagraph"/>
         <w:numPr>
           <w:ilvl w:val="0"/>
-          <w:numId w:val="13"/>
+          <w:numId w:val="14"/>
         </w:numPr>
       </w:pPr>
       <w:r>
@@ -2707,10 +2373,10 @@
           <w:b/>
           <w:bCs/>
         </w:rPr>
-        <w:t xml:space="preserve">Co-house staff and resources</w:t>
-      </w:r>
-      <w:r>
-        <w:t xml:space="preserve">. Utilize existing offices and share staff and other resources as capacity and funding allows. This is particularly important during the startup and early phases of developing a JPA.</w:t>
+        <w:t xml:space="preserve">Utilize public funds for startup and traditional projects</w:t>
+      </w:r>
+      <w:r>
+        <w:t xml:space="preserve">. Public funding is readily available and generally suitable for trials or the initial development of feasible but new ideas.</w:t>
       </w:r>
     </w:p>
     <w:p>
@@ -2718,7 +2384,7 @@
         <w:pStyle w:val="ListParagraph"/>
         <w:numPr>
           <w:ilvl w:val="0"/>
-          <w:numId w:val="13"/>
+          <w:numId w:val="14"/>
         </w:numPr>
       </w:pPr>
       <w:r>
@@ -2726,10 +2392,10 @@
           <w:b/>
           <w:bCs/>
         </w:rPr>
-        <w:t xml:space="preserve">Incorporate feedstock insurance</w:t>
-      </w:r>
-      <w:r>
-        <w:t xml:space="preserve">. To de-risk feedstock pricing and also attract new investors to wood product businesses.</w:t>
+        <w:t xml:space="preserve">Pilot non-traditional, higher risk, or new revenue sources</w:t>
+      </w:r>
+      <w:r>
+        <w:t xml:space="preserve">. Then, ramp them up with success, and participating entities and partners see their value and understand how they work.</w:t>
       </w:r>
     </w:p>
     <w:p>
@@ -2737,7 +2403,7 @@
         <w:pStyle w:val="ListParagraph"/>
         <w:numPr>
           <w:ilvl w:val="0"/>
-          <w:numId w:val="13"/>
+          <w:numId w:val="14"/>
         </w:numPr>
       </w:pPr>
       <w:r>
@@ -2745,10 +2411,10 @@
           <w:b/>
           <w:bCs/>
         </w:rPr>
-        <w:t xml:space="preserve">Leverage public funds with private investment</w:t>
-      </w:r>
-      <w:r>
-        <w:t xml:space="preserve">. When public funds are secured, immediately work to leverage them with other public and private funding resources. Don’t wait until near the end of grants to look for additional funds.</w:t>
+        <w:t xml:space="preserve">Co-house staff and resources</w:t>
+      </w:r>
+      <w:r>
+        <w:t xml:space="preserve">. Utilize existing offices and share staff and other resources as capacity and funding allow. This is particularly important during the startup and early phases of developing a JPA.</w:t>
       </w:r>
     </w:p>
     <w:p>
@@ -2756,7 +2422,7 @@
         <w:pStyle w:val="ListParagraph"/>
         <w:numPr>
           <w:ilvl w:val="0"/>
-          <w:numId w:val="13"/>
+          <w:numId w:val="14"/>
         </w:numPr>
       </w:pPr>
       <w:r>
@@ -2764,10 +2430,10 @@
           <w:b/>
           <w:bCs/>
         </w:rPr>
-        <w:t xml:space="preserve">Sort yards with wood campuses or easements</w:t>
-      </w:r>
-      <w:r>
-        <w:t xml:space="preserve">. Could land trusts or agencies that fund easements include sort yards as part of restoration efforts?</w:t>
+        <w:t xml:space="preserve">Leverage public funds with private investment</w:t>
+      </w:r>
+      <w:r>
+        <w:t xml:space="preserve">. When public funds are secured, immediately work to leverage them with other public and private funding resources. Don’t wait until near the end of the grant cycle to look for additional funds.</w:t>
       </w:r>
     </w:p>
     <w:p>
@@ -2775,7 +2441,7 @@
         <w:pStyle w:val="ListParagraph"/>
         <w:numPr>
           <w:ilvl w:val="0"/>
-          <w:numId w:val="13"/>
+          <w:numId w:val="14"/>
         </w:numPr>
       </w:pPr>
       <w:r>
@@ -2786,7 +2452,7 @@
         <w:t xml:space="preserve">Use the right revenue source</w:t>
       </w:r>
       <w:r>
-        <w:t xml:space="preserve">. Property and sales tax increases are more effective in populated areas with higher incomes; however, they usually are not appropriate for disadvantaged rural where the tax base and population tend to be to low to provide enough funding.</w:t>
+        <w:t xml:space="preserve">. Property and sales tax increases are more effective in populated areas with higher incomes; however, they are usually not appropriate for rural areas, where the tax base and population tend to be too low to provide sufficient funding.</w:t>
       </w:r>
     </w:p>
     <w:p>
@@ -2794,34 +2460,68 @@
         <w:pStyle w:val="Heading2"/>
       </w:pPr>
       <w:r>
+        <w:t xml:space="preserve">1.5	</w:t>
+      </w:r>
+      <w:r>
+        <w:t xml:space="preserve">Acknowledgements</w:t>
+      </w:r>
+    </w:p>
+    <w:p>
+      <w:r>
+        <w:t xml:space="preserve">A special thank you to Joshua Harrison, Center for the Study of the Force Majeure, and Temra Costa, Forestree Collective, for reviewing the draft manuscript. Thank you to the entire CAL FRAME team for ideas, edits, and development of the CAL FRAME report to the Office of Land Use and Climate Innovation. Eternal gratitude to Jeff Odefey, One Water Alliance, for helping to develop the initial ideas for this manuscript.</w:t>
+      </w:r>
+    </w:p>
+    <w:p>
+      <w:pPr>
+        <w:pStyle w:val="Heading2"/>
+      </w:pPr>
+      <w:r>
         <w:t xml:space="preserve">References</w:t>
       </w:r>
     </w:p>
     <w:p>
-      <w:r>
-        <w:t xml:space="preserve">Barker, J., Voorhis, J., &amp; Crotty, S. M. (2025). Assessing costs and constraints of forest residue disposal by pile burning. </w:t>
-      </w:r>
       <w:r>
         <w:rPr>
           <w:i/>
           <w:iCs/>
         </w:rPr>
-        <w:t xml:space="preserve">Frontiers in Forests and Global Change</w:t>
-      </w:r>
-      <w:r>
-        <w:t xml:space="preserve">, </w:t>
+        <w:t xml:space="preserve">Endowments</w:t>
+      </w:r>
+      <w:r>
+        <w:t xml:space="preserve">. (2025). Synchronicity Earth. </w:t>
+      </w:r>
+      <w:hyperlink w:history="1" r:id="rIdhyd3vvqki9zzfmrezryau">
+        <w:r>
+          <w:rPr>
+            <w:rStyle w:val="Hyperlink"/>
+          </w:rPr>
+          <w:t xml:space="preserve">https://shorter.gg/AKrVQs</w:t>
+        </w:r>
+      </w:hyperlink>
+      <w:r>
+        <w:t xml:space="preserve">Barker, J., Voorhis, J., &amp; Crotty, S. M. (2025). Assessing costs and constraints of forest residue disposal by pile burning. </w:t>
       </w:r>
       <w:r>
         <w:rPr>
           <w:i/>
           <w:iCs/>
         </w:rPr>
+        <w:t xml:space="preserve">Frontiers in Forests and Global Change</w:t>
+      </w:r>
+      <w:r>
+        <w:t xml:space="preserve">, </w:t>
+      </w:r>
+      <w:r>
+        <w:rPr>
+          <w:i/>
+          <w:iCs/>
+        </w:rPr>
         <w:t xml:space="preserve">7</w:t>
       </w:r>
       <w:r>
         <w:t xml:space="preserve">. </w:t>
       </w:r>
-      <w:hyperlink w:history="1" r:id="rIdqyghhpionnmogazz4m64b">
+      <w:hyperlink w:history="1" r:id="rIdi_udoahcvklhdnwy9lpul">
         <w:r>
           <w:rPr>
             <w:rStyle w:val="Hyperlink"/>
@@ -2852,7 +2552,7 @@
       <w:r>
         <w:t xml:space="preserve">(4), 208–218. </w:t>
       </w:r>
-      <w:hyperlink w:history="1" r:id="rIddsp5k8y8_ywsvt1optosc">
+      <w:hyperlink w:history="1" r:id="rIdimlzuqkvjcq-csjaazyc5">
         <w:r>
           <w:rPr>
             <w:rStyle w:val="Hyperlink"/>
@@ -2906,7 +2606,7 @@
       <w:r>
         <w:t xml:space="preserve">. </w:t>
       </w:r>
-      <w:hyperlink w:history="1" r:id="rIdoyifou9pvvllebyjotzyy">
+      <w:hyperlink w:history="1" r:id="rIdibecqr2w71otxrebn-f3b">
         <w:r>
           <w:rPr>
             <w:rStyle w:val="Hyperlink"/>
@@ -2927,7 +2627,7 @@
       <w:r>
         <w:t xml:space="preserve">. Regenerative Forest Solutions. </w:t>
       </w:r>
-      <w:hyperlink w:history="1" r:id="rId7dai7a2dsl1hwn6n4rkjc">
+      <w:hyperlink w:history="1" r:id="rId9lvk1adit1v42rrpizqd_">
         <w:r>
           <w:rPr>
             <w:rStyle w:val="Hyperlink"/>
@@ -2948,7 +2648,7 @@
       <w:r>
         <w:t xml:space="preserve">. Conservation Strategy Group. </w:t>
       </w:r>
-      <w:hyperlink w:history="1" r:id="rIdz15ryjutgeehbisgzp13d">
+      <w:hyperlink w:history="1" r:id="rIda9uwqmliu0tzyt21wimjl">
         <w:r>
           <w:rPr>
             <w:rStyle w:val="Hyperlink"/>
@@ -2969,7 +2669,7 @@
       <w:r>
         <w:t xml:space="preserve">. Senate Local Government Committee. </w:t>
       </w:r>
-      <w:hyperlink w:history="1" r:id="rIdiltcwgazr26dhlvmlxvqv">
+      <w:hyperlink w:history="1" r:id="rIdl5ui2z3jffr3ji3eqnbaz">
         <w:r>
           <w:rPr>
             <w:rStyle w:val="Hyperlink"/>
@@ -2978,19 +2678,32 @@
         </w:r>
       </w:hyperlink>
       <w:r>
-        <w:t xml:space="preserve">Darlington, C., &amp; Stevenson, C. (2023). </w:t>
+        <w:t xml:space="preserve">Darlington, C. (2025). </w:t>
       </w:r>
       <w:r>
         <w:rPr>
           <w:i/>
           <w:iCs/>
         </w:rPr>
+        <w:t xml:space="preserve">Local agency forest biomass market enhancement strategies and action July 10 presentation to Joint Institute for Wood Products Innovation AC Meeting</w:t>
+      </w:r>
+      <w:r>
+        <w:t xml:space="preserve">.</w:t>
+      </w:r>
+      <w:r>
+        <w:t xml:space="preserve">Darlington, C., &amp; Stevenson, C. (2023). </w:t>
+      </w:r>
+      <w:r>
+        <w:rPr>
+          <w:i/>
+          <w:iCs/>
+        </w:rPr>
         <w:t xml:space="preserve">Joint Powers Authorities: A tool to manage forest biomass residuals in California</w:t>
       </w:r>
       <w:r>
         <w:t xml:space="preserve">. CLERE, Inc. </w:t>
       </w:r>
-      <w:hyperlink w:history="1" r:id="rIdrgsfluknrab8ugp1-rtva">
+      <w:hyperlink w:history="1" r:id="rIdbtlkcwsrwcds5xtpxcunc">
         <w:r>
           <w:rPr>
             <w:rStyle w:val="Hyperlink"/>
@@ -2999,19 +2712,40 @@
         </w:r>
       </w:hyperlink>
       <w:r>
-        <w:t xml:space="preserve">de Sousa Mills, P. (2016). </w:t>
+        <w:t xml:space="preserve">Darlington, C., Moghaddas, Jason, &amp; Fanslow, G. (2023). </w:t>
       </w:r>
       <w:r>
         <w:rPr>
           <w:i/>
           <w:iCs/>
         </w:rPr>
+        <w:t xml:space="preserve">California forest biomass pile data collection</w:t>
+      </w:r>
+      <w:r>
+        <w:t xml:space="preserve">. Joint Institute for Wood Products Innovation. </w:t>
+      </w:r>
+      <w:hyperlink w:history="1" r:id="rIdpri-3_rzauf7ta2dohjy8">
+        <w:r>
+          <w:rPr>
+            <w:rStyle w:val="Hyperlink"/>
+          </w:rPr>
+          <w:t xml:space="preserve">https://bof.fire.ca.gov/media/0t1f0oqa/full-12-b-i-ca-forest-biomass-pile-data-collection-report-draft_part-1__11-8-23-adamfk.pdf</w:t>
+        </w:r>
+      </w:hyperlink>
+      <w:r>
+        <w:t xml:space="preserve">de Sousa Mills, P. (2016). </w:t>
+      </w:r>
+      <w:r>
+        <w:rPr>
+          <w:i/>
+          <w:iCs/>
+        </w:rPr>
         <w:t xml:space="preserve">The ins and outs of joint powers authorities in California</w:t>
       </w:r>
       <w:r>
         <w:t xml:space="preserve">. </w:t>
       </w:r>
-      <w:hyperlink w:history="1" r:id="rIdpkv_ogqdhjk03g4rj90lb">
+      <w:hyperlink w:history="1" r:id="rIdtdtyfl9gtypx0ndb-o5fl">
         <w:r>
           <w:rPr>
             <w:rStyle w:val="Hyperlink"/>
@@ -3042,7 +2776,7 @@
       <w:r>
         <w:t xml:space="preserve">. </w:t>
       </w:r>
-      <w:hyperlink w:history="1" r:id="rIdsj1yx2sdowjniwjvdkoo9">
+      <w:hyperlink w:history="1" r:id="rIdtnufsgbvaoea4kpooetnp">
         <w:r>
           <w:rPr>
             <w:rStyle w:val="Hyperlink"/>
@@ -3073,7 +2807,7 @@
       <w:r>
         <w:t xml:space="preserve">(8). </w:t>
       </w:r>
-      <w:hyperlink w:history="1" r:id="rIdbdcsiqd9tac4qi5qb9pkl">
+      <w:hyperlink w:history="1" r:id="rIdos19gm2hs-1uwpppkowx6">
         <w:r>
           <w:rPr>
             <w:rStyle w:val="Hyperlink"/>
@@ -3104,7 +2838,7 @@
       <w:r>
         <w:t xml:space="preserve">(7), 392–393. </w:t>
       </w:r>
-      <w:hyperlink w:history="1" r:id="rIdvr11-5ooxgd85nlzdigkb">
+      <w:hyperlink w:history="1" r:id="rIdpez845kpiolicawgljvqd">
         <w:r>
           <w:rPr>
             <w:rStyle w:val="Hyperlink"/>
@@ -3135,7 +2869,7 @@
       <w:r>
         <w:t xml:space="preserve">(1). </w:t>
       </w:r>
-      <w:hyperlink w:history="1" r:id="rIdm4rredmwv8x8wgbfoybs6">
+      <w:hyperlink w:history="1" r:id="rIdyk2e-qpykk5vnhpouofcy">
         <w:r>
           <w:rPr>
             <w:rStyle w:val="Hyperlink"/>
@@ -3166,7 +2900,7 @@
       <w:r>
         <w:t xml:space="preserve">, 120004. </w:t>
       </w:r>
-      <w:hyperlink w:history="1" r:id="rIdc0k71zhd9jya8xsyx0rqb">
+      <w:hyperlink w:history="1" r:id="rIdwxdj4f1_axpaoy_vxnhag">
         <w:r>
           <w:rPr>
             <w:rStyle w:val="Hyperlink"/>
@@ -3187,7 +2921,7 @@
       <w:r>
         <w:t xml:space="preserve">. U.S. Department of Agriculture, Forest Service, Pacific Southwest Research Station. </w:t>
       </w:r>
-      <w:hyperlink w:history="1" r:id="rId8zwtcxvczknwdv8cjpsql">
+      <w:hyperlink w:history="1" r:id="rIdw1rityih7h6-pgrxzp__6">
         <w:r>
           <w:rPr>
             <w:rStyle w:val="Hyperlink"/>
@@ -3208,7 +2942,7 @@
       <w:r>
         <w:t xml:space="preserve"> Swiss Re Corporate Solutions. </w:t>
       </w:r>
-      <w:hyperlink w:history="1" r:id="rIdrflvtqtl3bt3rm47gvdhu">
+      <w:hyperlink w:history="1" r:id="rIde_t_hjltag1pznuzsezof">
         <w:r>
           <w:rPr>
             <w:rStyle w:val="Hyperlink"/>
@@ -3217,29 +2951,92 @@
         </w:r>
       </w:hyperlink>
       <w:r>
-        <w:t xml:space="preserve">Swezy, C., Bailey, J., &amp; Chung, W. (2021). Linking Federal Forest Restoration with Wood Utilization: Modeling Biomass Prices and Analyzing Forest Restoration Costs in the Northern Sierra Nevada. </w:t>
+        <w:t xml:space="preserve">Russell, V., &amp; Odefey, J. (2024). </w:t>
       </w:r>
       <w:r>
         <w:rPr>
           <w:i/>
           <w:iCs/>
         </w:rPr>
-        <w:t xml:space="preserve">Energies</w:t>
-      </w:r>
-      <w:r>
-        <w:t xml:space="preserve">, </w:t>
+        <w:t xml:space="preserve">Conservation finance: Towards a new model for landscape restoration</w:t>
+      </w:r>
+      <w:r>
+        <w:t xml:space="preserve">. </w:t>
+      </w:r>
+      <w:hyperlink w:history="1" r:id="rIda_iaehxwzkmccdixywisa">
+        <w:r>
+          <w:rPr>
+            <w:rStyle w:val="Hyperlink"/>
+          </w:rPr>
+          <w:t xml:space="preserve">https://confinance.info</w:t>
+        </w:r>
+      </w:hyperlink>
+      <w:r>
+        <w:t xml:space="preserve">Russell, V., Sacco, C., Rinne, K., Adriance, J., &amp; Kahling, K. (2024). </w:t>
       </w:r>
       <w:r>
         <w:rPr>
           <w:i/>
           <w:iCs/>
         </w:rPr>
+        <w:t xml:space="preserve">Forest Business Guidebook</w:t>
+      </w:r>
+      <w:r>
+        <w:t xml:space="preserve">. Forest Business Alliance. </w:t>
+      </w:r>
+      <w:hyperlink w:history="1" r:id="rIdyijewznnczu43m9sekxe7">
+        <w:r>
+          <w:rPr>
+            <w:rStyle w:val="Hyperlink"/>
+          </w:rPr>
+          <w:t xml:space="preserve">https://3point.xyz/fba-myst/</w:t>
+        </w:r>
+      </w:hyperlink>
+      <w:r>
+        <w:t xml:space="preserve">Swezy, C., &amp; Oldson, S. (2025). </w:t>
+      </w:r>
+      <w:r>
+        <w:rPr>
+          <w:i/>
+          <w:iCs/>
+        </w:rPr>
+        <w:t xml:space="preserve">Assessing the feasibility of a joint powers authority-led sort yard in Northeastern California</w:t>
+      </w:r>
+      <w:r>
+        <w:t xml:space="preserve">. Fall River Resource Conservation District. </w:t>
+      </w:r>
+      <w:hyperlink w:history="1" r:id="rIdlgx0ocmi_7wdao8smjzbw">
+        <w:r>
+          <w:rPr>
+            <w:rStyle w:val="Hyperlink"/>
+          </w:rPr>
+          <w:t xml:space="preserve">https://www.fallriverrcd.org/_files/ugd/80da86_a2c73d8b5788458f96777341f64cf965.pdf</w:t>
+        </w:r>
+      </w:hyperlink>
+      <w:r>
+        <w:t xml:space="preserve">Swezy, C., Bailey, J., &amp; Chung, W. (2021). Linking Federal Forest Restoration with Wood Utilization: Modeling Biomass Prices and Analyzing Forest Restoration Costs in the Northern Sierra Nevada. </w:t>
+      </w:r>
+      <w:r>
+        <w:rPr>
+          <w:i/>
+          <w:iCs/>
+        </w:rPr>
+        <w:t xml:space="preserve">Energies</w:t>
+      </w:r>
+      <w:r>
+        <w:t xml:space="preserve">, </w:t>
+      </w:r>
+      <w:r>
+        <w:rPr>
+          <w:i/>
+          <w:iCs/>
+        </w:rPr>
         <w:t xml:space="preserve">14</w:t>
       </w:r>
       <w:r>
         <w:t xml:space="preserve">(9), 2696. </w:t>
       </w:r>
-      <w:hyperlink w:history="1" r:id="rId2fuxe3dzf6hsv9fj7hh42">
+      <w:hyperlink w:history="1" r:id="rIdkhfwga4h5xz_o1cxwrybj">
         <w:r>
           <w:rPr>
             <w:rStyle w:val="Hyperlink"/>
@@ -3260,7 +3057,7 @@
       <w:r>
         <w:t xml:space="preserve">. North Coast Resource Partnership. </w:t>
       </w:r>
-      <w:hyperlink w:history="1" r:id="rIdj8oqfd-8vadut5gardpyw">
+      <w:hyperlink w:history="1" r:id="rIdbv9glagnr5z7iyhkch6dr">
         <w:r>
           <w:rPr>
             <w:rStyle w:val="Hyperlink"/>
@@ -3299,7 +3096,7 @@
         <wp:inline distT="0" distB="0" distL="0" distR="0">
           <wp:extent cx="608542" cy="105833"/>
           <wp:effectExtent b="0" l="0" r="0" t="0"/>
-          <wp:docPr id="2" name="" descr="" title=""/>
+          <wp:docPr id="3" name="" descr="" title=""/>
           <wp:cNvGraphicFramePr>
             <a:graphicFrameLocks xmlns:a="http://schemas.openxmlformats.org/drawingml/2006/main" noChangeAspect="1"/>
           </wp:cNvGraphicFramePr>
@@ -3416,7 +3213,7 @@
         <w:footnoteRef/>
       </w:r>
       <w:r>
-        <w:t xml:space="preserve">JPAs similar to the Marin Wildfire Prevention Authority, funded through sales tax increase, aren’t possible in northeastern California where a low tax base and few people cannot generate the same income as a more densely populated county such as Marin.</w:t>
+        <w:t xml:space="preserve">The old rule of thumb is a maximum 50-mile deadhead (empty trailer returning after dropping off payload) trip for timber or other forest products.</w:t>
       </w:r>
     </w:p>
   </w:footnote>
@@ -3429,9 +3226,35 @@
         <w:footnoteRef/>
       </w:r>
       <w:r>
+        <w:t xml:space="preserve">Note that the Marin Wildfire Prevention Authority, funded by a sales tax increase in Marin County, has a $19.3 mn annual budget.</w:t>
+      </w:r>
+    </w:p>
+  </w:footnote>
+  <w:footnote w:id="4">
+    <w:p>
+      <w:r>
+        <w:rPr>
+          <w:rStyle w:val="FootnoteReference"/>
+        </w:rPr>
+        <w:footnoteRef/>
+      </w:r>
+      <w:r>
+        <w:t xml:space="preserve">Personal communication, Temra Costa, Regenerative Forest Solutions.</w:t>
+      </w:r>
+    </w:p>
+  </w:footnote>
+  <w:footnote w:id="5">
+    <w:p>
+      <w:r>
+        <w:rPr>
+          <w:rStyle w:val="FootnoteReference"/>
+        </w:rPr>
+        <w:footnoteRef/>
+      </w:r>
+      <w:r>
         <w:t xml:space="preserve">See </w:t>
       </w:r>
-      <w:hyperlink w:history="1" r:id="rIdssnonvxtdgc9omy18ai8q">
+      <w:hyperlink w:history="1" r:id="rId9qq-qdmq8kzcii0wghxul">
         <w:r>
           <w:rPr>
             <w:rStyle w:val="Hyperlink"/>
@@ -3444,47 +3267,12 @@
       </w:r>
     </w:p>
   </w:footnote>
-  <w:footnote w:id="4">
-    <w:p>
-      <w:r>
-        <w:rPr>
-          <w:rStyle w:val="FootnoteReference"/>
-        </w:rPr>
-        <w:footnoteRef/>
-      </w:r>
-      <w:r>
-        <w:t xml:space="preserve">For a deeper discussion of collaborative finance approaches to financing water infrastructure and fire mitigation, see </w:t>
-      </w:r>
-      <w:hyperlink w:history="1" r:id="rIdgq_ebpv2hjadynnv4q3n_">
-        <w:r>
-          <w:rPr>
-            <w:rStyle w:val="Hyperlink"/>
-          </w:rPr>
-          <w:t xml:space="preserve">Because It’s Worth It</w:t>
-        </w:r>
-      </w:hyperlink>
-      <w:r>
-        <w:t xml:space="preserve"> and </w:t>
-      </w:r>
-      <w:hyperlink w:history="1" r:id="rIdu67lhnlgeryly0k0cyfkd">
-        <w:r>
-          <w:rPr>
-            <w:rStyle w:val="Hyperlink"/>
-          </w:rPr>
-          <w:t xml:space="preserve">Conservation Finance: Towards a new model for landscape restoration</w:t>
-        </w:r>
-      </w:hyperlink>
-      <w:r>
-        <w:t xml:space="preserve">.</w:t>
-      </w:r>
-    </w:p>
-  </w:footnote>
 </w:footnotes>
 </file>
 
 <file path=word/numbering.xml><?xml version="1.0" encoding="utf-8"?>
 <w:numbering xmlns:wpc="http://schemas.microsoft.com/office/word/2010/wordprocessingCanvas" xmlns:mc="http://schemas.openxmlformats.org/markup-compatibility/2006" xmlns:o="urn:schemas-microsoft-com:office:office" xmlns:r="http://schemas.openxmlformats.org/officeDocument/2006/relationships" xmlns:m="http://schemas.openxmlformats.org/officeDocument/2006/math" xmlns:v="urn:schemas-microsoft-com:vml" xmlns:wp14="http://schemas.microsoft.com/office/word/2010/wordprocessingDrawing" xmlns:wp="http://schemas.openxmlformats.org/drawingml/2006/wordprocessingDrawing" xmlns:w10="urn:schemas-microsoft-com:office:word" xmlns:w="http://schemas.openxmlformats.org/wordprocessingml/2006/main" xmlns:w14="http://schemas.microsoft.com/office/word/2010/wordml" xmlns:w15="http://schemas.microsoft.com/office/word/2012/wordml" xmlns:wpg="http://schemas.microsoft.com/office/word/2010/wordprocessingGroup" xmlns:wpi="http://schemas.microsoft.com/office/word/2010/wordprocessingInk" xmlns:wne="http://schemas.microsoft.com/office/word/2006/wordml" xmlns:wps="http://schemas.microsoft.com/office/word/2010/wordprocessingShape" mc:Ignorable="w14 w15 wp14">
-  <w:abstractNum w:abstractNumId="3" w15:restartNumberingAfterBreak="0">
+  <w:abstractNum w:abstractNumId="4" w15:restartNumberingAfterBreak="0">
     <w:multiLevelType w:val="hybridMultilevel"/>
     <w:lvl w:ilvl="0" w15:tentative="1">
       <w:start w:val="1"/>
@@ -3565,90 +3353,6 @@
       <w:lvlJc w:val="left"/>
       <w:pPr>
         <w:ind w:left="6480" w:hanging="360"/>
-      </w:pPr>
-    </w:lvl>
-  </w:abstractNum>
-  <w:abstractNum w:abstractNumId="4" w15:restartNumberingAfterBreak="0">
-    <w:multiLevelType w:val="hybridMultilevel"/>
-    <w:lvl w:ilvl="0" w15:tentative="1">
-      <w:start w:val="1"/>
-      <w:numFmt w:val="decimal"/>
-      <w:lvlText w:val="%1."/>
-      <w:lvlJc w:val="start"/>
-      <w:pPr>
-        <w:ind w:left="720" w:hanging="259"/>
-      </w:pPr>
-    </w:lvl>
-    <w:lvl w:ilvl="1" w15:tentative="1">
-      <w:start w:val="1"/>
-      <w:numFmt w:val="lowerLetter"/>
-      <w:lvlText w:val="%2."/>
-      <w:lvlJc w:val="start"/>
-      <w:pPr>
-        <w:ind w:left="1440" w:hanging="259"/>
-      </w:pPr>
-    </w:lvl>
-    <w:lvl w:ilvl="2" w15:tentative="1">
-      <w:start w:val="1"/>
-      <w:numFmt w:val="lowerRoman"/>
-      <w:lvlText w:val="%3."/>
-      <w:lvlJc w:val="start"/>
-      <w:pPr>
-        <w:ind w:left="2160" w:hanging="259"/>
-      </w:pPr>
-    </w:lvl>
-    <w:lvl w:ilvl="3" w15:tentative="1">
-      <w:start w:val="1"/>
-      <w:numFmt w:val="decimal"/>
-      <w:lvlText w:val="%4."/>
-      <w:lvlJc w:val="start"/>
-      <w:pPr>
-        <w:ind w:left="2880" w:hanging="259"/>
-      </w:pPr>
-    </w:lvl>
-    <w:lvl w:ilvl="4" w15:tentative="1">
-      <w:start w:val="1"/>
-      <w:numFmt w:val="lowerLetter"/>
-      <w:lvlText w:val="%5."/>
-      <w:lvlJc w:val="start"/>
-      <w:pPr>
-        <w:ind w:left="3600" w:hanging="259"/>
-      </w:pPr>
-    </w:lvl>
-    <w:lvl w:ilvl="5" w15:tentative="1">
-      <w:start w:val="1"/>
-      <w:numFmt w:val="lowerRoman"/>
-      <w:lvlText w:val="%6."/>
-      <w:lvlJc w:val="start"/>
-      <w:pPr>
-        <w:ind w:left="4320" w:hanging="259"/>
-      </w:pPr>
-    </w:lvl>
-    <w:lvl w:ilvl="6" w15:tentative="1">
-      <w:start w:val="1"/>
-      <w:numFmt w:val="decimal"/>
-      <w:lvlText w:val="%7."/>
-      <w:lvlJc w:val="start"/>
-      <w:pPr>
-        <w:ind w:left="5040" w:hanging="259"/>
-      </w:pPr>
-    </w:lvl>
-    <w:lvl w:ilvl="7" w15:tentative="1">
-      <w:start w:val="1"/>
-      <w:numFmt w:val="lowerLetter"/>
-      <w:lvlText w:val="%8."/>
-      <w:lvlJc w:val="start"/>
-      <w:pPr>
-        <w:ind w:left="5760" w:hanging="259"/>
-      </w:pPr>
-    </w:lvl>
-    <w:lvl w:ilvl="8" w15:tentative="1">
-      <w:start w:val="1"/>
-      <w:numFmt w:val="lowerRoman"/>
-      <w:lvlText w:val="%9."/>
-      <w:lvlJc w:val="start"/>
-      <w:pPr>
-        <w:ind w:left="6480" w:hanging="259"/>
       </w:pPr>
     </w:lvl>
   </w:abstractNum>
@@ -3740,8 +3444,8 @@
     <w:multiLevelType w:val="hybridMultilevel"/>
     <w:lvl w:ilvl="0" w15:tentative="1">
       <w:start w:val="1"/>
-      <w:numFmt w:val="decimal"/>
-      <w:lvlText w:val="%1."/>
+      <w:numFmt w:val="bullet"/>
+      <w:lvlText w:val="●"/>
       <w:lvlJc w:val="start"/>
       <w:pPr>
         <w:ind w:left="720" w:hanging="259"/>
@@ -3749,8 +3453,8 @@
     </w:lvl>
     <w:lvl w:ilvl="1" w15:tentative="1">
       <w:start w:val="1"/>
-      <w:numFmt w:val="lowerLetter"/>
-      <w:lvlText w:val="%2."/>
+      <w:numFmt w:val="bullet"/>
+      <w:lvlText w:val="○"/>
       <w:lvlJc w:val="start"/>
       <w:pPr>
         <w:ind w:left="1440" w:hanging="259"/>
@@ -3758,8 +3462,8 @@
     </w:lvl>
     <w:lvl w:ilvl="2" w15:tentative="1">
       <w:start w:val="1"/>
-      <w:numFmt w:val="lowerRoman"/>
-      <w:lvlText w:val="%3."/>
+      <w:numFmt w:val="bullet"/>
+      <w:lvlText w:val="■"/>
       <w:lvlJc w:val="start"/>
       <w:pPr>
         <w:ind w:left="2160" w:hanging="259"/>
@@ -3767,8 +3471,8 @@
     </w:lvl>
     <w:lvl w:ilvl="3" w15:tentative="1">
       <w:start w:val="1"/>
-      <w:numFmt w:val="decimal"/>
-      <w:lvlText w:val="%4."/>
+      <w:numFmt w:val="bullet"/>
+      <w:lvlText w:val="●"/>
       <w:lvlJc w:val="start"/>
       <w:pPr>
         <w:ind w:left="2880" w:hanging="259"/>
@@ -3776,8 +3480,8 @@
     </w:lvl>
     <w:lvl w:ilvl="4" w15:tentative="1">
       <w:start w:val="1"/>
-      <w:numFmt w:val="lowerLetter"/>
-      <w:lvlText w:val="%5."/>
+      <w:numFmt w:val="bullet"/>
+      <w:lvlText w:val="○"/>
       <w:lvlJc w:val="start"/>
       <w:pPr>
         <w:ind w:left="3600" w:hanging="259"/>
@@ -3785,8 +3489,8 @@
     </w:lvl>
     <w:lvl w:ilvl="5" w15:tentative="1">
       <w:start w:val="1"/>
-      <w:numFmt w:val="lowerRoman"/>
-      <w:lvlText w:val="%6."/>
+      <w:numFmt w:val="bullet"/>
+      <w:lvlText w:val="■"/>
       <w:lvlJc w:val="start"/>
       <w:pPr>
         <w:ind w:left="4320" w:hanging="259"/>
@@ -3794,8 +3498,8 @@
     </w:lvl>
     <w:lvl w:ilvl="6" w15:tentative="1">
       <w:start w:val="1"/>
-      <w:numFmt w:val="decimal"/>
-      <w:lvlText w:val="%7."/>
+      <w:numFmt w:val="bullet"/>
+      <w:lvlText w:val="●"/>
       <w:lvlJc w:val="start"/>
       <w:pPr>
         <w:ind w:left="5040" w:hanging="259"/>
@@ -3803,8 +3507,8 @@
     </w:lvl>
     <w:lvl w:ilvl="7" w15:tentative="1">
       <w:start w:val="1"/>
-      <w:numFmt w:val="lowerLetter"/>
-      <w:lvlText w:val="%8."/>
+      <w:numFmt w:val="bullet"/>
+      <w:lvlText w:val="○"/>
       <w:lvlJc w:val="start"/>
       <w:pPr>
         <w:ind w:left="5760" w:hanging="259"/>
@@ -3812,8 +3516,8 @@
     </w:lvl>
     <w:lvl w:ilvl="8" w15:tentative="1">
       <w:start w:val="1"/>
-      <w:numFmt w:val="lowerRoman"/>
-      <w:lvlText w:val="%9."/>
+      <w:numFmt w:val="bullet"/>
+      <w:lvlText w:val="■"/>
       <w:lvlJc w:val="start"/>
       <w:pPr>
         <w:ind w:left="6480" w:hanging="259"/>
@@ -3824,8 +3528,8 @@
     <w:multiLevelType w:val="hybridMultilevel"/>
     <w:lvl w:ilvl="0" w15:tentative="1">
       <w:start w:val="1"/>
-      <w:numFmt w:val="bullet"/>
-      <w:lvlText w:val="●"/>
+      <w:numFmt w:val="decimal"/>
+      <w:lvlText w:val="%1."/>
       <w:lvlJc w:val="start"/>
       <w:pPr>
         <w:ind w:left="720" w:hanging="259"/>
@@ -3833,8 +3537,8 @@
     </w:lvl>
     <w:lvl w:ilvl="1" w15:tentative="1">
       <w:start w:val="1"/>
-      <w:numFmt w:val="bullet"/>
-      <w:lvlText w:val="○"/>
+      <w:numFmt w:val="lowerLetter"/>
+      <w:lvlText w:val="%2."/>
       <w:lvlJc w:val="start"/>
       <w:pPr>
         <w:ind w:left="1440" w:hanging="259"/>
@@ -3842,8 +3546,8 @@
     </w:lvl>
     <w:lvl w:ilvl="2" w15:tentative="1">
       <w:start w:val="1"/>
-      <w:numFmt w:val="bullet"/>
-      <w:lvlText w:val="■"/>
+      <w:numFmt w:val="lowerRoman"/>
+      <w:lvlText w:val="%3."/>
       <w:lvlJc w:val="start"/>
       <w:pPr>
         <w:ind w:left="2160" w:hanging="259"/>
@@ -3851,8 +3555,8 @@
     </w:lvl>
     <w:lvl w:ilvl="3" w15:tentative="1">
       <w:start w:val="1"/>
-      <w:numFmt w:val="bullet"/>
-      <w:lvlText w:val="●"/>
+      <w:numFmt w:val="decimal"/>
+      <w:lvlText w:val="%4."/>
       <w:lvlJc w:val="start"/>
       <w:pPr>
         <w:ind w:left="2880" w:hanging="259"/>
@@ -3860,8 +3564,8 @@
     </w:lvl>
     <w:lvl w:ilvl="4" w15:tentative="1">
       <w:start w:val="1"/>
-      <w:numFmt w:val="bullet"/>
-      <w:lvlText w:val="○"/>
+      <w:numFmt w:val="lowerLetter"/>
+      <w:lvlText w:val="%5."/>
       <w:lvlJc w:val="start"/>
       <w:pPr>
         <w:ind w:left="3600" w:hanging="259"/>
@@ -3869,8 +3573,8 @@
     </w:lvl>
     <w:lvl w:ilvl="5" w15:tentative="1">
       <w:start w:val="1"/>
-      <w:numFmt w:val="bullet"/>
-      <w:lvlText w:val="■"/>
+      <w:numFmt w:val="lowerRoman"/>
+      <w:lvlText w:val="%6."/>
       <w:lvlJc w:val="start"/>
       <w:pPr>
         <w:ind w:left="4320" w:hanging="259"/>
@@ -3878,8 +3582,8 @@
     </w:lvl>
     <w:lvl w:ilvl="6" w15:tentative="1">
       <w:start w:val="1"/>
-      <w:numFmt w:val="bullet"/>
-      <w:lvlText w:val="●"/>
+      <w:numFmt w:val="decimal"/>
+      <w:lvlText w:val="%7."/>
       <w:lvlJc w:val="start"/>
       <w:pPr>
         <w:ind w:left="5040" w:hanging="259"/>
@@ -3887,8 +3591,8 @@
     </w:lvl>
     <w:lvl w:ilvl="7" w15:tentative="1">
       <w:start w:val="1"/>
-      <w:numFmt w:val="bullet"/>
-      <w:lvlText w:val="○"/>
+      <w:numFmt w:val="lowerLetter"/>
+      <w:lvlText w:val="%8."/>
       <w:lvlJc w:val="start"/>
       <w:pPr>
         <w:ind w:left="5760" w:hanging="259"/>
@@ -3896,8 +3600,8 @@
     </w:lvl>
     <w:lvl w:ilvl="8" w15:tentative="1">
       <w:start w:val="1"/>
-      <w:numFmt w:val="bullet"/>
-      <w:lvlText w:val="■"/>
+      <w:numFmt w:val="lowerRoman"/>
+      <w:lvlText w:val="%9."/>
       <w:lvlJc w:val="start"/>
       <w:pPr>
         <w:ind w:left="6480" w:hanging="259"/>
@@ -3988,13 +3692,91 @@
       </w:pPr>
     </w:lvl>
   </w:abstractNum>
+  <w:abstractNum w:abstractNumId="9" w15:restartNumberingAfterBreak="0">
+    <w:multiLevelType w:val="hybridMultilevel"/>
+    <w:lvl w:ilvl="0" w15:tentative="1">
+      <w:start w:val="1"/>
+      <w:numFmt w:val="decimal"/>
+      <w:lvlText w:val="%1."/>
+      <w:lvlJc w:val="start"/>
+      <w:pPr>
+        <w:ind w:left="720" w:hanging="259"/>
+      </w:pPr>
+    </w:lvl>
+    <w:lvl w:ilvl="1" w15:tentative="1">
+      <w:start w:val="1"/>
+      <w:numFmt w:val="lowerLetter"/>
+      <w:lvlText w:val="%2."/>
+      <w:lvlJc w:val="start"/>
+      <w:pPr>
+        <w:ind w:left="1440" w:hanging="259"/>
+      </w:pPr>
+    </w:lvl>
+    <w:lvl w:ilvl="2" w15:tentative="1">
+      <w:start w:val="1"/>
+      <w:numFmt w:val="lowerRoman"/>
+      <w:lvlText w:val="%3."/>
+      <w:lvlJc w:val="start"/>
+      <w:pPr>
+        <w:ind w:left="2160" w:hanging="259"/>
+      </w:pPr>
+    </w:lvl>
+    <w:lvl w:ilvl="3" w15:tentative="1">
+      <w:start w:val="1"/>
+      <w:numFmt w:val="decimal"/>
+      <w:lvlText w:val="%4."/>
+      <w:lvlJc w:val="start"/>
+      <w:pPr>
+        <w:ind w:left="2880" w:hanging="259"/>
+      </w:pPr>
+    </w:lvl>
+    <w:lvl w:ilvl="4" w15:tentative="1">
+      <w:start w:val="1"/>
+      <w:numFmt w:val="lowerLetter"/>
+      <w:lvlText w:val="%5."/>
+      <w:lvlJc w:val="start"/>
+      <w:pPr>
+        <w:ind w:left="3600" w:hanging="259"/>
+      </w:pPr>
+    </w:lvl>
+    <w:lvl w:ilvl="5" w15:tentative="1">
+      <w:start w:val="1"/>
+      <w:numFmt w:val="lowerRoman"/>
+      <w:lvlText w:val="%6."/>
+      <w:lvlJc w:val="start"/>
+      <w:pPr>
+        <w:ind w:left="4320" w:hanging="259"/>
+      </w:pPr>
+    </w:lvl>
+    <w:lvl w:ilvl="6" w15:tentative="1">
+      <w:start w:val="1"/>
+      <w:numFmt w:val="decimal"/>
+      <w:lvlText w:val="%7."/>
+      <w:lvlJc w:val="start"/>
+      <w:pPr>
+        <w:ind w:left="5040" w:hanging="259"/>
+      </w:pPr>
+    </w:lvl>
+    <w:lvl w:ilvl="7" w15:tentative="1">
+      <w:start w:val="1"/>
+      <w:numFmt w:val="lowerLetter"/>
+      <w:lvlText w:val="%8."/>
+      <w:lvlJc w:val="start"/>
+      <w:pPr>
+        <w:ind w:left="5760" w:hanging="259"/>
+      </w:pPr>
+    </w:lvl>
+    <w:lvl w:ilvl="8" w15:tentative="1">
+      <w:start w:val="1"/>
+      <w:numFmt w:val="lowerRoman"/>
+      <w:lvlText w:val="%9."/>
+      <w:lvlJc w:val="start"/>
+      <w:pPr>
+        <w:ind w:left="6480" w:hanging="259"/>
+      </w:pPr>
+    </w:lvl>
+  </w:abstractNum>
   <w:num w:numId="1">
-    <w:abstractNumId w:val="3"/>
-    <w:lvlOverride w:ilvl="0">
-      <w:startOverride w:val="1"/>
-    </w:lvlOverride>
-  </w:num>
-  <w:num w:numId="9">
     <w:abstractNumId w:val="4"/>
     <w:lvlOverride w:ilvl="0">
       <w:startOverride w:val="1"/>
@@ -4020,6 +3802,12 @@
   </w:num>
   <w:num w:numId="13">
     <w:abstractNumId w:val="8"/>
+    <w:lvlOverride w:ilvl="0">
+      <w:startOverride w:val="1"/>
+    </w:lvlOverride>
+  </w:num>
+  <w:num w:numId="14">
+    <w:abstractNumId w:val="9"/>
     <w:lvlOverride w:ilvl="0">
       <w:startOverride w:val="1"/>
     </w:lvlOverride>

</xml_diff>

<commit_message>
Final edits and exports
</commit_message>
<xml_diff>
--- a/exports/jpa.docx
+++ b/exports/jpa.docx
@@ -55,7 +55,7 @@
         <w:pStyle w:val="ListParagraph"/>
         <w:numPr>
           <w:ilvl w:val="0"/>
-          <w:numId w:val="10"/>
+          <w:numId w:val="11"/>
         </w:numPr>
       </w:pPr>
       <w:r>
@@ -66,7 +66,16 @@
         <w:t xml:space="preserve">Portfolio strategy</w:t>
       </w:r>
       <w:r>
-        <w:t xml:space="preserve">. Be strategic about what funds you utilize for different projects and programs. Look to foundations and business support grants for organizational startup or administrative costs. Still, there are implementation grants for field projects and private or bank loans for scaling once a JPA is established.</w:t>
+        <w:t xml:space="preserve">. Be strategic about what funds you utilize for different projects and programs. Look to public funds, foundations,</w:t>
+      </w:r>
+      <w:r>
+        <w:rPr>
+          <w:rStyle w:val="FootnoteReference"/>
+        </w:rPr>
+        <w:footnoteReference w:id="1"/>
+      </w:r>
+      <w:r>
+        <w:t xml:space="preserve"> and business support grants for organizational startup or administrative costs. Still, there are implementation grants for field projects and private or bank loans for scaling once a JPA is established.</w:t>
       </w:r>
     </w:p>
     <w:p>
@@ -74,7 +83,7 @@
         <w:pStyle w:val="ListParagraph"/>
         <w:numPr>
           <w:ilvl w:val="0"/>
-          <w:numId w:val="10"/>
+          <w:numId w:val="11"/>
         </w:numPr>
       </w:pPr>
       <w:r>
@@ -93,7 +102,7 @@
         <w:pStyle w:val="ListParagraph"/>
         <w:numPr>
           <w:ilvl w:val="0"/>
-          <w:numId w:val="10"/>
+          <w:numId w:val="11"/>
         </w:numPr>
       </w:pPr>
       <w:r>
@@ -179,7 +188,7 @@
         <w:t xml:space="preserve"> (2009)</w:t>
       </w:r>
       <w:r>
-        <w:t xml:space="preserve"> advocates for an aggressive approach to treating fire-suppressed stands using an ecologically based approach that reduces the total number of trees/acre while maintaining stand heterogeneity.</w:t>
+        <w:t xml:space="preserve"> advocates for an aggressive approach to treating fire-suppressed stands using an ecologically-based approach that reduces the total number of trees/acre while maintaining stand heterogeneity.</w:t>
       </w:r>
     </w:p>
     <w:p>
@@ -190,15 +199,20 @@
         <w:t xml:space="preserve">1.1.3	</w:t>
       </w:r>
       <w:r>
-        <w:t xml:space="preserve">Concerns</w:t>
-      </w:r>
-    </w:p>
-    <w:p>
-      <w:r>
-        <w:t xml:space="preserve">A significant cause for concern regarding the protection of old-growth forests in the United States is their decline from historical levels due to logging and development. </w:t>
-      </w:r>
-      <w:r>
-        <w:t xml:space="preserve">DellaSala </w:t>
+        <w:t xml:space="preserve">Feedstock Aggregation</w:t>
+      </w:r>
+    </w:p>
+    <w:p>
+      <w:r>
+        <w:t xml:space="preserve">Thinned forests create a lot of biomass, and much of that biomass from forest health projects ends up in burn piles or log decks and may stay in these locations indefinitely. Not only does this negate fire mitigation efforts, as burn piles and decks can promote or worsen fires, but the carbon from wood is also at risk of not being sequestered.</w:t>
+      </w:r>
+    </w:p>
+    <w:p>
+      <w:r>
+        <w:t xml:space="preserve">Processing biomass from thinning is challenging; </w:t>
+      </w:r>
+      <w:r>
+        <w:t xml:space="preserve">Swezy </w:t>
       </w:r>
       <w:r>
         <w:rPr>
@@ -208,18 +222,13 @@
         <w:t xml:space="preserve">et al.</w:t>
       </w:r>
       <w:r>
-        <w:t xml:space="preserve"> (2022)</w:t>
-      </w:r>
-      <w:r>
-        <w:t xml:space="preserve"> highlight the fact that a large proportion of the remaining mature and old-growth forests on federal lands are still vulnerable to logging. The loss of these forests will not only diminish biodiversity but also release substantial amounts of carbon into the atmosphere.</w:t>
-      </w:r>
-    </w:p>
-    <w:p>
-      <w:r>
-        <w:t xml:space="preserve">Further compounding these concerns is the lack of a coordinated and effective national policy for old-growth conservation. </w:t>
-      </w:r>
-      <w:r>
-        <w:t xml:space="preserve">Carroll </w:t>
+        <w:t xml:space="preserve"> (2021)</w:t>
+      </w:r>
+      <w:r>
+        <w:t xml:space="preserve"> found that the cost of forest restoration far exceeds current market prices for biomass. </w:t>
+      </w:r>
+      <w:r>
+        <w:t xml:space="preserve">Becker </w:t>
       </w:r>
       <w:r>
         <w:rPr>
@@ -229,18 +238,16 @@
         <w:t xml:space="preserve">et al.</w:t>
       </w:r>
       <w:r>
-        <w:t xml:space="preserve"> (2025)</w:t>
-      </w:r>
-      <w:r>
-        <w:t xml:space="preserve"> point to a history of policy debates, such as the National Old-Growth Amendment, which failed to provide lasting protection. The authors advocate for a more comprehensive approach that extends beyond simple harvest restrictions to encompass landscape-level planning, the establishment of reserves, the protection of climate refugia, and the setting of specific goals for the recovery of species that depend on these unique habitats. Impacts on these forests are a concern for communities that rely on them for their water supplies.</w:t>
-      </w:r>
-    </w:p>
-    <w:p>
-      <w:r>
-        <w:t xml:space="preserve">However, let’s be very clear: thinning dense stands of fire-prone forests is entirely different from logging old-growth forests, and ecologically based thinning is not an excuse to log when maintaining stand heterogeneity and reducing fire risk are the primary treatment goals. Yet, misinformation about wildfire and forest treatments, similar to climate misinformation, persists (</w:t>
-      </w:r>
-      <w:r>
-        <w:t xml:space="preserve">Jones </w:t>
+        <w:t xml:space="preserve"> (2011)</w:t>
+      </w:r>
+      <w:r>
+        <w:t xml:space="preserve"> point out that supply guarantees, industry presence, transportation, and the value of the biomass are limiting factors to utilization, whereas agency staffing, budgets, compliance, and partnership aggravated utilization problems rather than impeding progress. A burn pile inventory across California showed massive wood tonnages scattered through national forests and other lands </w:t>
+      </w:r>
+      <w:r>
+        <w:t xml:space="preserve">(</w:t>
+      </w:r>
+      <w:r>
+        <w:t xml:space="preserve">Darlington </w:t>
       </w:r>
       <w:r>
         <w:rPr>
@@ -250,7 +257,16 @@
         <w:t xml:space="preserve">et al.</w:t>
       </w:r>
       <w:r>
-        <w:t xml:space="preserve"> (2022)</w:t>
+        <w:t xml:space="preserve">, 2023</w:t>
+      </w:r>
+      <w:r>
+        <w:t xml:space="preserve">)</w:t>
+      </w:r>
+      <w:r>
+        <w:t xml:space="preserve">. Yet burning those piles is likely more expensive than transporting them to a facility for processing (</w:t>
+      </w:r>
+      <w:r>
+        <w:t xml:space="preserve">Barker et al 2024</w:t>
       </w:r>
       <w:r>
         <w:t xml:space="preserve">).</w:t>
@@ -258,107 +274,12 @@
     </w:p>
     <w:p>
       <w:r>
-        <w:t xml:space="preserve">Managers implementing forest health treatments should adopt a tailored approach to increase forest resilience, mitigate fire risk, bring stands within a natural range of variation, and create forests that can thrive over the long term.</w:t>
+        <w:t xml:space="preserve">Transportation subsidies to move this feedstock to central locations or nearby facilities, as well as establishing right-sized facilities in areas with sufficient feedstock, could be a crucial missing component in addressing the wildfire problem across the western United States.</w:t>
       </w:r>
       <w:r>
         <w:rPr>
           <w:rStyle w:val="FootnoteReference"/>
         </w:rPr>
-        <w:footnoteReference w:id="1"/>
-      </w:r>
-      <w:r>
-        <w:t xml:space="preserve"> Treating mixed conifer stands on the western slope of the Sierra Nevada requires different treatments than mesic forests in the Pacific Northwest. Managers should take steps to reduce fire risk while still considering the negative impacts on biodiversity when planning any fire mitigation project.</w:t>
-      </w:r>
-    </w:p>
-    <w:p>
-      <w:pPr>
-        <w:pStyle w:val="Heading3"/>
-      </w:pPr>
-      <w:r>
-        <w:t xml:space="preserve">1.1.4	</w:t>
-      </w:r>
-      <w:r>
-        <w:t xml:space="preserve">Feedstock Aggregation</w:t>
-      </w:r>
-    </w:p>
-    <w:p>
-      <w:r>
-        <w:t xml:space="preserve">Thinned forests create a lot of biomass, and much of that biomass from forest health projects ends up in burn piles or log decks and may stay in these locations indefinitely. Not only does this negate fire mitigation efforts, as burn piles and decks can promote or worsen fires, but the carbon from wood is also at risk of not being sequestered.</w:t>
-      </w:r>
-    </w:p>
-    <w:p>
-      <w:r>
-        <w:t xml:space="preserve">Processing biomass from thinning is challenging; </w:t>
-      </w:r>
-      <w:r>
-        <w:t xml:space="preserve">Swezy </w:t>
-      </w:r>
-      <w:r>
-        <w:rPr>
-          <w:i/>
-          <w:iCs/>
-        </w:rPr>
-        <w:t xml:space="preserve">et al.</w:t>
-      </w:r>
-      <w:r>
-        <w:t xml:space="preserve"> (2021)</w:t>
-      </w:r>
-      <w:r>
-        <w:t xml:space="preserve"> found that the cost of forest restoration far exceeds current market prices for biomass. </w:t>
-      </w:r>
-      <w:r>
-        <w:t xml:space="preserve">Becker </w:t>
-      </w:r>
-      <w:r>
-        <w:rPr>
-          <w:i/>
-          <w:iCs/>
-        </w:rPr>
-        <w:t xml:space="preserve">et al.</w:t>
-      </w:r>
-      <w:r>
-        <w:t xml:space="preserve"> (2011)</w:t>
-      </w:r>
-      <w:r>
-        <w:t xml:space="preserve"> point out that supply guarantees, industry presence, transportation, and the value of the biomass are limiting factors to utilization, whereas agency staffing, budgets, compliance, and partnership aggravated utilization problems rather than impeding progress. A burn pile inventory across California showed massive wood tonnages scattered through national forests and other lands </w:t>
-      </w:r>
-      <w:r>
-        <w:t xml:space="preserve">(</w:t>
-      </w:r>
-      <w:r>
-        <w:t xml:space="preserve">Darlington </w:t>
-      </w:r>
-      <w:r>
-        <w:rPr>
-          <w:i/>
-          <w:iCs/>
-        </w:rPr>
-        <w:t xml:space="preserve">et al.</w:t>
-      </w:r>
-      <w:r>
-        <w:t xml:space="preserve">, 2023</w:t>
-      </w:r>
-      <w:r>
-        <w:t xml:space="preserve">)</w:t>
-      </w:r>
-      <w:r>
-        <w:t xml:space="preserve">. Yet burning those piles is likely more expensive than transporting them to a facility for processing (</w:t>
-      </w:r>
-      <w:r>
-        <w:t xml:space="preserve">Barker et al 2024</w:t>
-      </w:r>
-      <w:r>
-        <w:t xml:space="preserve">).</w:t>
-      </w:r>
-    </w:p>
-    <w:p>
-      <w:r>
-        <w:t xml:space="preserve">Transportation subsidies to move this feedstock to central locations or nearby facilities could be a crucial missing component in addressing the wildfire problem across the western United States.</w:t>
-      </w:r>
-      <w:r>
-        <w:rPr>
-          <w:rStyle w:val="FootnoteReference"/>
-        </w:rPr>
         <w:footnoteReference w:id="2"/>
       </w:r>
       <w:r>
@@ -369,7 +290,7 @@
       <w:r>
         <w:t xml:space="preserve">For instance, </w:t>
       </w:r>
-      <w:hyperlink w:history="1" r:id="rId-koxdvkvvfxoz02iludj-">
+      <w:hyperlink w:history="1" r:id="rIdpicx1wfbf1hbhzgehxtfd">
         <w:r>
           <w:rPr>
             <w:rStyle w:val="Hyperlink"/>
@@ -387,7 +308,7 @@
         <w:t xml:space="preserve">1.1</w:t>
       </w:r>
       <w:r>
-        <w:t xml:space="preserve">). Berry Sawmill was identified as an ideal location for a wood products campus and aggregation yard </w:t>
+        <w:t xml:space="preserve">). Creation of a coordinating entity and establishment of a wood campus at an existing, permitted sawmill site, Berry’s Sawmill in Cazadero, California, were identified as effective strategies for enabling an increase in the utilization of forest biomass residuals </w:t>
       </w:r>
       <w:r>
         <w:t xml:space="preserve">(</w:t>
@@ -399,13 +320,56 @@
         <w:t xml:space="preserve">)</w:t>
       </w:r>
       <w:r>
-        <w:t xml:space="preserve">. Creating similar management entities across the West could make it easier for investors to conduct due diligence. Joint Powers Authorities may be an organizational template that can meet these needs. </w:t>
+        <w:t xml:space="preserve">. Creating similar  entities and wood campuses across the West could make it easier for investors to de-risk investments. Joint Powers Authorities may be an organizational template that can meet these needs. </w:t>
       </w:r>
       <w:r>
         <w:t xml:space="preserve">Swezy &amp; Oldson (2025)</w:t>
       </w:r>
       <w:r>
         <w:t xml:space="preserve"> cautioned against starting new sort yards in northeast California, instead focusing on supporting existing biomass facilities, offering insurance to existing wood yards, and securing funding for a consistent pipeline of environmentally compliant (CEQA/NEPA) projects on which operators can bid.</w:t>
+      </w:r>
+    </w:p>
+    <w:p>
+      <w:r>
+        <w:t xml:space="preserve">However, an overarching limitation to utilizing forest biomass is the inability to commercialize small-diameter wood, slash, or other wood waste. A vast amount of biomass in this category is outside of Timber Harvest Plans (THPs) and Nonindustrial Timber Management Plans (NTMPs). Utilizing this wood could reduce high-grading to offset the costs of timber management and open opportunities for community-based wood products.[^temra] </w:t>
+      </w:r>
+      <w:r>
+        <w:t xml:space="preserve">Delyser </w:t>
+      </w:r>
+      <w:r>
+        <w:rPr>
+          <w:i/>
+          <w:iCs/>
+        </w:rPr>
+        <w:t xml:space="preserve">et al.</w:t>
+      </w:r>
+      <w:r>
+        <w:t xml:space="preserve"> (2025)</w:t>
+      </w:r>
+      <w:r>
+        <w:t xml:space="preserve"> found that 39-50% of forest treatment costs could be offset through the recovery and utilization of non-commercial wood as the highest and best use of this material and an important contributor to Climate Smart Forestry </w:t>
+      </w:r>
+      <w:r>
+        <w:t xml:space="preserve">(</w:t>
+      </w:r>
+      <w:r>
+        <w:t xml:space="preserve">see Nabuurs </w:t>
+      </w:r>
+      <w:r>
+        <w:rPr>
+          <w:i/>
+          <w:iCs/>
+        </w:rPr>
+        <w:t xml:space="preserve">et al.</w:t>
+      </w:r>
+      <w:r>
+        <w:t xml:space="preserve">, 2018</w:t>
+      </w:r>
+      <w:r>
+        <w:t xml:space="preserve">)</w:t>
+      </w:r>
+      <w:r>
+        <w:t xml:space="preserve">. It’s possible that JPAs could also help broker increased utilization of wood products, working with CAL FIRE to examine pathways to increase utilization across all organizations and communities.</w:t>
       </w:r>
     </w:p>
     <w:p>
@@ -482,13 +446,13 @@
         <w:t xml:space="preserve"> </w:t>
       </w:r>
       <w:r>
-        <w:t xml:space="preserve">Feasible treatment areas of Sonoma County and the location of Berry Sawmill as a feedstock aggregation site—adapted from </w:t>
+        <w:t xml:space="preserve">Feasible treatment areas of Sonoma County and the location of Berry’s Sawmill as a feedstock aggregation and processing site—adapted from </w:t>
       </w:r>
       <w:r>
         <w:t xml:space="preserve">Tukman &amp; Griffith (2022)</w:t>
       </w:r>
       <w:r>
-        <w:t xml:space="preserve">. Treatment areas exclude waterways, slopes above 45%, and biomass that is not within sufficient proximity to roadways.</w:t>
+        <w:t xml:space="preserve">. The green treatment areas exclude waterways, slopes above 45%, and biomass that is not within sufficient proximity to existing roadways.</w:t>
       </w:r>
     </w:p>
     <w:p>
@@ -496,7 +460,7 @@
         <w:pStyle w:val="Heading3"/>
       </w:pPr>
       <w:r>
-        <w:t xml:space="preserve">1.1.5	</w:t>
+        <w:t xml:space="preserve">1.1.4	</w:t>
       </w:r>
       <w:r>
         <w:t xml:space="preserve">Joint Powers Authority</w:t>
@@ -516,7 +480,7 @@
         <w:t xml:space="preserve">)</w:t>
       </w:r>
       <w:r>
-        <w:t xml:space="preserve">. The lack of long-term contracts makes investment in wood utilization businesses risky. Creating JPAs in some regions may be a solution to address this issue. JPAs could act as brokers to facilitate long-term contracts between suppliers and processors, thereby driving investment in processing facilities. Most lenders and investors view wood product businesses as too risky without a minimum term contract of 10 years, preferably longer </w:t>
+        <w:t xml:space="preserve">. The lack of long-term contracts makes investment in wood utilization businesses risky. Creating new JPAs in some regions may be a solution to address this issue. JPAs could act as brokers to facilitate long-term contracts between suppliers and processors, thereby driving investment in processing facilities. Most lenders and investors view wood product businesses as too risky without a minimum term contract of 10 years, preferably longer </w:t>
       </w:r>
       <w:r>
         <w:t xml:space="preserve">(</w:t>
@@ -528,7 +492,7 @@
         <w:t xml:space="preserve">)</w:t>
       </w:r>
       <w:r>
-        <w:t xml:space="preserve">.</w:t>
+        <w:t xml:space="preserve">. The USDA Timber Production Expansion Program (TPEP) was established for this reason and is a potential funder of facilities.</w:t>
       </w:r>
     </w:p>
     <w:p>
@@ -553,7 +517,7 @@
         <w:pStyle w:val="ListParagraph"/>
         <w:numPr>
           <w:ilvl w:val="0"/>
-          <w:numId w:val="11"/>
+          <w:numId w:val="12"/>
         </w:numPr>
       </w:pPr>
       <w:r>
@@ -565,7 +529,7 @@
         <w:pStyle w:val="ListParagraph"/>
         <w:numPr>
           <w:ilvl w:val="0"/>
-          <w:numId w:val="11"/>
+          <w:numId w:val="12"/>
         </w:numPr>
       </w:pPr>
       <w:r>
@@ -577,7 +541,7 @@
         <w:pStyle w:val="ListParagraph"/>
         <w:numPr>
           <w:ilvl w:val="0"/>
-          <w:numId w:val="11"/>
+          <w:numId w:val="12"/>
         </w:numPr>
       </w:pPr>
       <w:r>
@@ -589,7 +553,7 @@
         <w:pStyle w:val="ListParagraph"/>
         <w:numPr>
           <w:ilvl w:val="0"/>
-          <w:numId w:val="11"/>
+          <w:numId w:val="12"/>
         </w:numPr>
       </w:pPr>
       <w:r>
@@ -601,7 +565,7 @@
         <w:pStyle w:val="ListParagraph"/>
         <w:numPr>
           <w:ilvl w:val="0"/>
-          <w:numId w:val="11"/>
+          <w:numId w:val="12"/>
         </w:numPr>
       </w:pPr>
       <w:r>
@@ -634,7 +598,7 @@
         <w:ind w:left="288" w:right="288"/>
       </w:pPr>
       <w:r>
-        <w:t xml:space="preserve">Joint Powers Authorities are legally created entities that allow two or more public agencies to jointly exercise common powers </w:t>
+        <w:t xml:space="preserve">Joint Powers Authorities (JPAs) are legally created entities that allow two or more public agencies to jointly exercise common powers </w:t>
       </w:r>
       <w:r>
         <w:t xml:space="preserve">(</w:t>
@@ -646,7 +610,7 @@
         <w:t xml:space="preserve">)</w:t>
       </w:r>
       <w:r>
-        <w:t xml:space="preserve">. A joint powers authority shares powers common to the member agencies, and those powers are outlined in the joint powers agreement. Joint powers are exercised when public officials from more than two agencies agree to create a new legal entity or establish a joint approach to address a common problem, fund a project, or serve as a representative body for a specific activity. Examples of areas where JPAs are used commonly include groundwater management, road construction, and habitat conservation </w:t>
+        <w:t xml:space="preserve">. A JPA shares powers common to the member agencies, and those powers are outlined in the joint powers agreement. Joint powers are exercised when public officials from more than two agencies agree to create a new legal entity or establish a joint approach to address a common problem, fund a project, or serve as a representative body for a specific activity. Examples of areas where JPAs are used commonly include groundwater management, road construction, and habitat conservation </w:t>
       </w:r>
       <w:r>
         <w:t xml:space="preserve">(</w:t>
@@ -675,7 +639,7 @@
     </w:p>
     <w:p>
       <w:r>
-        <w:t xml:space="preserve">JPA establishment is at different levels across the state. During the establishment or modification of existing JPAs, participants have been clear about the entity’s role: to act as a critical entity for long-term feedstock supply contracts without competing for funds with other organizations, such as Resource Conservation Districts (RCDs), sawmills, or licensed timber operators (LTOs). This approach requires a realistic revenue assessment and a plan for the initial five years of operation, acknowledging that creating a stably funded JPA will be challenging given the wide fluctuations in private and public funding. But how can such an entity be funded in rural counties with low tax bases that cannot support a sales tax to develop sustainable revenue for a new entity?</w:t>
+        <w:t xml:space="preserve">JPA establishment is at different levels across the state. During the establishment or modification of existing JPAs, participants have been clear about the entity’s role: to act as a critical entity for long-term feedstock supply contracts without competing for funds with other organizations, such as Resource Conservation Districts (RCDs), sawmills, or licensed timber operators (LTOs). This approach requires a realistic revenue assessment and a plan for the initial five years of operation, acknowledging that creating a stably funded JPA will be challenging given the wide fluctuations in private and public funding. This may be especially challenging for rural counties with low tax bases that cannot support a sales tax to establish the JPA and provide stable revenue for the entity to operate.</w:t>
       </w:r>
       <w:r>
         <w:rPr>
@@ -717,9 +681,9 @@
         <w:t xml:space="preserve">Resource Conservation Districts</w:t>
       </w:r>
       <w:r>
-        <w:t xml:space="preserve"> (RCDs) are quasi-governmental, non-regulatory agencies based in California’s counties, providing critical resources, funding, and training to address forest health. There are approximately 40 RCDs with forestry programs that focus on implementing thinning, prescribed fire, and providing technical assistance to private landowners, as well as collaborating with other organizations (</w:t>
-      </w:r>
-      <w:hyperlink w:history="1" r:id="rIdsovsxaukpbnxuqrndmj1n">
+        <w:t xml:space="preserve"> (RCDs) are quasi-governmental, non-regulatory agencies, typically special districts with limited powers, based in California’s counties, that provide critical resources, funding, and training to address forest health. There are approximately 40 RCDs with forestry programs that focus on implementing thinning, prescribed fire, and providing technical assistance to private landowners, as well as collaborating with other organizations (</w:t>
+      </w:r>
+      <w:hyperlink w:history="1" r:id="rIdny3wyoip5f9zbyelcetov">
         <w:r>
           <w:rPr>
             <w:rStyle w:val="Hyperlink"/>
@@ -748,7 +712,7 @@
       <w:r>
         <w:t xml:space="preserve"> (LTOs) are the loggers licensed to operate forestry operations in the state of California. They are licensed under the state’s Forest Practice Act Law and authorized to conduct tree cutting and removal (</w:t>
       </w:r>
-      <w:hyperlink w:history="1" r:id="rIdntsd9k9lwprao2fgv5ecz">
+      <w:hyperlink w:history="1" r:id="rIdwz6_4zqslyuw7jckv1bjc">
         <w:r>
           <w:rPr>
             <w:rStyle w:val="Hyperlink"/>
@@ -774,7 +738,7 @@
     </w:p>
     <w:p>
       <w:r>
-        <w:t xml:space="preserve">The abundance of state and federal funding over the past five years has led many agencies and organizations to rely heavily on grant funding for implementing restoration and infrastructure projects. The Trump administration’s cuts in 2025, or the periodic surplus/deficit of California state funding, demonstrate the vulnerability of grant funding dependence. Many organizations are familiar with the cyclical nature of funding sources and seek to create more dependable, even-keeled funding streams, although grants can often complement stable revenue streams.</w:t>
+        <w:t xml:space="preserve">The abundance of state and federal funding over the past five years has led many agencies and organizations to rely heavily on grant funding for implementing restoration and infrastructure projects. The Trump administration’s cuts in 2025 and the periodic surplus/deficit of California state funding demonstrate the vulnerability of grant funding dependence. Many organizations are familiar with the cyclical nature of funding sources and seek to create more dependable, even-keeled funding streams, although grants can often complement stable revenue streams.</w:t>
       </w:r>
     </w:p>
     <w:p>
@@ -790,7 +754,7 @@
     </w:p>
     <w:p>
       <w:r>
-        <w:t xml:space="preserve">Many of the Office of Land Use and Climate Innovation’s feedstock aggregation pilots recognized the need for long-term funding sources and that grants are not a dependable resource to maintain an organization over time. Traditional funding sources are many, and a blended portfolio should help weather changes in grant cycles and tap into funding sources that can provide steady revenue. These options are described below, with the pluses and minuses of each summarized in (</w:t>
+        <w:t xml:space="preserve">Many of the Office of Land Use and Climate Innovation’s CALFRAME feedstock aggregation pilots recognized the need for long-term funding sources and that grants are not a dependable resource to maintain an organization over time. Traditional funding sources are many, and a blended portfolio should help weather changes in grant cycles and tap into funding sources that can provide steady revenue. These options are described below, with the pluses and minuses of each summarized in (</w:t>
       </w:r>
       <w:r>
         <w:t xml:space="preserve">Table </w:t>
@@ -807,7 +771,7 @@
         <w:pStyle w:val="ListParagraph"/>
         <w:numPr>
           <w:ilvl w:val="0"/>
-          <w:numId w:val="12"/>
+          <w:numId w:val="13"/>
         </w:numPr>
       </w:pPr>
       <w:r>
@@ -818,7 +782,7 @@
         <w:t xml:space="preserve">Endowment</w:t>
       </w:r>
       <w:r>
-        <w:t xml:space="preserve">. In the case of the feedstock aggregation pilots, the Office of Land Use and Climate Change Innovation provided a funding tranche to kickstart JPA creation. This funding could be used to create an endowment or, at the very least, seed an endowment that could provide a steady source of unrestricted revenue if invested wisely. Other JPAs could do the same with an initial foundation grant or a campaign to raise sufficient funds to start an endowment.</w:t>
+        <w:t xml:space="preserve">. In the case of the feedstock aggregation pilots, the Office of Land Use and Climate Innovation provided a funding tranche to kickstart JPA creation. This funding could potentially be used to create an endowment or, at the very least, seed an endowment that could provide a steady source of unrestricted revenue if invested wisely. Other JPAs could do the same with an initial foundation grant or a campaign, such as a bond measure, to raise sufficient funds to start an endowment.</w:t>
       </w:r>
     </w:p>
     <w:p>
@@ -826,7 +790,7 @@
         <w:pStyle w:val="ListParagraph"/>
         <w:numPr>
           <w:ilvl w:val="0"/>
-          <w:numId w:val="12"/>
+          <w:numId w:val="13"/>
         </w:numPr>
       </w:pPr>
       <w:r>
@@ -867,7 +831,7 @@
         <w:pStyle w:val="ListParagraph"/>
         <w:numPr>
           <w:ilvl w:val="0"/>
-          <w:numId w:val="12"/>
+          <w:numId w:val="13"/>
         </w:numPr>
       </w:pPr>
       <w:r>
@@ -878,7 +842,7 @@
         <w:t xml:space="preserve">Federal and State Grants</w:t>
       </w:r>
       <w:r>
-        <w:t xml:space="preserve">. It is unlikely that a JPA will receive significant operational funding from state and federal grants, but any proposals it leads or participates in could charge overhead (~10%) plus directly bill salaries to cover some operating costs related to the grant. A negotiated indirect cost rate agreement, or NICRA, to increase this value through public grants could be another approach to boost operating cost revenues.</w:t>
+        <w:t xml:space="preserve">. JPAs should be competitive for a variety of state and federal grants and be able to budget overhead costs (~10%) and directly bill salaries to cover a portion of operating costs. A negotiated indirect cost rate agreement, or NICRA, to increase indirect limits through public grants could be another approach to boost operating cost revenues.</w:t>
       </w:r>
     </w:p>
     <w:p>
@@ -886,7 +850,7 @@
         <w:pStyle w:val="ListParagraph"/>
         <w:numPr>
           <w:ilvl w:val="0"/>
-          <w:numId w:val="12"/>
+          <w:numId w:val="13"/>
         </w:numPr>
       </w:pPr>
       <w:r>
@@ -905,7 +869,7 @@
         <w:pStyle w:val="ListParagraph"/>
         <w:numPr>
           <w:ilvl w:val="0"/>
-          <w:numId w:val="12"/>
+          <w:numId w:val="13"/>
         </w:numPr>
       </w:pPr>
       <w:r>
@@ -924,7 +888,7 @@
         <w:pStyle w:val="ListParagraph"/>
         <w:numPr>
           <w:ilvl w:val="0"/>
-          <w:numId w:val="12"/>
+          <w:numId w:val="13"/>
         </w:numPr>
       </w:pPr>
       <w:r>
@@ -935,7 +899,16 @@
         <w:t xml:space="preserve">Sort yards</w:t>
       </w:r>
       <w:r>
-        <w:t xml:space="preserve">. Managing a sort yard for aggregated feedstock could be a strategic revenue source. Note that feedstock aggregation and sort yards should not be conflated, nor should the creation of JPAs be thought of as sort yard managers. A sort yard may be one strategy for income generation, but it not necessarily connected to the goal of a feedstock aggregation JPA, which is to broker long-term supply contracts.</w:t>
+        <w:t xml:space="preserve">. Managing a sort yard for aggregated feedstock could be a strategic revenue source, but some regions found a lack of feasible revenue for sort yards.</w:t>
+      </w:r>
+      <w:r>
+        <w:rPr>
+          <w:rStyle w:val="FootnoteReference"/>
+        </w:rPr>
+        <w:footnoteReference w:id="4"/>
+      </w:r>
+      <w:r>
+        <w:t xml:space="preserve"> Note that feedstock aggregation and sort yards should not be conflated, nor should the creation of JPAs be thought of as sort yard managers. A sort yard may be one strategy for income generation, but it is not necessarily connected to the goal of a feedstock aggregation JPA, which is to broker long-term supply contracts.</w:t>
       </w:r>
     </w:p>
     <w:p>
@@ -1288,7 +1261,7 @@
     </w:p>
     <w:p>
       <w:r>
-        <w:t xml:space="preserve">Endowment-based funding represents a promising and underutilized strategy for ensuring the long-term financial sustainability of Joint Powers Authorities (JPAs) engaged in forest health and feedstock aggregation. Unlike grant-dependent models, which are vulnerable to the cyclical nature of public budgets and shifting political priorities, endowments can provide a stable and predictable revenue stream. Endowments may be the most strategic way to fund JPAs, especially since some may struggle to garner grant funding in the future, given their long-term feedstock supply contract focus.</w:t>
+        <w:t xml:space="preserve">Endowment-based funding represents a promising and underutilized strategy for ensuring the long-term financial sustainability of Joint Powers Authorities (JPAs) engaged in forest health and feedstock aggregation. Unlike grant-dependent models, which are vulnerable to the cyclical nature of public budgets and shifting political priorities, endowments can provide a stable and predictable revenue stream. Endowments may be the most strategic way to fund JPAs, especially since some may struggle to secure grant funding in the future, given their long-term focus on feedstock supply contracts.</w:t>
       </w:r>
     </w:p>
     <w:p>
@@ -1399,7 +1372,7 @@
     <w:p>
       <w:r>
         <w:br/>
-        <w:t xml:space="preserve">Financial calculations demonstrate the power of the initial investment over time compared to annual grants or allocations. With a conservative annual return of 7%, a spending rate of 4%, and an administrative fee of 0.2%, an endowment of $10 mn  could yield approximately $400,000 in its first year, with annual income rising to nearly $448,000 by year 5 (</w:t>
+        <w:t xml:space="preserve">Financial calculations demonstrate the power of the initial investment over time compared to annual grants or allocations. With a conservative yearly return of 7%, a spending rate of 4%, and an administrative fee of 0.2%, an endowment of $10 million could yield approximately $400,000 in its first year, with annual income rising to nearly $448,000 by year 5 (</w:t>
       </w:r>
       <w:r>
         <w:t xml:space="preserve">Table </w:t>
@@ -1445,7 +1418,17 @@
         <w:t xml:space="preserve"> </w:t>
       </w:r>
       <w:r>
-        <w:t xml:space="preserve">Endowments based on four pilot JPA annual budget estimates. 5-year budget is an estimate from the respective JPA proponents. Average returns are based on a 7% return with income generated averaged over the 1st five years. An estimated 0.2% administrative fee and $5,000 contribution to the principal are included in the calculations. RRA = Risk Reduction Authority, RFS = Regenerative Forest Solutions.</w:t>
+        <w:t xml:space="preserve">Example endowments based on five pilot JPA annual budget estimates.The 5-year budget is an estimate from the respective JPA proponents. Average returns are based on a 7% return with income generated averaged over the 1st five years. An estimated 0.2% administrative fee and $5,000 contribution to the principal are included in the calculations. The Central Sierra South example is being developed from an existing JPA (Central Sierra Economic Development District or CSEDD) and, therefore, may not be directly comparable to the other four startup JPAs. A similar example in development is the Eastern Sierra Council of Governments (ESCOG). RRA = Risk Reduction Authority, FBA = Forest Biomass Authority, RFS = Regenerative Forest Solutions.  </w:t>
+      </w:r>
+      <w:r>
+        <w:rPr>
+          <w:b/>
+          <w:bCs/>
+        </w:rPr>
+        <w:t xml:space="preserve">JPA endowments are not limited to these examples</w:t>
+      </w:r>
+      <w:r>
+        <w:t xml:space="preserve">.</w:t>
       </w:r>
     </w:p>
     <w:tbl>
@@ -1514,7 +1497,7 @@
         <w:tc>
           <w:p>
             <w:r>
-              <w:t xml:space="preserve">Tahoe Central Sierra</w:t>
+              <w:t xml:space="preserve">Central Sierra Tahoe</w:t>
             </w:r>
           </w:p>
         </w:tc>
@@ -1528,21 +1511,21 @@
         <w:tc>
           <w:p>
             <w:r>
-              <w:t xml:space="preserve">6,500,000</w:t>
-            </w:r>
-          </w:p>
-        </w:tc>
-        <w:tc>
-          <w:p>
-            <w:r>
-              <w:t xml:space="preserve">275,596</w:t>
-            </w:r>
-          </w:p>
-        </w:tc>
-        <w:tc>
-          <w:p>
-            <w:r>
-              <w:t xml:space="preserve">1,377,982</w:t>
+              <w:t xml:space="preserve">6,470,000</w:t>
+            </w:r>
+          </w:p>
+        </w:tc>
+        <w:tc>
+          <w:p>
+            <w:r>
+              <w:t xml:space="preserve">258,733</w:t>
+            </w:r>
+          </w:p>
+        </w:tc>
+        <w:tc>
+          <w:p>
+            <w:r>
+              <w:t xml:space="preserve">1,293,663</w:t>
             </w:r>
           </w:p>
         </w:tc>
@@ -1554,35 +1537,35 @@
         <w:tc>
           <w:p>
             <w:r>
-              <w:t xml:space="preserve">Lake County RRA</w:t>
-            </w:r>
-          </w:p>
-        </w:tc>
-        <w:tc>
-          <w:p>
-            <w:r>
-              <w:t xml:space="preserve">1,380,662</w:t>
-            </w:r>
-          </w:p>
-        </w:tc>
-        <w:tc>
-          <w:p>
-            <w:r>
-              <w:t xml:space="preserve">6,600,000</w:t>
-            </w:r>
-          </w:p>
-        </w:tc>
-        <w:tc>
-          <w:p>
-            <w:r>
-              <w:t xml:space="preserve">279,596</w:t>
-            </w:r>
-          </w:p>
-        </w:tc>
-        <w:tc>
-          <w:p>
-            <w:r>
-              <w:t xml:space="preserve">1,399,134</w:t>
+              <w:t xml:space="preserve">Central Sierra South</w:t>
+            </w:r>
+          </w:p>
+        </w:tc>
+        <w:tc>
+          <w:p>
+            <w:r>
+              <w:t xml:space="preserve">1,386,080</w:t>
+            </w:r>
+          </w:p>
+        </w:tc>
+        <w:tc>
+          <w:p>
+            <w:r>
+              <w:t xml:space="preserve">6,930,000</w:t>
+            </w:r>
+          </w:p>
+        </w:tc>
+        <w:tc>
+          <w:p>
+            <w:r>
+              <w:t xml:space="preserve">277,222</w:t>
+            </w:r>
+          </w:p>
+        </w:tc>
+        <w:tc>
+          <w:p>
+            <w:r>
+              <w:t xml:space="preserve">1,474,272</w:t>
             </w:r>
           </w:p>
         </w:tc>
@@ -1594,35 +1577,35 @@
         <w:tc>
           <w:p>
             <w:r>
-              <w:t xml:space="preserve">Northeast CA</w:t>
-            </w:r>
-          </w:p>
-        </w:tc>
-        <w:tc>
-          <w:p>
-            <w:r>
-              <w:t xml:space="preserve">2,067,375</w:t>
-            </w:r>
-          </w:p>
-        </w:tc>
-        <w:tc>
-          <w:p>
-            <w:r>
-              <w:t xml:space="preserve">10,000,000</w:t>
-            </w:r>
-          </w:p>
-        </w:tc>
-        <w:tc>
-          <w:p>
-            <w:r>
-              <w:t xml:space="preserve">423,659</w:t>
-            </w:r>
-          </w:p>
-        </w:tc>
-        <w:tc>
-          <w:p>
-            <w:r>
-              <w:t xml:space="preserve">2,118,296</w:t>
+              <w:t xml:space="preserve">Lake County RRA</w:t>
+            </w:r>
+          </w:p>
+        </w:tc>
+        <w:tc>
+          <w:p>
+            <w:r>
+              <w:t xml:space="preserve">1,380,662</w:t>
+            </w:r>
+          </w:p>
+        </w:tc>
+        <w:tc>
+          <w:p>
+            <w:r>
+              <w:t xml:space="preserve">6,900,000</w:t>
+            </w:r>
+          </w:p>
+        </w:tc>
+        <w:tc>
+          <w:p>
+            <w:r>
+              <w:t xml:space="preserve">276,132</w:t>
+            </w:r>
+          </w:p>
+        </w:tc>
+        <w:tc>
+          <w:p>
+            <w:r>
+              <w:t xml:space="preserve">1,469,175</w:t>
             </w:r>
           </w:p>
         </w:tc>
@@ -1634,35 +1617,35 @@
         <w:tc>
           <w:p>
             <w:r>
-              <w:t xml:space="preserve">Sonoma County RFS</w:t>
-            </w:r>
-          </w:p>
-        </w:tc>
-        <w:tc>
-          <w:p>
-            <w:r>
-              <w:t xml:space="preserve">3,674,075</w:t>
-            </w:r>
-          </w:p>
-        </w:tc>
-        <w:tc>
-          <w:p>
-            <w:r>
-              <w:t xml:space="preserve">17,500,000</w:t>
-            </w:r>
-          </w:p>
-        </w:tc>
-        <w:tc>
-          <w:p>
-            <w:r>
-              <w:t xml:space="preserve">740,313</w:t>
-            </w:r>
-          </w:p>
-        </w:tc>
-        <w:tc>
-          <w:p>
-            <w:r>
-              <w:t xml:space="preserve">3,701,566</w:t>
+              <w:t xml:space="preserve">Northeast CA FBA</w:t>
+            </w:r>
+          </w:p>
+        </w:tc>
+        <w:tc>
+          <w:p>
+            <w:r>
+              <w:t xml:space="preserve">2,067,375</w:t>
+            </w:r>
+          </w:p>
+        </w:tc>
+        <w:tc>
+          <w:p>
+            <w:r>
+              <w:t xml:space="preserve">10,340,000</w:t>
+            </w:r>
+          </w:p>
+        </w:tc>
+        <w:tc>
+          <w:p>
+            <w:r>
+              <w:t xml:space="preserve">413,475</w:t>
+            </w:r>
+          </w:p>
+        </w:tc>
+        <w:tc>
+          <w:p>
+            <w:r>
+              <w:t xml:space="preserve">2,067,375</w:t>
             </w:r>
           </w:p>
         </w:tc>
@@ -1674,6 +1657,46 @@
         <w:tc>
           <w:p>
             <w:r>
+              <w:t xml:space="preserve">Sonoma County RFS</w:t>
+            </w:r>
+          </w:p>
+        </w:tc>
+        <w:tc>
+          <w:p>
+            <w:r>
+              <w:t xml:space="preserve">2,809,895</w:t>
+            </w:r>
+          </w:p>
+        </w:tc>
+        <w:tc>
+          <w:p>
+            <w:r>
+              <w:t xml:space="preserve">14,050,000</w:t>
+            </w:r>
+          </w:p>
+        </w:tc>
+        <w:tc>
+          <w:p>
+            <w:r>
+              <w:t xml:space="preserve">561,979</w:t>
+            </w:r>
+          </w:p>
+        </w:tc>
+        <w:tc>
+          <w:p>
+            <w:r>
+              <w:t xml:space="preserve">2,809,895</w:t>
+            </w:r>
+          </w:p>
+        </w:tc>
+      </w:tr>
+      <w:tr>
+        <w:trPr>
+          <w:tblHeader/>
+        </w:trPr>
+        <w:tc>
+          <w:p>
+            <w:r>
               <w:t xml:space="preserve">TOTAL</w:t>
             </w:r>
           </w:p>
@@ -1681,14 +1704,14 @@
         <w:tc>
           <w:p>
             <w:r>
-              <w:t xml:space="preserve">8,415,862</w:t>
-            </w:r>
-          </w:p>
-        </w:tc>
-        <w:tc>
-          <w:p>
-            <w:r>
-              <w:t xml:space="preserve">40,700,000</w:t>
+              <w:t xml:space="preserve">8,938,762</w:t>
+            </w:r>
+          </w:p>
+        </w:tc>
+        <w:tc>
+          <w:p>
+            <w:r>
+              <w:t xml:space="preserve">44,690,000</w:t>
             </w:r>
           </w:p>
         </w:tc>
@@ -1702,7 +1725,7 @@
         <w:tc>
           <w:p>
             <w:r>
-              <w:t xml:space="preserve">8,618,130</w:t>
+              <w:t xml:space="preserve">8,940,719</w:t>
             </w:r>
           </w:p>
         </w:tc>
@@ -1723,7 +1746,12 @@
     </w:p>
     <w:p>
       <w:r>
-        <w:t xml:space="preserve">Let’s assume that it would cost $115,000/yr for a state agency to manage a grants program. This includes staff, administrative, and operating costs. We’ve assumed an annual rate of inflation of 4% to give a total five-year cost of $622,877. The 5-year returns are very close to the estimated operating costs of each JPA, so we’ll assume that $8.7 mn is the total amount granted, giving a total cost of 9,322,877. Although the granting agency return on investment is really the public benefit from making the grants for project implementation, these operating costs would provide an ROI of -6.7% (</w:t>
+        <w:t xml:space="preserve">Let’s assume that it would cost $115,000/yr for a state agency to manage a grants program. This includes staff, administrative, and operating costs. If we add an annual rate of inflation of 4%, that gives a total five-year cost of $622,877 for grant administration. The five-year budgets from the JPAs would likely form the basis of grant requests so the grant administration plus five-year budgets totals $9,561,639.</w:t>
+      </w:r>
+    </w:p>
+    <w:p>
+      <w:r>
+        <w:t xml:space="preserve">Although the granting agency return on investment is really the public benefit from making the grants for project implementation, these operating costs would provide an ROI of -100% since there would be no return (</w:t>
       </w:r>
       <w:r>
         <w:t xml:space="preserve">Table </w:t>
@@ -1732,7 +1760,12 @@
         <w:t xml:space="preserve">1.3</w:t>
       </w:r>
       <w:r>
-        <w:t xml:space="preserve">) for five years. That ROI would continue to decrease over time, e.g., become more costly for the State, whereas the ROI of 27% for the endowment investment would continue to grow.</w:t>
+        <w:t xml:space="preserve">). That ROI would continue to decrease over time, e.g., become more costly for the State, as the program continues to support the JPAs via grants.</w:t>
+      </w:r>
+    </w:p>
+    <w:p>
+      <w:r>
+        <w:t xml:space="preserve">On the other hand, the initial investment of $44.6 million for the endowments amortizes to ~$8.94 million over five years and gives a return of nearly $9.2 million or 21%. The return for the endowments would continue to grow and not be a recurring state cost, allowing state funds to be invested in other JPAs or new projects.</w:t>
       </w:r>
     </w:p>
     <w:p>
@@ -1764,7 +1797,7 @@
         <w:t xml:space="preserve"> </w:t>
       </w:r>
       <w:r>
-        <w:t xml:space="preserve">Avoided cost estimate estimated from the four pilot budgets vs. estimated agency costs to manage grant funds.</w:t>
+        <w:t xml:space="preserve">Avoided 5-year cost estimate estimated from the five pilot budgets vs. estimated agency costs to manage grant funds. The return is a 5-year return. ROI = Return on Investment.</w:t>
       </w:r>
     </w:p>
     <w:tbl>
@@ -1799,14 +1832,14 @@
         <w:tc>
           <w:p>
             <w:r>
-              <w:t xml:space="preserve">Amount</w:t>
-            </w:r>
-          </w:p>
-        </w:tc>
-        <w:tc>
-          <w:p>
-            <w:r>
-              <w:t xml:space="preserve">5-year return</w:t>
+              <w:t xml:space="preserve">Investment</w:t>
+            </w:r>
+          </w:p>
+        </w:tc>
+        <w:tc>
+          <w:p>
+            <w:r>
+              <w:t xml:space="preserve">Return</w:t>
             </w:r>
           </w:p>
         </w:tc>
@@ -1832,14 +1865,14 @@
         <w:tc>
           <w:p>
             <w:r>
-              <w:t xml:space="preserve">40,700,000</w:t>
-            </w:r>
-          </w:p>
-        </w:tc>
-        <w:tc>
-          <w:p>
-            <w:r>
-              <w:t xml:space="preserve">8,618,130</w:t>
+              <w:t xml:space="preserve">8,938,762</w:t>
+            </w:r>
+          </w:p>
+        </w:tc>
+        <w:tc>
+          <w:p>
+            <w:r>
+              <w:t xml:space="preserve">8,940,719</w:t>
             </w:r>
           </w:p>
         </w:tc>
@@ -1865,21 +1898,21 @@
         <w:tc>
           <w:p>
             <w:r>
-              <w:t xml:space="preserve">9,322,877</w:t>
-            </w:r>
-          </w:p>
-        </w:tc>
-        <w:tc>
-          <w:p>
-            <w:r>
-              <w:t xml:space="preserve">-8,700,000</w:t>
-            </w:r>
-          </w:p>
-        </w:tc>
-        <w:tc>
-          <w:p>
-            <w:r>
-              <w:t xml:space="preserve">-6.7</w:t>
+              <w:t xml:space="preserve">9,615,071</w:t>
+            </w:r>
+          </w:p>
+        </w:tc>
+        <w:tc>
+          <w:p>
+            <w:r>
+              <w:t xml:space="preserve">-9,615,071</w:t>
+            </w:r>
+          </w:p>
+        </w:tc>
+        <w:tc>
+          <w:p>
+            <w:r>
+              <w:t xml:space="preserve">-100</w:t>
             </w:r>
           </w:p>
         </w:tc>
@@ -1895,7 +1928,7 @@
         <w:pStyle w:val="Heading4"/>
       </w:pPr>
       <w:r>
-        <w:t xml:space="preserve">Benefits</w:t>
+        <w:t xml:space="preserve">Revolving Loan Fund</w:t>
       </w:r>
     </w:p>
     <w:p>
@@ -1906,97 +1939,10 @@
         <w:rPr>
           <w:rStyle w:val="FootnoteReference"/>
         </w:rPr>
-        <w:footnoteReference w:id="4"/>
+        <w:footnoteReference w:id="5"/>
       </w:r>
       <w:r>
         <w:t xml:space="preserve"> By acting as a community-based lender, the JPA can support local projects that might otherwise struggle to access affordable capital, accelerating restoration and market development. The interest payments received from these loans can then be reinvested into the endowment, steadily growing the principal over time. This strategy not only amplifies the reach of the original endowment but also creates a self-reinforcing cycle of investment and impact, enhancing both financial sustainability and landscape resilience.</w:t>
-      </w:r>
-    </w:p>
-    <w:p>
-      <w:r>
-        <w:t xml:space="preserve">Although we don’t have evidence to support this theory, we suspect organizations with a solid endowment will be more competitive for public funding, given their ability to provide a match and solid operating revenue. Established endowments offer a source of unrestricted funds that can be strategically used to meet grant match requirements for state and federal funding opportunities. With a robust endowment, organizations can offer greater match amounts, making their grant applications more competitive and attractive to funders. Additionally, a solid core operating budget supported by endowment income ensures organizational stability and the capacity to manage and implement grant-funded projects effectively.</w:t>
-      </w:r>
-    </w:p>
-    <w:p>
-      <w:pPr>
-        <w:pStyle w:val="Heading3"/>
-      </w:pPr>
-      <w:r>
-        <w:t xml:space="preserve">1.2.3	</w:t>
-      </w:r>
-      <w:r>
-        <w:t xml:space="preserve">Temporal Adoption</w:t>
-      </w:r>
-    </w:p>
-    <w:p>
-      <w:r>
-        <w:t xml:space="preserve">Any funding strategies, whether they are traditional or new conservation finance approaches, may be new or untested for certain audiences. Raising funds from traditional resources, then piloting new options over time, may be the best approach to introduce novel income sources. For example:</w:t>
-      </w:r>
-    </w:p>
-    <w:p>
-      <w:pPr>
-        <w:pStyle w:val="ListParagraph"/>
-        <w:numPr>
-          <w:ilvl w:val="0"/>
-          <w:numId w:val="13"/>
-        </w:numPr>
-      </w:pPr>
-      <w:r>
-        <w:t xml:space="preserve">New finance options, such as environmental impact bonds, could be introduced over a longer period and trialed at a small scale, then scaled up when successful. These could also include other financial mechanisms, such as revolving loan funds (offering low-interest loans), public-private partnerships, or bonds.</w:t>
-      </w:r>
-    </w:p>
-    <w:p>
-      <w:pPr>
-        <w:pStyle w:val="ListParagraph"/>
-        <w:numPr>
-          <w:ilvl w:val="0"/>
-          <w:numId w:val="13"/>
-        </w:numPr>
-      </w:pPr>
-      <w:r>
-        <w:t xml:space="preserve">Other revenue-generating options could be tested in the same manner to ensure their effectiveness and introduce them to skeptical participants, financial managers, or government entities that are not used to working with alternative finance options.</w:t>
-      </w:r>
-    </w:p>
-    <w:p>
-      <w:pPr>
-        <w:pStyle w:val="Heading3"/>
-      </w:pPr>
-      <w:r>
-        <w:t xml:space="preserve">1.2.4	</w:t>
-      </w:r>
-      <w:r>
-        <w:t xml:space="preserve">Collaborative Finance</w:t>
-      </w:r>
-    </w:p>
-    <w:p>
-      <w:r>
-        <w:t xml:space="preserve">Collaborative finance is a conservation finance strategy that involves cooperative interaction between individual project developers, stakeholders, and finance providers </w:t>
-      </w:r>
-      <w:r>
-        <w:t xml:space="preserve">(</w:t>
-      </w:r>
-      <w:r>
-        <w:t xml:space="preserve">Russell &amp; Odefey, 2024</w:t>
-      </w:r>
-      <w:r>
-        <w:t xml:space="preserve">)</w:t>
-      </w:r>
-      <w:r>
-        <w:t xml:space="preserve">. This process may or may not include traditional financial institutions.</w:t>
-      </w:r>
-      <w:r>
-        <w:rPr>
-          <w:rStyle w:val="FootnoteReference"/>
-        </w:rPr>
-        <w:footnoteReference w:id="5"/>
-      </w:r>
-      <w:r>
-        <w:t xml:space="preserve"> The term can be broadened to include finance developed through the fair and equitable participation of stakeholders in a region, landscape, or watershed, addressing natural resource and infrastructure management needs, and utilizing multiple forms of funding, from public grants to private investment. Finance approaches may include outcomes-based finance models such as environmental impact bonds.</w:t>
-      </w:r>
-    </w:p>
-    <w:p>
-      <w:r>
-        <w:t xml:space="preserve">The challenge of new finance options vs. more traditional approaches is, simply put, they’re new. As a result, more conservative controllers, accountants, and similar financial managers within any organization will be resistant to implementing new, unproven methods for generating income. Consequently, it may be best to start strong with traditional approaches and gradually test new strategies. Feasibility studies may also help introduce collaborative finance and new approaches. However, there are examples of established and successful impact finance bonds on the North Yuba River to draw upon when creating novel funding streams.</w:t>
       </w:r>
     </w:p>
     <w:p/>
@@ -2014,7 +1960,7 @@
           <w:bCs/>
           <w:color w:val="FFFFFF"/>
         </w:rPr>
-        <w:t xml:space="preserve">New Funding Options</w:t>
+        <w:t xml:space="preserve">Revolving Loan Fund Example</w:t>
       </w:r>
     </w:p>
     <w:p>
@@ -2025,15 +1971,157 @@
         <w:ind w:left="288" w:right="288"/>
       </w:pPr>
       <w:r>
+        <w:t xml:space="preserve">Maryland’s Shore Erosion Control Revolving Loan Fund, created in 1964, provides 0% interest loans to landowners to utilize natural solutions for shoreline erosion control </w:t>
+      </w:r>
+      <w:r>
+        <w:t xml:space="preserve">(</w:t>
+      </w:r>
+      <w:r>
+        <w:t xml:space="preserve">Crook, 2021</w:t>
+      </w:r>
+      <w:r>
+        <w:t xml:space="preserve">)</w:t>
+      </w:r>
+      <w:r>
+        <w:t xml:space="preserve">. The fund was initially capitalized with $1.5 million, with an additional /$650,000 added in the 1970s. Since then, it provides 15-20 loans annually up to $700,000 with 15% of repayments to cover administrative costs and 85% returned to the fund. As of 2021, the fund provided more than 700 loans over 52 years.</w:t>
+      </w:r>
+    </w:p>
+    <w:p/>
+    <w:p>
+      <w:r>
+        <w:t xml:space="preserve">The economics of a revolving loan fund depend on several key factors: the total annual return from the principal, the yearly amount loaned out, the interest rate charged, and the loan performance period. The calculated returns in </w:t>
+      </w:r>
+      <w:r>
+        <w:t xml:space="preserve">Table </w:t>
+      </w:r>
+      <w:r>
+        <w:t xml:space="preserve">1.2</w:t>
+      </w:r>
+      <w:r>
+        <w:t xml:space="preserve"> are based on a modest 7% return with a 4% spending rate. If the JPA governing board added guardrails to revolving loan spending, interest rates, and other factors, presumably 1-2% of the return could be set aside for a loan fund that is carefully loaned to local organizations when a predetermined amount is reached. If the loan interest rate is a point or two above the endowment earning rate, then that would allow the revolving loan principal to grow. There’s a risk of unpaid loans, loans that take too long to pay back, or too many loans, but those factors could all be mitigated in the JPA’s bylaws.</w:t>
+      </w:r>
+    </w:p>
+    <w:p>
+      <w:r>
+        <w:t xml:space="preserve">Over 10 years, a $10,000,000 endowment with a 7% annual return, 4% annual spending, a 0.2% administrative fee, and $5,000 added each year would generate a steadily growing cumulative loan pool. By setting aside the yearly earnings above the spending and administrative costs, the loan pool would reach approximately $3.2 million by year ten (</w:t>
+      </w:r>
+      <w:r>
+        <w:t xml:space="preserve">Figure </w:t>
+      </w:r>
+      <w:r>
+        <w:t xml:space="preserve">1.3</w:t>
+      </w:r>
+      <w:r>
+        <w:t xml:space="preserve">). This approach allows the JPA to support additional projects through low-interest loans while maintaining the long-term growth and stability of the endowment.</w:t>
+      </w:r>
+    </w:p>
+    <w:p>
+      <w:pPr>
+        <w:jc w:val="center"/>
+      </w:pPr>
+      <w:r>
+        <w:drawing>
+          <wp:inline distT="0" distB="0" distL="0" distR="0">
+            <wp:extent cx="4000500" cy="2382502"/>
+            <wp:effectExtent b="0" l="0" r="0" t="0"/>
+            <wp:docPr id="3" name="" descr="" title=""/>
+            <wp:cNvGraphicFramePr>
+              <a:graphicFrameLocks xmlns:a="http://schemas.openxmlformats.org/drawingml/2006/main" noChangeAspect="1"/>
+            </wp:cNvGraphicFramePr>
+            <a:graphic xmlns:a="http://schemas.openxmlformats.org/drawingml/2006/main">
+              <a:graphicData uri="http://schemas.openxmlformats.org/drawingml/2006/picture">
+                <pic:pic xmlns:pic="http://schemas.openxmlformats.org/drawingml/2006/picture">
+                  <pic:nvPicPr>
+                    <pic:cNvPr id="0" name="" descr=""/>
+                    <pic:cNvPicPr>
+                      <a:picLocks noChangeAspect="1" noChangeArrowheads="1"/>
+                    </pic:cNvPicPr>
+                  </pic:nvPicPr>
+                  <pic:blipFill>
+                    <a:blip r:embed="rId9" cstate="none"/>
+                    <a:srcRect/>
+                    <a:stretch>
+                      <a:fillRect/>
+                    </a:stretch>
+                  </pic:blipFill>
+                  <pic:spPr bwMode="auto">
+                    <a:xfrm>
+                      <a:off x="0" y="0"/>
+                      <a:ext cx="4000500" cy="2382502"/>
+                    </a:xfrm>
+                    <a:prstGeom prst="rect">
+                      <a:avLst/>
+                    </a:prstGeom>
+                  </pic:spPr>
+                </pic:pic>
+              </a:graphicData>
+            </a:graphic>
+          </wp:inline>
+        </w:drawing>
+      </w:r>
+    </w:p>
+    <w:p>
+      <w:pPr>
+        <w:pStyle w:val="Caption"/>
+      </w:pPr>
+      <w:r>
         <w:rPr>
           <w:b/>
           <w:bCs/>
         </w:rPr>
-        <w:t xml:space="preserve">New Finance Options</w:t>
-      </w:r>
-      <w:r>
-        <w:t xml:space="preserve">
-Conservation finance options include environmental impact bonds, such as Blue Forest’s Forest Resilience Bonds, which leverage private investment from impact investors to support forest health projects. Repayment to investors is supported over time by beneficiaries based on the savings and benefits from reduced wildfire risks and improved ecosystem services. A JPA could utilize environmental impact bonds on a trial basis at a small scale and then expand over an extended period. Identifying potential payor entities interested in covering the avoided costs of wildfire through proactive measures, such as thinning and prescribed fire, is worth pursuing immediately or as soon as an executive director is hired.</w:t>
+        <w:t xml:space="preserve">Figure </w:t>
+      </w:r>
+      <w:r>
+        <w:rPr>
+          <w:b/>
+          <w:bCs/>
+        </w:rPr>
+        <w:t xml:space="preserve">1.3</w:t>
+      </w:r>
+      <w:r>
+        <w:rPr>
+          <w:b/>
+          <w:bCs/>
+        </w:rPr>
+        <w:t xml:space="preserve">:</w:t>
+      </w:r>
+      <w:r>
+        <w:t xml:space="preserve"> </w:t>
+      </w:r>
+      <w:r>
+        <w:t xml:space="preserve">Hypothetical creation of a revolving loan fund from a $10 million endowment with 3% set aside annually, 4% spending for operating costs, $5,000 annual contribution, and 0.2% administrative fee.</w:t>
+      </w:r>
+    </w:p>
+    <w:p>
+      <w:pPr>
+        <w:pStyle w:val="Heading4"/>
+      </w:pPr>
+      <w:r>
+        <w:br/>
+        <w:t xml:space="preserve">Forest Resilience Authorities</w:t>
+      </w:r>
+    </w:p>
+    <w:p>
+      <w:r>
+        <w:t xml:space="preserve">Another model could be a special fund established in statute at the state treasury and capitalized with a $250 million endowment, with LCI designated as the administrator. There are clear advantages and trade-offs to managing the fund as a single pool versus distributing one-time endowments to each aggregation pilot. Centralized management by a state agency could streamline administration, reduce overhead costs for individual pilots, and provide each entity with access to a larger, more diversified pool of funds. This approach would also ensure consistent oversight and potentially greater investment returns due to the scale of the endowment, while guaranteeing each pilot entity an annual appropriation to finance its operating budget. Higher returns may be possible with the larger pooled funds.</w:t>
+      </w:r>
+    </w:p>
+    <w:p/>
+    <w:p>
+      <w:pPr>
+        <w:pBdr>
+          <w:left w:val="double" w:color="5D85D0"/>
+        </w:pBdr>
+        <w:shd w:color="5D85D0" w:val="solid"/>
+        <w:ind w:left="288" w:right="288"/>
+      </w:pPr>
+      <w:r>
+        <w:rPr>
+          <w:b/>
+          <w:bCs/>
+          <w:color w:val="FFFFFF"/>
+        </w:rPr>
+        <w:t xml:space="preserve">New vs. Existing JPAs</w:t>
       </w:r>
     </w:p>
     <w:p>
@@ -2044,7 +2132,7 @@
         <w:ind w:left="288" w:right="288"/>
       </w:pPr>
       <w:r>
-        <w:t xml:space="preserve">We do not recommend relying solely on impact bonds, as they take a lengthy time to develop and rely on a payor to provide avoided cost funding. However, a bond could be a valuable complementary funding resource to other secured revenues. Other ‘newer’ finance options could include the following:</w:t>
+        <w:t xml:space="preserve">Endowments for feedstock aggregation pilots are not limited to the examples given and may be created from new or existing JPAs.</w:t>
       </w:r>
     </w:p>
     <w:p>
@@ -2055,15 +2143,7 @@
         <w:ind w:left="288" w:right="288"/>
       </w:pPr>
       <w:r>
-        <w:rPr>
-          <w:b/>
-          <w:bCs/>
-        </w:rPr>
-        <w:t xml:space="preserve">Carbon Markets</w:t>
-      </w:r>
-      <w:r>
-        <w:t xml:space="preserve">
-Carbon markets offer an opportunity to secure funding for on-the-ground forest management activities, including thinning, pruning, mastication, mechanical treatment, and prescribed burning. Revenue realized through carbon markets could help a JPA to treat more forest land than otherwise possible and generate additional biomass that could be put under supply contracts. Market prices for carbon credits vary depending on a given project’s size, location, treatment type, and the specific carbon market or registry used. Carbon credits can be generated for projects of any size, regardless of their location on federal, state, or private lands. Refer to the Avoided Wildfire Emissions Protocol section below for an alternative approach that is easier to implement than carbon sequestration credits or markets, as the avoided costs are already calculated, and proponents do not need to seek an entity to purchase the credits.</w:t>
+        <w:t xml:space="preserve">For example, the Eastern Sierra Council of Governments (ESCOG) is comparable to CSEDD, where proponents are adding feedstock aggregation functionality to an existing JPA and also forming a local collaborative connected to forest health and fuel treatments for wildfire mitigation. Where strong JPAs exist and there is interest in creating a special district, this may be the best route to follow, given that JPAs take a long time to form. ESCOG, for instance, took six years to create.</w:t>
       </w:r>
     </w:p>
     <w:p>
@@ -2074,7 +2154,131 @@
         <w:ind w:left="288" w:right="288"/>
       </w:pPr>
       <w:r>
-        <w:t xml:space="preserve">The National Forest Foundation implemented several voluntary carbon projects in California and the West following wildfires. Funded by corporate donors, the projects created carbon based on the growth trajectories of planted trees. The credits were registered with the American Carbon Registry but were immediately retired upon creation, as trading carbon on public lands is prohibited.</w:t>
+        <w:t xml:space="preserve">Creation from existing authorities may also make startup and implementation much less costly over time.</w:t>
+      </w:r>
+    </w:p>
+    <w:p/>
+    <w:p>
+      <w:r>
+        <w:t xml:space="preserve">However, managing the fund as one large sum may limit the flexibility of each pilot entity to respond to local needs, as access to additional funds for loans or grants would be subject to a competitive process administered by LCI. In this model, each pilot would be designated as a Forest Resilience Authority in state statute and guaranteed an annual appropriation through the fund to finance operating budgets. While this could foster innovation and ensure that funds are allocated to the most impactful projects, it may also introduce uncertainty for authorities that rely on supplemental funding for infrastructure or project development. In contrast, issuing one-time endowments directly to each pilot entity would empower them to make independent decisions about granting or lending funds, tailoring their financial strategies to the unique needs of their service areas.</w:t>
+      </w:r>
+    </w:p>
+    <w:p>
+      <w:r>
+        <w:t xml:space="preserve">Under the centralized model, with a 5% interest rate on $250 million, approximately $12.5 million in earnings would be generated in the first year. If 90% of these earnings are distributed as grants and 10% reinvested/used for administration, about $11.25 million would be available annually to support pilot operating budgets and project funding. This structure would provide pilots with a stable base of support while leaving a substantial pool—over $9.5 million in year one—for competitive grants or loans to finance infrastructure, transportation subsidies, and other critical needs, with the potential for these resources to grow and fund new or existing JPAs as feedstock aggregation entities as the endowment appreciates over time.</w:t>
+      </w:r>
+    </w:p>
+    <w:p>
+      <w:pPr>
+        <w:pStyle w:val="Heading4"/>
+      </w:pPr>
+      <w:r>
+        <w:t xml:space="preserve">Grant Leverage</w:t>
+      </w:r>
+    </w:p>
+    <w:p>
+      <w:r>
+        <w:t xml:space="preserve">Although we don’t have evidence to support this theory, we suspect organizations with a solid endowment will be more competitive for public funding, given their ability to provide a match and solid operating revenue. Established endowments offer a source of unrestricted funds that can be strategically used to meet grant match requirements for state and federal funding opportunities. With a robust endowment, organizations can offer greater match amounts, making their grant applications more competitive and attractive to funders. Additionally, a solid core operating budget supported by endowment income ensures organizational stability and the capacity to manage and implement grant-funded projects effectively.</w:t>
+      </w:r>
+    </w:p>
+    <w:p>
+      <w:pPr>
+        <w:pStyle w:val="Heading3"/>
+      </w:pPr>
+      <w:r>
+        <w:t xml:space="preserve">1.2.3	</w:t>
+      </w:r>
+      <w:r>
+        <w:t xml:space="preserve">Temporal Adoption</w:t>
+      </w:r>
+    </w:p>
+    <w:p>
+      <w:r>
+        <w:t xml:space="preserve">Any funding strategies, whether they are traditional or new conservation finance approaches, may be new or untested for certain audiences. Raising funds from conventional resources, then piloting new options over time, may be the best approach to introduce novel income sources. For example:</w:t>
+      </w:r>
+    </w:p>
+    <w:p>
+      <w:pPr>
+        <w:pStyle w:val="ListParagraph"/>
+        <w:numPr>
+          <w:ilvl w:val="0"/>
+          <w:numId w:val="14"/>
+        </w:numPr>
+      </w:pPr>
+      <w:r>
+        <w:t xml:space="preserve">New finance options, such as environmental impact bonds, could be introduced over a longer period and trialed at a small scale, then scaled up when successful. These could also include other financial mechanisms, such as revolving loan funds (offering low-interest loans), public-private partnerships, or bonds.</w:t>
+      </w:r>
+    </w:p>
+    <w:p>
+      <w:pPr>
+        <w:pStyle w:val="ListParagraph"/>
+        <w:numPr>
+          <w:ilvl w:val="0"/>
+          <w:numId w:val="14"/>
+        </w:numPr>
+      </w:pPr>
+      <w:r>
+        <w:t xml:space="preserve">Other revenue-generating options could be tested in the same manner to ensure their effectiveness and introduce them to skeptical participants, financial managers, or government entities that are not used to working with alternative finance options.</w:t>
+      </w:r>
+    </w:p>
+    <w:p>
+      <w:pPr>
+        <w:pStyle w:val="Heading3"/>
+      </w:pPr>
+      <w:r>
+        <w:t xml:space="preserve">1.2.4	</w:t>
+      </w:r>
+      <w:r>
+        <w:t xml:space="preserve">Collaborative Finance</w:t>
+      </w:r>
+    </w:p>
+    <w:p>
+      <w:r>
+        <w:t xml:space="preserve">Collaborative finance is a conservation finance strategy that involves cooperative interaction between individual project developers, stakeholders, and finance providers </w:t>
+      </w:r>
+      <w:r>
+        <w:t xml:space="preserve">(</w:t>
+      </w:r>
+      <w:r>
+        <w:t xml:space="preserve">Russell &amp; Odefey, 2024</w:t>
+      </w:r>
+      <w:r>
+        <w:t xml:space="preserve">)</w:t>
+      </w:r>
+      <w:r>
+        <w:t xml:space="preserve">. This process may or may not include traditional financial institutions.</w:t>
+      </w:r>
+      <w:r>
+        <w:rPr>
+          <w:rStyle w:val="FootnoteReference"/>
+        </w:rPr>
+        <w:footnoteReference w:id="6"/>
+      </w:r>
+      <w:r>
+        <w:t xml:space="preserve"> The term can be broadened to include finance developed through the fair and equitable participation of stakeholders in a region, landscape, or watershed, addressing natural resource and infrastructure management needs, and utilizing multiple forms of funding, from public grants to private investment. Finance approaches may include outcomes-based finance models such as environmental impact bonds.</w:t>
+      </w:r>
+    </w:p>
+    <w:p>
+      <w:r>
+        <w:t xml:space="preserve">The challenge of new finance options vs. more traditional approaches is, simply put, they’re new. As a result, more conservative controllers, accountants, and similar financial managers within any organization will be resistant to implementing new, unproven methods for generating income. Consequently, it may be best to start strong with traditional approaches and gradually test new strategies. Feasibility studies may also help introduce collaborative finance and new approaches. However, there are examples of established and successful impact finance bonds on the North Yuba River to draw upon when creating novel funding streams.</w:t>
+      </w:r>
+    </w:p>
+    <w:p/>
+    <w:p>
+      <w:pPr>
+        <w:pBdr>
+          <w:left w:val="double" w:color="5D85D0"/>
+        </w:pBdr>
+        <w:shd w:color="5D85D0" w:val="solid"/>
+        <w:ind w:left="288" w:right="288"/>
+      </w:pPr>
+      <w:r>
+        <w:rPr>
+          <w:b/>
+          <w:bCs/>
+          <w:color w:val="FFFFFF"/>
+        </w:rPr>
+        <w:t xml:space="preserve">New Funding Options</w:t>
       </w:r>
     </w:p>
     <w:p>
@@ -2089,13 +2293,73 @@
           <w:b/>
           <w:bCs/>
         </w:rPr>
+        <w:t xml:space="preserve">New Finance Options</w:t>
+      </w:r>
+      <w:r>
+        <w:t xml:space="preserve">
+Conservation finance options include environmental impact bonds, such as Blue Forest’s Forest Resilience Bonds, which leverage private investment from impact investors to support forest health projects. Repayment to investors is supported over time by beneficiaries, such as water districts, based on the savings and benefits from reduced wildfire risks and improved ecosystem services. A JPA could utilize environmental impact bonds on a trial basis at a small scale and then expand over an extended period. Identifying potential payor entities interested in covering the avoided costs of wildfire through proactive measures, such as thinning and prescribed fire, is worth pursuing immediately or as soon as an executive director is hired.</w:t>
+      </w:r>
+    </w:p>
+    <w:p>
+      <w:pPr>
+        <w:pBdr>
+          <w:left w:val="double" w:color="5D85D0"/>
+        </w:pBdr>
+        <w:ind w:left="288" w:right="288"/>
+      </w:pPr>
+      <w:r>
+        <w:t xml:space="preserve">We do not recommend relying solely on impact bonds, as they take a lengthy time to develop and rely on a payor to provide avoided cost funding. However, a bond could be a valuable complementary funding resource to other secured revenues. Other ‘newer’ finance options could include the following:</w:t>
+      </w:r>
+    </w:p>
+    <w:p>
+      <w:pPr>
+        <w:pBdr>
+          <w:left w:val="double" w:color="5D85D0"/>
+        </w:pBdr>
+        <w:ind w:left="288" w:right="288"/>
+      </w:pPr>
+      <w:r>
+        <w:rPr>
+          <w:b/>
+          <w:bCs/>
+        </w:rPr>
+        <w:t xml:space="preserve">Carbon Markets</w:t>
+      </w:r>
+      <w:r>
+        <w:t xml:space="preserve">
+Carbon markets offer an opportunity to secure funding for on-the-ground forest management activities, including thinning, pruning, mastication, mechanical treatment, and prescribed burning. Revenue realized through carbon markets could help a JPA to treat more forest land than otherwise possible and generate additional biomass that could be put under supply contracts. Market prices for carbon credits vary depending on a given project’s size, location, treatment type, and the specific carbon market or registry used. Carbon credits can be generated for projects of any size, regardless of their location on federal, state, or private lands. Refer to the Avoided Wildfire Emissions Protocol section below for an alternative approach that is easier to implement than carbon sequestration credits or markets, as the avoided costs are already calculated, and proponents do not need to seek an entity to purchase the credits.</w:t>
+      </w:r>
+    </w:p>
+    <w:p>
+      <w:pPr>
+        <w:pBdr>
+          <w:left w:val="double" w:color="5D85D0"/>
+        </w:pBdr>
+        <w:ind w:left="288" w:right="288"/>
+      </w:pPr>
+      <w:r>
+        <w:t xml:space="preserve">The National Forest Foundation implemented several voluntary carbon projects in California and the West following wildfires. Funded by corporate donors, the projects created carbon credits based on the growth trajectories of planted trees. The credits were registered with the American Carbon Registry but were immediately retired upon creation, as trading carbon on public lands is prohibited.</w:t>
+      </w:r>
+    </w:p>
+    <w:p>
+      <w:pPr>
+        <w:pBdr>
+          <w:left w:val="double" w:color="5D85D0"/>
+        </w:pBdr>
+        <w:ind w:left="288" w:right="288"/>
+      </w:pPr>
+      <w:r>
+        <w:rPr>
+          <w:b/>
+          <w:bCs/>
+        </w:rPr>
         <w:t xml:space="preserve">Avoided Wildfire Emissions</w:t>
       </w:r>
       <w:r>
         <w:t xml:space="preserve">
 The Spatial Informatics Group and Element Markets developed a forecast methodology under the Climate Forward program to recognize the climate benefits associated with fuel treatment activities that reduce the risk of catastrophic forest fires and their associated emissions. Known as the Avoided Wildfire Emissions Forecast Methodology, the protocol could provide complementary funding for thinning and prescribed fire projects, in addition to grants and private investments. The Protocol differs from carbon offsets in that forecasted mitigation units (FMUs) are issued for forecasted reductions or removals of greenhouse gases. FMUs are used to mitigate anticipated future emissions, such as wildfires. This methodology, however, uses outdated allometric equations to calculate changes to forests and does not model fire or climate. Verra’s </w:t>
       </w:r>
-      <w:hyperlink w:history="1" r:id="rIdhir5t89dyflsp8oeh4du_">
+      <w:hyperlink w:history="1" r:id="rIdziu1tuum0cb6nnskf8ujk">
         <w:r>
           <w:rPr>
             <w:rStyle w:val="Hyperlink"/>
@@ -2142,7 +2406,7 @@
       </w:r>
       <w:r>
         <w:t xml:space="preserve">
-Pooled funding sources, such as impact bonds or revolving loan funds, can help make a greater amount of funds available to more projects across a landscape. Typically offered at lower-than-market interest rates, revolving loan funds are self-replenishing pools of money that utilize principal and interest payments on existing loans to issue new loans. They have been used effectively on both small and large scales to develop businesses, support healthcare, and improve environmental outcomes. Revolving loan funds also provide much-needed upfront capital for project startups. They are flexible and can be used in conjunction with more conventional funds, such as grants and loans.</w:t>
+Pooled funding sources, such as impact bonds or revolving loan funds, can help make a greater amount of funds available to more projects across a landscape. Typically offered at below-market interest rates, revolving loan funds are self-replenishing pools of money that utilize principal and interest payments on existing loans to issue new loans. They have been used effectively on both small and large scales to develop businesses, support healthcare, and improve environmental outcomes. Revolving loan funds also provide much-needed upfront capital for project startups. They are flexible and can be used in conjunction with more conventional funds, such as grants and loans.</w:t>
       </w:r>
     </w:p>
     <w:p>
@@ -2208,7 +2472,7 @@
       <w:r>
         <w:t xml:space="preserve">One of the earliest examples of parametric insurance used for nature recovery is the Mesoamerican Reef parametric insurance that provided $800,000 for reef restoration following Hurricane Delta. The trigger was windspeed with a parameter greater than 100 knots. The funds originated from the </w:t>
       </w:r>
-      <w:hyperlink w:history="1" r:id="rIdebh02ezesfwpcadziejb5">
+      <w:hyperlink w:history="1" r:id="rIdcoa9lb30dum3vssbpmfus">
         <w:r>
           <w:rPr>
             <w:rStyle w:val="Hyperlink"/>
@@ -2280,7 +2544,7 @@
     </w:p>
     <w:p>
       <w:r>
-        <w:t xml:space="preserve">In the case of pilot projects supported by the Governor’s Office of Land Use and Climate Innovation, a tranche of endowment-like funding is being provided for startup funding of aggregation entities. In some cases, this amount is as much as $1 million, which, along with a capital campaign to bolster individual giving and create awareness around a JPA, could create a base endowment and provide stable operational revenue to a new organization from the principal if the endowment funds are wisely invested.</w:t>
+        <w:t xml:space="preserve">In the case of pilot projects supported by the Governor’s Office of Land Use and Climate Innovation, a tranche of endowment-like funding is recommended for startup funding of aggregation entities. In some cases, this amount is as much as $1 million, which, along with a capital campaign to bolster individual giving and create awareness around a JPA, could create a base endowment and provide stable operational revenue to a new organization from the principal if the endowment funds are wisely invested.</w:t>
       </w:r>
     </w:p>
     <w:p>
@@ -2314,7 +2578,7 @@
         <w:ind w:left="288" w:right="288"/>
       </w:pPr>
       <w:r>
-        <w:t xml:space="preserve">Evaluating whether to form a new governmental entity or organization is an important consideration for feedstock aggregation. Working with existing organizations, such as Resource Conservation Districts or Fire Safe Councils, would be a good starting point. It is critical to incorporate into the JPA’s bylaws and revenue-generating practices that grant fundraising does not compete with RCDs. It is possible a JPA may collaborate on a grant with one or more RCDs, but should never submit grants for which an RCD is eligible.</w:t>
+        <w:t xml:space="preserve">Evaluating whether to form a new governmental entity or organization is an important consideration for feedstock aggregation. Working with existing organizations, such as Resource Conservation Districts or Fire Safe Councils, would be a good starting point. It is critical to incorporate into the JPA’s bylaws and revenue-generating practices that grant fundraising does not compete with RCDs. It is possible that a JPA may collaborate on a grant with one or more RCDs, but should never submit grants for which an RCD is eligible.</w:t>
       </w:r>
     </w:p>
     <w:p/>
@@ -2336,7 +2600,7 @@
     </w:p>
     <w:p>
       <w:r>
-        <w:t xml:space="preserve">An annual expense budget of ~$ $400,000-2 million is estimated for a JPA startup. The total expenses/year could slowly ramp up each year of the budget, with the idea that additional secured revenue would enable a JPA to bring on more staff capacity, increase offerings, reach, or fee-for-service activities, or undertake additional revenue generation activities. The bulk of the expenses is for labor and staff, although some JPAs operate completely through contracted staff.</w:t>
+        <w:t xml:space="preserve">An annual expense budget of ~$400,000-2 million is estimated for a JPA startup. The total expenses/year could slowly ramp up each year of the budget, with the idea that additional secured revenue would enable a JPA to bring on more staff capacity, increase offerings, reach, or fee-for-service activities, or undertake additional revenue generation activities. The bulk of the expenses is for labor and staff, although some JPAs operate completely through contracted staff.</w:t>
       </w:r>
     </w:p>
     <w:p>
@@ -2365,7 +2629,7 @@
         <w:pStyle w:val="ListParagraph"/>
         <w:numPr>
           <w:ilvl w:val="0"/>
-          <w:numId w:val="14"/>
+          <w:numId w:val="15"/>
         </w:numPr>
       </w:pPr>
       <w:r>
@@ -2384,7 +2648,7 @@
         <w:pStyle w:val="ListParagraph"/>
         <w:numPr>
           <w:ilvl w:val="0"/>
-          <w:numId w:val="14"/>
+          <w:numId w:val="15"/>
         </w:numPr>
       </w:pPr>
       <w:r>
@@ -2403,7 +2667,7 @@
         <w:pStyle w:val="ListParagraph"/>
         <w:numPr>
           <w:ilvl w:val="0"/>
-          <w:numId w:val="14"/>
+          <w:numId w:val="15"/>
         </w:numPr>
       </w:pPr>
       <w:r>
@@ -2422,7 +2686,7 @@
         <w:pStyle w:val="ListParagraph"/>
         <w:numPr>
           <w:ilvl w:val="0"/>
-          <w:numId w:val="14"/>
+          <w:numId w:val="15"/>
         </w:numPr>
       </w:pPr>
       <w:r>
@@ -2441,7 +2705,7 @@
         <w:pStyle w:val="ListParagraph"/>
         <w:numPr>
           <w:ilvl w:val="0"/>
-          <w:numId w:val="14"/>
+          <w:numId w:val="15"/>
         </w:numPr>
       </w:pPr>
       <w:r>
@@ -2468,7 +2732,7 @@
     </w:p>
     <w:p>
       <w:r>
-        <w:t xml:space="preserve">A special thank you to Joshua Harrison, Center for the Study of the Force Majeure, and Temra Costa, Forestree Collective, for reviewing the draft manuscript. Thank you to the entire CAL FRAME team for ideas, edits, and development of the CAL FRAME report to the Office of Land Use and Climate Innovation. Eternal gratitude to Jeff Odefey, One Water Alliance, for helping to develop the initial ideas for this manuscript.</w:t>
+        <w:t xml:space="preserve">A special thank you to Michael Maguire, LCI, Sharmie Stevenson, Fall River RCD, Joshua Harrison, Center for the Study of the Force Majeure, Temra Costa, Regenerative Forest Solutions, and Christiana Darlington, CLERE, Inc. for reviewing the draft manuscript. Thank you to the entire Northeast California CAL FRAME team for ideas, edits, and development of the CAL FRAME Entity Action Report to LCI. Eternal gratitude to Jeff Odefey, One Water Alliance, for helping to develop the initial ideas for this manuscript.</w:t>
       </w:r>
     </w:p>
     <w:p>
@@ -2490,7 +2754,7 @@
       <w:r>
         <w:t xml:space="preserve">. (2025). Synchronicity Earth. </w:t>
       </w:r>
-      <w:hyperlink w:history="1" r:id="rIdhyd3vvqki9zzfmrezryau">
+      <w:hyperlink w:history="1" r:id="rIdmhplwpnnf9pi5ck6z47wm">
         <w:r>
           <w:rPr>
             <w:rStyle w:val="Hyperlink"/>
@@ -2521,7 +2785,7 @@
       <w:r>
         <w:t xml:space="preserve">. </w:t>
       </w:r>
-      <w:hyperlink w:history="1" r:id="rIdi_udoahcvklhdnwy9lpul">
+      <w:hyperlink w:history="1" r:id="rId5khxmt7crceqpmkm7k85h">
         <w:r>
           <w:rPr>
             <w:rStyle w:val="Hyperlink"/>
@@ -2552,7 +2816,7 @@
       <w:r>
         <w:t xml:space="preserve">(4), 208–218. </w:t>
       </w:r>
-      <w:hyperlink w:history="1" r:id="rIdimlzuqkvjcq-csjaazyc5">
+      <w:hyperlink w:history="1" r:id="rIdzg9ccxlulstkan8lcpake">
         <w:r>
           <w:rPr>
             <w:rStyle w:val="Hyperlink"/>
@@ -2561,73 +2825,19 @@
         </w:r>
       </w:hyperlink>
       <w:r>
-        <w:t xml:space="preserve">Bohlman, G. N., Safford, H. D., &amp; Skinner, C. N. (2021). Natural range of variation for yellow pine and mixed-conifer forests in northwestern California and southwestern Oregon. </w:t>
+        <w:t xml:space="preserve">Costa, T. (2025). </w:t>
       </w:r>
       <w:r>
         <w:rPr>
           <w:i/>
           <w:iCs/>
         </w:rPr>
-        <w:t xml:space="preserve">Gen. Tech. Rep. PSW-GTR-273. Albany, CA: US Department of Agriculture, Forest Service, Pacific Southwest Research Station. 146 p.</w:t>
-      </w:r>
-      <w:r>
-        <w:t xml:space="preserve">, </w:t>
-      </w:r>
-      <w:r>
-        <w:rPr>
-          <w:i/>
-          <w:iCs/>
-        </w:rPr>
-        <w:t xml:space="preserve">273</w:t>
-      </w:r>
-      <w:r>
-        <w:t xml:space="preserve">.</w:t>
-      </w:r>
-      <w:r>
-        <w:t xml:space="preserve">Carroll, C., Noon, B. R., Masino, S. A., &amp; Noss, R. F. (2025). Coordinating old-growth conservation across scales of space, time, and biodiversity: lessons from the US policy debate. </w:t>
-      </w:r>
-      <w:r>
-        <w:rPr>
-          <w:i/>
-          <w:iCs/>
-        </w:rPr>
-        <w:t xml:space="preserve">Frontiers in Forests and Global Change</w:t>
-      </w:r>
-      <w:r>
-        <w:t xml:space="preserve">, </w:t>
-      </w:r>
-      <w:r>
-        <w:rPr>
-          <w:i/>
-          <w:iCs/>
-        </w:rPr>
-        <w:t xml:space="preserve">8</w:t>
-      </w:r>
-      <w:r>
-        <w:t xml:space="preserve">. </w:t>
-      </w:r>
-      <w:hyperlink w:history="1" r:id="rIdibecqr2w71otxrebn-f3b">
-        <w:r>
-          <w:rPr>
-            <w:rStyle w:val="Hyperlink"/>
-          </w:rPr>
-          <w:t xml:space="preserve">10.3389/ffgc.2025.1493879</w:t>
-        </w:r>
-      </w:hyperlink>
-      <w:r>
-        <w:t xml:space="preserve">Costa, T. (2025). </w:t>
-      </w:r>
-      <w:r>
-        <w:rPr>
-          <w:i/>
-          <w:iCs/>
-        </w:rPr>
         <w:t xml:space="preserve">Assessing the viability of wood recovery and utilization in Sonoma County</w:t>
       </w:r>
       <w:r>
         <w:t xml:space="preserve">. Regenerative Forest Solutions. </w:t>
       </w:r>
-      <w:hyperlink w:history="1" r:id="rId9lvk1adit1v42rrpizqd_">
+      <w:hyperlink w:history="1" r:id="rId2hibrxhatc7d-ejzceno2">
         <w:r>
           <w:rPr>
             <w:rStyle w:val="Hyperlink"/>
@@ -2636,19 +2846,40 @@
         </w:r>
       </w:hyperlink>
       <w:r>
-        <w:t xml:space="preserve">CSG. (2020). </w:t>
+        <w:t xml:space="preserve">Crook, M. (2021). </w:t>
       </w:r>
       <w:r>
         <w:rPr>
           <w:i/>
           <w:iCs/>
         </w:rPr>
+        <w:t xml:space="preserve">How Can Revolving Loan Funds Make Our Coasts More Resilient?</w:t>
+      </w:r>
+      <w:r>
+        <w:t xml:space="preserve"> Environmental. </w:t>
+      </w:r>
+      <w:hyperlink w:history="1" r:id="rId0frwzqrv5euivau6gyn42">
+        <w:r>
+          <w:rPr>
+            <w:rStyle w:val="Hyperlink"/>
+          </w:rPr>
+          <w:t xml:space="preserve">https://www.eesi.org/papers/viewfact-sheet-how-can-revolving-loan-funds-make-our-coasts-more-resilient</w:t>
+        </w:r>
+      </w:hyperlink>
+      <w:r>
+        <w:t xml:space="preserve">CSG. (2020). </w:t>
+      </w:r>
+      <w:r>
+        <w:rPr>
+          <w:i/>
+          <w:iCs/>
+        </w:rPr>
         <w:t xml:space="preserve">Forest resilience authorities (FRAs): How regional wood waste management can support forest health and economic development goals in California</w:t>
       </w:r>
       <w:r>
         <w:t xml:space="preserve">. Conservation Strategy Group. </w:t>
       </w:r>
-      <w:hyperlink w:history="1" r:id="rIda9uwqmliu0tzyt21wimjl">
+      <w:hyperlink w:history="1" r:id="rId-qq2xrpadtbegwlqo9lm4">
         <w:r>
           <w:rPr>
             <w:rStyle w:val="Hyperlink"/>
@@ -2669,7 +2900,7 @@
       <w:r>
         <w:t xml:space="preserve">. Senate Local Government Committee. </w:t>
       </w:r>
-      <w:hyperlink w:history="1" r:id="rIdl5ui2z3jffr3ji3eqnbaz">
+      <w:hyperlink w:history="1" r:id="rIdkeje2fgc3frfkpdj1u2qs">
         <w:r>
           <w:rPr>
             <w:rStyle w:val="Hyperlink"/>
@@ -2703,7 +2934,7 @@
       <w:r>
         <w:t xml:space="preserve">. CLERE, Inc. </w:t>
       </w:r>
-      <w:hyperlink w:history="1" r:id="rIdbtlkcwsrwcds5xtpxcunc">
+      <w:hyperlink w:history="1" r:id="rId4ovyzrh7ast1uwuabucsa">
         <w:r>
           <w:rPr>
             <w:rStyle w:val="Hyperlink"/>
@@ -2724,7 +2955,7 @@
       <w:r>
         <w:t xml:space="preserve">. Joint Institute for Wood Products Innovation. </w:t>
       </w:r>
-      <w:hyperlink w:history="1" r:id="rIdpri-3_rzauf7ta2dohjy8">
+      <w:hyperlink w:history="1" r:id="rIddetppd9roh8cfoyletxvu">
         <w:r>
           <w:rPr>
             <w:rStyle w:val="Hyperlink"/>
@@ -2745,7 +2976,7 @@
       <w:r>
         <w:t xml:space="preserve">. </w:t>
       </w:r>
-      <w:hyperlink w:history="1" r:id="rIdtdtyfl9gtypx0ndb-o5fl">
+      <w:hyperlink w:history="1" r:id="rIdeupz04wve9wwzxkdbxlqo">
         <w:r>
           <w:rPr>
             <w:rStyle w:val="Hyperlink"/>
@@ -2754,34 +2985,24 @@
         </w:r>
       </w:hyperlink>
       <w:r>
-        <w:t xml:space="preserve">DellaSala, D. A., Mackey, B., Norman, P., Campbell, C., Comer, P. J., Kormos, C. F., Keith, H., &amp; Rogers, B. (2022). Mature and old-growth forests contribute to large-scale conservation targets in the conterminous United States. </w:t>
+        <w:t xml:space="preserve">Delyser, K., Tase, N., Clay, K., Magnan, M., Evans, S., Keithley, C., Bartowitz, K., Gadoth-Goodman, D., Papa, C., Ontl, T., &amp; Cooper, L. (2025). </w:t>
       </w:r>
       <w:r>
         <w:rPr>
           <w:i/>
           <w:iCs/>
         </w:rPr>
-        <w:t xml:space="preserve">Frontiers in Forests and Global Change</w:t>
-      </w:r>
-      <w:r>
-        <w:t xml:space="preserve">, </w:t>
-      </w:r>
-      <w:r>
-        <w:rPr>
-          <w:i/>
-          <w:iCs/>
-        </w:rPr>
-        <w:t xml:space="preserve">5</w:t>
-      </w:r>
-      <w:r>
-        <w:t xml:space="preserve">. </w:t>
-      </w:r>
-      <w:hyperlink w:history="1" r:id="rIdtnufsgbvaoea4kpooetnp">
+        <w:t xml:space="preserve">Effects of Forest Management &amp; Wood Utilization on Carbon Sequestration &amp; Storage in California</w:t>
+      </w:r>
+      <w:r>
+        <w:t xml:space="preserve">. CAL FIRE. </w:t>
+      </w:r>
+      <w:hyperlink w:history="1" r:id="rIdaqixsyph0miugktokbgdc">
         <w:r>
           <w:rPr>
             <w:rStyle w:val="Hyperlink"/>
           </w:rPr>
-          <w:t xml:space="preserve">10.3389/ffgc.2022.979528</w:t>
+          <w:t xml:space="preserve">https://d3f9k0n15ckvhe.cloudfront.net/wp-content/uploads/2025/02/CBM_CA_report_FINAL.pdf</w:t>
         </w:r>
       </w:hyperlink>
       <w:r>
@@ -2807,7 +3028,7 @@
       <w:r>
         <w:t xml:space="preserve">(8). </w:t>
       </w:r>
-      <w:hyperlink w:history="1" r:id="rIdos19gm2hs-1uwpppkowx6">
+      <w:hyperlink w:history="1" r:id="rId-uistmcxlopc1go2_l49s">
         <w:r>
           <w:rPr>
             <w:rStyle w:val="Hyperlink"/>
@@ -2816,14 +3037,14 @@
         </w:r>
       </w:hyperlink>
       <w:r>
-        <w:t xml:space="preserve">Jones, G. M., Vraga, E. K., Hessburg, P. F., Hurteau, M. D., Allen, C. D., Keane, R. E., Spies, T. A., North, M. P., Collins, B. M., Finney, M. A., Lydersen, J. M., &amp; Westerling, A. L. (2022). Counteracting wildfire misinformation. </w:t>
+        <w:t xml:space="preserve">Keeley, J. E., &amp; Syphard, A. D. (2021). Large California wildfires: 2020 fires in historical context. </w:t>
       </w:r>
       <w:r>
         <w:rPr>
           <w:i/>
           <w:iCs/>
         </w:rPr>
-        <w:t xml:space="preserve">Frontiers in Ecology and the Environment</w:t>
+        <w:t xml:space="preserve">Fire Ecology</w:t>
       </w:r>
       <w:r>
         <w:t xml:space="preserve">, </w:t>
@@ -2833,43 +3054,12 @@
           <w:i/>
           <w:iCs/>
         </w:rPr>
-        <w:t xml:space="preserve">20</w:t>
-      </w:r>
-      <w:r>
-        <w:t xml:space="preserve">(7), 392–393. </w:t>
-      </w:r>
-      <w:hyperlink w:history="1" r:id="rIdpez845kpiolicawgljvqd">
-        <w:r>
-          <w:rPr>
-            <w:rStyle w:val="Hyperlink"/>
-          </w:rPr>
-          <w:t xml:space="preserve">10.1002/fee.2553</w:t>
-        </w:r>
-      </w:hyperlink>
-      <w:r>
-        <w:t xml:space="preserve">Keeley, J. E., &amp; Syphard, A. D. (2021). Large California wildfires: 2020 fires in historical context. </w:t>
-      </w:r>
-      <w:r>
-        <w:rPr>
-          <w:i/>
-          <w:iCs/>
-        </w:rPr>
-        <w:t xml:space="preserve">Fire Ecology</w:t>
-      </w:r>
-      <w:r>
-        <w:t xml:space="preserve">, </w:t>
-      </w:r>
-      <w:r>
-        <w:rPr>
-          <w:i/>
-          <w:iCs/>
-        </w:rPr>
         <w:t xml:space="preserve">17</w:t>
       </w:r>
       <w:r>
         <w:t xml:space="preserve">(1). </w:t>
       </w:r>
-      <w:hyperlink w:history="1" r:id="rIdyk2e-qpykk5vnhpouofcy">
+      <w:hyperlink w:history="1" r:id="rId8mukqo1vdz4lwxwvg1x1h">
         <w:r>
           <w:rPr>
             <w:rStyle w:val="Hyperlink"/>
@@ -2878,29 +3068,42 @@
         </w:r>
       </w:hyperlink>
       <w:r>
-        <w:t xml:space="preserve">North, M. P., Tompkins, R. E., Bernal, A. A., Collins, B. M., Stephens, S. L., &amp; York, R. A. (2022). Operational resilience in western US frequent-fire forests. </w:t>
+        <w:t xml:space="preserve">Nabuurs, G.-J., Verkerk, P. J., Schelhaas, M.-J., González Olabarria, J. R., Trasobares, A., &amp; Cienciala, E. (2018). </w:t>
       </w:r>
       <w:r>
         <w:rPr>
           <w:i/>
           <w:iCs/>
         </w:rPr>
-        <w:t xml:space="preserve">Forest Ecology and Management</w:t>
-      </w:r>
-      <w:r>
-        <w:t xml:space="preserve">, </w:t>
+        <w:t xml:space="preserve">Climate-Smart Forestry: mitigation impacts in three European regions</w:t>
+      </w:r>
+      <w:r>
+        <w:t xml:space="preserve"> (Vol. 6). EFI Helsinki, Finland.</w:t>
+      </w:r>
+      <w:r>
+        <w:t xml:space="preserve">North, M. P., Tompkins, R. E., Bernal, A. A., Collins, B. M., Stephens, S. L., &amp; York, R. A. (2022). Operational resilience in western US frequent-fire forests. </w:t>
       </w:r>
       <w:r>
         <w:rPr>
           <w:i/>
           <w:iCs/>
         </w:rPr>
+        <w:t xml:space="preserve">Forest Ecology and Management</w:t>
+      </w:r>
+      <w:r>
+        <w:t xml:space="preserve">, </w:t>
+      </w:r>
+      <w:r>
+        <w:rPr>
+          <w:i/>
+          <w:iCs/>
+        </w:rPr>
         <w:t xml:space="preserve">507</w:t>
       </w:r>
       <w:r>
         <w:t xml:space="preserve">, 120004. </w:t>
       </w:r>
-      <w:hyperlink w:history="1" r:id="rIdwxdj4f1_axpaoy_vxnhag">
+      <w:hyperlink w:history="1" r:id="rIdxdy0_mwfg2sypxapupmmr">
         <w:r>
           <w:rPr>
             <w:rStyle w:val="Hyperlink"/>
@@ -2921,7 +3124,7 @@
       <w:r>
         <w:t xml:space="preserve">. U.S. Department of Agriculture, Forest Service, Pacific Southwest Research Station. </w:t>
       </w:r>
-      <w:hyperlink w:history="1" r:id="rIdw1rityih7h6-pgrxzp__6">
+      <w:hyperlink w:history="1" r:id="rIdc-29efmpghilmtdeukswj">
         <w:r>
           <w:rPr>
             <w:rStyle w:val="Hyperlink"/>
@@ -2942,7 +3145,7 @@
       <w:r>
         <w:t xml:space="preserve"> Swiss Re Corporate Solutions. </w:t>
       </w:r>
-      <w:hyperlink w:history="1" r:id="rIde_t_hjltag1pznuzsezof">
+      <w:hyperlink w:history="1" r:id="rIdjd1ibhuzi3zs4wa3dnxwj">
         <w:r>
           <w:rPr>
             <w:rStyle w:val="Hyperlink"/>
@@ -2963,7 +3166,7 @@
       <w:r>
         <w:t xml:space="preserve">. </w:t>
       </w:r>
-      <w:hyperlink w:history="1" r:id="rIda_iaehxwzkmccdixywisa">
+      <w:hyperlink w:history="1" r:id="rIdod2xmolgnossgstbkcncm">
         <w:r>
           <w:rPr>
             <w:rStyle w:val="Hyperlink"/>
@@ -2984,7 +3187,7 @@
       <w:r>
         <w:t xml:space="preserve">. Forest Business Alliance. </w:t>
       </w:r>
-      <w:hyperlink w:history="1" r:id="rIdyijewznnczu43m9sekxe7">
+      <w:hyperlink w:history="1" r:id="rIdcmtdy3extgfk1xy4c3ee0">
         <w:r>
           <w:rPr>
             <w:rStyle w:val="Hyperlink"/>
@@ -3005,7 +3208,7 @@
       <w:r>
         <w:t xml:space="preserve">. Fall River Resource Conservation District. </w:t>
       </w:r>
-      <w:hyperlink w:history="1" r:id="rIdlgx0ocmi_7wdao8smjzbw">
+      <w:hyperlink w:history="1" r:id="rIdwl_pgx_t1ye3bu9nli1_r">
         <w:r>
           <w:rPr>
             <w:rStyle w:val="Hyperlink"/>
@@ -3036,7 +3239,7 @@
       <w:r>
         <w:t xml:space="preserve">(9), 2696. </w:t>
       </w:r>
-      <w:hyperlink w:history="1" r:id="rIdkhfwga4h5xz_o1cxwrybj">
+      <w:hyperlink w:history="1" r:id="rIdyvhfxpgbrgejoni1lo39l">
         <w:r>
           <w:rPr>
             <w:rStyle w:val="Hyperlink"/>
@@ -3057,7 +3260,7 @@
       <w:r>
         <w:t xml:space="preserve">. North Coast Resource Partnership. </w:t>
       </w:r>
-      <w:hyperlink w:history="1" r:id="rIdbv9glagnr5z7iyhkch6dr">
+      <w:hyperlink w:history="1" r:id="rId95pcdbyqr7476kqpvgvd7">
         <w:r>
           <w:rPr>
             <w:rStyle w:val="Hyperlink"/>
@@ -3096,7 +3299,7 @@
         <wp:inline distT="0" distB="0" distL="0" distR="0">
           <wp:extent cx="608542" cy="105833"/>
           <wp:effectExtent b="0" l="0" r="0" t="0"/>
-          <wp:docPr id="3" name="" descr="" title=""/>
+          <wp:docPr id="4" name="" descr="" title=""/>
           <wp:cNvGraphicFramePr>
             <a:graphicFrameLocks xmlns:a="http://schemas.openxmlformats.org/drawingml/2006/main" noChangeAspect="1"/>
           </wp:cNvGraphicFramePr>
@@ -3178,29 +3381,7 @@
         <w:footnoteRef/>
       </w:r>
       <w:r>
-        <w:t xml:space="preserve">See </w:t>
-      </w:r>
-      <w:r>
-        <w:t xml:space="preserve">(</w:t>
-      </w:r>
-      <w:r>
-        <w:t xml:space="preserve">Bohlman </w:t>
-      </w:r>
-      <w:r>
-        <w:rPr>
-          <w:i/>
-          <w:iCs/>
-        </w:rPr>
-        <w:t xml:space="preserve">et al.</w:t>
-      </w:r>
-      <w:r>
-        <w:t xml:space="preserve">, 2021</w:t>
-      </w:r>
-      <w:r>
-        <w:t xml:space="preserve">)</w:t>
-      </w:r>
-      <w:r>
-        <w:t xml:space="preserve">.</w:t>
+        <w:t xml:space="preserve">JPAs can receive funding directed to tax-exempt organizations without being a nonprofit. However, any tax benefits would be lost. It may be necessary to connect any funding, e.g., from a foundation, to a nonprofit fiscal sponsor.</w:t>
       </w:r>
     </w:p>
   </w:footnote>
@@ -3213,7 +3394,7 @@
         <w:footnoteRef/>
       </w:r>
       <w:r>
-        <w:t xml:space="preserve">The old rule of thumb is a maximum 50-mile deadhead (empty trailer returning after dropping off payload) trip for timber or other forest products.</w:t>
+        <w:t xml:space="preserve">The rule of thumb is a maximum 50-mile deadhead (empty trailer returning after dropping off payload) trip for timber or other forest products.</w:t>
       </w:r>
     </w:p>
   </w:footnote>
@@ -3226,7 +3407,7 @@
         <w:footnoteRef/>
       </w:r>
       <w:r>
-        <w:t xml:space="preserve">Note that the Marin Wildfire Prevention Authority, funded by a sales tax increase in Marin County, has a $19.3 mn annual budget.</w:t>
+        <w:t xml:space="preserve">Note that the Marin Wildfire Prevention Authority, funded by a sales tax increase in Marin County, has a $19.3 million annual budget.</w:t>
       </w:r>
     </w:p>
   </w:footnote>
@@ -3239,7 +3420,7 @@
         <w:footnoteRef/>
       </w:r>
       <w:r>
-        <w:t xml:space="preserve">Personal communication, Temra Costa, Regenerative Forest Solutions.</w:t>
+        <w:t xml:space="preserve">Personal communication, Sharmie Stevenson, Fall River RCD.</w:t>
       </w:r>
     </w:p>
   </w:footnote>
@@ -3252,9 +3433,55 @@
         <w:footnoteRef/>
       </w:r>
       <w:r>
+        <w:t xml:space="preserve">Revolving loan funds are a proven vehicle to fund </w:t>
+      </w:r>
+      <w:hyperlink w:history="1" r:id="rIdrtbaegtv65yyc8rm0lc80">
+        <w:r>
+          <w:rPr>
+            <w:rStyle w:val="Hyperlink"/>
+          </w:rPr>
+          <w:t xml:space="preserve">grant programs</w:t>
+        </w:r>
+      </w:hyperlink>
+      <w:r>
+        <w:t xml:space="preserve">, </w:t>
+      </w:r>
+      <w:hyperlink w:history="1" r:id="rId21tc7zttkpds7s-6amkw3">
+        <w:r>
+          <w:rPr>
+            <w:rStyle w:val="Hyperlink"/>
+          </w:rPr>
+          <w:t xml:space="preserve">community development</w:t>
+        </w:r>
+      </w:hyperlink>
+      <w:r>
+        <w:t xml:space="preserve">, and </w:t>
+      </w:r>
+      <w:hyperlink w:history="1" r:id="rId_aa3lyhid__gkfacxwno8">
+        <w:r>
+          <w:rPr>
+            <w:rStyle w:val="Hyperlink"/>
+          </w:rPr>
+          <w:t xml:space="preserve">wildfire mitigation</w:t>
+        </w:r>
+      </w:hyperlink>
+      <w:r>
+        <w:t xml:space="preserve"> and have been in use worldwide for decades.</w:t>
+      </w:r>
+    </w:p>
+  </w:footnote>
+  <w:footnote w:id="6">
+    <w:p>
+      <w:r>
+        <w:rPr>
+          <w:rStyle w:val="FootnoteReference"/>
+        </w:rPr>
+        <w:footnoteRef/>
+      </w:r>
+      <w:r>
         <w:t xml:space="preserve">See </w:t>
       </w:r>
-      <w:hyperlink w:history="1" r:id="rId9qq-qdmq8kzcii0wghxul">
+      <w:hyperlink w:history="1" r:id="rIdddqmexupmrw5y2_hchptz">
         <w:r>
           <w:rPr>
             <w:rStyle w:val="Hyperlink"/>
@@ -3272,7 +3499,7 @@
 
 <file path=word/numbering.xml><?xml version="1.0" encoding="utf-8"?>
 <w:numbering xmlns:wpc="http://schemas.microsoft.com/office/word/2010/wordprocessingCanvas" xmlns:mc="http://schemas.openxmlformats.org/markup-compatibility/2006" xmlns:o="urn:schemas-microsoft-com:office:office" xmlns:r="http://schemas.openxmlformats.org/officeDocument/2006/relationships" xmlns:m="http://schemas.openxmlformats.org/officeDocument/2006/math" xmlns:v="urn:schemas-microsoft-com:vml" xmlns:wp14="http://schemas.microsoft.com/office/word/2010/wordprocessingDrawing" xmlns:wp="http://schemas.openxmlformats.org/drawingml/2006/wordprocessingDrawing" xmlns:w10="urn:schemas-microsoft-com:office:word" xmlns:w="http://schemas.openxmlformats.org/wordprocessingml/2006/main" xmlns:w14="http://schemas.microsoft.com/office/word/2010/wordml" xmlns:w15="http://schemas.microsoft.com/office/word/2012/wordml" xmlns:wpg="http://schemas.microsoft.com/office/word/2010/wordprocessingGroup" xmlns:wpi="http://schemas.microsoft.com/office/word/2010/wordprocessingInk" xmlns:wne="http://schemas.microsoft.com/office/word/2006/wordml" xmlns:wps="http://schemas.microsoft.com/office/word/2010/wordprocessingShape" mc:Ignorable="w14 w15 wp14">
-  <w:abstractNum w:abstractNumId="4" w15:restartNumberingAfterBreak="0">
+  <w:abstractNum w:abstractNumId="5" w15:restartNumberingAfterBreak="0">
     <w:multiLevelType w:val="hybridMultilevel"/>
     <w:lvl w:ilvl="0" w15:tentative="1">
       <w:start w:val="1"/>
@@ -3353,90 +3580,6 @@
       <w:lvlJc w:val="left"/>
       <w:pPr>
         <w:ind w:left="6480" w:hanging="360"/>
-      </w:pPr>
-    </w:lvl>
-  </w:abstractNum>
-  <w:abstractNum w:abstractNumId="5" w15:restartNumberingAfterBreak="0">
-    <w:multiLevelType w:val="hybridMultilevel"/>
-    <w:lvl w:ilvl="0" w15:tentative="1">
-      <w:start w:val="1"/>
-      <w:numFmt w:val="decimal"/>
-      <w:lvlText w:val="%1."/>
-      <w:lvlJc w:val="start"/>
-      <w:pPr>
-        <w:ind w:left="720" w:hanging="259"/>
-      </w:pPr>
-    </w:lvl>
-    <w:lvl w:ilvl="1" w15:tentative="1">
-      <w:start w:val="1"/>
-      <w:numFmt w:val="lowerLetter"/>
-      <w:lvlText w:val="%2."/>
-      <w:lvlJc w:val="start"/>
-      <w:pPr>
-        <w:ind w:left="1440" w:hanging="259"/>
-      </w:pPr>
-    </w:lvl>
-    <w:lvl w:ilvl="2" w15:tentative="1">
-      <w:start w:val="1"/>
-      <w:numFmt w:val="lowerRoman"/>
-      <w:lvlText w:val="%3."/>
-      <w:lvlJc w:val="start"/>
-      <w:pPr>
-        <w:ind w:left="2160" w:hanging="259"/>
-      </w:pPr>
-    </w:lvl>
-    <w:lvl w:ilvl="3" w15:tentative="1">
-      <w:start w:val="1"/>
-      <w:numFmt w:val="decimal"/>
-      <w:lvlText w:val="%4."/>
-      <w:lvlJc w:val="start"/>
-      <w:pPr>
-        <w:ind w:left="2880" w:hanging="259"/>
-      </w:pPr>
-    </w:lvl>
-    <w:lvl w:ilvl="4" w15:tentative="1">
-      <w:start w:val="1"/>
-      <w:numFmt w:val="lowerLetter"/>
-      <w:lvlText w:val="%5."/>
-      <w:lvlJc w:val="start"/>
-      <w:pPr>
-        <w:ind w:left="3600" w:hanging="259"/>
-      </w:pPr>
-    </w:lvl>
-    <w:lvl w:ilvl="5" w15:tentative="1">
-      <w:start w:val="1"/>
-      <w:numFmt w:val="lowerRoman"/>
-      <w:lvlText w:val="%6."/>
-      <w:lvlJc w:val="start"/>
-      <w:pPr>
-        <w:ind w:left="4320" w:hanging="259"/>
-      </w:pPr>
-    </w:lvl>
-    <w:lvl w:ilvl="6" w15:tentative="1">
-      <w:start w:val="1"/>
-      <w:numFmt w:val="decimal"/>
-      <w:lvlText w:val="%7."/>
-      <w:lvlJc w:val="start"/>
-      <w:pPr>
-        <w:ind w:left="5040" w:hanging="259"/>
-      </w:pPr>
-    </w:lvl>
-    <w:lvl w:ilvl="7" w15:tentative="1">
-      <w:start w:val="1"/>
-      <w:numFmt w:val="lowerLetter"/>
-      <w:lvlText w:val="%8."/>
-      <w:lvlJc w:val="start"/>
-      <w:pPr>
-        <w:ind w:left="5760" w:hanging="259"/>
-      </w:pPr>
-    </w:lvl>
-    <w:lvl w:ilvl="8" w15:tentative="1">
-      <w:start w:val="1"/>
-      <w:numFmt w:val="lowerRoman"/>
-      <w:lvlText w:val="%9."/>
-      <w:lvlJc w:val="start"/>
-      <w:pPr>
-        <w:ind w:left="6480" w:hanging="259"/>
       </w:pPr>
     </w:lvl>
   </w:abstractNum>
@@ -3444,8 +3587,8 @@
     <w:multiLevelType w:val="hybridMultilevel"/>
     <w:lvl w:ilvl="0" w15:tentative="1">
       <w:start w:val="1"/>
-      <w:numFmt w:val="bullet"/>
-      <w:lvlText w:val="●"/>
+      <w:numFmt w:val="decimal"/>
+      <w:lvlText w:val="%1."/>
       <w:lvlJc w:val="start"/>
       <w:pPr>
         <w:ind w:left="720" w:hanging="259"/>
@@ -3453,8 +3596,8 @@
     </w:lvl>
     <w:lvl w:ilvl="1" w15:tentative="1">
       <w:start w:val="1"/>
-      <w:numFmt w:val="bullet"/>
-      <w:lvlText w:val="○"/>
+      <w:numFmt w:val="lowerLetter"/>
+      <w:lvlText w:val="%2."/>
       <w:lvlJc w:val="start"/>
       <w:pPr>
         <w:ind w:left="1440" w:hanging="259"/>
@@ -3462,8 +3605,8 @@
     </w:lvl>
     <w:lvl w:ilvl="2" w15:tentative="1">
       <w:start w:val="1"/>
-      <w:numFmt w:val="bullet"/>
-      <w:lvlText w:val="■"/>
+      <w:numFmt w:val="lowerRoman"/>
+      <w:lvlText w:val="%3."/>
       <w:lvlJc w:val="start"/>
       <w:pPr>
         <w:ind w:left="2160" w:hanging="259"/>
@@ -3471,8 +3614,8 @@
     </w:lvl>
     <w:lvl w:ilvl="3" w15:tentative="1">
       <w:start w:val="1"/>
-      <w:numFmt w:val="bullet"/>
-      <w:lvlText w:val="●"/>
+      <w:numFmt w:val="decimal"/>
+      <w:lvlText w:val="%4."/>
       <w:lvlJc w:val="start"/>
       <w:pPr>
         <w:ind w:left="2880" w:hanging="259"/>
@@ -3480,8 +3623,8 @@
     </w:lvl>
     <w:lvl w:ilvl="4" w15:tentative="1">
       <w:start w:val="1"/>
-      <w:numFmt w:val="bullet"/>
-      <w:lvlText w:val="○"/>
+      <w:numFmt w:val="lowerLetter"/>
+      <w:lvlText w:val="%5."/>
       <w:lvlJc w:val="start"/>
       <w:pPr>
         <w:ind w:left="3600" w:hanging="259"/>
@@ -3489,8 +3632,8 @@
     </w:lvl>
     <w:lvl w:ilvl="5" w15:tentative="1">
       <w:start w:val="1"/>
-      <w:numFmt w:val="bullet"/>
-      <w:lvlText w:val="■"/>
+      <w:numFmt w:val="lowerRoman"/>
+      <w:lvlText w:val="%6."/>
       <w:lvlJc w:val="start"/>
       <w:pPr>
         <w:ind w:left="4320" w:hanging="259"/>
@@ -3498,8 +3641,8 @@
     </w:lvl>
     <w:lvl w:ilvl="6" w15:tentative="1">
       <w:start w:val="1"/>
-      <w:numFmt w:val="bullet"/>
-      <w:lvlText w:val="●"/>
+      <w:numFmt w:val="decimal"/>
+      <w:lvlText w:val="%7."/>
       <w:lvlJc w:val="start"/>
       <w:pPr>
         <w:ind w:left="5040" w:hanging="259"/>
@@ -3507,8 +3650,8 @@
     </w:lvl>
     <w:lvl w:ilvl="7" w15:tentative="1">
       <w:start w:val="1"/>
-      <w:numFmt w:val="bullet"/>
-      <w:lvlText w:val="○"/>
+      <w:numFmt w:val="lowerLetter"/>
+      <w:lvlText w:val="%8."/>
       <w:lvlJc w:val="start"/>
       <w:pPr>
         <w:ind w:left="5760" w:hanging="259"/>
@@ -3516,8 +3659,8 @@
     </w:lvl>
     <w:lvl w:ilvl="8" w15:tentative="1">
       <w:start w:val="1"/>
-      <w:numFmt w:val="bullet"/>
-      <w:lvlText w:val="■"/>
+      <w:numFmt w:val="lowerRoman"/>
+      <w:lvlText w:val="%9."/>
       <w:lvlJc w:val="start"/>
       <w:pPr>
         <w:ind w:left="6480" w:hanging="259"/>
@@ -3528,8 +3671,8 @@
     <w:multiLevelType w:val="hybridMultilevel"/>
     <w:lvl w:ilvl="0" w15:tentative="1">
       <w:start w:val="1"/>
-      <w:numFmt w:val="decimal"/>
-      <w:lvlText w:val="%1."/>
+      <w:numFmt w:val="bullet"/>
+      <w:lvlText w:val="●"/>
       <w:lvlJc w:val="start"/>
       <w:pPr>
         <w:ind w:left="720" w:hanging="259"/>
@@ -3537,8 +3680,8 @@
     </w:lvl>
     <w:lvl w:ilvl="1" w15:tentative="1">
       <w:start w:val="1"/>
-      <w:numFmt w:val="lowerLetter"/>
-      <w:lvlText w:val="%2."/>
+      <w:numFmt w:val="bullet"/>
+      <w:lvlText w:val="○"/>
       <w:lvlJc w:val="start"/>
       <w:pPr>
         <w:ind w:left="1440" w:hanging="259"/>
@@ -3546,8 +3689,8 @@
     </w:lvl>
     <w:lvl w:ilvl="2" w15:tentative="1">
       <w:start w:val="1"/>
-      <w:numFmt w:val="lowerRoman"/>
-      <w:lvlText w:val="%3."/>
+      <w:numFmt w:val="bullet"/>
+      <w:lvlText w:val="■"/>
       <w:lvlJc w:val="start"/>
       <w:pPr>
         <w:ind w:left="2160" w:hanging="259"/>
@@ -3555,8 +3698,8 @@
     </w:lvl>
     <w:lvl w:ilvl="3" w15:tentative="1">
       <w:start w:val="1"/>
-      <w:numFmt w:val="decimal"/>
-      <w:lvlText w:val="%4."/>
+      <w:numFmt w:val="bullet"/>
+      <w:lvlText w:val="●"/>
       <w:lvlJc w:val="start"/>
       <w:pPr>
         <w:ind w:left="2880" w:hanging="259"/>
@@ -3564,8 +3707,8 @@
     </w:lvl>
     <w:lvl w:ilvl="4" w15:tentative="1">
       <w:start w:val="1"/>
-      <w:numFmt w:val="lowerLetter"/>
-      <w:lvlText w:val="%5."/>
+      <w:numFmt w:val="bullet"/>
+      <w:lvlText w:val="○"/>
       <w:lvlJc w:val="start"/>
       <w:pPr>
         <w:ind w:left="3600" w:hanging="259"/>
@@ -3573,8 +3716,8 @@
     </w:lvl>
     <w:lvl w:ilvl="5" w15:tentative="1">
       <w:start w:val="1"/>
-      <w:numFmt w:val="lowerRoman"/>
-      <w:lvlText w:val="%6."/>
+      <w:numFmt w:val="bullet"/>
+      <w:lvlText w:val="■"/>
       <w:lvlJc w:val="start"/>
       <w:pPr>
         <w:ind w:left="4320" w:hanging="259"/>
@@ -3582,8 +3725,8 @@
     </w:lvl>
     <w:lvl w:ilvl="6" w15:tentative="1">
       <w:start w:val="1"/>
-      <w:numFmt w:val="decimal"/>
-      <w:lvlText w:val="%7."/>
+      <w:numFmt w:val="bullet"/>
+      <w:lvlText w:val="●"/>
       <w:lvlJc w:val="start"/>
       <w:pPr>
         <w:ind w:left="5040" w:hanging="259"/>
@@ -3591,8 +3734,8 @@
     </w:lvl>
     <w:lvl w:ilvl="7" w15:tentative="1">
       <w:start w:val="1"/>
-      <w:numFmt w:val="lowerLetter"/>
-      <w:lvlText w:val="%8."/>
+      <w:numFmt w:val="bullet"/>
+      <w:lvlText w:val="○"/>
       <w:lvlJc w:val="start"/>
       <w:pPr>
         <w:ind w:left="5760" w:hanging="259"/>
@@ -3600,8 +3743,8 @@
     </w:lvl>
     <w:lvl w:ilvl="8" w15:tentative="1">
       <w:start w:val="1"/>
-      <w:numFmt w:val="lowerRoman"/>
-      <w:lvlText w:val="%9."/>
+      <w:numFmt w:val="bullet"/>
+      <w:lvlText w:val="■"/>
       <w:lvlJc w:val="start"/>
       <w:pPr>
         <w:ind w:left="6480" w:hanging="259"/>
@@ -3776,13 +3919,91 @@
       </w:pPr>
     </w:lvl>
   </w:abstractNum>
+  <w:abstractNum w:abstractNumId="10" w15:restartNumberingAfterBreak="0">
+    <w:multiLevelType w:val="hybridMultilevel"/>
+    <w:lvl w:ilvl="0" w15:tentative="1">
+      <w:start w:val="1"/>
+      <w:numFmt w:val="decimal"/>
+      <w:lvlText w:val="%1."/>
+      <w:lvlJc w:val="start"/>
+      <w:pPr>
+        <w:ind w:left="720" w:hanging="259"/>
+      </w:pPr>
+    </w:lvl>
+    <w:lvl w:ilvl="1" w15:tentative="1">
+      <w:start w:val="1"/>
+      <w:numFmt w:val="lowerLetter"/>
+      <w:lvlText w:val="%2."/>
+      <w:lvlJc w:val="start"/>
+      <w:pPr>
+        <w:ind w:left="1440" w:hanging="259"/>
+      </w:pPr>
+    </w:lvl>
+    <w:lvl w:ilvl="2" w15:tentative="1">
+      <w:start w:val="1"/>
+      <w:numFmt w:val="lowerRoman"/>
+      <w:lvlText w:val="%3."/>
+      <w:lvlJc w:val="start"/>
+      <w:pPr>
+        <w:ind w:left="2160" w:hanging="259"/>
+      </w:pPr>
+    </w:lvl>
+    <w:lvl w:ilvl="3" w15:tentative="1">
+      <w:start w:val="1"/>
+      <w:numFmt w:val="decimal"/>
+      <w:lvlText w:val="%4."/>
+      <w:lvlJc w:val="start"/>
+      <w:pPr>
+        <w:ind w:left="2880" w:hanging="259"/>
+      </w:pPr>
+    </w:lvl>
+    <w:lvl w:ilvl="4" w15:tentative="1">
+      <w:start w:val="1"/>
+      <w:numFmt w:val="lowerLetter"/>
+      <w:lvlText w:val="%5."/>
+      <w:lvlJc w:val="start"/>
+      <w:pPr>
+        <w:ind w:left="3600" w:hanging="259"/>
+      </w:pPr>
+    </w:lvl>
+    <w:lvl w:ilvl="5" w15:tentative="1">
+      <w:start w:val="1"/>
+      <w:numFmt w:val="lowerRoman"/>
+      <w:lvlText w:val="%6."/>
+      <w:lvlJc w:val="start"/>
+      <w:pPr>
+        <w:ind w:left="4320" w:hanging="259"/>
+      </w:pPr>
+    </w:lvl>
+    <w:lvl w:ilvl="6" w15:tentative="1">
+      <w:start w:val="1"/>
+      <w:numFmt w:val="decimal"/>
+      <w:lvlText w:val="%7."/>
+      <w:lvlJc w:val="start"/>
+      <w:pPr>
+        <w:ind w:left="5040" w:hanging="259"/>
+      </w:pPr>
+    </w:lvl>
+    <w:lvl w:ilvl="7" w15:tentative="1">
+      <w:start w:val="1"/>
+      <w:numFmt w:val="lowerLetter"/>
+      <w:lvlText w:val="%8."/>
+      <w:lvlJc w:val="start"/>
+      <w:pPr>
+        <w:ind w:left="5760" w:hanging="259"/>
+      </w:pPr>
+    </w:lvl>
+    <w:lvl w:ilvl="8" w15:tentative="1">
+      <w:start w:val="1"/>
+      <w:numFmt w:val="lowerRoman"/>
+      <w:lvlText w:val="%9."/>
+      <w:lvlJc w:val="start"/>
+      <w:pPr>
+        <w:ind w:left="6480" w:hanging="259"/>
+      </w:pPr>
+    </w:lvl>
+  </w:abstractNum>
   <w:num w:numId="1">
-    <w:abstractNumId w:val="4"/>
-    <w:lvlOverride w:ilvl="0">
-      <w:startOverride w:val="1"/>
-    </w:lvlOverride>
-  </w:num>
-  <w:num w:numId="10">
     <w:abstractNumId w:val="5"/>
     <w:lvlOverride w:ilvl="0">
       <w:startOverride w:val="1"/>
@@ -3808,6 +4029,12 @@
   </w:num>
   <w:num w:numId="14">
     <w:abstractNumId w:val="9"/>
+    <w:lvlOverride w:ilvl="0">
+      <w:startOverride w:val="1"/>
+    </w:lvlOverride>
+  </w:num>
+  <w:num w:numId="15">
+    <w:abstractNumId w:val="10"/>
     <w:lvlOverride w:ilvl="0">
       <w:startOverride w:val="1"/>
     </w:lvlOverride>

</xml_diff>